<commit_message>
docs(checklist): record ai reply fix evidence
</commit_message>
<xml_diff>
--- a/CHECKLIST_M1_M2_REMEDIATION_2026-04-28.docx
+++ b/CHECKLIST_M1_M2_REMEDIATION_2026-04-28.docx
@@ -6013,6 +6013,18 @@
         </w:numPr>
       </w:pPr>
       <w:r>
+        <w:t xml:space="preserve">Regression: reply-triggered owner action reclassification fires.</w:t>
+      </w:r>
+    </w:p>
+    <w:p>
+      <w:pPr>
+        <w:pStyle w:val="Compact"/>
+        <w:numPr>
+          <w:ilvl w:val="0"/>
+          <w:numId w:val="1152"/>
+        </w:numPr>
+      </w:pPr>
+      <w:r>
         <w:t xml:space="preserve">Regression: owner action reclassification still fires.</w:t>
       </w:r>
     </w:p>
@@ -6029,7 +6041,7 @@
         <w:pStyle w:val="Compact"/>
         <w:numPr>
           <w:ilvl w:val="0"/>
-          <w:numId w:val="1152"/>
+          <w:numId w:val="1153"/>
         </w:numPr>
       </w:pPr>
       <w:r>
@@ -6047,7 +6059,7 @@
         <w:pStyle w:val="Compact"/>
         <w:numPr>
           <w:ilvl w:val="0"/>
-          <w:numId w:val="1152"/>
+          <w:numId w:val="1153"/>
         </w:numPr>
       </w:pPr>
       <w:r>
@@ -6059,7 +6071,7 @@
         <w:pStyle w:val="Compact"/>
         <w:numPr>
           <w:ilvl w:val="0"/>
-          <w:numId w:val="1152"/>
+          <w:numId w:val="1153"/>
         </w:numPr>
       </w:pPr>
       <w:r>
@@ -6077,7 +6089,7 @@
         <w:pStyle w:val="Compact"/>
         <w:numPr>
           <w:ilvl w:val="0"/>
-          <w:numId w:val="1152"/>
+          <w:numId w:val="1153"/>
         </w:numPr>
       </w:pPr>
       <w:r>
@@ -6107,7 +6119,7 @@
         <w:pStyle w:val="Compact"/>
         <w:numPr>
           <w:ilvl w:val="0"/>
-          <w:numId w:val="1152"/>
+          <w:numId w:val="1153"/>
         </w:numPr>
       </w:pPr>
       <w:r>
@@ -6151,7 +6163,7 @@
         <w:pStyle w:val="Compact"/>
         <w:numPr>
           <w:ilvl w:val="0"/>
-          <w:numId w:val="1153"/>
+          <w:numId w:val="1154"/>
         </w:numPr>
       </w:pPr>
       <w:r>
@@ -6163,7 +6175,7 @@
         <w:pStyle w:val="Compact"/>
         <w:numPr>
           <w:ilvl w:val="0"/>
-          <w:numId w:val="1154"/>
+          <w:numId w:val="1155"/>
         </w:numPr>
       </w:pPr>
       <w:r>
@@ -6175,7 +6187,7 @@
         <w:pStyle w:val="Compact"/>
         <w:numPr>
           <w:ilvl w:val="0"/>
-          <w:numId w:val="1155"/>
+          <w:numId w:val="1156"/>
         </w:numPr>
       </w:pPr>
       <w:r>
@@ -6187,7 +6199,7 @@
         <w:pStyle w:val="Compact"/>
         <w:numPr>
           <w:ilvl w:val="0"/>
-          <w:numId w:val="1156"/>
+          <w:numId w:val="1157"/>
         </w:numPr>
       </w:pPr>
       <w:r>
@@ -6225,7 +6237,7 @@
         <w:pStyle w:val="Compact"/>
         <w:numPr>
           <w:ilvl w:val="0"/>
-          <w:numId w:val="1157"/>
+          <w:numId w:val="1158"/>
         </w:numPr>
       </w:pPr>
       <w:r>
@@ -6237,7 +6249,7 @@
         <w:pStyle w:val="Compact"/>
         <w:numPr>
           <w:ilvl w:val="0"/>
-          <w:numId w:val="1157"/>
+          <w:numId w:val="1158"/>
         </w:numPr>
       </w:pPr>
       <w:r>
@@ -6249,7 +6261,7 @@
         <w:pStyle w:val="Compact"/>
         <w:numPr>
           <w:ilvl w:val="0"/>
-          <w:numId w:val="1157"/>
+          <w:numId w:val="1158"/>
         </w:numPr>
       </w:pPr>
       <w:r>
@@ -6261,7 +6273,7 @@
         <w:pStyle w:val="Compact"/>
         <w:numPr>
           <w:ilvl w:val="0"/>
-          <w:numId w:val="1157"/>
+          <w:numId w:val="1158"/>
         </w:numPr>
       </w:pPr>
       <w:r>
@@ -6273,7 +6285,7 @@
         <w:pStyle w:val="Compact"/>
         <w:numPr>
           <w:ilvl w:val="0"/>
-          <w:numId w:val="1157"/>
+          <w:numId w:val="1158"/>
         </w:numPr>
       </w:pPr>
       <w:r>
@@ -6285,7 +6297,7 @@
         <w:pStyle w:val="Compact"/>
         <w:numPr>
           <w:ilvl w:val="0"/>
-          <w:numId w:val="1157"/>
+          <w:numId w:val="1158"/>
         </w:numPr>
       </w:pPr>
       <w:r>
@@ -6306,7 +6318,7 @@
         <w:pStyle w:val="Compact"/>
         <w:numPr>
           <w:ilvl w:val="0"/>
-          <w:numId w:val="1158"/>
+          <w:numId w:val="1159"/>
         </w:numPr>
       </w:pPr>
       <w:r>
@@ -6342,7 +6354,7 @@
         <w:pStyle w:val="Compact"/>
         <w:numPr>
           <w:ilvl w:val="0"/>
-          <w:numId w:val="1159"/>
+          <w:numId w:val="1160"/>
         </w:numPr>
       </w:pPr>
       <w:r>
@@ -6354,7 +6366,7 @@
         <w:pStyle w:val="Compact"/>
         <w:numPr>
           <w:ilvl w:val="0"/>
-          <w:numId w:val="1160"/>
+          <w:numId w:val="1161"/>
         </w:numPr>
       </w:pPr>
       <w:r>
@@ -6402,7 +6414,7 @@
         <w:pStyle w:val="Compact"/>
         <w:numPr>
           <w:ilvl w:val="0"/>
-          <w:numId w:val="1161"/>
+          <w:numId w:val="1162"/>
         </w:numPr>
       </w:pPr>
       <w:r>
@@ -6437,7 +6449,7 @@
         <w:pStyle w:val="Compact"/>
         <w:numPr>
           <w:ilvl w:val="0"/>
-          <w:numId w:val="1162"/>
+          <w:numId w:val="1163"/>
         </w:numPr>
       </w:pPr>
       <w:r>
@@ -6470,7 +6482,7 @@
         <w:pStyle w:val="Compact"/>
         <w:numPr>
           <w:ilvl w:val="0"/>
-          <w:numId w:val="1162"/>
+          <w:numId w:val="1163"/>
         </w:numPr>
       </w:pPr>
       <w:r>
@@ -6494,7 +6506,7 @@
         <w:pStyle w:val="Compact"/>
         <w:numPr>
           <w:ilvl w:val="0"/>
-          <w:numId w:val="1162"/>
+          <w:numId w:val="1163"/>
         </w:numPr>
       </w:pPr>
       <w:r>
@@ -6506,7 +6518,7 @@
         <w:pStyle w:val="Compact"/>
         <w:numPr>
           <w:ilvl w:val="0"/>
-          <w:numId w:val="1162"/>
+          <w:numId w:val="1163"/>
         </w:numPr>
       </w:pPr>
       <w:r>
@@ -6564,7 +6576,7 @@
         <w:pStyle w:val="Compact"/>
         <w:numPr>
           <w:ilvl w:val="0"/>
-          <w:numId w:val="1163"/>
+          <w:numId w:val="1164"/>
         </w:numPr>
       </w:pPr>
       <w:r>
@@ -6591,7 +6603,7 @@
         <w:pStyle w:val="Compact"/>
         <w:numPr>
           <w:ilvl w:val="0"/>
-          <w:numId w:val="1164"/>
+          <w:numId w:val="1165"/>
         </w:numPr>
       </w:pPr>
       <w:r>
@@ -6615,7 +6627,7 @@
         <w:pStyle w:val="Compact"/>
         <w:numPr>
           <w:ilvl w:val="0"/>
-          <w:numId w:val="1165"/>
+          <w:numId w:val="1166"/>
         </w:numPr>
       </w:pPr>
       <w:r>
@@ -6675,7 +6687,7 @@
         <w:pStyle w:val="Compact"/>
         <w:numPr>
           <w:ilvl w:val="0"/>
-          <w:numId w:val="1166"/>
+          <w:numId w:val="1167"/>
         </w:numPr>
       </w:pPr>
       <w:r>
@@ -6687,7 +6699,7 @@
         <w:pStyle w:val="Compact"/>
         <w:numPr>
           <w:ilvl w:val="0"/>
-          <w:numId w:val="1167"/>
+          <w:numId w:val="1168"/>
         </w:numPr>
       </w:pPr>
       <w:r>
@@ -6699,7 +6711,7 @@
         <w:pStyle w:val="Compact"/>
         <w:numPr>
           <w:ilvl w:val="0"/>
-          <w:numId w:val="1168"/>
+          <w:numId w:val="1169"/>
         </w:numPr>
       </w:pPr>
       <w:r>
@@ -6711,7 +6723,7 @@
         <w:pStyle w:val="Compact"/>
         <w:numPr>
           <w:ilvl w:val="0"/>
-          <w:numId w:val="1169"/>
+          <w:numId w:val="1170"/>
         </w:numPr>
       </w:pPr>
       <w:r>
@@ -6723,7 +6735,7 @@
         <w:pStyle w:val="Compact"/>
         <w:numPr>
           <w:ilvl w:val="0"/>
-          <w:numId w:val="1170"/>
+          <w:numId w:val="1171"/>
         </w:numPr>
       </w:pPr>
       <w:r>
@@ -6735,7 +6747,7 @@
         <w:pStyle w:val="Compact"/>
         <w:numPr>
           <w:ilvl w:val="0"/>
-          <w:numId w:val="1171"/>
+          <w:numId w:val="1172"/>
         </w:numPr>
       </w:pPr>
       <w:r>
@@ -6747,7 +6759,7 @@
         <w:pStyle w:val="Compact"/>
         <w:numPr>
           <w:ilvl w:val="0"/>
-          <w:numId w:val="1172"/>
+          <w:numId w:val="1173"/>
         </w:numPr>
       </w:pPr>
       <w:r>
@@ -6774,7 +6786,7 @@
         <w:pStyle w:val="Compact"/>
         <w:numPr>
           <w:ilvl w:val="0"/>
-          <w:numId w:val="1173"/>
+          <w:numId w:val="1174"/>
         </w:numPr>
       </w:pPr>
       <w:r>
@@ -6796,7 +6808,7 @@
         <w:pStyle w:val="Compact"/>
         <w:numPr>
           <w:ilvl w:val="0"/>
-          <w:numId w:val="1174"/>
+          <w:numId w:val="1175"/>
         </w:numPr>
       </w:pPr>
       <w:r>
@@ -6823,7 +6835,7 @@
         <w:pStyle w:val="Compact"/>
         <w:numPr>
           <w:ilvl w:val="0"/>
-          <w:numId w:val="1175"/>
+          <w:numId w:val="1176"/>
         </w:numPr>
       </w:pPr>
       <w:r>
@@ -6835,7 +6847,7 @@
         <w:pStyle w:val="Compact"/>
         <w:numPr>
           <w:ilvl w:val="0"/>
-          <w:numId w:val="1176"/>
+          <w:numId w:val="1177"/>
         </w:numPr>
       </w:pPr>
       <w:r>
@@ -6847,7 +6859,7 @@
         <w:pStyle w:val="Compact"/>
         <w:numPr>
           <w:ilvl w:val="0"/>
-          <w:numId w:val="1177"/>
+          <w:numId w:val="1178"/>
         </w:numPr>
       </w:pPr>
       <w:r>
@@ -6859,7 +6871,7 @@
         <w:pStyle w:val="Compact"/>
         <w:numPr>
           <w:ilvl w:val="0"/>
-          <w:numId w:val="1178"/>
+          <w:numId w:val="1179"/>
         </w:numPr>
       </w:pPr>
       <w:r>
@@ -6871,7 +6883,7 @@
         <w:pStyle w:val="Compact"/>
         <w:numPr>
           <w:ilvl w:val="0"/>
-          <w:numId w:val="1179"/>
+          <w:numId w:val="1180"/>
         </w:numPr>
       </w:pPr>
       <w:r>
@@ -6883,7 +6895,7 @@
         <w:pStyle w:val="Compact"/>
         <w:numPr>
           <w:ilvl w:val="0"/>
-          <w:numId w:val="1180"/>
+          <w:numId w:val="1181"/>
         </w:numPr>
       </w:pPr>
       <w:r>
@@ -6895,7 +6907,7 @@
         <w:pStyle w:val="Compact"/>
         <w:numPr>
           <w:ilvl w:val="0"/>
-          <w:numId w:val="1181"/>
+          <w:numId w:val="1182"/>
         </w:numPr>
       </w:pPr>
       <w:r>
@@ -6928,7 +6940,7 @@
         <w:pStyle w:val="Compact"/>
         <w:numPr>
           <w:ilvl w:val="0"/>
-          <w:numId w:val="1182"/>
+          <w:numId w:val="1183"/>
         </w:numPr>
       </w:pPr>
       <w:r>
@@ -6963,7 +6975,7 @@
         <w:pStyle w:val="Compact"/>
         <w:numPr>
           <w:ilvl w:val="0"/>
-          <w:numId w:val="1183"/>
+          <w:numId w:val="1184"/>
         </w:numPr>
       </w:pPr>
       <w:r>
@@ -6975,7 +6987,7 @@
         <w:pStyle w:val="Compact"/>
         <w:numPr>
           <w:ilvl w:val="0"/>
-          <w:numId w:val="1184"/>
+          <w:numId w:val="1185"/>
         </w:numPr>
       </w:pPr>
       <w:r>
@@ -6987,7 +6999,7 @@
         <w:pStyle w:val="Compact"/>
         <w:numPr>
           <w:ilvl w:val="0"/>
-          <w:numId w:val="1185"/>
+          <w:numId w:val="1186"/>
         </w:numPr>
       </w:pPr>
       <w:r>
@@ -6999,7 +7011,7 @@
         <w:pStyle w:val="Compact"/>
         <w:numPr>
           <w:ilvl w:val="0"/>
-          <w:numId w:val="1186"/>
+          <w:numId w:val="1187"/>
         </w:numPr>
       </w:pPr>
       <w:r>
@@ -7037,7 +7049,7 @@
         <w:pStyle w:val="Compact"/>
         <w:numPr>
           <w:ilvl w:val="0"/>
-          <w:numId w:val="1187"/>
+          <w:numId w:val="1188"/>
         </w:numPr>
       </w:pPr>
       <w:r>
@@ -7049,7 +7061,7 @@
         <w:pStyle w:val="Compact"/>
         <w:numPr>
           <w:ilvl w:val="0"/>
-          <w:numId w:val="1188"/>
+          <w:numId w:val="1189"/>
         </w:numPr>
       </w:pPr>
       <w:r>
@@ -7061,7 +7073,7 @@
         <w:pStyle w:val="Compact"/>
         <w:numPr>
           <w:ilvl w:val="0"/>
-          <w:numId w:val="1189"/>
+          <w:numId w:val="1190"/>
         </w:numPr>
       </w:pPr>
       <w:r>
@@ -7073,7 +7085,7 @@
         <w:pStyle w:val="Compact"/>
         <w:numPr>
           <w:ilvl w:val="0"/>
-          <w:numId w:val="1190"/>
+          <w:numId w:val="1191"/>
         </w:numPr>
       </w:pPr>
       <w:r>
@@ -7085,7 +7097,7 @@
         <w:pStyle w:val="Compact"/>
         <w:numPr>
           <w:ilvl w:val="0"/>
-          <w:numId w:val="1191"/>
+          <w:numId w:val="1192"/>
         </w:numPr>
       </w:pPr>
       <w:r>
@@ -7097,7 +7109,7 @@
         <w:pStyle w:val="Compact"/>
         <w:numPr>
           <w:ilvl w:val="0"/>
-          <w:numId w:val="1192"/>
+          <w:numId w:val="1193"/>
         </w:numPr>
       </w:pPr>
       <w:r>
@@ -7109,7 +7121,7 @@
         <w:pStyle w:val="Compact"/>
         <w:numPr>
           <w:ilvl w:val="0"/>
-          <w:numId w:val="1193"/>
+          <w:numId w:val="1194"/>
         </w:numPr>
       </w:pPr>
       <w:r>
@@ -7121,7 +7133,7 @@
         <w:pStyle w:val="Compact"/>
         <w:numPr>
           <w:ilvl w:val="0"/>
-          <w:numId w:val="1194"/>
+          <w:numId w:val="1195"/>
         </w:numPr>
       </w:pPr>
       <w:r>
@@ -7133,7 +7145,7 @@
         <w:pStyle w:val="Compact"/>
         <w:numPr>
           <w:ilvl w:val="0"/>
-          <w:numId w:val="1195"/>
+          <w:numId w:val="1196"/>
         </w:numPr>
       </w:pPr>
       <w:r>
@@ -7145,7 +7157,7 @@
         <w:pStyle w:val="Compact"/>
         <w:numPr>
           <w:ilvl w:val="0"/>
-          <w:numId w:val="1196"/>
+          <w:numId w:val="1197"/>
         </w:numPr>
       </w:pPr>
       <w:r>
@@ -7165,7 +7177,7 @@
         <w:pStyle w:val="Compact"/>
         <w:numPr>
           <w:ilvl w:val="0"/>
-          <w:numId w:val="1197"/>
+          <w:numId w:val="1198"/>
         </w:numPr>
       </w:pPr>
       <w:r>
@@ -7177,7 +7189,7 @@
         <w:pStyle w:val="Compact"/>
         <w:numPr>
           <w:ilvl w:val="0"/>
-          <w:numId w:val="1198"/>
+          <w:numId w:val="1199"/>
         </w:numPr>
       </w:pPr>
       <w:r>
@@ -7189,7 +7201,7 @@
         <w:pStyle w:val="Compact"/>
         <w:numPr>
           <w:ilvl w:val="0"/>
-          <w:numId w:val="1199"/>
+          <w:numId w:val="1200"/>
         </w:numPr>
       </w:pPr>
       <w:r>
@@ -7201,7 +7213,7 @@
         <w:pStyle w:val="Compact"/>
         <w:numPr>
           <w:ilvl w:val="0"/>
-          <w:numId w:val="1200"/>
+          <w:numId w:val="1201"/>
         </w:numPr>
       </w:pPr>
       <w:r>
@@ -7247,7 +7259,7 @@
         <w:pStyle w:val="Compact"/>
         <w:numPr>
           <w:ilvl w:val="0"/>
-          <w:numId w:val="1201"/>
+          <w:numId w:val="1202"/>
         </w:numPr>
       </w:pPr>
       <w:r>
@@ -7259,7 +7271,7 @@
         <w:pStyle w:val="Compact"/>
         <w:numPr>
           <w:ilvl w:val="0"/>
-          <w:numId w:val="1202"/>
+          <w:numId w:val="1203"/>
         </w:numPr>
       </w:pPr>
       <w:r>
@@ -7271,7 +7283,7 @@
         <w:pStyle w:val="Compact"/>
         <w:numPr>
           <w:ilvl w:val="0"/>
-          <w:numId w:val="1203"/>
+          <w:numId w:val="1204"/>
         </w:numPr>
       </w:pPr>
       <w:r>
@@ -7283,7 +7295,7 @@
         <w:pStyle w:val="Compact"/>
         <w:numPr>
           <w:ilvl w:val="0"/>
-          <w:numId w:val="1204"/>
+          <w:numId w:val="1205"/>
         </w:numPr>
       </w:pPr>
       <w:r>
@@ -7295,7 +7307,7 @@
         <w:pStyle w:val="Compact"/>
         <w:numPr>
           <w:ilvl w:val="0"/>
-          <w:numId w:val="1205"/>
+          <w:numId w:val="1206"/>
         </w:numPr>
       </w:pPr>
       <w:r>
@@ -7307,7 +7319,7 @@
         <w:pStyle w:val="Compact"/>
         <w:numPr>
           <w:ilvl w:val="0"/>
-          <w:numId w:val="1206"/>
+          <w:numId w:val="1207"/>
         </w:numPr>
       </w:pPr>
       <w:r>
@@ -7329,7 +7341,7 @@
         <w:pStyle w:val="Compact"/>
         <w:numPr>
           <w:ilvl w:val="0"/>
-          <w:numId w:val="1207"/>
+          <w:numId w:val="1208"/>
         </w:numPr>
       </w:pPr>
       <w:r>
@@ -7341,7 +7353,7 @@
         <w:pStyle w:val="Compact"/>
         <w:numPr>
           <w:ilvl w:val="0"/>
-          <w:numId w:val="1208"/>
+          <w:numId w:val="1209"/>
         </w:numPr>
       </w:pPr>
       <w:r>
@@ -7353,7 +7365,7 @@
         <w:pStyle w:val="Compact"/>
         <w:numPr>
           <w:ilvl w:val="0"/>
-          <w:numId w:val="1209"/>
+          <w:numId w:val="1210"/>
         </w:numPr>
       </w:pPr>
       <w:r>
@@ -7365,7 +7377,7 @@
         <w:pStyle w:val="Compact"/>
         <w:numPr>
           <w:ilvl w:val="0"/>
-          <w:numId w:val="1210"/>
+          <w:numId w:val="1211"/>
         </w:numPr>
       </w:pPr>
       <w:r>
@@ -7377,7 +7389,7 @@
         <w:pStyle w:val="Compact"/>
         <w:numPr>
           <w:ilvl w:val="0"/>
-          <w:numId w:val="1211"/>
+          <w:numId w:val="1212"/>
         </w:numPr>
       </w:pPr>
       <w:r>
@@ -7397,7 +7409,7 @@
         <w:pStyle w:val="Compact"/>
         <w:numPr>
           <w:ilvl w:val="0"/>
-          <w:numId w:val="1212"/>
+          <w:numId w:val="1213"/>
         </w:numPr>
       </w:pPr>
       <w:r>
@@ -7409,7 +7421,7 @@
         <w:pStyle w:val="Compact"/>
         <w:numPr>
           <w:ilvl w:val="0"/>
-          <w:numId w:val="1213"/>
+          <w:numId w:val="1214"/>
         </w:numPr>
       </w:pPr>
       <w:r>
@@ -7421,7 +7433,7 @@
         <w:pStyle w:val="Compact"/>
         <w:numPr>
           <w:ilvl w:val="0"/>
-          <w:numId w:val="1214"/>
+          <w:numId w:val="1215"/>
         </w:numPr>
       </w:pPr>
       <w:r>
@@ -7480,7 +7492,7 @@
         <w:pStyle w:val="Compact"/>
         <w:numPr>
           <w:ilvl w:val="0"/>
-          <w:numId w:val="1215"/>
+          <w:numId w:val="1216"/>
         </w:numPr>
       </w:pPr>
       <w:r>
@@ -7492,7 +7504,7 @@
         <w:pStyle w:val="Compact"/>
         <w:numPr>
           <w:ilvl w:val="0"/>
-          <w:numId w:val="1216"/>
+          <w:numId w:val="1217"/>
         </w:numPr>
       </w:pPr>
       <w:r>
@@ -7504,7 +7516,7 @@
         <w:pStyle w:val="Compact"/>
         <w:numPr>
           <w:ilvl w:val="0"/>
-          <w:numId w:val="1217"/>
+          <w:numId w:val="1218"/>
         </w:numPr>
       </w:pPr>
       <w:r>
@@ -7516,7 +7528,7 @@
         <w:pStyle w:val="Compact"/>
         <w:numPr>
           <w:ilvl w:val="0"/>
-          <w:numId w:val="1218"/>
+          <w:numId w:val="1219"/>
         </w:numPr>
       </w:pPr>
       <w:r>
@@ -7540,7 +7552,7 @@
         <w:pStyle w:val="Compact"/>
         <w:numPr>
           <w:ilvl w:val="0"/>
-          <w:numId w:val="1219"/>
+          <w:numId w:val="1220"/>
         </w:numPr>
       </w:pPr>
       <w:r>
@@ -7561,7 +7573,7 @@
         <w:pStyle w:val="Compact"/>
         <w:numPr>
           <w:ilvl w:val="0"/>
-          <w:numId w:val="1220"/>
+          <w:numId w:val="1221"/>
         </w:numPr>
       </w:pPr>
       <w:r>
@@ -7573,7 +7585,7 @@
         <w:pStyle w:val="Compact"/>
         <w:numPr>
           <w:ilvl w:val="0"/>
-          <w:numId w:val="1221"/>
+          <w:numId w:val="1222"/>
         </w:numPr>
       </w:pPr>
       <w:r>
@@ -7585,7 +7597,7 @@
         <w:pStyle w:val="Compact"/>
         <w:numPr>
           <w:ilvl w:val="0"/>
-          <w:numId w:val="1222"/>
+          <w:numId w:val="1223"/>
         </w:numPr>
       </w:pPr>
       <w:r>
@@ -7597,7 +7609,7 @@
         <w:pStyle w:val="Compact"/>
         <w:numPr>
           <w:ilvl w:val="0"/>
-          <w:numId w:val="1223"/>
+          <w:numId w:val="1224"/>
         </w:numPr>
       </w:pPr>
       <w:r>
@@ -7619,7 +7631,7 @@
         <w:pStyle w:val="Compact"/>
         <w:numPr>
           <w:ilvl w:val="0"/>
-          <w:numId w:val="1224"/>
+          <w:numId w:val="1225"/>
         </w:numPr>
       </w:pPr>
       <w:r>
@@ -7646,7 +7658,7 @@
         <w:pStyle w:val="Compact"/>
         <w:numPr>
           <w:ilvl w:val="0"/>
-          <w:numId w:val="1225"/>
+          <w:numId w:val="1226"/>
         </w:numPr>
       </w:pPr>
       <w:r>
@@ -7673,7 +7685,7 @@
         <w:pStyle w:val="Compact"/>
         <w:numPr>
           <w:ilvl w:val="0"/>
-          <w:numId w:val="1226"/>
+          <w:numId w:val="1227"/>
         </w:numPr>
       </w:pPr>
       <w:r>
@@ -7685,7 +7697,7 @@
         <w:pStyle w:val="Compact"/>
         <w:numPr>
           <w:ilvl w:val="0"/>
-          <w:numId w:val="1227"/>
+          <w:numId w:val="1228"/>
         </w:numPr>
       </w:pPr>
       <w:r>
@@ -7697,7 +7709,7 @@
         <w:pStyle w:val="Compact"/>
         <w:numPr>
           <w:ilvl w:val="0"/>
-          <w:numId w:val="1228"/>
+          <w:numId w:val="1229"/>
         </w:numPr>
       </w:pPr>
       <w:r>
@@ -7709,7 +7721,7 @@
         <w:pStyle w:val="Compact"/>
         <w:numPr>
           <w:ilvl w:val="0"/>
-          <w:numId w:val="1229"/>
+          <w:numId w:val="1230"/>
         </w:numPr>
       </w:pPr>
       <w:r>
@@ -7746,7 +7758,7 @@
         <w:pStyle w:val="Compact"/>
         <w:numPr>
           <w:ilvl w:val="0"/>
-          <w:numId w:val="1230"/>
+          <w:numId w:val="1231"/>
         </w:numPr>
       </w:pPr>
       <w:r>
@@ -7773,7 +7785,7 @@
         <w:pStyle w:val="Compact"/>
         <w:numPr>
           <w:ilvl w:val="0"/>
-          <w:numId w:val="1231"/>
+          <w:numId w:val="1232"/>
         </w:numPr>
       </w:pPr>
       <w:r>
@@ -7785,7 +7797,7 @@
         <w:pStyle w:val="Compact"/>
         <w:numPr>
           <w:ilvl w:val="0"/>
-          <w:numId w:val="1232"/>
+          <w:numId w:val="1233"/>
         </w:numPr>
       </w:pPr>
       <w:r>
@@ -7797,7 +7809,7 @@
         <w:pStyle w:val="Compact"/>
         <w:numPr>
           <w:ilvl w:val="0"/>
-          <w:numId w:val="1233"/>
+          <w:numId w:val="1234"/>
         </w:numPr>
       </w:pPr>
       <w:r>
@@ -7842,7 +7854,7 @@
         <w:pStyle w:val="Compact"/>
         <w:numPr>
           <w:ilvl w:val="0"/>
-          <w:numId w:val="1234"/>
+          <w:numId w:val="1235"/>
         </w:numPr>
       </w:pPr>
       <w:r>
@@ -7854,7 +7866,7 @@
         <w:pStyle w:val="Compact"/>
         <w:numPr>
           <w:ilvl w:val="0"/>
-          <w:numId w:val="1235"/>
+          <w:numId w:val="1236"/>
         </w:numPr>
       </w:pPr>
       <w:r>
@@ -7874,7 +7886,7 @@
         <w:pStyle w:val="Compact"/>
         <w:numPr>
           <w:ilvl w:val="0"/>
-          <w:numId w:val="1236"/>
+          <w:numId w:val="1237"/>
         </w:numPr>
       </w:pPr>
       <w:r>
@@ -7886,7 +7898,7 @@
         <w:pStyle w:val="Compact"/>
         <w:numPr>
           <w:ilvl w:val="0"/>
-          <w:numId w:val="1237"/>
+          <w:numId w:val="1238"/>
         </w:numPr>
       </w:pPr>
       <w:r>
@@ -7898,7 +7910,7 @@
         <w:pStyle w:val="Compact"/>
         <w:numPr>
           <w:ilvl w:val="0"/>
-          <w:numId w:val="1238"/>
+          <w:numId w:val="1239"/>
         </w:numPr>
       </w:pPr>
       <w:r>
@@ -7918,7 +7930,7 @@
         <w:pStyle w:val="Compact"/>
         <w:numPr>
           <w:ilvl w:val="0"/>
-          <w:numId w:val="1239"/>
+          <w:numId w:val="1240"/>
         </w:numPr>
       </w:pPr>
       <w:r>
@@ -7954,7 +7966,7 @@
         <w:pStyle w:val="Compact"/>
         <w:numPr>
           <w:ilvl w:val="0"/>
-          <w:numId w:val="1239"/>
+          <w:numId w:val="1240"/>
         </w:numPr>
       </w:pPr>
       <w:r>
@@ -7966,7 +7978,7 @@
         <w:pStyle w:val="Compact"/>
         <w:numPr>
           <w:ilvl w:val="0"/>
-          <w:numId w:val="1239"/>
+          <w:numId w:val="1240"/>
         </w:numPr>
       </w:pPr>
       <w:r>
@@ -7990,7 +8002,7 @@
         <w:pStyle w:val="Compact"/>
         <w:numPr>
           <w:ilvl w:val="0"/>
-          <w:numId w:val="1239"/>
+          <w:numId w:val="1240"/>
         </w:numPr>
       </w:pPr>
       <w:r>
@@ -8002,7 +8014,7 @@
         <w:pStyle w:val="Compact"/>
         <w:numPr>
           <w:ilvl w:val="0"/>
-          <w:numId w:val="1239"/>
+          <w:numId w:val="1240"/>
         </w:numPr>
       </w:pPr>
       <w:r>
@@ -8014,7 +8026,7 @@
         <w:pStyle w:val="Compact"/>
         <w:numPr>
           <w:ilvl w:val="0"/>
-          <w:numId w:val="1239"/>
+          <w:numId w:val="1240"/>
         </w:numPr>
       </w:pPr>
       <w:r>
@@ -8062,7 +8074,7 @@
         <w:pStyle w:val="Compact"/>
         <w:numPr>
           <w:ilvl w:val="0"/>
-          <w:numId w:val="1239"/>
+          <w:numId w:val="1240"/>
         </w:numPr>
       </w:pPr>
       <w:r>
@@ -8104,7 +8116,7 @@
         <w:pStyle w:val="Compact"/>
         <w:numPr>
           <w:ilvl w:val="0"/>
-          <w:numId w:val="1239"/>
+          <w:numId w:val="1240"/>
         </w:numPr>
       </w:pPr>
       <w:r>
@@ -8140,7 +8152,7 @@
         <w:pStyle w:val="Compact"/>
         <w:numPr>
           <w:ilvl w:val="0"/>
-          <w:numId w:val="1239"/>
+          <w:numId w:val="1240"/>
         </w:numPr>
       </w:pPr>
       <w:r>
@@ -8203,7 +8215,7 @@
         <w:pStyle w:val="Compact"/>
         <w:numPr>
           <w:ilvl w:val="0"/>
-          <w:numId w:val="1239"/>
+          <w:numId w:val="1240"/>
         </w:numPr>
       </w:pPr>
       <w:r>
@@ -8254,7 +8266,7 @@
         <w:pStyle w:val="Compact"/>
         <w:numPr>
           <w:ilvl w:val="0"/>
-          <w:numId w:val="1239"/>
+          <w:numId w:val="1240"/>
         </w:numPr>
       </w:pPr>
       <w:r>
@@ -8336,7 +8348,7 @@
         <w:pStyle w:val="Compact"/>
         <w:numPr>
           <w:ilvl w:val="0"/>
-          <w:numId w:val="1240"/>
+          <w:numId w:val="1241"/>
         </w:numPr>
       </w:pPr>
       <w:r>
@@ -8363,7 +8375,7 @@
         <w:pStyle w:val="Compact"/>
         <w:numPr>
           <w:ilvl w:val="0"/>
-          <w:numId w:val="1241"/>
+          <w:numId w:val="1242"/>
         </w:numPr>
       </w:pPr>
       <w:r>
@@ -8390,7 +8402,7 @@
         <w:pStyle w:val="Compact"/>
         <w:numPr>
           <w:ilvl w:val="0"/>
-          <w:numId w:val="1242"/>
+          <w:numId w:val="1243"/>
         </w:numPr>
       </w:pPr>
       <w:r>
@@ -8410,7 +8422,7 @@
         <w:pStyle w:val="Compact"/>
         <w:numPr>
           <w:ilvl w:val="0"/>
-          <w:numId w:val="1243"/>
+          <w:numId w:val="1244"/>
         </w:numPr>
       </w:pPr>
       <w:r>
@@ -8452,7 +8464,7 @@
         <w:pStyle w:val="Compact"/>
         <w:numPr>
           <w:ilvl w:val="0"/>
-          <w:numId w:val="1244"/>
+          <w:numId w:val="1245"/>
         </w:numPr>
       </w:pPr>
       <w:r>
@@ -8488,7 +8500,7 @@
         <w:pStyle w:val="Compact"/>
         <w:numPr>
           <w:ilvl w:val="0"/>
-          <w:numId w:val="1245"/>
+          <w:numId w:val="1246"/>
         </w:numPr>
       </w:pPr>
       <w:r>
@@ -8524,7 +8536,7 @@
         <w:pStyle w:val="Compact"/>
         <w:numPr>
           <w:ilvl w:val="0"/>
-          <w:numId w:val="1246"/>
+          <w:numId w:val="1247"/>
         </w:numPr>
       </w:pPr>
       <w:r>
@@ -8577,7 +8589,7 @@
         <w:pStyle w:val="Compact"/>
         <w:numPr>
           <w:ilvl w:val="0"/>
-          <w:numId w:val="1247"/>
+          <w:numId w:val="1248"/>
         </w:numPr>
       </w:pPr>
       <w:r>
@@ -8589,7 +8601,7 @@
         <w:pStyle w:val="Compact"/>
         <w:numPr>
           <w:ilvl w:val="0"/>
-          <w:numId w:val="1247"/>
+          <w:numId w:val="1248"/>
         </w:numPr>
       </w:pPr>
       <w:r>
@@ -8601,7 +8613,7 @@
         <w:pStyle w:val="Compact"/>
         <w:numPr>
           <w:ilvl w:val="0"/>
-          <w:numId w:val="1247"/>
+          <w:numId w:val="1248"/>
         </w:numPr>
       </w:pPr>
       <w:r>
@@ -8613,7 +8625,7 @@
         <w:pStyle w:val="Compact"/>
         <w:numPr>
           <w:ilvl w:val="0"/>
-          <w:numId w:val="1247"/>
+          <w:numId w:val="1248"/>
         </w:numPr>
       </w:pPr>
       <w:r>
@@ -8637,7 +8649,7 @@
         <w:pStyle w:val="Compact"/>
         <w:numPr>
           <w:ilvl w:val="0"/>
-          <w:numId w:val="1247"/>
+          <w:numId w:val="1248"/>
         </w:numPr>
       </w:pPr>
       <w:r>
@@ -8676,7 +8688,7 @@
         <w:pStyle w:val="Compact"/>
         <w:numPr>
           <w:ilvl w:val="0"/>
-          <w:numId w:val="1247"/>
+          <w:numId w:val="1248"/>
         </w:numPr>
       </w:pPr>
       <w:r>
@@ -8802,7 +8814,7 @@
         <w:pStyle w:val="Compact"/>
         <w:numPr>
           <w:ilvl w:val="0"/>
-          <w:numId w:val="1248"/>
+          <w:numId w:val="1249"/>
         </w:numPr>
       </w:pPr>
       <w:r>
@@ -8814,7 +8826,7 @@
         <w:pStyle w:val="Compact"/>
         <w:numPr>
           <w:ilvl w:val="0"/>
-          <w:numId w:val="1249"/>
+          <w:numId w:val="1250"/>
         </w:numPr>
       </w:pPr>
       <w:r>
@@ -8826,7 +8838,7 @@
         <w:pStyle w:val="Compact"/>
         <w:numPr>
           <w:ilvl w:val="0"/>
-          <w:numId w:val="1250"/>
+          <w:numId w:val="1251"/>
         </w:numPr>
       </w:pPr>
       <w:r>
@@ -8838,7 +8850,7 @@
         <w:pStyle w:val="Compact"/>
         <w:numPr>
           <w:ilvl w:val="0"/>
-          <w:numId w:val="1251"/>
+          <w:numId w:val="1252"/>
         </w:numPr>
       </w:pPr>
       <w:r>
@@ -8850,7 +8862,7 @@
         <w:pStyle w:val="Compact"/>
         <w:numPr>
           <w:ilvl w:val="0"/>
-          <w:numId w:val="1252"/>
+          <w:numId w:val="1253"/>
         </w:numPr>
       </w:pPr>
       <w:r>
@@ -8895,7 +8907,7 @@
         <w:pStyle w:val="Compact"/>
         <w:numPr>
           <w:ilvl w:val="0"/>
-          <w:numId w:val="1253"/>
+          <w:numId w:val="1254"/>
         </w:numPr>
       </w:pPr>
       <w:r>
@@ -8907,7 +8919,7 @@
         <w:pStyle w:val="Compact"/>
         <w:numPr>
           <w:ilvl w:val="0"/>
-          <w:numId w:val="1254"/>
+          <w:numId w:val="1255"/>
         </w:numPr>
       </w:pPr>
       <w:r>
@@ -8942,7 +8954,7 @@
         <w:pStyle w:val="Compact"/>
         <w:numPr>
           <w:ilvl w:val="0"/>
-          <w:numId w:val="1255"/>
+          <w:numId w:val="1256"/>
         </w:numPr>
       </w:pPr>
       <w:r>
@@ -8964,7 +8976,7 @@
         <w:pStyle w:val="Compact"/>
         <w:numPr>
           <w:ilvl w:val="0"/>
-          <w:numId w:val="1256"/>
+          <w:numId w:val="1257"/>
         </w:numPr>
       </w:pPr>
       <w:r>
@@ -8991,7 +9003,7 @@
         <w:pStyle w:val="Compact"/>
         <w:numPr>
           <w:ilvl w:val="0"/>
-          <w:numId w:val="1257"/>
+          <w:numId w:val="1258"/>
         </w:numPr>
       </w:pPr>
       <w:r>
@@ -9015,7 +9027,7 @@
         <w:pStyle w:val="Compact"/>
         <w:numPr>
           <w:ilvl w:val="0"/>
-          <w:numId w:val="1258"/>
+          <w:numId w:val="1259"/>
         </w:numPr>
       </w:pPr>
       <w:r>
@@ -9048,7 +9060,7 @@
         <w:pStyle w:val="Compact"/>
         <w:numPr>
           <w:ilvl w:val="0"/>
-          <w:numId w:val="1259"/>
+          <w:numId w:val="1260"/>
         </w:numPr>
       </w:pPr>
       <w:r>
@@ -9069,7 +9081,7 @@
         <w:pStyle w:val="Compact"/>
         <w:numPr>
           <w:ilvl w:val="0"/>
-          <w:numId w:val="1260"/>
+          <w:numId w:val="1261"/>
         </w:numPr>
       </w:pPr>
       <w:r>
@@ -9102,7 +9114,7 @@
         <w:pStyle w:val="Compact"/>
         <w:numPr>
           <w:ilvl w:val="0"/>
-          <w:numId w:val="1261"/>
+          <w:numId w:val="1262"/>
         </w:numPr>
       </w:pPr>
       <w:r>
@@ -9129,7 +9141,7 @@
         <w:pStyle w:val="Compact"/>
         <w:numPr>
           <w:ilvl w:val="0"/>
-          <w:numId w:val="1262"/>
+          <w:numId w:val="1263"/>
         </w:numPr>
       </w:pPr>
       <w:r>
@@ -9160,7 +9172,7 @@
         <w:pStyle w:val="Compact"/>
         <w:numPr>
           <w:ilvl w:val="0"/>
-          <w:numId w:val="1263"/>
+          <w:numId w:val="1264"/>
         </w:numPr>
       </w:pPr>
       <w:r>
@@ -9172,7 +9184,7 @@
         <w:pStyle w:val="Compact"/>
         <w:numPr>
           <w:ilvl w:val="0"/>
-          <w:numId w:val="1264"/>
+          <w:numId w:val="1265"/>
         </w:numPr>
       </w:pPr>
       <w:r>
@@ -9184,7 +9196,7 @@
         <w:pStyle w:val="Compact"/>
         <w:numPr>
           <w:ilvl w:val="0"/>
-          <w:numId w:val="1265"/>
+          <w:numId w:val="1266"/>
         </w:numPr>
       </w:pPr>
       <w:r>
@@ -9196,7 +9208,34 @@
         <w:pStyle w:val="Compact"/>
         <w:numPr>
           <w:ilvl w:val="0"/>
-          <w:numId w:val="1266"/>
+          <w:numId w:val="1267"/>
+        </w:numPr>
+      </w:pPr>
+      <w:r>
+        <w:t xml:space="preserve">Sync latest</w:t>
+      </w:r>
+      <w:r>
+        <w:t xml:space="preserve"> </w:t>
+      </w:r>
+      <w:r>
+        <w:rPr>
+          <w:rStyle w:val="VerbatimChar"/>
+        </w:rPr>
+        <w:t xml:space="preserve">a5b587f</w:t>
+      </w:r>
+      <w:r>
+        <w:t xml:space="preserve"> </w:t>
+      </w:r>
+      <w:r>
+        <w:t xml:space="preserve">snapshot after current AI-suggestion fix.</w:t>
+      </w:r>
+    </w:p>
+    <w:p>
+      <w:pPr>
+        <w:pStyle w:val="Compact"/>
+        <w:numPr>
+          <w:ilvl w:val="0"/>
+          <w:numId w:val="1268"/>
         </w:numPr>
       </w:pPr>
       <w:r>
@@ -9220,7 +9259,7 @@
         <w:pStyle w:val="Compact"/>
         <w:numPr>
           <w:ilvl w:val="0"/>
-          <w:numId w:val="1267"/>
+          <w:numId w:val="1269"/>
         </w:numPr>
       </w:pPr>
       <w:r>
@@ -9240,7 +9279,7 @@
         <w:pStyle w:val="Compact"/>
         <w:numPr>
           <w:ilvl w:val="0"/>
-          <w:numId w:val="1268"/>
+          <w:numId w:val="1270"/>
         </w:numPr>
       </w:pPr>
       <w:r>
@@ -9267,7 +9306,7 @@
         <w:pStyle w:val="Compact"/>
         <w:numPr>
           <w:ilvl w:val="0"/>
-          <w:numId w:val="1269"/>
+          <w:numId w:val="1271"/>
         </w:numPr>
       </w:pPr>
       <w:r>
@@ -9279,7 +9318,7 @@
         <w:pStyle w:val="Compact"/>
         <w:numPr>
           <w:ilvl w:val="0"/>
-          <w:numId w:val="1270"/>
+          <w:numId w:val="1272"/>
         </w:numPr>
       </w:pPr>
       <w:r>
@@ -9303,7 +9342,7 @@
         <w:pStyle w:val="Compact"/>
         <w:numPr>
           <w:ilvl w:val="0"/>
-          <w:numId w:val="1271"/>
+          <w:numId w:val="1273"/>
         </w:numPr>
       </w:pPr>
       <w:r>
@@ -9335,7 +9374,7 @@
         <w:pStyle w:val="Compact"/>
         <w:numPr>
           <w:ilvl w:val="0"/>
-          <w:numId w:val="1272"/>
+          <w:numId w:val="1274"/>
         </w:numPr>
       </w:pPr>
       <w:r>
@@ -9371,7 +9410,7 @@
         <w:pStyle w:val="Compact"/>
         <w:numPr>
           <w:ilvl w:val="0"/>
-          <w:numId w:val="1272"/>
+          <w:numId w:val="1274"/>
         </w:numPr>
       </w:pPr>
       <w:r>
@@ -9419,7 +9458,7 @@
         <w:pStyle w:val="Compact"/>
         <w:numPr>
           <w:ilvl w:val="0"/>
-          <w:numId w:val="1272"/>
+          <w:numId w:val="1274"/>
         </w:numPr>
       </w:pPr>
       <w:r>
@@ -9467,7 +9506,7 @@
         <w:pStyle w:val="Compact"/>
         <w:numPr>
           <w:ilvl w:val="0"/>
-          <w:numId w:val="1272"/>
+          <w:numId w:val="1274"/>
         </w:numPr>
       </w:pPr>
       <w:r>
@@ -9506,7 +9545,7 @@
         <w:pStyle w:val="Compact"/>
         <w:numPr>
           <w:ilvl w:val="0"/>
-          <w:numId w:val="1272"/>
+          <w:numId w:val="1274"/>
         </w:numPr>
       </w:pPr>
       <w:r>
@@ -9542,7 +9581,7 @@
         <w:pStyle w:val="Compact"/>
         <w:numPr>
           <w:ilvl w:val="0"/>
-          <w:numId w:val="1272"/>
+          <w:numId w:val="1274"/>
         </w:numPr>
       </w:pPr>
       <w:r>
@@ -9584,7 +9623,7 @@
         <w:pStyle w:val="Compact"/>
         <w:numPr>
           <w:ilvl w:val="0"/>
-          <w:numId w:val="1272"/>
+          <w:numId w:val="1274"/>
         </w:numPr>
       </w:pPr>
       <w:r>
@@ -9812,11 +9851,77 @@
         <w:pStyle w:val="Compact"/>
         <w:numPr>
           <w:ilvl w:val="0"/>
-          <w:numId w:val="1272"/>
+          <w:numId w:val="1274"/>
         </w:numPr>
       </w:pPr>
       <w:r>
         <w:t xml:space="preserve">Follow-up security action still pending: rotate/revoke the chat-pasted PAT after confirming the client repo is visible as expected.</w:t>
+      </w:r>
+    </w:p>
+    <w:p>
+      <w:pPr>
+        <w:pStyle w:val="Compact"/>
+        <w:numPr>
+          <w:ilvl w:val="0"/>
+          <w:numId w:val="1274"/>
+        </w:numPr>
+      </w:pPr>
+      <w:r>
+        <w:t xml:space="preserve">Latest re-sync attempt after commit</w:t>
+      </w:r>
+      <w:r>
+        <w:t xml:space="preserve"> </w:t>
+      </w:r>
+      <w:r>
+        <w:rPr>
+          <w:rStyle w:val="VerbatimChar"/>
+        </w:rPr>
+        <w:t xml:space="preserve">a5b587f</w:t>
+      </w:r>
+      <w:r>
+        <w:t xml:space="preserve"> </w:t>
+      </w:r>
+      <w:r>
+        <w:t xml:space="preserve">failed with GitHub</w:t>
+      </w:r>
+      <w:r>
+        <w:t xml:space="preserve"> </w:t>
+      </w:r>
+      <w:r>
+        <w:rPr>
+          <w:rStyle w:val="VerbatimChar"/>
+        </w:rPr>
+        <w:t xml:space="preserve">403</w:t>
+      </w:r>
+      <w:r>
+        <w:t xml:space="preserve">: current local auth is</w:t>
+      </w:r>
+      <w:r>
+        <w:t xml:space="preserve"> </w:t>
+      </w:r>
+      <w:r>
+        <w:rPr>
+          <w:rStyle w:val="VerbatimChar"/>
+        </w:rPr>
+        <w:t xml:space="preserve">ksanyok</w:t>
+      </w:r>
+      <w:r>
+        <w:t xml:space="preserve">, and target repo denied write access, so mirror remains at</w:t>
+      </w:r>
+      <w:r>
+        <w:t xml:space="preserve"> </w:t>
+      </w:r>
+      <w:r>
+        <w:rPr>
+          <w:rStyle w:val="VerbatimChar"/>
+        </w:rPr>
+        <w:t xml:space="preserve">3f1224d</w:t>
+      </w:r>
+      <w:r>
+        <w:t xml:space="preserve"> </w:t>
+      </w:r>
+      <w:r>
+        <w:t xml:space="preserve">until fresh client-side access is restored.</w:t>
       </w:r>
     </w:p>
     <w:p>
@@ -9851,7 +9956,7 @@
         <w:pStyle w:val="Compact"/>
         <w:numPr>
           <w:ilvl w:val="0"/>
-          <w:numId w:val="1273"/>
+          <w:numId w:val="1275"/>
         </w:numPr>
       </w:pPr>
       <w:r>
@@ -9869,7 +9974,7 @@
         <w:pStyle w:val="Compact"/>
         <w:numPr>
           <w:ilvl w:val="0"/>
-          <w:numId w:val="1274"/>
+          <w:numId w:val="1276"/>
         </w:numPr>
       </w:pPr>
       <w:r>
@@ -9881,7 +9986,7 @@
         <w:pStyle w:val="Compact"/>
         <w:numPr>
           <w:ilvl w:val="0"/>
-          <w:numId w:val="1275"/>
+          <w:numId w:val="1277"/>
         </w:numPr>
       </w:pPr>
       <w:r>
@@ -9893,7 +9998,7 @@
         <w:pStyle w:val="Compact"/>
         <w:numPr>
           <w:ilvl w:val="0"/>
-          <w:numId w:val="1276"/>
+          <w:numId w:val="1278"/>
         </w:numPr>
       </w:pPr>
       <w:r>
@@ -9905,7 +10010,7 @@
         <w:pStyle w:val="Compact"/>
         <w:numPr>
           <w:ilvl w:val="0"/>
-          <w:numId w:val="1277"/>
+          <w:numId w:val="1279"/>
         </w:numPr>
       </w:pPr>
       <w:r>
@@ -9917,7 +10022,7 @@
         <w:pStyle w:val="Compact"/>
         <w:numPr>
           <w:ilvl w:val="0"/>
-          <w:numId w:val="1278"/>
+          <w:numId w:val="1280"/>
         </w:numPr>
       </w:pPr>
       <w:r>
@@ -9939,7 +10044,7 @@
         <w:pStyle w:val="Compact"/>
         <w:numPr>
           <w:ilvl w:val="0"/>
-          <w:numId w:val="1279"/>
+          <w:numId w:val="1281"/>
         </w:numPr>
       </w:pPr>
       <w:r>
@@ -9957,7 +10062,7 @@
         <w:pStyle w:val="Compact"/>
         <w:numPr>
           <w:ilvl w:val="0"/>
-          <w:numId w:val="1280"/>
+          <w:numId w:val="1282"/>
         </w:numPr>
       </w:pPr>
       <w:r>
@@ -9969,7 +10074,7 @@
         <w:pStyle w:val="Compact"/>
         <w:numPr>
           <w:ilvl w:val="0"/>
-          <w:numId w:val="1281"/>
+          <w:numId w:val="1283"/>
         </w:numPr>
       </w:pPr>
       <w:r>
@@ -9981,7 +10086,7 @@
         <w:pStyle w:val="Compact"/>
         <w:numPr>
           <w:ilvl w:val="0"/>
-          <w:numId w:val="1282"/>
+          <w:numId w:val="1284"/>
         </w:numPr>
       </w:pPr>
       <w:r>
@@ -9993,7 +10098,7 @@
         <w:pStyle w:val="Compact"/>
         <w:numPr>
           <w:ilvl w:val="0"/>
-          <w:numId w:val="1283"/>
+          <w:numId w:val="1285"/>
         </w:numPr>
       </w:pPr>
       <w:r>
@@ -10005,7 +10110,7 @@
         <w:pStyle w:val="Compact"/>
         <w:numPr>
           <w:ilvl w:val="0"/>
-          <w:numId w:val="1284"/>
+          <w:numId w:val="1286"/>
         </w:numPr>
       </w:pPr>
       <w:r>
@@ -10017,7 +10122,7 @@
         <w:pStyle w:val="Compact"/>
         <w:numPr>
           <w:ilvl w:val="0"/>
-          <w:numId w:val="1285"/>
+          <w:numId w:val="1287"/>
         </w:numPr>
       </w:pPr>
       <w:r>
@@ -10039,7 +10144,7 @@
         <w:pStyle w:val="Compact"/>
         <w:numPr>
           <w:ilvl w:val="0"/>
-          <w:numId w:val="1286"/>
+          <w:numId w:val="1288"/>
         </w:numPr>
       </w:pPr>
       <w:r>
@@ -10051,7 +10156,7 @@
         <w:pStyle w:val="Compact"/>
         <w:numPr>
           <w:ilvl w:val="0"/>
-          <w:numId w:val="1287"/>
+          <w:numId w:val="1289"/>
         </w:numPr>
       </w:pPr>
       <w:r>
@@ -10063,7 +10168,7 @@
         <w:pStyle w:val="Compact"/>
         <w:numPr>
           <w:ilvl w:val="0"/>
-          <w:numId w:val="1288"/>
+          <w:numId w:val="1290"/>
         </w:numPr>
       </w:pPr>
       <w:r>
@@ -10075,7 +10180,7 @@
         <w:pStyle w:val="Compact"/>
         <w:numPr>
           <w:ilvl w:val="0"/>
-          <w:numId w:val="1289"/>
+          <w:numId w:val="1291"/>
         </w:numPr>
       </w:pPr>
       <w:r>
@@ -10087,7 +10192,7 @@
         <w:pStyle w:val="Compact"/>
         <w:numPr>
           <w:ilvl w:val="0"/>
-          <w:numId w:val="1290"/>
+          <w:numId w:val="1292"/>
         </w:numPr>
       </w:pPr>
       <w:r>
@@ -10099,7 +10204,7 @@
         <w:pStyle w:val="Compact"/>
         <w:numPr>
           <w:ilvl w:val="0"/>
-          <w:numId w:val="1291"/>
+          <w:numId w:val="1293"/>
         </w:numPr>
       </w:pPr>
       <w:r>
@@ -10111,7 +10216,7 @@
         <w:pStyle w:val="Compact"/>
         <w:numPr>
           <w:ilvl w:val="0"/>
-          <w:numId w:val="1292"/>
+          <w:numId w:val="1294"/>
         </w:numPr>
       </w:pPr>
       <w:r>
@@ -10133,7 +10238,7 @@
         <w:pStyle w:val="Compact"/>
         <w:numPr>
           <w:ilvl w:val="0"/>
-          <w:numId w:val="1293"/>
+          <w:numId w:val="1295"/>
         </w:numPr>
       </w:pPr>
       <w:r>
@@ -10145,7 +10250,7 @@
         <w:pStyle w:val="Compact"/>
         <w:numPr>
           <w:ilvl w:val="0"/>
-          <w:numId w:val="1294"/>
+          <w:numId w:val="1296"/>
         </w:numPr>
       </w:pPr>
       <w:r>
@@ -10157,7 +10262,7 @@
         <w:pStyle w:val="Compact"/>
         <w:numPr>
           <w:ilvl w:val="0"/>
-          <w:numId w:val="1295"/>
+          <w:numId w:val="1297"/>
         </w:numPr>
       </w:pPr>
       <w:r>
@@ -10169,7 +10274,7 @@
         <w:pStyle w:val="Compact"/>
         <w:numPr>
           <w:ilvl w:val="0"/>
-          <w:numId w:val="1296"/>
+          <w:numId w:val="1298"/>
         </w:numPr>
       </w:pPr>
       <w:r>
@@ -10193,7 +10298,7 @@
         <w:pStyle w:val="Compact"/>
         <w:numPr>
           <w:ilvl w:val="0"/>
-          <w:numId w:val="1297"/>
+          <w:numId w:val="1299"/>
         </w:numPr>
       </w:pPr>
       <w:r>
@@ -10220,7 +10325,7 @@
         <w:pStyle w:val="Compact"/>
         <w:numPr>
           <w:ilvl w:val="0"/>
-          <w:numId w:val="1298"/>
+          <w:numId w:val="1300"/>
         </w:numPr>
       </w:pPr>
       <w:r>
@@ -10232,7 +10337,7 @@
         <w:pStyle w:val="Compact"/>
         <w:numPr>
           <w:ilvl w:val="0"/>
-          <w:numId w:val="1299"/>
+          <w:numId w:val="1301"/>
         </w:numPr>
       </w:pPr>
       <w:r>
@@ -10252,7 +10357,7 @@
         <w:pStyle w:val="Compact"/>
         <w:numPr>
           <w:ilvl w:val="0"/>
-          <w:numId w:val="1300"/>
+          <w:numId w:val="1302"/>
         </w:numPr>
       </w:pPr>
       <w:r>
@@ -10265,127 +10370,334 @@
         <w:rPr>
           <w:rStyle w:val="VerbatimChar"/>
         </w:rPr>
+        <w:t xml:space="preserve">a5b587f</w:t>
+      </w:r>
+      <w:r>
+        <w:t xml:space="preserve"> </w:t>
+      </w:r>
+      <w:r>
+        <w:t xml:space="preserve">on</w:t>
+      </w:r>
+      <w:r>
+        <w:t xml:space="preserve"> </w:t>
+      </w:r>
+      <w:r>
+        <w:rPr>
+          <w:rStyle w:val="VerbatimChar"/>
+        </w:rPr>
+        <w:t xml:space="preserve">deploy/mysql-hosting</w:t>
+      </w:r>
+      <w:r>
+        <w:t xml:space="preserve">; production</w:t>
+      </w:r>
+      <w:r>
+        <w:t xml:space="preserve"> </w:t>
+      </w:r>
+      <w:r>
+        <w:rPr>
+          <w:rStyle w:val="VerbatimChar"/>
+        </w:rPr>
+        <w:t xml:space="preserve">git status --porcelain</w:t>
+      </w:r>
+      <w:r>
+        <w:t xml:space="preserve"> </w:t>
+      </w:r>
+      <w:r>
+        <w:t xml:space="preserve">lines:</w:t>
+      </w:r>
+      <w:r>
+        <w:t xml:space="preserve"> </w:t>
+      </w:r>
+      <w:r>
+        <w:rPr>
+          <w:rStyle w:val="VerbatimChar"/>
+        </w:rPr>
+        <w:t xml:space="preserve">0</w:t>
+      </w:r>
+      <w:r>
+        <w:t xml:space="preserve">.</w:t>
+      </w:r>
+    </w:p>
+    <w:p>
+      <w:pPr>
+        <w:pStyle w:val="Compact"/>
+        <w:numPr>
+          <w:ilvl w:val="0"/>
+          <w:numId w:val="1302"/>
+        </w:numPr>
+      </w:pPr>
+      <w:r>
+        <w:t xml:space="preserve">Production deploy path used committed code only: initial full deploy fast-forwarded</w:t>
+      </w:r>
+      <w:r>
+        <w:t xml:space="preserve"> </w:t>
+      </w:r>
+      <w:r>
+        <w:rPr>
+          <w:rStyle w:val="VerbatimChar"/>
+        </w:rPr>
+        <w:t xml:space="preserve">e596d85..15414cf</w:t>
+      </w:r>
+      <w:r>
+        <w:t xml:space="preserve">, then unread-badge frontend-only fast-forward</w:t>
+      </w:r>
+      <w:r>
+        <w:t xml:space="preserve"> </w:t>
+      </w:r>
+      <w:r>
+        <w:rPr>
+          <w:rStyle w:val="VerbatimChar"/>
+        </w:rPr>
+        <w:t xml:space="preserve">15414cf..b2572de</w:t>
+      </w:r>
+      <w:r>
+        <w:t xml:space="preserve">, then AI-suggestion reply-refresh fast-forward</w:t>
+      </w:r>
+      <w:r>
+        <w:t xml:space="preserve"> </w:t>
+      </w:r>
+      <w:r>
+        <w:rPr>
+          <w:rStyle w:val="VerbatimChar"/>
+        </w:rPr>
+        <w:t xml:space="preserve">b2572de..a5b587f</w:t>
+      </w:r>
+      <w:r>
+        <w:t xml:space="preserve"> </w:t>
+      </w:r>
+      <w:r>
+        <w:t xml:space="preserve">with fresh</w:t>
+      </w:r>
+      <w:r>
+        <w:t xml:space="preserve"> </w:t>
+      </w:r>
+      <w:r>
+        <w:rPr>
+          <w:rStyle w:val="VerbatimChar"/>
+        </w:rPr>
+        <w:t xml:space="preserve">server</w:t>
+      </w:r>
+      <w:r>
+        <w:t xml:space="preserve"> </w:t>
+      </w:r>
+      <w:r>
+        <w:t xml:space="preserve">and</w:t>
+      </w:r>
+      <w:r>
+        <w:t xml:space="preserve"> </w:t>
+      </w:r>
+      <w:r>
+        <w:rPr>
+          <w:rStyle w:val="VerbatimChar"/>
+        </w:rPr>
+        <w:t xml:space="preserve">client</w:t>
+      </w:r>
+      <w:r>
+        <w:t xml:space="preserve"> </w:t>
+      </w:r>
+      <w:r>
+        <w:t xml:space="preserve">builds on production.</w:t>
+      </w:r>
+    </w:p>
+    <w:p>
+      <w:pPr>
+        <w:pStyle w:val="Compact"/>
+        <w:numPr>
+          <w:ilvl w:val="0"/>
+          <w:numId w:val="1302"/>
+        </w:numPr>
+      </w:pPr>
+      <w:r>
+        <w:t xml:space="preserve">Production health:</w:t>
+      </w:r>
+      <w:r>
+        <w:t xml:space="preserve"> </w:t>
+      </w:r>
+      <w:r>
+        <w:rPr>
+          <w:rStyle w:val="VerbatimChar"/>
+        </w:rPr>
+        <w:t xml:space="preserve">http://127.0.0.1:3001/api/health</w:t>
+      </w:r>
+      <w:r>
+        <w:t xml:space="preserve"> </w:t>
+      </w:r>
+      <w:r>
+        <w:t xml:space="preserve">returned</w:t>
+      </w:r>
+      <w:r>
+        <w:t xml:space="preserve"> </w:t>
+      </w:r>
+      <w:r>
+        <w:rPr>
+          <w:rStyle w:val="VerbatimChar"/>
+        </w:rPr>
+        <w:t xml:space="preserve">ok/ok/ok</w:t>
+      </w:r>
+      <w:r>
+        <w:t xml:space="preserve"> </w:t>
+      </w:r>
+      <w:r>
+        <w:t xml:space="preserve">for app/database/redis.</w:t>
+      </w:r>
+    </w:p>
+    <w:p>
+      <w:pPr>
+        <w:pStyle w:val="Compact"/>
+        <w:numPr>
+          <w:ilvl w:val="0"/>
+          <w:numId w:val="1302"/>
+        </w:numPr>
+      </w:pPr>
+      <w:r>
+        <w:t xml:space="preserve">PM2:</w:t>
+      </w:r>
+      <w:r>
+        <w:t xml:space="preserve"> </w:t>
+      </w:r>
+      <w:r>
+        <w:rPr>
+          <w:rStyle w:val="VerbatimChar"/>
+        </w:rPr>
+        <w:t xml:space="preserve">sms-api</w:t>
+      </w:r>
+      <w:r>
+        <w:t xml:space="preserve"> </w:t>
+      </w:r>
+      <w:r>
+        <w:t xml:space="preserve">online after restart; restart count</w:t>
+      </w:r>
+      <w:r>
+        <w:t xml:space="preserve"> </w:t>
+      </w:r>
+      <w:r>
+        <w:rPr>
+          <w:rStyle w:val="VerbatimChar"/>
+        </w:rPr>
+        <w:t xml:space="preserve">11</w:t>
+      </w:r>
+      <w:r>
+        <w:t xml:space="preserve">.</w:t>
+      </w:r>
+    </w:p>
+    <w:p>
+      <w:pPr>
+        <w:pStyle w:val="Compact"/>
+        <w:numPr>
+          <w:ilvl w:val="0"/>
+          <w:numId w:val="1302"/>
+        </w:numPr>
+      </w:pPr>
+      <w:r>
+        <w:t xml:space="preserve">Production runtime logs: PM2</w:t>
+      </w:r>
+      <w:r>
+        <w:t xml:space="preserve"> </w:t>
+      </w:r>
+      <w:r>
+        <w:rPr>
+          <w:rStyle w:val="VerbatimChar"/>
+        </w:rPr>
+        <w:t xml:space="preserve">out</w:t>
+      </w:r>
+      <w:r>
+        <w:t xml:space="preserve">/</w:t>
+      </w:r>
+      <w:r>
+        <w:rPr>
+          <w:rStyle w:val="VerbatimChar"/>
+        </w:rPr>
+        <w:t xml:space="preserve">error</w:t>
+      </w:r>
+      <w:r>
+        <w:t xml:space="preserve"> </w:t>
+      </w:r>
+      <w:r>
+        <w:t xml:space="preserve">tails were empty immediately after deploy; no fresh runtime errors were emitted after restart.</w:t>
+      </w:r>
+    </w:p>
+    <w:p>
+      <w:pPr>
+        <w:pStyle w:val="Compact"/>
+        <w:numPr>
+          <w:ilvl w:val="0"/>
+          <w:numId w:val="1302"/>
+        </w:numPr>
+      </w:pPr>
+      <w:r>
+        <w:t xml:space="preserve">Latest CI proof: run</w:t>
+      </w:r>
+      <w:r>
+        <w:t xml:space="preserve"> </w:t>
+      </w:r>
+      <w:r>
+        <w:rPr>
+          <w:rStyle w:val="VerbatimChar"/>
+        </w:rPr>
+        <w:t xml:space="preserve">25068339405</w:t>
+      </w:r>
+      <w:r>
+        <w:t xml:space="preserve">, commit</w:t>
+      </w:r>
+      <w:r>
+        <w:t xml:space="preserve"> </w:t>
+      </w:r>
+      <w:r>
+        <w:rPr>
+          <w:rStyle w:val="VerbatimChar"/>
+        </w:rPr>
         <w:t xml:space="preserve">b2572de</w:t>
       </w:r>
       <w:r>
-        <w:t xml:space="preserve"> </w:t>
-      </w:r>
-      <w:r>
-        <w:t xml:space="preserve">on</w:t>
-      </w:r>
-      <w:r>
-        <w:t xml:space="preserve"> </w:t>
-      </w:r>
-      <w:r>
-        <w:rPr>
-          <w:rStyle w:val="VerbatimChar"/>
-        </w:rPr>
-        <w:t xml:space="preserve">deploy/mysql-hosting</w:t>
-      </w:r>
-      <w:r>
-        <w:t xml:space="preserve">; production</w:t>
-      </w:r>
-      <w:r>
-        <w:t xml:space="preserve"> </w:t>
-      </w:r>
-      <w:r>
-        <w:rPr>
-          <w:rStyle w:val="VerbatimChar"/>
-        </w:rPr>
-        <w:t xml:space="preserve">git status --porcelain</w:t>
-      </w:r>
-      <w:r>
-        <w:t xml:space="preserve"> </w:t>
-      </w:r>
-      <w:r>
-        <w:t xml:space="preserve">lines:</w:t>
-      </w:r>
-      <w:r>
-        <w:t xml:space="preserve"> </w:t>
-      </w:r>
-      <w:r>
-        <w:rPr>
-          <w:rStyle w:val="VerbatimChar"/>
-        </w:rPr>
-        <w:t xml:space="preserve">0</w:t>
-      </w:r>
-      <w:r>
-        <w:t xml:space="preserve">.</w:t>
-      </w:r>
-    </w:p>
-    <w:p>
-      <w:pPr>
-        <w:pStyle w:val="Compact"/>
-        <w:numPr>
-          <w:ilvl w:val="0"/>
-          <w:numId w:val="1300"/>
-        </w:numPr>
-      </w:pPr>
-      <w:r>
-        <w:t xml:space="preserve">Production deploy path used committed code only: initial full deploy fast-forwarded</w:t>
-      </w:r>
-      <w:r>
-        <w:t xml:space="preserve"> </w:t>
-      </w:r>
-      <w:r>
-        <w:rPr>
-          <w:rStyle w:val="VerbatimChar"/>
-        </w:rPr>
-        <w:t xml:space="preserve">e596d85..15414cf</w:t>
-      </w:r>
-      <w:r>
-        <w:t xml:space="preserve">, then unread-badge frontend-only fast-forward</w:t>
-      </w:r>
-      <w:r>
-        <w:t xml:space="preserve"> </w:t>
-      </w:r>
-      <w:r>
-        <w:rPr>
-          <w:rStyle w:val="VerbatimChar"/>
-        </w:rPr>
-        <w:t xml:space="preserve">15414cf..b2572de</w:t>
-      </w:r>
-      <w:r>
-        <w:t xml:space="preserve"> </w:t>
-      </w:r>
-      <w:r>
-        <w:t xml:space="preserve">with fresh</w:t>
-      </w:r>
-      <w:r>
-        <w:t xml:space="preserve"> </w:t>
-      </w:r>
-      <w:r>
-        <w:rPr>
-          <w:rStyle w:val="VerbatimChar"/>
-        </w:rPr>
-        <w:t xml:space="preserve">client</w:t>
-      </w:r>
-      <w:r>
-        <w:t xml:space="preserve"> </w:t>
-      </w:r>
-      <w:r>
-        <w:t xml:space="preserve">build on production.</w:t>
-      </w:r>
-    </w:p>
-    <w:p>
-      <w:pPr>
-        <w:pStyle w:val="Compact"/>
-        <w:numPr>
-          <w:ilvl w:val="0"/>
-          <w:numId w:val="1300"/>
-        </w:numPr>
-      </w:pPr>
-      <w:r>
-        <w:t xml:space="preserve">Production health:</w:t>
-      </w:r>
-      <w:r>
-        <w:t xml:space="preserve"> </w:t>
-      </w:r>
-      <w:r>
-        <w:rPr>
-          <w:rStyle w:val="VerbatimChar"/>
-        </w:rPr>
-        <w:t xml:space="preserve">http://127.0.0.1:3001/api/health</w:t>
+        <w:t xml:space="preserve">, jobs completed successfully.</w:t>
+      </w:r>
+    </w:p>
+    <w:p>
+      <w:pPr>
+        <w:pStyle w:val="Compact"/>
+        <w:numPr>
+          <w:ilvl w:val="0"/>
+          <w:numId w:val="1302"/>
+        </w:numPr>
+      </w:pPr>
+      <w:r>
+        <w:t xml:space="preserve">Latest production build proof: server build passed; client build passed with known CSS minify warning</w:t>
+      </w:r>
+      <w:r>
+        <w:t xml:space="preserve"> </w:t>
+      </w:r>
+      <w:r>
+        <w:rPr>
+          <w:rStyle w:val="VerbatimChar"/>
+        </w:rPr>
+        <w:t xml:space="preserve">.light .bg-dark-800.border*</w:t>
+      </w:r>
+      <w:r>
+        <w:t xml:space="preserve"> </w:t>
+      </w:r>
+      <w:r>
+        <w:t xml:space="preserve">only.</w:t>
+      </w:r>
+    </w:p>
+    <w:p>
+      <w:pPr>
+        <w:pStyle w:val="Compact"/>
+        <w:numPr>
+          <w:ilvl w:val="0"/>
+          <w:numId w:val="1302"/>
+        </w:numPr>
+      </w:pPr>
+      <w:r>
+        <w:t xml:space="preserve">Public frontend smoke:</w:t>
+      </w:r>
+      <w:r>
+        <w:t xml:space="preserve"> </w:t>
+      </w:r>
+      <w:r>
+        <w:rPr>
+          <w:rStyle w:val="VerbatimChar"/>
+        </w:rPr>
+        <w:t xml:space="preserve">https://app.sclcapital.io/</w:t>
       </w:r>
       <w:r>
         <w:t xml:space="preserve"> </w:t>
@@ -10400,177 +10712,6 @@
         <w:rPr>
           <w:rStyle w:val="VerbatimChar"/>
         </w:rPr>
-        <w:t xml:space="preserve">ok/ok/ok</w:t>
-      </w:r>
-      <w:r>
-        <w:t xml:space="preserve"> </w:t>
-      </w:r>
-      <w:r>
-        <w:t xml:space="preserve">for app/database/redis.</w:t>
-      </w:r>
-    </w:p>
-    <w:p>
-      <w:pPr>
-        <w:pStyle w:val="Compact"/>
-        <w:numPr>
-          <w:ilvl w:val="0"/>
-          <w:numId w:val="1300"/>
-        </w:numPr>
-      </w:pPr>
-      <w:r>
-        <w:t xml:space="preserve">PM2:</w:t>
-      </w:r>
-      <w:r>
-        <w:t xml:space="preserve"> </w:t>
-      </w:r>
-      <w:r>
-        <w:rPr>
-          <w:rStyle w:val="VerbatimChar"/>
-        </w:rPr>
-        <w:t xml:space="preserve">sms-api</w:t>
-      </w:r>
-      <w:r>
-        <w:t xml:space="preserve"> </w:t>
-      </w:r>
-      <w:r>
-        <w:t xml:space="preserve">online after restart; restart count</w:t>
-      </w:r>
-      <w:r>
-        <w:t xml:space="preserve"> </w:t>
-      </w:r>
-      <w:r>
-        <w:rPr>
-          <w:rStyle w:val="VerbatimChar"/>
-        </w:rPr>
-        <w:t xml:space="preserve">10</w:t>
-      </w:r>
-      <w:r>
-        <w:t xml:space="preserve">.</w:t>
-      </w:r>
-    </w:p>
-    <w:p>
-      <w:pPr>
-        <w:pStyle w:val="Compact"/>
-        <w:numPr>
-          <w:ilvl w:val="0"/>
-          <w:numId w:val="1300"/>
-        </w:numPr>
-      </w:pPr>
-      <w:r>
-        <w:t xml:space="preserve">Production runtime logs:</w:t>
-      </w:r>
-      <w:r>
-        <w:t xml:space="preserve"> </w:t>
-      </w:r>
-      <w:r>
-        <w:rPr>
-          <w:rStyle w:val="VerbatimChar"/>
-        </w:rPr>
-        <w:t xml:space="preserve">RECENT_ERRORS=0</w:t>
-      </w:r>
-      <w:r>
-        <w:t xml:space="preserve"> </w:t>
-      </w:r>
-      <w:r>
-        <w:t xml:space="preserve">for Prisma unknown field/uncaught/unhandled/fatal markers after smoke.</w:t>
-      </w:r>
-    </w:p>
-    <w:p>
-      <w:pPr>
-        <w:pStyle w:val="Compact"/>
-        <w:numPr>
-          <w:ilvl w:val="0"/>
-          <w:numId w:val="1300"/>
-        </w:numPr>
-      </w:pPr>
-      <w:r>
-        <w:t xml:space="preserve">Latest CI proof: run</w:t>
-      </w:r>
-      <w:r>
-        <w:t xml:space="preserve"> </w:t>
-      </w:r>
-      <w:r>
-        <w:rPr>
-          <w:rStyle w:val="VerbatimChar"/>
-        </w:rPr>
-        <w:t xml:space="preserve">25068339405</w:t>
-      </w:r>
-      <w:r>
-        <w:t xml:space="preserve">, commit</w:t>
-      </w:r>
-      <w:r>
-        <w:t xml:space="preserve"> </w:t>
-      </w:r>
-      <w:r>
-        <w:rPr>
-          <w:rStyle w:val="VerbatimChar"/>
-        </w:rPr>
-        <w:t xml:space="preserve">b2572de</w:t>
-      </w:r>
-      <w:r>
-        <w:t xml:space="preserve">, jobs completed successfully.</w:t>
-      </w:r>
-    </w:p>
-    <w:p>
-      <w:pPr>
-        <w:pStyle w:val="Compact"/>
-        <w:numPr>
-          <w:ilvl w:val="0"/>
-          <w:numId w:val="1300"/>
-        </w:numPr>
-      </w:pPr>
-      <w:r>
-        <w:t xml:space="preserve">Latest production build proof: server build passed; client build passed with known CSS minify warning</w:t>
-      </w:r>
-      <w:r>
-        <w:t xml:space="preserve"> </w:t>
-      </w:r>
-      <w:r>
-        <w:rPr>
-          <w:rStyle w:val="VerbatimChar"/>
-        </w:rPr>
-        <w:t xml:space="preserve">.light .bg-dark-800.border*</w:t>
-      </w:r>
-      <w:r>
-        <w:t xml:space="preserve"> </w:t>
-      </w:r>
-      <w:r>
-        <w:t xml:space="preserve">only.</w:t>
-      </w:r>
-    </w:p>
-    <w:p>
-      <w:pPr>
-        <w:pStyle w:val="Compact"/>
-        <w:numPr>
-          <w:ilvl w:val="0"/>
-          <w:numId w:val="1300"/>
-        </w:numPr>
-      </w:pPr>
-      <w:r>
-        <w:t xml:space="preserve">Public frontend smoke:</w:t>
-      </w:r>
-      <w:r>
-        <w:t xml:space="preserve"> </w:t>
-      </w:r>
-      <w:r>
-        <w:rPr>
-          <w:rStyle w:val="VerbatimChar"/>
-        </w:rPr>
-        <w:t xml:space="preserve">https://app.sclcapital.io/</w:t>
-      </w:r>
-      <w:r>
-        <w:t xml:space="preserve"> </w:t>
-      </w:r>
-      <w:r>
-        <w:t xml:space="preserve">returned</w:t>
-      </w:r>
-      <w:r>
-        <w:t xml:space="preserve"> </w:t>
-      </w:r>
-      <w:r>
-        <w:rPr>
-          <w:rStyle w:val="VerbatimChar"/>
-        </w:rPr>
         <w:t xml:space="preserve">200 OK</w:t>
       </w:r>
       <w:r>
@@ -10585,7 +10726,7 @@
         <w:pStyle w:val="Compact"/>
         <w:numPr>
           <w:ilvl w:val="0"/>
-          <w:numId w:val="1300"/>
+          <w:numId w:val="1302"/>
         </w:numPr>
       </w:pPr>
       <w:r>
@@ -10597,7 +10738,64 @@
         <w:pStyle w:val="Compact"/>
         <w:numPr>
           <w:ilvl w:val="0"/>
-          <w:numId w:val="1300"/>
+          <w:numId w:val="1302"/>
+        </w:numPr>
+      </w:pPr>
+      <w:r>
+        <w:t xml:space="preserve">Latest AI suggestion reply-refresh fix: commit</w:t>
+      </w:r>
+      <w:r>
+        <w:t xml:space="preserve"> </w:t>
+      </w:r>
+      <w:r>
+        <w:rPr>
+          <w:rStyle w:val="VerbatimChar"/>
+        </w:rPr>
+        <w:t xml:space="preserve">a5b587f</w:t>
+      </w:r>
+      <w:r>
+        <w:t xml:space="preserve"> </w:t>
+      </w:r>
+      <w:r>
+        <w:t xml:space="preserve">triggers owner-action reclassification after successful outbound reply; targeted regression</w:t>
+      </w:r>
+      <w:r>
+        <w:t xml:space="preserve"> </w:t>
+      </w:r>
+      <w:r>
+        <w:rPr>
+          <w:rStyle w:val="VerbatimChar"/>
+        </w:rPr>
+        <w:t xml:space="preserve">server/tests/inboxReplyReclassification.test.ts</w:t>
+      </w:r>
+      <w:r>
+        <w:t xml:space="preserve"> </w:t>
+      </w:r>
+      <w:r>
+        <w:t xml:space="preserve">passed 2/2;</w:t>
+      </w:r>
+      <w:r>
+        <w:t xml:space="preserve"> </w:t>
+      </w:r>
+      <w:r>
+        <w:rPr>
+          <w:rStyle w:val="VerbatimChar"/>
+        </w:rPr>
+        <w:t xml:space="preserve">server npm run build</w:t>
+      </w:r>
+      <w:r>
+        <w:t xml:space="preserve"> </w:t>
+      </w:r>
+      <w:r>
+        <w:t xml:space="preserve">passed.</w:t>
+      </w:r>
+    </w:p>
+    <w:p>
+      <w:pPr>
+        <w:pStyle w:val="Compact"/>
+        <w:numPr>
+          <w:ilvl w:val="0"/>
+          <w:numId w:val="1302"/>
         </w:numPr>
       </w:pPr>
       <w:r>
@@ -10635,7 +10833,7 @@
         <w:pStyle w:val="Compact"/>
         <w:numPr>
           <w:ilvl w:val="0"/>
-          <w:numId w:val="1301"/>
+          <w:numId w:val="1303"/>
         </w:numPr>
       </w:pPr>
       <w:r>
@@ -10647,7 +10845,7 @@
         <w:pStyle w:val="Compact"/>
         <w:numPr>
           <w:ilvl w:val="0"/>
-          <w:numId w:val="1302"/>
+          <w:numId w:val="1304"/>
         </w:numPr>
       </w:pPr>
       <w:r>
@@ -10659,7 +10857,7 @@
         <w:pStyle w:val="Compact"/>
         <w:numPr>
           <w:ilvl w:val="0"/>
-          <w:numId w:val="1303"/>
+          <w:numId w:val="1305"/>
         </w:numPr>
       </w:pPr>
       <w:r>
@@ -10671,7 +10869,7 @@
         <w:pStyle w:val="Compact"/>
         <w:numPr>
           <w:ilvl w:val="0"/>
-          <w:numId w:val="1304"/>
+          <w:numId w:val="1306"/>
         </w:numPr>
       </w:pPr>
       <w:r>
@@ -10683,7 +10881,7 @@
         <w:pStyle w:val="Compact"/>
         <w:numPr>
           <w:ilvl w:val="0"/>
-          <w:numId w:val="1305"/>
+          <w:numId w:val="1307"/>
         </w:numPr>
       </w:pPr>
       <w:r>
@@ -10695,7 +10893,7 @@
         <w:pStyle w:val="Compact"/>
         <w:numPr>
           <w:ilvl w:val="0"/>
-          <w:numId w:val="1306"/>
+          <w:numId w:val="1308"/>
         </w:numPr>
       </w:pPr>
       <w:r>
@@ -10707,7 +10905,7 @@
         <w:pStyle w:val="Compact"/>
         <w:numPr>
           <w:ilvl w:val="0"/>
-          <w:numId w:val="1307"/>
+          <w:numId w:val="1309"/>
         </w:numPr>
       </w:pPr>
       <w:r>
@@ -12657,6 +12855,255 @@
             </w:pPr>
             <w:r>
               <w:t xml:space="preserve">Done</w:t>
+            </w:r>
+          </w:p>
+        </w:tc>
+      </w:tr>
+      <w:tr>
+        <w:tc>
+          <w:tcPr/>
+          <w:p>
+            <w:pPr>
+              <w:pStyle w:val="Compact"/>
+            </w:pPr>
+            <w:r>
+              <w:t xml:space="preserve">2026-04-28</w:t>
+            </w:r>
+          </w:p>
+        </w:tc>
+        <w:tc>
+          <w:tcPr/>
+          <w:p>
+            <w:pPr>
+              <w:pStyle w:val="Compact"/>
+            </w:pPr>
+            <w:r>
+              <w:t xml:space="preserve">AI Suggestions</w:t>
+            </w:r>
+          </w:p>
+        </w:tc>
+        <w:tc>
+          <w:tcPr/>
+          <w:p>
+            <w:pPr>
+              <w:pStyle w:val="Compact"/>
+            </w:pPr>
+            <w:r>
+              <w:t xml:space="preserve">Re-triggered classification after successful outbound reply</w:t>
+            </w:r>
+          </w:p>
+        </w:tc>
+        <w:tc>
+          <w:tcPr/>
+          <w:p>
+            <w:pPr>
+              <w:pStyle w:val="Compact"/>
+            </w:pPr>
+            <w:r>
+              <w:t xml:space="preserve">a5b587f</w:t>
+            </w:r>
+          </w:p>
+        </w:tc>
+        <w:tc>
+          <w:tcPr/>
+          <w:p>
+            <w:pPr>
+              <w:pStyle w:val="Compact"/>
+            </w:pPr>
+            <w:r>
+              <w:t xml:space="preserve">Targeted regression 2/2 passed;</w:t>
+            </w:r>
+            <w:r>
+              <w:t xml:space="preserve"> </w:t>
+            </w:r>
+            <w:r>
+              <w:rPr>
+                <w:rStyle w:val="VerbatimChar"/>
+              </w:rPr>
+              <w:t xml:space="preserve">server npm run build</w:t>
+            </w:r>
+            <w:r>
+              <w:t xml:space="preserve"> </w:t>
+            </w:r>
+            <w:r>
+              <w:t xml:space="preserve">passed</w:t>
+            </w:r>
+          </w:p>
+        </w:tc>
+        <w:tc>
+          <w:tcPr/>
+          <w:p>
+            <w:pPr>
+              <w:pStyle w:val="Compact"/>
+            </w:pPr>
+            <w:r>
+              <w:t xml:space="preserve">Done</w:t>
+            </w:r>
+          </w:p>
+        </w:tc>
+      </w:tr>
+      <w:tr>
+        <w:tc>
+          <w:tcPr/>
+          <w:p>
+            <w:pPr>
+              <w:pStyle w:val="Compact"/>
+            </w:pPr>
+            <w:r>
+              <w:t xml:space="preserve">2026-04-28</w:t>
+            </w:r>
+          </w:p>
+        </w:tc>
+        <w:tc>
+          <w:tcPr/>
+          <w:p>
+            <w:pPr>
+              <w:pStyle w:val="Compact"/>
+            </w:pPr>
+            <w:r>
+              <w:t xml:space="preserve">Production Deploy</w:t>
+            </w:r>
+          </w:p>
+        </w:tc>
+        <w:tc>
+          <w:tcPr/>
+          <w:p>
+            <w:pPr>
+              <w:pStyle w:val="Compact"/>
+            </w:pPr>
+            <w:r>
+              <w:t xml:space="preserve">Deployed AI suggestion reply-refresh fix to production</w:t>
+            </w:r>
+          </w:p>
+        </w:tc>
+        <w:tc>
+          <w:tcPr/>
+          <w:p>
+            <w:pPr>
+              <w:pStyle w:val="Compact"/>
+            </w:pPr>
+            <w:r>
+              <w:t xml:space="preserve">a5b587f</w:t>
+            </w:r>
+          </w:p>
+        </w:tc>
+        <w:tc>
+          <w:tcPr/>
+          <w:p>
+            <w:pPr>
+              <w:pStyle w:val="Compact"/>
+            </w:pPr>
+            <w:r>
+              <w:t xml:space="preserve">Production SHA a5b587f; health ok; PM2 online; logs empty</w:t>
+            </w:r>
+          </w:p>
+        </w:tc>
+        <w:tc>
+          <w:tcPr/>
+          <w:p>
+            <w:pPr>
+              <w:pStyle w:val="Compact"/>
+            </w:pPr>
+            <w:r>
+              <w:t xml:space="preserve">Done</w:t>
+            </w:r>
+          </w:p>
+        </w:tc>
+      </w:tr>
+      <w:tr>
+        <w:tc>
+          <w:tcPr/>
+          <w:p>
+            <w:pPr>
+              <w:pStyle w:val="Compact"/>
+            </w:pPr>
+            <w:r>
+              <w:t xml:space="preserve">2026-04-28</w:t>
+            </w:r>
+          </w:p>
+        </w:tc>
+        <w:tc>
+          <w:tcPr/>
+          <w:p>
+            <w:pPr>
+              <w:pStyle w:val="Compact"/>
+            </w:pPr>
+            <w:r>
+              <w:t xml:space="preserve">Client Repo Mirror</w:t>
+            </w:r>
+          </w:p>
+        </w:tc>
+        <w:tc>
+          <w:tcPr/>
+          <w:p>
+            <w:pPr>
+              <w:pStyle w:val="Compact"/>
+            </w:pPr>
+            <w:r>
+              <w:t xml:space="preserve">Attempted sanitized re-sync after AI suggestion fix</w:t>
+            </w:r>
+          </w:p>
+        </w:tc>
+        <w:tc>
+          <w:tcPr/>
+          <w:p>
+            <w:pPr>
+              <w:pStyle w:val="Compact"/>
+            </w:pPr>
+            <w:r>
+              <w:t xml:space="preserve">a5b587f</w:t>
+            </w:r>
+          </w:p>
+        </w:tc>
+        <w:tc>
+          <w:tcPr/>
+          <w:p>
+            <w:pPr>
+              <w:pStyle w:val="Compact"/>
+            </w:pPr>
+            <w:r>
+              <w:t xml:space="preserve">Push blocked by GitHub</w:t>
+            </w:r>
+            <w:r>
+              <w:t xml:space="preserve"> </w:t>
+            </w:r>
+            <w:r>
+              <w:rPr>
+                <w:rStyle w:val="VerbatimChar"/>
+              </w:rPr>
+              <w:t xml:space="preserve">403</w:t>
+            </w:r>
+            <w:r>
+              <w:t xml:space="preserve"> </w:t>
+            </w:r>
+            <w:r>
+              <w:t xml:space="preserve">for current</w:t>
+            </w:r>
+            <w:r>
+              <w:t xml:space="preserve"> </w:t>
+            </w:r>
+            <w:r>
+              <w:rPr>
+                <w:rStyle w:val="VerbatimChar"/>
+              </w:rPr>
+              <w:t xml:space="preserve">ksanyok</w:t>
+            </w:r>
+            <w:r>
+              <w:t xml:space="preserve"> </w:t>
+            </w:r>
+            <w:r>
+              <w:t xml:space="preserve">auth</w:t>
+            </w:r>
+          </w:p>
+        </w:tc>
+        <w:tc>
+          <w:tcPr/>
+          <w:p>
+            <w:pPr>
+              <w:pStyle w:val="Compact"/>
+            </w:pPr>
+            <w:r>
+              <w:t xml:space="preserve">Blocked</w:t>
             </w:r>
           </w:p>
         </w:tc>
@@ -13483,29 +13930,29 @@
     <w:abstractNumId w:val="993"/>
   </w:num>
   <w:num w:numId="1151">
+    <w:abstractNumId w:val="993"/>
+  </w:num>
+  <w:num w:numId="1152">
     <w:abstractNumId w:val="992"/>
   </w:num>
-  <w:num w:numId="1152">
+  <w:num w:numId="1153">
     <w:abstractNumId w:val="991"/>
   </w:num>
-  <w:num w:numId="1153">
-    <w:abstractNumId w:val="993"/>
-  </w:num>
   <w:num w:numId="1154">
+    <w:abstractNumId w:val="993"/>
+  </w:num>
+  <w:num w:numId="1155">
     <w:abstractNumId w:val="992"/>
   </w:num>
-  <w:num w:numId="1155">
-    <w:abstractNumId w:val="993"/>
-  </w:num>
   <w:num w:numId="1156">
+    <w:abstractNumId w:val="993"/>
+  </w:num>
+  <w:num w:numId="1157">
     <w:abstractNumId w:val="992"/>
   </w:num>
-  <w:num w:numId="1157">
+  <w:num w:numId="1158">
     <w:abstractNumId w:val="991"/>
   </w:num>
-  <w:num w:numId="1158">
-    <w:abstractNumId w:val="993"/>
-  </w:num>
   <w:num w:numId="1159">
     <w:abstractNumId w:val="993"/>
   </w:num>
@@ -13516,11 +13963,11 @@
     <w:abstractNumId w:val="993"/>
   </w:num>
   <w:num w:numId="1162">
+    <w:abstractNumId w:val="993"/>
+  </w:num>
+  <w:num w:numId="1163">
     <w:abstractNumId w:val="991"/>
   </w:num>
-  <w:num w:numId="1163">
-    <w:abstractNumId w:val="993"/>
-  </w:num>
   <w:num w:numId="1164">
     <w:abstractNumId w:val="993"/>
   </w:num>
@@ -13591,7 +14038,7 @@
     <w:abstractNumId w:val="993"/>
   </w:num>
   <w:num w:numId="1187">
-    <w:abstractNumId w:val="992"/>
+    <w:abstractNumId w:val="993"/>
   </w:num>
   <w:num w:numId="1188">
     <w:abstractNumId w:val="992"/>
@@ -13675,7 +14122,7 @@
     <w:abstractNumId w:val="992"/>
   </w:num>
   <w:num w:numId="1215">
-    <w:abstractNumId w:val="993"/>
+    <w:abstractNumId w:val="992"/>
   </w:num>
   <w:num w:numId="1216">
     <w:abstractNumId w:val="993"/>
@@ -13726,32 +14173,32 @@
     <w:abstractNumId w:val="993"/>
   </w:num>
   <w:num w:numId="1232">
-    <w:abstractNumId w:val="992"/>
+    <w:abstractNumId w:val="993"/>
   </w:num>
   <w:num w:numId="1233">
     <w:abstractNumId w:val="992"/>
   </w:num>
   <w:num w:numId="1234">
-    <w:abstractNumId w:val="993"/>
+    <w:abstractNumId w:val="992"/>
   </w:num>
   <w:num w:numId="1235">
+    <w:abstractNumId w:val="993"/>
+  </w:num>
+  <w:num w:numId="1236">
     <w:abstractNumId w:val="992"/>
   </w:num>
-  <w:num w:numId="1236">
-    <w:abstractNumId w:val="993"/>
-  </w:num>
   <w:num w:numId="1237">
     <w:abstractNumId w:val="993"/>
   </w:num>
   <w:num w:numId="1238">
+    <w:abstractNumId w:val="993"/>
+  </w:num>
+  <w:num w:numId="1239">
     <w:abstractNumId w:val="992"/>
   </w:num>
-  <w:num w:numId="1239">
+  <w:num w:numId="1240">
     <w:abstractNumId w:val="991"/>
   </w:num>
-  <w:num w:numId="1240">
-    <w:abstractNumId w:val="993"/>
-  </w:num>
   <w:num w:numId="1241">
     <w:abstractNumId w:val="993"/>
   </w:num>
@@ -13771,16 +14218,16 @@
     <w:abstractNumId w:val="993"/>
   </w:num>
   <w:num w:numId="1247">
+    <w:abstractNumId w:val="993"/>
+  </w:num>
+  <w:num w:numId="1248">
     <w:abstractNumId w:val="991"/>
-  </w:num>
-  <w:num w:numId="1248">
-    <w:abstractNumId w:val="992"/>
   </w:num>
   <w:num w:numId="1249">
     <w:abstractNumId w:val="992"/>
   </w:num>
   <w:num w:numId="1250">
-    <w:abstractNumId w:val="993"/>
+    <w:abstractNumId w:val="992"/>
   </w:num>
   <w:num w:numId="1251">
     <w:abstractNumId w:val="993"/>
@@ -13792,10 +14239,10 @@
     <w:abstractNumId w:val="993"/>
   </w:num>
   <w:num w:numId="1254">
+    <w:abstractNumId w:val="993"/>
+  </w:num>
+  <w:num w:numId="1255">
     <w:abstractNumId w:val="992"/>
-  </w:num>
-  <w:num w:numId="1255">
-    <w:abstractNumId w:val="993"/>
   </w:num>
   <w:num w:numId="1256">
     <w:abstractNumId w:val="993"/>
@@ -13837,23 +14284,23 @@
     <w:abstractNumId w:val="993"/>
   </w:num>
   <w:num w:numId="1269">
-    <w:abstractNumId w:val="993"/>
+    <w:abstractNumId w:val="992"/>
   </w:num>
   <w:num w:numId="1270">
     <w:abstractNumId w:val="993"/>
   </w:num>
   <w:num w:numId="1271">
-    <w:abstractNumId w:val="993"/>
+    <w:abstractNumId w:val="992"/>
   </w:num>
   <w:num w:numId="1272">
+    <w:abstractNumId w:val="993"/>
+  </w:num>
+  <w:num w:numId="1273">
+    <w:abstractNumId w:val="993"/>
+  </w:num>
+  <w:num w:numId="1274">
     <w:abstractNumId w:val="991"/>
   </w:num>
-  <w:num w:numId="1273">
-    <w:abstractNumId w:val="993"/>
-  </w:num>
-  <w:num w:numId="1274">
-    <w:abstractNumId w:val="993"/>
-  </w:num>
   <w:num w:numId="1275">
     <w:abstractNumId w:val="993"/>
   </w:num>
@@ -13870,31 +14317,31 @@
     <w:abstractNumId w:val="993"/>
   </w:num>
   <w:num w:numId="1280">
+    <w:abstractNumId w:val="993"/>
+  </w:num>
+  <w:num w:numId="1281">
+    <w:abstractNumId w:val="993"/>
+  </w:num>
+  <w:num w:numId="1282">
     <w:abstractNumId w:val="992"/>
-  </w:num>
-  <w:num w:numId="1281">
-    <w:abstractNumId w:val="992"/>
-  </w:num>
-  <w:num w:numId="1282">
-    <w:abstractNumId w:val="993"/>
   </w:num>
   <w:num w:numId="1283">
     <w:abstractNumId w:val="992"/>
   </w:num>
   <w:num w:numId="1284">
-    <w:abstractNumId w:val="992"/>
+    <w:abstractNumId w:val="993"/>
   </w:num>
   <w:num w:numId="1285">
     <w:abstractNumId w:val="992"/>
   </w:num>
   <w:num w:numId="1286">
-    <w:abstractNumId w:val="993"/>
+    <w:abstractNumId w:val="992"/>
   </w:num>
   <w:num w:numId="1287">
     <w:abstractNumId w:val="992"/>
   </w:num>
   <w:num w:numId="1288">
-    <w:abstractNumId w:val="992"/>
+    <w:abstractNumId w:val="993"/>
   </w:num>
   <w:num w:numId="1289">
     <w:abstractNumId w:val="992"/>
@@ -13909,10 +14356,10 @@
     <w:abstractNumId w:val="992"/>
   </w:num>
   <w:num w:numId="1293">
-    <w:abstractNumId w:val="993"/>
+    <w:abstractNumId w:val="992"/>
   </w:num>
   <w:num w:numId="1294">
-    <w:abstractNumId w:val="993"/>
+    <w:abstractNumId w:val="992"/>
   </w:num>
   <w:num w:numId="1295">
     <w:abstractNumId w:val="993"/>
@@ -13927,16 +14374,16 @@
     <w:abstractNumId w:val="993"/>
   </w:num>
   <w:num w:numId="1299">
-    <w:abstractNumId w:val="992"/>
+    <w:abstractNumId w:val="993"/>
   </w:num>
   <w:num w:numId="1300">
-    <w:abstractNumId w:val="991"/>
+    <w:abstractNumId w:val="993"/>
   </w:num>
   <w:num w:numId="1301">
     <w:abstractNumId w:val="992"/>
   </w:num>
   <w:num w:numId="1302">
-    <w:abstractNumId w:val="992"/>
+    <w:abstractNumId w:val="991"/>
   </w:num>
   <w:num w:numId="1303">
     <w:abstractNumId w:val="992"/>
@@ -13951,6 +14398,12 @@
     <w:abstractNumId w:val="992"/>
   </w:num>
   <w:num w:numId="1307">
+    <w:abstractNumId w:val="992"/>
+  </w:num>
+  <w:num w:numId="1308">
+    <w:abstractNumId w:val="992"/>
+  </w:num>
+  <w:num w:numId="1309">
     <w:abstractNumId w:val="992"/>
   </w:num>
 </w:numbering>

</xml_diff>

<commit_message>
docs(checklist): record ai suggestion restore
</commit_message>
<xml_diff>
--- a/CHECKLIST_M1_M2_REMEDIATION_2026-04-28.docx
+++ b/CHECKLIST_M1_M2_REMEDIATION_2026-04-28.docx
@@ -10370,52 +10370,436 @@
         <w:rPr>
           <w:rStyle w:val="VerbatimChar"/>
         </w:rPr>
+        <w:t xml:space="preserve">9f6e478</w:t>
+      </w:r>
+      <w:r>
+        <w:t xml:space="preserve"> </w:t>
+      </w:r>
+      <w:r>
+        <w:t xml:space="preserve">on</w:t>
+      </w:r>
+      <w:r>
+        <w:t xml:space="preserve"> </w:t>
+      </w:r>
+      <w:r>
+        <w:rPr>
+          <w:rStyle w:val="VerbatimChar"/>
+        </w:rPr>
+        <w:t xml:space="preserve">deploy/mysql-hosting</w:t>
+      </w:r>
+      <w:r>
+        <w:t xml:space="preserve">; production</w:t>
+      </w:r>
+      <w:r>
+        <w:t xml:space="preserve"> </w:t>
+      </w:r>
+      <w:r>
+        <w:rPr>
+          <w:rStyle w:val="VerbatimChar"/>
+        </w:rPr>
+        <w:t xml:space="preserve">git status --porcelain</w:t>
+      </w:r>
+      <w:r>
+        <w:t xml:space="preserve"> </w:t>
+      </w:r>
+      <w:r>
+        <w:t xml:space="preserve">lines:</w:t>
+      </w:r>
+      <w:r>
+        <w:t xml:space="preserve"> </w:t>
+      </w:r>
+      <w:r>
+        <w:rPr>
+          <w:rStyle w:val="VerbatimChar"/>
+        </w:rPr>
+        <w:t xml:space="preserve">0</w:t>
+      </w:r>
+      <w:r>
+        <w:t xml:space="preserve">.</w:t>
+      </w:r>
+    </w:p>
+    <w:p>
+      <w:pPr>
+        <w:pStyle w:val="Compact"/>
+        <w:numPr>
+          <w:ilvl w:val="0"/>
+          <w:numId w:val="1302"/>
+        </w:numPr>
+      </w:pPr>
+      <w:r>
+        <w:t xml:space="preserve">Production deploy path used committed code only: initial full deploy fast-forwarded</w:t>
+      </w:r>
+      <w:r>
+        <w:t xml:space="preserve"> </w:t>
+      </w:r>
+      <w:r>
+        <w:rPr>
+          <w:rStyle w:val="VerbatimChar"/>
+        </w:rPr>
+        <w:t xml:space="preserve">e596d85..15414cf</w:t>
+      </w:r>
+      <w:r>
+        <w:t xml:space="preserve">, then unread-badge frontend-only fast-forward</w:t>
+      </w:r>
+      <w:r>
+        <w:t xml:space="preserve"> </w:t>
+      </w:r>
+      <w:r>
+        <w:rPr>
+          <w:rStyle w:val="VerbatimChar"/>
+        </w:rPr>
+        <w:t xml:space="preserve">15414cf..b2572de</w:t>
+      </w:r>
+      <w:r>
+        <w:t xml:space="preserve">, then AI-suggestion reply-refresh fast-forward</w:t>
+      </w:r>
+      <w:r>
+        <w:t xml:space="preserve"> </w:t>
+      </w:r>
+      <w:r>
+        <w:rPr>
+          <w:rStyle w:val="VerbatimChar"/>
+        </w:rPr>
+        <w:t xml:space="preserve">b2572de..a5b587f</w:t>
+      </w:r>
+      <w:r>
+        <w:t xml:space="preserve">, then fallback-suggestion restore fast-forward</w:t>
+      </w:r>
+      <w:r>
+        <w:t xml:space="preserve"> </w:t>
+      </w:r>
+      <w:r>
+        <w:rPr>
+          <w:rStyle w:val="VerbatimChar"/>
+        </w:rPr>
+        <w:t xml:space="preserve">a5b587f..9f6e478</w:t>
+      </w:r>
+      <w:r>
+        <w:t xml:space="preserve"> </w:t>
+      </w:r>
+      <w:r>
+        <w:t xml:space="preserve">with fresh</w:t>
+      </w:r>
+      <w:r>
+        <w:t xml:space="preserve"> </w:t>
+      </w:r>
+      <w:r>
+        <w:rPr>
+          <w:rStyle w:val="VerbatimChar"/>
+        </w:rPr>
+        <w:t xml:space="preserve">server</w:t>
+      </w:r>
+      <w:r>
+        <w:t xml:space="preserve"> </w:t>
+      </w:r>
+      <w:r>
+        <w:t xml:space="preserve">and</w:t>
+      </w:r>
+      <w:r>
+        <w:t xml:space="preserve"> </w:t>
+      </w:r>
+      <w:r>
+        <w:rPr>
+          <w:rStyle w:val="VerbatimChar"/>
+        </w:rPr>
+        <w:t xml:space="preserve">client</w:t>
+      </w:r>
+      <w:r>
+        <w:t xml:space="preserve"> </w:t>
+      </w:r>
+      <w:r>
+        <w:t xml:space="preserve">builds on production.</w:t>
+      </w:r>
+    </w:p>
+    <w:p>
+      <w:pPr>
+        <w:pStyle w:val="Compact"/>
+        <w:numPr>
+          <w:ilvl w:val="0"/>
+          <w:numId w:val="1302"/>
+        </w:numPr>
+      </w:pPr>
+      <w:r>
+        <w:t xml:space="preserve">Production health:</w:t>
+      </w:r>
+      <w:r>
+        <w:t xml:space="preserve"> </w:t>
+      </w:r>
+      <w:r>
+        <w:rPr>
+          <w:rStyle w:val="VerbatimChar"/>
+        </w:rPr>
+        <w:t xml:space="preserve">http://127.0.0.1:3001/api/health</w:t>
+      </w:r>
+      <w:r>
+        <w:t xml:space="preserve"> </w:t>
+      </w:r>
+      <w:r>
+        <w:t xml:space="preserve">returned</w:t>
+      </w:r>
+      <w:r>
+        <w:t xml:space="preserve"> </w:t>
+      </w:r>
+      <w:r>
+        <w:rPr>
+          <w:rStyle w:val="VerbatimChar"/>
+        </w:rPr>
+        <w:t xml:space="preserve">ok/ok/ok</w:t>
+      </w:r>
+      <w:r>
+        <w:t xml:space="preserve"> </w:t>
+      </w:r>
+      <w:r>
+        <w:t xml:space="preserve">for app/database/redis.</w:t>
+      </w:r>
+    </w:p>
+    <w:p>
+      <w:pPr>
+        <w:pStyle w:val="Compact"/>
+        <w:numPr>
+          <w:ilvl w:val="0"/>
+          <w:numId w:val="1302"/>
+        </w:numPr>
+      </w:pPr>
+      <w:r>
+        <w:t xml:space="preserve">PM2:</w:t>
+      </w:r>
+      <w:r>
+        <w:t xml:space="preserve"> </w:t>
+      </w:r>
+      <w:r>
+        <w:rPr>
+          <w:rStyle w:val="VerbatimChar"/>
+        </w:rPr>
+        <w:t xml:space="preserve">sms-api</w:t>
+      </w:r>
+      <w:r>
+        <w:t xml:space="preserve"> </w:t>
+      </w:r>
+      <w:r>
+        <w:t xml:space="preserve">online after restart; restart count</w:t>
+      </w:r>
+      <w:r>
+        <w:t xml:space="preserve"> </w:t>
+      </w:r>
+      <w:r>
+        <w:rPr>
+          <w:rStyle w:val="VerbatimChar"/>
+        </w:rPr>
+        <w:t xml:space="preserve">12</w:t>
+      </w:r>
+      <w:r>
+        <w:t xml:space="preserve">.</w:t>
+      </w:r>
+    </w:p>
+    <w:p>
+      <w:pPr>
+        <w:pStyle w:val="Compact"/>
+        <w:numPr>
+          <w:ilvl w:val="0"/>
+          <w:numId w:val="1302"/>
+        </w:numPr>
+      </w:pPr>
+      <w:r>
+        <w:t xml:space="preserve">Production runtime logs: PM2</w:t>
+      </w:r>
+      <w:r>
+        <w:t xml:space="preserve"> </w:t>
+      </w:r>
+      <w:r>
+        <w:rPr>
+          <w:rStyle w:val="VerbatimChar"/>
+        </w:rPr>
+        <w:t xml:space="preserve">out</w:t>
+      </w:r>
+      <w:r>
+        <w:t xml:space="preserve">/</w:t>
+      </w:r>
+      <w:r>
+        <w:rPr>
+          <w:rStyle w:val="VerbatimChar"/>
+        </w:rPr>
+        <w:t xml:space="preserve">error</w:t>
+      </w:r>
+      <w:r>
+        <w:t xml:space="preserve"> </w:t>
+      </w:r>
+      <w:r>
+        <w:t xml:space="preserve">tails were empty immediately after deploy; no fresh runtime errors were emitted after restart.</w:t>
+      </w:r>
+    </w:p>
+    <w:p>
+      <w:pPr>
+        <w:pStyle w:val="Compact"/>
+        <w:numPr>
+          <w:ilvl w:val="0"/>
+          <w:numId w:val="1302"/>
+        </w:numPr>
+      </w:pPr>
+      <w:r>
+        <w:t xml:space="preserve">Latest CI proof: run</w:t>
+      </w:r>
+      <w:r>
+        <w:t xml:space="preserve"> </w:t>
+      </w:r>
+      <w:r>
+        <w:rPr>
+          <w:rStyle w:val="VerbatimChar"/>
+        </w:rPr>
+        <w:t xml:space="preserve">25068339405</w:t>
+      </w:r>
+      <w:r>
+        <w:t xml:space="preserve">, commit</w:t>
+      </w:r>
+      <w:r>
+        <w:t xml:space="preserve"> </w:t>
+      </w:r>
+      <w:r>
+        <w:rPr>
+          <w:rStyle w:val="VerbatimChar"/>
+        </w:rPr>
+        <w:t xml:space="preserve">b2572de</w:t>
+      </w:r>
+      <w:r>
+        <w:t xml:space="preserve">, jobs completed successfully.</w:t>
+      </w:r>
+    </w:p>
+    <w:p>
+      <w:pPr>
+        <w:pStyle w:val="Compact"/>
+        <w:numPr>
+          <w:ilvl w:val="0"/>
+          <w:numId w:val="1302"/>
+        </w:numPr>
+      </w:pPr>
+      <w:r>
+        <w:t xml:space="preserve">Latest production build proof: server build passed; client build passed with known CSS minify warning</w:t>
+      </w:r>
+      <w:r>
+        <w:t xml:space="preserve"> </w:t>
+      </w:r>
+      <w:r>
+        <w:rPr>
+          <w:rStyle w:val="VerbatimChar"/>
+        </w:rPr>
+        <w:t xml:space="preserve">.light .bg-dark-800.border*</w:t>
+      </w:r>
+      <w:r>
+        <w:t xml:space="preserve"> </w:t>
+      </w:r>
+      <w:r>
+        <w:t xml:space="preserve">only.</w:t>
+      </w:r>
+    </w:p>
+    <w:p>
+      <w:pPr>
+        <w:pStyle w:val="Compact"/>
+        <w:numPr>
+          <w:ilvl w:val="0"/>
+          <w:numId w:val="1302"/>
+        </w:numPr>
+      </w:pPr>
+      <w:r>
+        <w:t xml:space="preserve">Public frontend smoke:</w:t>
+      </w:r>
+      <w:r>
+        <w:t xml:space="preserve"> </w:t>
+      </w:r>
+      <w:r>
+        <w:rPr>
+          <w:rStyle w:val="VerbatimChar"/>
+        </w:rPr>
+        <w:t xml:space="preserve">https://app.sclcapital.io/</w:t>
+      </w:r>
+      <w:r>
+        <w:t xml:space="preserve"> </w:t>
+      </w:r>
+      <w:r>
+        <w:t xml:space="preserve">returned</w:t>
+      </w:r>
+      <w:r>
+        <w:t xml:space="preserve"> </w:t>
+      </w:r>
+      <w:r>
+        <w:rPr>
+          <w:rStyle w:val="VerbatimChar"/>
+        </w:rPr>
+        <w:t xml:space="preserve">200 OK</w:t>
+      </w:r>
+      <w:r>
+        <w:t xml:space="preserve"> </w:t>
+      </w:r>
+      <w:r>
+        <w:t xml:space="preserve">and current index timestamp after deploy.</w:t>
+      </w:r>
+    </w:p>
+    <w:p>
+      <w:pPr>
+        <w:pStyle w:val="Compact"/>
+        <w:numPr>
+          <w:ilvl w:val="0"/>
+          <w:numId w:val="1302"/>
+        </w:numPr>
+      </w:pPr>
+      <w:r>
+        <w:t xml:space="preserve">Current unread-badge fix: sidebar Inbox badge now uses unread conversation count, matching Inbox/Admin View and the User Guide contract.</w:t>
+      </w:r>
+    </w:p>
+    <w:p>
+      <w:pPr>
+        <w:pStyle w:val="Compact"/>
+        <w:numPr>
+          <w:ilvl w:val="0"/>
+          <w:numId w:val="1302"/>
+        </w:numPr>
+      </w:pPr>
+      <w:r>
+        <w:t xml:space="preserve">Latest AI suggestion reply-refresh fix: commit</w:t>
+      </w:r>
+      <w:r>
+        <w:t xml:space="preserve"> </w:t>
+      </w:r>
+      <w:r>
+        <w:rPr>
+          <w:rStyle w:val="VerbatimChar"/>
+        </w:rPr>
         <w:t xml:space="preserve">a5b587f</w:t>
       </w:r>
       <w:r>
         <w:t xml:space="preserve"> </w:t>
       </w:r>
       <w:r>
-        <w:t xml:space="preserve">on</w:t>
-      </w:r>
-      <w:r>
-        <w:t xml:space="preserve"> </w:t>
-      </w:r>
-      <w:r>
-        <w:rPr>
-          <w:rStyle w:val="VerbatimChar"/>
-        </w:rPr>
-        <w:t xml:space="preserve">deploy/mysql-hosting</w:t>
-      </w:r>
-      <w:r>
-        <w:t xml:space="preserve">; production</w:t>
-      </w:r>
-      <w:r>
-        <w:t xml:space="preserve"> </w:t>
-      </w:r>
-      <w:r>
-        <w:rPr>
-          <w:rStyle w:val="VerbatimChar"/>
-        </w:rPr>
-        <w:t xml:space="preserve">git status --porcelain</w:t>
-      </w:r>
-      <w:r>
-        <w:t xml:space="preserve"> </w:t>
-      </w:r>
-      <w:r>
-        <w:t xml:space="preserve">lines:</w:t>
-      </w:r>
-      <w:r>
-        <w:t xml:space="preserve"> </w:t>
-      </w:r>
-      <w:r>
-        <w:rPr>
-          <w:rStyle w:val="VerbatimChar"/>
-        </w:rPr>
-        <w:t xml:space="preserve">0</w:t>
-      </w:r>
-      <w:r>
-        <w:t xml:space="preserve">.</w:t>
+        <w:t xml:space="preserve">triggers owner-action reclassification after successful outbound reply; targeted regression</w:t>
+      </w:r>
+      <w:r>
+        <w:t xml:space="preserve"> </w:t>
+      </w:r>
+      <w:r>
+        <w:rPr>
+          <w:rStyle w:val="VerbatimChar"/>
+        </w:rPr>
+        <w:t xml:space="preserve">server/tests/inboxReplyReclassification.test.ts</w:t>
+      </w:r>
+      <w:r>
+        <w:t xml:space="preserve"> </w:t>
+      </w:r>
+      <w:r>
+        <w:t xml:space="preserve">passed 2/2;</w:t>
+      </w:r>
+      <w:r>
+        <w:t xml:space="preserve"> </w:t>
+      </w:r>
+      <w:r>
+        <w:rPr>
+          <w:rStyle w:val="VerbatimChar"/>
+        </w:rPr>
+        <w:t xml:space="preserve">server npm run build</w:t>
+      </w:r>
+      <w:r>
+        <w:t xml:space="preserve"> </w:t>
+      </w:r>
+      <w:r>
+        <w:t xml:space="preserve">passed.</w:t>
       </w:r>
     </w:p>
     <w:p>
@@ -10427,76 +10811,67 @@
         </w:numPr>
       </w:pPr>
       <w:r>
-        <w:t xml:space="preserve">Production deploy path used committed code only: initial full deploy fast-forwarded</w:t>
-      </w:r>
-      <w:r>
-        <w:t xml:space="preserve"> </w:t>
-      </w:r>
-      <w:r>
-        <w:rPr>
-          <w:rStyle w:val="VerbatimChar"/>
-        </w:rPr>
-        <w:t xml:space="preserve">e596d85..15414cf</w:t>
-      </w:r>
-      <w:r>
-        <w:t xml:space="preserve">, then unread-badge frontend-only fast-forward</w:t>
-      </w:r>
-      <w:r>
-        <w:t xml:space="preserve"> </w:t>
-      </w:r>
-      <w:r>
-        <w:rPr>
-          <w:rStyle w:val="VerbatimChar"/>
-        </w:rPr>
-        <w:t xml:space="preserve">15414cf..b2572de</w:t>
-      </w:r>
-      <w:r>
-        <w:t xml:space="preserve">, then AI-suggestion reply-refresh fast-forward</w:t>
-      </w:r>
-      <w:r>
-        <w:t xml:space="preserve"> </w:t>
-      </w:r>
-      <w:r>
-        <w:rPr>
-          <w:rStyle w:val="VerbatimChar"/>
-        </w:rPr>
-        <w:t xml:space="preserve">b2572de..a5b587f</w:t>
-      </w:r>
-      <w:r>
-        <w:t xml:space="preserve"> </w:t>
-      </w:r>
-      <w:r>
-        <w:t xml:space="preserve">with fresh</w:t>
-      </w:r>
-      <w:r>
-        <w:t xml:space="preserve"> </w:t>
-      </w:r>
-      <w:r>
-        <w:rPr>
-          <w:rStyle w:val="VerbatimChar"/>
-        </w:rPr>
-        <w:t xml:space="preserve">server</w:t>
-      </w:r>
-      <w:r>
-        <w:t xml:space="preserve"> </w:t>
-      </w:r>
-      <w:r>
-        <w:t xml:space="preserve">and</w:t>
-      </w:r>
-      <w:r>
-        <w:t xml:space="preserve"> </w:t>
-      </w:r>
-      <w:r>
-        <w:rPr>
-          <w:rStyle w:val="VerbatimChar"/>
-        </w:rPr>
-        <w:t xml:space="preserve">client</w:t>
-      </w:r>
-      <w:r>
-        <w:t xml:space="preserve"> </w:t>
-      </w:r>
-      <w:r>
-        <w:t xml:space="preserve">builds on production.</w:t>
+        <w:t xml:space="preserve">Latest AI suggestion restore fix: commit</w:t>
+      </w:r>
+      <w:r>
+        <w:t xml:space="preserve"> </w:t>
+      </w:r>
+      <w:r>
+        <w:rPr>
+          <w:rStyle w:val="VerbatimChar"/>
+        </w:rPr>
+        <w:t xml:space="preserve">9f6e478</w:t>
+      </w:r>
+      <w:r>
+        <w:t xml:space="preserve"> </w:t>
+      </w:r>
+      <w:r>
+        <w:t xml:space="preserve">rebuilds fallback suggestions when classified conversations have an empty</w:t>
+      </w:r>
+      <w:r>
+        <w:t xml:space="preserve"> </w:t>
+      </w:r>
+      <w:r>
+        <w:rPr>
+          <w:rStyle w:val="VerbatimChar"/>
+        </w:rPr>
+        <w:t xml:space="preserve">aiSuggestions</w:t>
+      </w:r>
+      <w:r>
+        <w:t xml:space="preserve"> </w:t>
+      </w:r>
+      <w:r>
+        <w:t xml:space="preserve">array; targeted regression</w:t>
+      </w:r>
+      <w:r>
+        <w:t xml:space="preserve"> </w:t>
+      </w:r>
+      <w:r>
+        <w:rPr>
+          <w:rStyle w:val="VerbatimChar"/>
+        </w:rPr>
+        <w:t xml:space="preserve">server/tests/aiSuggestionPolicy.test.ts</w:t>
+      </w:r>
+      <w:r>
+        <w:t xml:space="preserve"> </w:t>
+      </w:r>
+      <w:r>
+        <w:t xml:space="preserve">passed 5/5;</w:t>
+      </w:r>
+      <w:r>
+        <w:t xml:space="preserve"> </w:t>
+      </w:r>
+      <w:r>
+        <w:rPr>
+          <w:rStyle w:val="VerbatimChar"/>
+        </w:rPr>
+        <w:t xml:space="preserve">server npm run build</w:t>
+      </w:r>
+      <w:r>
+        <w:t xml:space="preserve"> </w:t>
+      </w:r>
+      <w:r>
+        <w:t xml:space="preserve">passed.</w:t>
       </w:r>
     </w:p>
     <w:p>
@@ -10508,286 +10883,70 @@
         </w:numPr>
       </w:pPr>
       <w:r>
-        <w:t xml:space="preserve">Production health:</w:t>
-      </w:r>
-      <w:r>
-        <w:t xml:space="preserve"> </w:t>
-      </w:r>
-      <w:r>
-        <w:rPr>
-          <w:rStyle w:val="VerbatimChar"/>
-        </w:rPr>
-        <w:t xml:space="preserve">http://127.0.0.1:3001/api/health</w:t>
-      </w:r>
-      <w:r>
-        <w:t xml:space="preserve"> </w:t>
-      </w:r>
-      <w:r>
-        <w:t xml:space="preserve">returned</w:t>
-      </w:r>
-      <w:r>
-        <w:t xml:space="preserve"> </w:t>
-      </w:r>
-      <w:r>
-        <w:rPr>
-          <w:rStyle w:val="VerbatimChar"/>
-        </w:rPr>
-        <w:t xml:space="preserve">ok/ok/ok</w:t>
-      </w:r>
-      <w:r>
-        <w:t xml:space="preserve"> </w:t>
-      </w:r>
-      <w:r>
-        <w:t xml:space="preserve">for app/database/redis.</w:t>
-      </w:r>
-    </w:p>
-    <w:p>
-      <w:pPr>
-        <w:pStyle w:val="Compact"/>
-        <w:numPr>
-          <w:ilvl w:val="0"/>
-          <w:numId w:val="1302"/>
-        </w:numPr>
-      </w:pPr>
-      <w:r>
-        <w:t xml:space="preserve">PM2:</w:t>
-      </w:r>
-      <w:r>
-        <w:t xml:space="preserve"> </w:t>
-      </w:r>
-      <w:r>
-        <w:rPr>
-          <w:rStyle w:val="VerbatimChar"/>
-        </w:rPr>
-        <w:t xml:space="preserve">sms-api</w:t>
-      </w:r>
-      <w:r>
-        <w:t xml:space="preserve"> </w:t>
-      </w:r>
-      <w:r>
-        <w:t xml:space="preserve">online after restart; restart count</w:t>
-      </w:r>
-      <w:r>
-        <w:t xml:space="preserve"> </w:t>
-      </w:r>
-      <w:r>
-        <w:rPr>
-          <w:rStyle w:val="VerbatimChar"/>
-        </w:rPr>
-        <w:t xml:space="preserve">11</w:t>
-      </w:r>
-      <w:r>
-        <w:t xml:space="preserve">.</w:t>
-      </w:r>
-    </w:p>
-    <w:p>
-      <w:pPr>
-        <w:pStyle w:val="Compact"/>
-        <w:numPr>
-          <w:ilvl w:val="0"/>
-          <w:numId w:val="1302"/>
-        </w:numPr>
-      </w:pPr>
-      <w:r>
-        <w:t xml:space="preserve">Production runtime logs: PM2</w:t>
-      </w:r>
-      <w:r>
-        <w:t xml:space="preserve"> </w:t>
-      </w:r>
-      <w:r>
-        <w:rPr>
-          <w:rStyle w:val="VerbatimChar"/>
-        </w:rPr>
-        <w:t xml:space="preserve">out</w:t>
-      </w:r>
-      <w:r>
-        <w:t xml:space="preserve">/</w:t>
-      </w:r>
-      <w:r>
-        <w:rPr>
-          <w:rStyle w:val="VerbatimChar"/>
-        </w:rPr>
-        <w:t xml:space="preserve">error</w:t>
-      </w:r>
-      <w:r>
-        <w:t xml:space="preserve"> </w:t>
-      </w:r>
-      <w:r>
-        <w:t xml:space="preserve">tails were empty immediately after deploy; no fresh runtime errors were emitted after restart.</w:t>
-      </w:r>
-    </w:p>
-    <w:p>
-      <w:pPr>
-        <w:pStyle w:val="Compact"/>
-        <w:numPr>
-          <w:ilvl w:val="0"/>
-          <w:numId w:val="1302"/>
-        </w:numPr>
-      </w:pPr>
-      <w:r>
-        <w:t xml:space="preserve">Latest CI proof: run</w:t>
-      </w:r>
-      <w:r>
-        <w:t xml:space="preserve"> </w:t>
-      </w:r>
-      <w:r>
-        <w:rPr>
-          <w:rStyle w:val="VerbatimChar"/>
-        </w:rPr>
-        <w:t xml:space="preserve">25068339405</w:t>
-      </w:r>
-      <w:r>
-        <w:t xml:space="preserve">, commit</w:t>
-      </w:r>
-      <w:r>
-        <w:t xml:space="preserve"> </w:t>
-      </w:r>
-      <w:r>
-        <w:rPr>
-          <w:rStyle w:val="VerbatimChar"/>
-        </w:rPr>
-        <w:t xml:space="preserve">b2572de</w:t>
-      </w:r>
-      <w:r>
-        <w:t xml:space="preserve">, jobs completed successfully.</w:t>
-      </w:r>
-    </w:p>
-    <w:p>
-      <w:pPr>
-        <w:pStyle w:val="Compact"/>
-        <w:numPr>
-          <w:ilvl w:val="0"/>
-          <w:numId w:val="1302"/>
-        </w:numPr>
-      </w:pPr>
-      <w:r>
-        <w:t xml:space="preserve">Latest production build proof: server build passed; client build passed with known CSS minify warning</w:t>
-      </w:r>
-      <w:r>
-        <w:t xml:space="preserve"> </w:t>
-      </w:r>
-      <w:r>
-        <w:rPr>
-          <w:rStyle w:val="VerbatimChar"/>
-        </w:rPr>
-        <w:t xml:space="preserve">.light .bg-dark-800.border*</w:t>
-      </w:r>
-      <w:r>
-        <w:t xml:space="preserve"> </w:t>
-      </w:r>
-      <w:r>
-        <w:t xml:space="preserve">only.</w:t>
-      </w:r>
-    </w:p>
-    <w:p>
-      <w:pPr>
-        <w:pStyle w:val="Compact"/>
-        <w:numPr>
-          <w:ilvl w:val="0"/>
-          <w:numId w:val="1302"/>
-        </w:numPr>
-      </w:pPr>
-      <w:r>
-        <w:t xml:space="preserve">Public frontend smoke:</w:t>
-      </w:r>
-      <w:r>
-        <w:t xml:space="preserve"> </w:t>
-      </w:r>
-      <w:r>
-        <w:rPr>
-          <w:rStyle w:val="VerbatimChar"/>
-        </w:rPr>
-        <w:t xml:space="preserve">https://app.sclcapital.io/</w:t>
-      </w:r>
-      <w:r>
-        <w:t xml:space="preserve"> </w:t>
-      </w:r>
-      <w:r>
-        <w:t xml:space="preserve">returned</w:t>
-      </w:r>
-      <w:r>
-        <w:t xml:space="preserve"> </w:t>
-      </w:r>
-      <w:r>
-        <w:rPr>
-          <w:rStyle w:val="VerbatimChar"/>
-        </w:rPr>
-        <w:t xml:space="preserve">200 OK</w:t>
-      </w:r>
-      <w:r>
-        <w:t xml:space="preserve"> </w:t>
-      </w:r>
-      <w:r>
-        <w:t xml:space="preserve">and current index timestamp after deploy.</w:t>
-      </w:r>
-    </w:p>
-    <w:p>
-      <w:pPr>
-        <w:pStyle w:val="Compact"/>
-        <w:numPr>
-          <w:ilvl w:val="0"/>
-          <w:numId w:val="1302"/>
-        </w:numPr>
-      </w:pPr>
-      <w:r>
-        <w:t xml:space="preserve">Current unread-badge fix: sidebar Inbox badge now uses unread conversation count, matching Inbox/Admin View and the User Guide contract.</w:t>
-      </w:r>
-    </w:p>
-    <w:p>
-      <w:pPr>
-        <w:pStyle w:val="Compact"/>
-        <w:numPr>
-          <w:ilvl w:val="0"/>
-          <w:numId w:val="1302"/>
-        </w:numPr>
-      </w:pPr>
-      <w:r>
-        <w:t xml:space="preserve">Latest AI suggestion reply-refresh fix: commit</w:t>
-      </w:r>
-      <w:r>
-        <w:t xml:space="preserve"> </w:t>
-      </w:r>
-      <w:r>
-        <w:rPr>
-          <w:rStyle w:val="VerbatimChar"/>
-        </w:rPr>
-        <w:t xml:space="preserve">a5b587f</w:t>
-      </w:r>
-      <w:r>
-        <w:t xml:space="preserve"> </w:t>
-      </w:r>
-      <w:r>
-        <w:t xml:space="preserve">triggers owner-action reclassification after successful outbound reply; targeted regression</w:t>
-      </w:r>
-      <w:r>
-        <w:t xml:space="preserve"> </w:t>
-      </w:r>
-      <w:r>
-        <w:rPr>
-          <w:rStyle w:val="VerbatimChar"/>
-        </w:rPr>
-        <w:t xml:space="preserve">server/tests/inboxReplyReclassification.test.ts</w:t>
-      </w:r>
-      <w:r>
-        <w:t xml:space="preserve"> </w:t>
-      </w:r>
-      <w:r>
-        <w:t xml:space="preserve">passed 2/2;</w:t>
-      </w:r>
-      <w:r>
-        <w:t xml:space="preserve"> </w:t>
-      </w:r>
-      <w:r>
-        <w:rPr>
-          <w:rStyle w:val="VerbatimChar"/>
-        </w:rPr>
-        <w:t xml:space="preserve">server npm run build</w:t>
-      </w:r>
-      <w:r>
-        <w:t xml:space="preserve"> </w:t>
-      </w:r>
-      <w:r>
-        <w:t xml:space="preserve">passed.</w:t>
+        <w:t xml:space="preserve">Production API verification after deploy: previously broken threads</w:t>
+      </w:r>
+      <w:r>
+        <w:t xml:space="preserve"> </w:t>
+      </w:r>
+      <w:r>
+        <w:rPr>
+          <w:rStyle w:val="VerbatimChar"/>
+        </w:rPr>
+        <w:t xml:space="preserve">Audrey Berry $150,000.00</w:t>
+      </w:r>
+      <w:r>
+        <w:t xml:space="preserve"> </w:t>
+      </w:r>
+      <w:r>
+        <w:t xml:space="preserve">(</w:t>
+      </w:r>
+      <w:r>
+        <w:rPr>
+          <w:rStyle w:val="VerbatimChar"/>
+        </w:rPr>
+        <w:t xml:space="preserve">cmnt61hpb01cxzosfj9e0gj7d</w:t>
+      </w:r>
+      <w:r>
+        <w:t xml:space="preserve">) and</w:t>
+      </w:r>
+      <w:r>
+        <w:t xml:space="preserve"> </w:t>
+      </w:r>
+      <w:r>
+        <w:rPr>
+          <w:rStyle w:val="VerbatimChar"/>
+        </w:rPr>
+        <w:t xml:space="preserve">Jamie Johnson</w:t>
+      </w:r>
+      <w:r>
+        <w:t xml:space="preserve"> </w:t>
+      </w:r>
+      <w:r>
+        <w:t xml:space="preserve">(</w:t>
+      </w:r>
+      <w:r>
+        <w:rPr>
+          <w:rStyle w:val="VerbatimChar"/>
+        </w:rPr>
+        <w:t xml:space="preserve">cmoiqslus0d9tzo5uwqu6c25a</w:t>
+      </w:r>
+      <w:r>
+        <w:t xml:space="preserve">) now return</w:t>
+      </w:r>
+      <w:r>
+        <w:t xml:space="preserve"> </w:t>
+      </w:r>
+      <w:r>
+        <w:rPr>
+          <w:rStyle w:val="VerbatimChar"/>
+        </w:rPr>
+        <w:t xml:space="preserve">aiSuggestionsCount=1</w:t>
+      </w:r>
+      <w:r>
+        <w:t xml:space="preserve"> </w:t>
+      </w:r>
+      <w:r>
+        <w:t xml:space="preserve">with non-empty fallback text.</w:t>
       </w:r>
     </w:p>
     <w:p>
@@ -10937,12 +11096,12 @@
         <w:tblLook w:firstRow="1" w:lastRow="0" w:firstColumn="0" w:lastColumn="0" w:noHBand="0" w:noVBand="0" w:val="0020"/>
       </w:tblPr>
       <w:tblGrid>
-        <w:gridCol w:w="457"/>
-        <w:gridCol w:w="961"/>
-        <w:gridCol w:w="2609"/>
-        <w:gridCol w:w="457"/>
-        <w:gridCol w:w="3158"/>
-        <w:gridCol w:w="274"/>
+        <w:gridCol w:w="450"/>
+        <w:gridCol w:w="945"/>
+        <w:gridCol w:w="2655"/>
+        <w:gridCol w:w="450"/>
+        <w:gridCol w:w="3105"/>
+        <w:gridCol w:w="315"/>
       </w:tblGrid>
       <w:tr>
         <w:trPr>
@@ -13104,6 +13263,166 @@
             </w:pPr>
             <w:r>
               <w:t xml:space="preserve">Blocked</w:t>
+            </w:r>
+          </w:p>
+        </w:tc>
+      </w:tr>
+      <w:tr>
+        <w:tc>
+          <w:tcPr/>
+          <w:p>
+            <w:pPr>
+              <w:pStyle w:val="Compact"/>
+            </w:pPr>
+            <w:r>
+              <w:t xml:space="preserve">2026-04-28</w:t>
+            </w:r>
+          </w:p>
+        </w:tc>
+        <w:tc>
+          <w:tcPr/>
+          <w:p>
+            <w:pPr>
+              <w:pStyle w:val="Compact"/>
+            </w:pPr>
+            <w:r>
+              <w:t xml:space="preserve">AI Suggestions</w:t>
+            </w:r>
+          </w:p>
+        </w:tc>
+        <w:tc>
+          <w:tcPr/>
+          <w:p>
+            <w:pPr>
+              <w:pStyle w:val="Compact"/>
+            </w:pPr>
+            <w:r>
+              <w:t xml:space="preserve">Restored fallback suggestions for classified empty threads</w:t>
+            </w:r>
+          </w:p>
+        </w:tc>
+        <w:tc>
+          <w:tcPr/>
+          <w:p>
+            <w:pPr>
+              <w:pStyle w:val="Compact"/>
+            </w:pPr>
+            <w:r>
+              <w:t xml:space="preserve">9f6e478</w:t>
+            </w:r>
+          </w:p>
+        </w:tc>
+        <w:tc>
+          <w:tcPr/>
+          <w:p>
+            <w:pPr>
+              <w:pStyle w:val="Compact"/>
+            </w:pPr>
+            <w:r>
+              <w:t xml:space="preserve">Targeted regression 5/5 passed;</w:t>
+            </w:r>
+            <w:r>
+              <w:t xml:space="preserve"> </w:t>
+            </w:r>
+            <w:r>
+              <w:rPr>
+                <w:rStyle w:val="VerbatimChar"/>
+              </w:rPr>
+              <w:t xml:space="preserve">server npm run build</w:t>
+            </w:r>
+            <w:r>
+              <w:t xml:space="preserve"> </w:t>
+            </w:r>
+            <w:r>
+              <w:t xml:space="preserve">passed</w:t>
+            </w:r>
+          </w:p>
+        </w:tc>
+        <w:tc>
+          <w:tcPr/>
+          <w:p>
+            <w:pPr>
+              <w:pStyle w:val="Compact"/>
+            </w:pPr>
+            <w:r>
+              <w:t xml:space="preserve">Done</w:t>
+            </w:r>
+          </w:p>
+        </w:tc>
+      </w:tr>
+      <w:tr>
+        <w:tc>
+          <w:tcPr/>
+          <w:p>
+            <w:pPr>
+              <w:pStyle w:val="Compact"/>
+            </w:pPr>
+            <w:r>
+              <w:t xml:space="preserve">2026-04-28</w:t>
+            </w:r>
+          </w:p>
+        </w:tc>
+        <w:tc>
+          <w:tcPr/>
+          <w:p>
+            <w:pPr>
+              <w:pStyle w:val="Compact"/>
+            </w:pPr>
+            <w:r>
+              <w:t xml:space="preserve">Production Deploy</w:t>
+            </w:r>
+          </w:p>
+        </w:tc>
+        <w:tc>
+          <w:tcPr/>
+          <w:p>
+            <w:pPr>
+              <w:pStyle w:val="Compact"/>
+            </w:pPr>
+            <w:r>
+              <w:t xml:space="preserve">Deployed AI suggestion fallback restore fix to production</w:t>
+            </w:r>
+          </w:p>
+        </w:tc>
+        <w:tc>
+          <w:tcPr/>
+          <w:p>
+            <w:pPr>
+              <w:pStyle w:val="Compact"/>
+            </w:pPr>
+            <w:r>
+              <w:t xml:space="preserve">9f6e478</w:t>
+            </w:r>
+          </w:p>
+        </w:tc>
+        <w:tc>
+          <w:tcPr/>
+          <w:p>
+            <w:pPr>
+              <w:pStyle w:val="Compact"/>
+            </w:pPr>
+            <w:r>
+              <w:t xml:space="preserve">Audrey/Jamie API checks now return</w:t>
+            </w:r>
+            <w:r>
+              <w:t xml:space="preserve"> </w:t>
+            </w:r>
+            <w:r>
+              <w:rPr>
+                <w:rStyle w:val="VerbatimChar"/>
+              </w:rPr>
+              <w:t xml:space="preserve">aiSuggestionsCount=1</w:t>
+            </w:r>
+          </w:p>
+        </w:tc>
+        <w:tc>
+          <w:tcPr/>
+          <w:p>
+            <w:pPr>
+              <w:pStyle w:val="Compact"/>
+            </w:pPr>
+            <w:r>
+              <w:t xml:space="preserve">Done</w:t>
             </w:r>
           </w:p>
         </w:tc>

</xml_diff>

<commit_message>
docs(checklist): record handoff ai fix
</commit_message>
<xml_diff>
--- a/CHECKLIST_M1_M2_REMEDIATION_2026-04-28.docx
+++ b/CHECKLIST_M1_M2_REMEDIATION_2026-04-28.docx
@@ -10370,52 +10370,532 @@
         <w:rPr>
           <w:rStyle w:val="VerbatimChar"/>
         </w:rPr>
+        <w:t xml:space="preserve">34e62a9</w:t>
+      </w:r>
+      <w:r>
+        <w:t xml:space="preserve"> </w:t>
+      </w:r>
+      <w:r>
+        <w:t xml:space="preserve">on</w:t>
+      </w:r>
+      <w:r>
+        <w:t xml:space="preserve"> </w:t>
+      </w:r>
+      <w:r>
+        <w:rPr>
+          <w:rStyle w:val="VerbatimChar"/>
+        </w:rPr>
+        <w:t xml:space="preserve">deploy/mysql-hosting</w:t>
+      </w:r>
+      <w:r>
+        <w:t xml:space="preserve">; production</w:t>
+      </w:r>
+      <w:r>
+        <w:t xml:space="preserve"> </w:t>
+      </w:r>
+      <w:r>
+        <w:rPr>
+          <w:rStyle w:val="VerbatimChar"/>
+        </w:rPr>
+        <w:t xml:space="preserve">git status --porcelain</w:t>
+      </w:r>
+      <w:r>
+        <w:t xml:space="preserve"> </w:t>
+      </w:r>
+      <w:r>
+        <w:t xml:space="preserve">lines:</w:t>
+      </w:r>
+      <w:r>
+        <w:t xml:space="preserve"> </w:t>
+      </w:r>
+      <w:r>
+        <w:rPr>
+          <w:rStyle w:val="VerbatimChar"/>
+        </w:rPr>
+        <w:t xml:space="preserve">0</w:t>
+      </w:r>
+      <w:r>
+        <w:t xml:space="preserve">.</w:t>
+      </w:r>
+    </w:p>
+    <w:p>
+      <w:pPr>
+        <w:pStyle w:val="Compact"/>
+        <w:numPr>
+          <w:ilvl w:val="0"/>
+          <w:numId w:val="1302"/>
+        </w:numPr>
+      </w:pPr>
+      <w:r>
+        <w:t xml:space="preserve">Production deploy path used committed code only: initial full deploy fast-forwarded</w:t>
+      </w:r>
+      <w:r>
+        <w:t xml:space="preserve"> </w:t>
+      </w:r>
+      <w:r>
+        <w:rPr>
+          <w:rStyle w:val="VerbatimChar"/>
+        </w:rPr>
+        <w:t xml:space="preserve">e596d85..15414cf</w:t>
+      </w:r>
+      <w:r>
+        <w:t xml:space="preserve">, then unread-badge frontend-only fast-forward</w:t>
+      </w:r>
+      <w:r>
+        <w:t xml:space="preserve"> </w:t>
+      </w:r>
+      <w:r>
+        <w:rPr>
+          <w:rStyle w:val="VerbatimChar"/>
+        </w:rPr>
+        <w:t xml:space="preserve">15414cf..b2572de</w:t>
+      </w:r>
+      <w:r>
+        <w:t xml:space="preserve">, then AI-suggestion reply-refresh fast-forward</w:t>
+      </w:r>
+      <w:r>
+        <w:t xml:space="preserve"> </w:t>
+      </w:r>
+      <w:r>
+        <w:rPr>
+          <w:rStyle w:val="VerbatimChar"/>
+        </w:rPr>
+        <w:t xml:space="preserve">b2572de..a5b587f</w:t>
+      </w:r>
+      <w:r>
+        <w:t xml:space="preserve">, then fallback-suggestion restore fast-forward</w:t>
+      </w:r>
+      <w:r>
+        <w:t xml:space="preserve"> </w:t>
+      </w:r>
+      <w:r>
+        <w:rPr>
+          <w:rStyle w:val="VerbatimChar"/>
+        </w:rPr>
+        <w:t xml:space="preserve">a5b587f..9f6e478</w:t>
+      </w:r>
+      <w:r>
+        <w:t xml:space="preserve">, then email-suggestion repair fast-forward</w:t>
+      </w:r>
+      <w:r>
+        <w:t xml:space="preserve"> </w:t>
+      </w:r>
+      <w:r>
+        <w:rPr>
+          <w:rStyle w:val="VerbatimChar"/>
+        </w:rPr>
+        <w:t xml:space="preserve">9f6e478..064b88d</w:t>
+      </w:r>
+      <w:r>
+        <w:t xml:space="preserve">, then handoff-gap-selling restore fast-forward</w:t>
+      </w:r>
+      <w:r>
+        <w:t xml:space="preserve"> </w:t>
+      </w:r>
+      <w:r>
+        <w:rPr>
+          <w:rStyle w:val="VerbatimChar"/>
+        </w:rPr>
+        <w:t xml:space="preserve">064b88d..34e62a9</w:t>
+      </w:r>
+      <w:r>
+        <w:t xml:space="preserve"> </w:t>
+      </w:r>
+      <w:r>
+        <w:t xml:space="preserve">with fresh</w:t>
+      </w:r>
+      <w:r>
+        <w:t xml:space="preserve"> </w:t>
+      </w:r>
+      <w:r>
+        <w:rPr>
+          <w:rStyle w:val="VerbatimChar"/>
+        </w:rPr>
+        <w:t xml:space="preserve">server</w:t>
+      </w:r>
+      <w:r>
+        <w:t xml:space="preserve"> </w:t>
+      </w:r>
+      <w:r>
+        <w:t xml:space="preserve">and</w:t>
+      </w:r>
+      <w:r>
+        <w:t xml:space="preserve"> </w:t>
+      </w:r>
+      <w:r>
+        <w:rPr>
+          <w:rStyle w:val="VerbatimChar"/>
+        </w:rPr>
+        <w:t xml:space="preserve">client</w:t>
+      </w:r>
+      <w:r>
+        <w:t xml:space="preserve"> </w:t>
+      </w:r>
+      <w:r>
+        <w:t xml:space="preserve">builds on production.</w:t>
+      </w:r>
+    </w:p>
+    <w:p>
+      <w:pPr>
+        <w:pStyle w:val="Compact"/>
+        <w:numPr>
+          <w:ilvl w:val="0"/>
+          <w:numId w:val="1302"/>
+        </w:numPr>
+      </w:pPr>
+      <w:r>
+        <w:t xml:space="preserve">Production health:</w:t>
+      </w:r>
+      <w:r>
+        <w:t xml:space="preserve"> </w:t>
+      </w:r>
+      <w:r>
+        <w:rPr>
+          <w:rStyle w:val="VerbatimChar"/>
+        </w:rPr>
+        <w:t xml:space="preserve">http://127.0.0.1:3001/api/health</w:t>
+      </w:r>
+      <w:r>
+        <w:t xml:space="preserve"> </w:t>
+      </w:r>
+      <w:r>
+        <w:t xml:space="preserve">returned</w:t>
+      </w:r>
+      <w:r>
+        <w:t xml:space="preserve"> </w:t>
+      </w:r>
+      <w:r>
+        <w:rPr>
+          <w:rStyle w:val="VerbatimChar"/>
+        </w:rPr>
+        <w:t xml:space="preserve">ok/ok/ok</w:t>
+      </w:r>
+      <w:r>
+        <w:t xml:space="preserve"> </w:t>
+      </w:r>
+      <w:r>
+        <w:t xml:space="preserve">for app/database/redis.</w:t>
+      </w:r>
+    </w:p>
+    <w:p>
+      <w:pPr>
+        <w:pStyle w:val="Compact"/>
+        <w:numPr>
+          <w:ilvl w:val="0"/>
+          <w:numId w:val="1302"/>
+        </w:numPr>
+      </w:pPr>
+      <w:r>
+        <w:t xml:space="preserve">PM2:</w:t>
+      </w:r>
+      <w:r>
+        <w:t xml:space="preserve"> </w:t>
+      </w:r>
+      <w:r>
+        <w:rPr>
+          <w:rStyle w:val="VerbatimChar"/>
+        </w:rPr>
+        <w:t xml:space="preserve">sms-api</w:t>
+      </w:r>
+      <w:r>
+        <w:t xml:space="preserve"> </w:t>
+      </w:r>
+      <w:r>
+        <w:t xml:space="preserve">online after restart; restart count</w:t>
+      </w:r>
+      <w:r>
+        <w:t xml:space="preserve"> </w:t>
+      </w:r>
+      <w:r>
+        <w:rPr>
+          <w:rStyle w:val="VerbatimChar"/>
+        </w:rPr>
+        <w:t xml:space="preserve">15</w:t>
+      </w:r>
+      <w:r>
+        <w:t xml:space="preserve">.</w:t>
+      </w:r>
+    </w:p>
+    <w:p>
+      <w:pPr>
+        <w:pStyle w:val="Compact"/>
+        <w:numPr>
+          <w:ilvl w:val="0"/>
+          <w:numId w:val="1302"/>
+        </w:numPr>
+      </w:pPr>
+      <w:r>
+        <w:t xml:space="preserve">Production runtime logs: PM2</w:t>
+      </w:r>
+      <w:r>
+        <w:t xml:space="preserve"> </w:t>
+      </w:r>
+      <w:r>
+        <w:rPr>
+          <w:rStyle w:val="VerbatimChar"/>
+        </w:rPr>
+        <w:t xml:space="preserve">out</w:t>
+      </w:r>
+      <w:r>
+        <w:t xml:space="preserve">/</w:t>
+      </w:r>
+      <w:r>
+        <w:rPr>
+          <w:rStyle w:val="VerbatimChar"/>
+        </w:rPr>
+        <w:t xml:space="preserve">error</w:t>
+      </w:r>
+      <w:r>
+        <w:t xml:space="preserve"> </w:t>
+      </w:r>
+      <w:r>
+        <w:t xml:space="preserve">tails were empty immediately after deploy; no fresh runtime errors were emitted after restart.</w:t>
+      </w:r>
+    </w:p>
+    <w:p>
+      <w:pPr>
+        <w:pStyle w:val="Compact"/>
+        <w:numPr>
+          <w:ilvl w:val="0"/>
+          <w:numId w:val="1302"/>
+        </w:numPr>
+      </w:pPr>
+      <w:r>
+        <w:t xml:space="preserve">Latest CI proof: run</w:t>
+      </w:r>
+      <w:r>
+        <w:t xml:space="preserve"> </w:t>
+      </w:r>
+      <w:r>
+        <w:rPr>
+          <w:rStyle w:val="VerbatimChar"/>
+        </w:rPr>
+        <w:t xml:space="preserve">25068339405</w:t>
+      </w:r>
+      <w:r>
+        <w:t xml:space="preserve">, commit</w:t>
+      </w:r>
+      <w:r>
+        <w:t xml:space="preserve"> </w:t>
+      </w:r>
+      <w:r>
+        <w:rPr>
+          <w:rStyle w:val="VerbatimChar"/>
+        </w:rPr>
+        <w:t xml:space="preserve">b2572de</w:t>
+      </w:r>
+      <w:r>
+        <w:t xml:space="preserve">, jobs completed successfully.</w:t>
+      </w:r>
+    </w:p>
+    <w:p>
+      <w:pPr>
+        <w:pStyle w:val="Compact"/>
+        <w:numPr>
+          <w:ilvl w:val="0"/>
+          <w:numId w:val="1302"/>
+        </w:numPr>
+      </w:pPr>
+      <w:r>
+        <w:t xml:space="preserve">Latest production build proof: server build passed; client build passed with known CSS minify warning</w:t>
+      </w:r>
+      <w:r>
+        <w:t xml:space="preserve"> </w:t>
+      </w:r>
+      <w:r>
+        <w:rPr>
+          <w:rStyle w:val="VerbatimChar"/>
+        </w:rPr>
+        <w:t xml:space="preserve">.light .bg-dark-800.border*</w:t>
+      </w:r>
+      <w:r>
+        <w:t xml:space="preserve"> </w:t>
+      </w:r>
+      <w:r>
+        <w:t xml:space="preserve">only.</w:t>
+      </w:r>
+    </w:p>
+    <w:p>
+      <w:pPr>
+        <w:pStyle w:val="Compact"/>
+        <w:numPr>
+          <w:ilvl w:val="0"/>
+          <w:numId w:val="1302"/>
+        </w:numPr>
+      </w:pPr>
+      <w:r>
+        <w:t xml:space="preserve">Public frontend smoke:</w:t>
+      </w:r>
+      <w:r>
+        <w:t xml:space="preserve"> </w:t>
+      </w:r>
+      <w:r>
+        <w:rPr>
+          <w:rStyle w:val="VerbatimChar"/>
+        </w:rPr>
+        <w:t xml:space="preserve">https://app.sclcapital.io/</w:t>
+      </w:r>
+      <w:r>
+        <w:t xml:space="preserve"> </w:t>
+      </w:r>
+      <w:r>
+        <w:t xml:space="preserve">returned</w:t>
+      </w:r>
+      <w:r>
+        <w:t xml:space="preserve"> </w:t>
+      </w:r>
+      <w:r>
+        <w:rPr>
+          <w:rStyle w:val="VerbatimChar"/>
+        </w:rPr>
+        <w:t xml:space="preserve">200 OK</w:t>
+      </w:r>
+      <w:r>
+        <w:t xml:space="preserve"> </w:t>
+      </w:r>
+      <w:r>
+        <w:t xml:space="preserve">and current index timestamp after deploy.</w:t>
+      </w:r>
+    </w:p>
+    <w:p>
+      <w:pPr>
+        <w:pStyle w:val="Compact"/>
+        <w:numPr>
+          <w:ilvl w:val="0"/>
+          <w:numId w:val="1302"/>
+        </w:numPr>
+      </w:pPr>
+      <w:r>
+        <w:t xml:space="preserve">Current unread-badge fix: sidebar Inbox badge now uses unread conversation count, matching Inbox/Admin View and the User Guide contract.</w:t>
+      </w:r>
+    </w:p>
+    <w:p>
+      <w:pPr>
+        <w:pStyle w:val="Compact"/>
+        <w:numPr>
+          <w:ilvl w:val="0"/>
+          <w:numId w:val="1302"/>
+        </w:numPr>
+      </w:pPr>
+      <w:r>
+        <w:t xml:space="preserve">Latest AI suggestion reply-refresh fix: commit</w:t>
+      </w:r>
+      <w:r>
+        <w:t xml:space="preserve"> </w:t>
+      </w:r>
+      <w:r>
+        <w:rPr>
+          <w:rStyle w:val="VerbatimChar"/>
+        </w:rPr>
+        <w:t xml:space="preserve">a5b587f</w:t>
+      </w:r>
+      <w:r>
+        <w:t xml:space="preserve"> </w:t>
+      </w:r>
+      <w:r>
+        <w:t xml:space="preserve">triggers owner-action reclassification after successful outbound reply; targeted regression</w:t>
+      </w:r>
+      <w:r>
+        <w:t xml:space="preserve"> </w:t>
+      </w:r>
+      <w:r>
+        <w:rPr>
+          <w:rStyle w:val="VerbatimChar"/>
+        </w:rPr>
+        <w:t xml:space="preserve">server/tests/inboxReplyReclassification.test.ts</w:t>
+      </w:r>
+      <w:r>
+        <w:t xml:space="preserve"> </w:t>
+      </w:r>
+      <w:r>
+        <w:t xml:space="preserve">passed 2/2;</w:t>
+      </w:r>
+      <w:r>
+        <w:t xml:space="preserve"> </w:t>
+      </w:r>
+      <w:r>
+        <w:rPr>
+          <w:rStyle w:val="VerbatimChar"/>
+        </w:rPr>
+        <w:t xml:space="preserve">server npm run build</w:t>
+      </w:r>
+      <w:r>
+        <w:t xml:space="preserve"> </w:t>
+      </w:r>
+      <w:r>
+        <w:t xml:space="preserve">passed.</w:t>
+      </w:r>
+    </w:p>
+    <w:p>
+      <w:pPr>
+        <w:pStyle w:val="Compact"/>
+        <w:numPr>
+          <w:ilvl w:val="0"/>
+          <w:numId w:val="1302"/>
+        </w:numPr>
+      </w:pPr>
+      <w:r>
+        <w:t xml:space="preserve">Latest AI suggestion restore fix: commit</w:t>
+      </w:r>
+      <w:r>
+        <w:t xml:space="preserve"> </w:t>
+      </w:r>
+      <w:r>
+        <w:rPr>
+          <w:rStyle w:val="VerbatimChar"/>
+        </w:rPr>
         <w:t xml:space="preserve">9f6e478</w:t>
       </w:r>
       <w:r>
         <w:t xml:space="preserve"> </w:t>
       </w:r>
       <w:r>
-        <w:t xml:space="preserve">on</w:t>
-      </w:r>
-      <w:r>
-        <w:t xml:space="preserve"> </w:t>
-      </w:r>
-      <w:r>
-        <w:rPr>
-          <w:rStyle w:val="VerbatimChar"/>
-        </w:rPr>
-        <w:t xml:space="preserve">deploy/mysql-hosting</w:t>
-      </w:r>
-      <w:r>
-        <w:t xml:space="preserve">; production</w:t>
-      </w:r>
-      <w:r>
-        <w:t xml:space="preserve"> </w:t>
-      </w:r>
-      <w:r>
-        <w:rPr>
-          <w:rStyle w:val="VerbatimChar"/>
-        </w:rPr>
-        <w:t xml:space="preserve">git status --porcelain</w:t>
-      </w:r>
-      <w:r>
-        <w:t xml:space="preserve"> </w:t>
-      </w:r>
-      <w:r>
-        <w:t xml:space="preserve">lines:</w:t>
-      </w:r>
-      <w:r>
-        <w:t xml:space="preserve"> </w:t>
-      </w:r>
-      <w:r>
-        <w:rPr>
-          <w:rStyle w:val="VerbatimChar"/>
-        </w:rPr>
-        <w:t xml:space="preserve">0</w:t>
-      </w:r>
-      <w:r>
-        <w:t xml:space="preserve">.</w:t>
+        <w:t xml:space="preserve">rebuilds fallback suggestions when classified conversations have an empty</w:t>
+      </w:r>
+      <w:r>
+        <w:t xml:space="preserve"> </w:t>
+      </w:r>
+      <w:r>
+        <w:rPr>
+          <w:rStyle w:val="VerbatimChar"/>
+        </w:rPr>
+        <w:t xml:space="preserve">aiSuggestions</w:t>
+      </w:r>
+      <w:r>
+        <w:t xml:space="preserve"> </w:t>
+      </w:r>
+      <w:r>
+        <w:t xml:space="preserve">array; targeted regression</w:t>
+      </w:r>
+      <w:r>
+        <w:t xml:space="preserve"> </w:t>
+      </w:r>
+      <w:r>
+        <w:rPr>
+          <w:rStyle w:val="VerbatimChar"/>
+        </w:rPr>
+        <w:t xml:space="preserve">server/tests/aiSuggestionPolicy.test.ts</w:t>
+      </w:r>
+      <w:r>
+        <w:t xml:space="preserve"> </w:t>
+      </w:r>
+      <w:r>
+        <w:t xml:space="preserve">passed 5/5;</w:t>
+      </w:r>
+      <w:r>
+        <w:t xml:space="preserve"> </w:t>
+      </w:r>
+      <w:r>
+        <w:rPr>
+          <w:rStyle w:val="VerbatimChar"/>
+        </w:rPr>
+        <w:t xml:space="preserve">server npm run build</w:t>
+      </w:r>
+      <w:r>
+        <w:t xml:space="preserve"> </w:t>
+      </w:r>
+      <w:r>
+        <w:t xml:space="preserve">passed.</w:t>
       </w:r>
     </w:p>
     <w:p>
@@ -10427,67 +10907,226 @@
         </w:numPr>
       </w:pPr>
       <w:r>
-        <w:t xml:space="preserve">Production deploy path used committed code only: initial full deploy fast-forwarded</w:t>
-      </w:r>
-      <w:r>
-        <w:t xml:space="preserve"> </w:t>
-      </w:r>
-      <w:r>
-        <w:rPr>
-          <w:rStyle w:val="VerbatimChar"/>
-        </w:rPr>
-        <w:t xml:space="preserve">e596d85..15414cf</w:t>
-      </w:r>
-      <w:r>
-        <w:t xml:space="preserve">, then unread-badge frontend-only fast-forward</w:t>
-      </w:r>
-      <w:r>
-        <w:t xml:space="preserve"> </w:t>
-      </w:r>
-      <w:r>
-        <w:rPr>
-          <w:rStyle w:val="VerbatimChar"/>
-        </w:rPr>
-        <w:t xml:space="preserve">15414cf..b2572de</w:t>
-      </w:r>
-      <w:r>
-        <w:t xml:space="preserve">, then AI-suggestion reply-refresh fast-forward</w:t>
-      </w:r>
-      <w:r>
-        <w:t xml:space="preserve"> </w:t>
-      </w:r>
-      <w:r>
-        <w:rPr>
-          <w:rStyle w:val="VerbatimChar"/>
-        </w:rPr>
-        <w:t xml:space="preserve">b2572de..a5b587f</w:t>
-      </w:r>
-      <w:r>
-        <w:t xml:space="preserve">, then fallback-suggestion restore fast-forward</w:t>
-      </w:r>
-      <w:r>
-        <w:t xml:space="preserve"> </w:t>
-      </w:r>
-      <w:r>
-        <w:rPr>
-          <w:rStyle w:val="VerbatimChar"/>
-        </w:rPr>
-        <w:t xml:space="preserve">a5b587f..9f6e478</w:t>
-      </w:r>
-      <w:r>
-        <w:t xml:space="preserve"> </w:t>
-      </w:r>
-      <w:r>
-        <w:t xml:space="preserve">with fresh</w:t>
-      </w:r>
-      <w:r>
-        <w:t xml:space="preserve"> </w:t>
-      </w:r>
-      <w:r>
-        <w:rPr>
-          <w:rStyle w:val="VerbatimChar"/>
-        </w:rPr>
-        <w:t xml:space="preserve">server</w:t>
+        <w:t xml:space="preserve">Production API verification after deploy: previously broken threads</w:t>
+      </w:r>
+      <w:r>
+        <w:t xml:space="preserve"> </w:t>
+      </w:r>
+      <w:r>
+        <w:rPr>
+          <w:rStyle w:val="VerbatimChar"/>
+        </w:rPr>
+        <w:t xml:space="preserve">Audrey Berry $150,000.00</w:t>
+      </w:r>
+      <w:r>
+        <w:t xml:space="preserve"> </w:t>
+      </w:r>
+      <w:r>
+        <w:t xml:space="preserve">(</w:t>
+      </w:r>
+      <w:r>
+        <w:rPr>
+          <w:rStyle w:val="VerbatimChar"/>
+        </w:rPr>
+        <w:t xml:space="preserve">cmnt61hpb01cxzosfj9e0gj7d</w:t>
+      </w:r>
+      <w:r>
+        <w:t xml:space="preserve">) and</w:t>
+      </w:r>
+      <w:r>
+        <w:t xml:space="preserve"> </w:t>
+      </w:r>
+      <w:r>
+        <w:rPr>
+          <w:rStyle w:val="VerbatimChar"/>
+        </w:rPr>
+        <w:t xml:space="preserve">Jamie Johnson</w:t>
+      </w:r>
+      <w:r>
+        <w:t xml:space="preserve"> </w:t>
+      </w:r>
+      <w:r>
+        <w:t xml:space="preserve">(</w:t>
+      </w:r>
+      <w:r>
+        <w:rPr>
+          <w:rStyle w:val="VerbatimChar"/>
+        </w:rPr>
+        <w:t xml:space="preserve">cmoiqslus0d9tzo5uwqu6c25a</w:t>
+      </w:r>
+      <w:r>
+        <w:t xml:space="preserve">) now return</w:t>
+      </w:r>
+      <w:r>
+        <w:t xml:space="preserve"> </w:t>
+      </w:r>
+      <w:r>
+        <w:rPr>
+          <w:rStyle w:val="VerbatimChar"/>
+        </w:rPr>
+        <w:t xml:space="preserve">aiSuggestionsCount=1</w:t>
+      </w:r>
+      <w:r>
+        <w:t xml:space="preserve"> </w:t>
+      </w:r>
+      <w:r>
+        <w:t xml:space="preserve">with non-empty fallback text.</w:t>
+      </w:r>
+    </w:p>
+    <w:p>
+      <w:pPr>
+        <w:pStyle w:val="Compact"/>
+        <w:numPr>
+          <w:ilvl w:val="0"/>
+          <w:numId w:val="1302"/>
+        </w:numPr>
+      </w:pPr>
+      <w:r>
+        <w:t xml:space="preserve">Uploaded handoff archive verification:</w:t>
+      </w:r>
+      <w:r>
+        <w:t xml:space="preserve"> </w:t>
+      </w:r>
+      <w:r>
+        <w:rPr>
+          <w:rStyle w:val="VerbatimChar"/>
+        </w:rPr>
+        <w:t xml:space="preserve">scl-handoff-2026-4-25.rar</w:t>
+      </w:r>
+      <w:r>
+        <w:t xml:space="preserve"> </w:t>
+      </w:r>
+      <w:r>
+        <w:t xml:space="preserve">contains the same</w:t>
+      </w:r>
+      <w:r>
+        <w:t xml:space="preserve"> </w:t>
+      </w:r>
+      <w:r>
+        <w:rPr>
+          <w:rStyle w:val="VerbatimChar"/>
+        </w:rPr>
+        <w:t xml:space="preserve">classifier_prompt_v4_LOCKED.md</w:t>
+      </w:r>
+      <w:r>
+        <w:t xml:space="preserve"> </w:t>
+      </w:r>
+      <w:r>
+        <w:t xml:space="preserve">as the live</w:t>
+      </w:r>
+      <w:r>
+        <w:t xml:space="preserve"> </w:t>
+      </w:r>
+      <w:r>
+        <w:rPr>
+          <w:rStyle w:val="VerbatimChar"/>
+        </w:rPr>
+        <w:t xml:space="preserve">SCL-HandOff/</w:t>
+      </w:r>
+      <w:r>
+        <w:t xml:space="preserve"> </w:t>
+      </w:r>
+      <w:r>
+        <w:t xml:space="preserve">folder, so the prompt file itself was not the regression source.</w:t>
+      </w:r>
+    </w:p>
+    <w:p>
+      <w:pPr>
+        <w:pStyle w:val="Compact"/>
+        <w:numPr>
+          <w:ilvl w:val="0"/>
+          <w:numId w:val="1302"/>
+        </w:numPr>
+      </w:pPr>
+      <w:r>
+        <w:t xml:space="preserve">Latest handoff-alignment fix: commit</w:t>
+      </w:r>
+      <w:r>
+        <w:t xml:space="preserve"> </w:t>
+      </w:r>
+      <w:r>
+        <w:rPr>
+          <w:rStyle w:val="VerbatimChar"/>
+        </w:rPr>
+        <w:t xml:space="preserve">34e62a9</w:t>
+      </w:r>
+      <w:r>
+        <w:t xml:space="preserve"> </w:t>
+      </w:r>
+      <w:r>
+        <w:t xml:space="preserve">removes old deterministic HOT upgrades that contradicted locked v4 (</w:t>
+      </w:r>
+      <w:r>
+        <w:rPr>
+          <w:rStyle w:val="VerbatimChar"/>
+        </w:rPr>
+        <w:t xml:space="preserve">bare email</w:t>
+      </w:r>
+      <w:r>
+        <w:t xml:space="preserve"> </w:t>
+      </w:r>
+      <w:r>
+        <w:t xml:space="preserve">/</w:t>
+      </w:r>
+      <w:r>
+        <w:t xml:space="preserve"> </w:t>
+      </w:r>
+      <w:r>
+        <w:rPr>
+          <w:rStyle w:val="VerbatimChar"/>
+        </w:rPr>
+        <w:t xml:space="preserve">bare yes</w:t>
+      </w:r>
+      <w:r>
+        <w:t xml:space="preserve"> </w:t>
+      </w:r>
+      <w:r>
+        <w:t xml:space="preserve">no longer auto-promote to HOT), upgrades fallback suggestions to objection-aware Gap Selling phrasing, and keeps unread DNC replies visible in default Inbox filters until they are read.</w:t>
+      </w:r>
+    </w:p>
+    <w:p>
+      <w:pPr>
+        <w:pStyle w:val="Compact"/>
+        <w:numPr>
+          <w:ilvl w:val="0"/>
+          <w:numId w:val="1302"/>
+        </w:numPr>
+      </w:pPr>
+      <w:r>
+        <w:t xml:space="preserve">Production evidence for client screenshots:</w:t>
+      </w:r>
+      <w:r>
+        <w:t xml:space="preserve"> </w:t>
+      </w:r>
+      <w:r>
+        <w:rPr>
+          <w:rStyle w:val="VerbatimChar"/>
+        </w:rPr>
+        <w:t xml:space="preserve">Reinforce Tools</w:t>
+      </w:r>
+      <w:r>
+        <w:t xml:space="preserve"> </w:t>
+      </w:r>
+      <w:r>
+        <w:t xml:space="preserve">(</w:t>
+      </w:r>
+      <w:r>
+        <w:rPr>
+          <w:rStyle w:val="VerbatimChar"/>
+        </w:rPr>
+        <w:t xml:space="preserve">cmo0m0skg04pyzo0ze7y1siwe</w:t>
+      </w:r>
+      <w:r>
+        <w:t xml:space="preserve">) had</w:t>
+      </w:r>
+      <w:r>
+        <w:t xml:space="preserve"> </w:t>
+      </w:r>
+      <w:r>
+        <w:rPr>
+          <w:rStyle w:val="VerbatimChar"/>
+        </w:rPr>
+        <w:t xml:space="preserve">aiClassification=null</w:t>
       </w:r>
       <w:r>
         <w:t xml:space="preserve"> </w:t>
@@ -10502,451 +11141,64 @@
         <w:rPr>
           <w:rStyle w:val="VerbatimChar"/>
         </w:rPr>
-        <w:t xml:space="preserve">client</w:t>
-      </w:r>
-      <w:r>
-        <w:t xml:space="preserve"> </w:t>
-      </w:r>
-      <w:r>
-        <w:t xml:space="preserve">builds on production.</w:t>
-      </w:r>
-    </w:p>
-    <w:p>
-      <w:pPr>
-        <w:pStyle w:val="Compact"/>
-        <w:numPr>
-          <w:ilvl w:val="0"/>
-          <w:numId w:val="1302"/>
-        </w:numPr>
-      </w:pPr>
-      <w:r>
-        <w:t xml:space="preserve">Production health:</w:t>
-      </w:r>
-      <w:r>
-        <w:t xml:space="preserve"> </w:t>
-      </w:r>
-      <w:r>
-        <w:rPr>
-          <w:rStyle w:val="VerbatimChar"/>
-        </w:rPr>
-        <w:t xml:space="preserve">http://127.0.0.1:3001/api/health</w:t>
-      </w:r>
-      <w:r>
-        <w:t xml:space="preserve"> </w:t>
-      </w:r>
-      <w:r>
-        <w:t xml:space="preserve">returned</w:t>
-      </w:r>
-      <w:r>
-        <w:t xml:space="preserve"> </w:t>
-      </w:r>
-      <w:r>
-        <w:rPr>
-          <w:rStyle w:val="VerbatimChar"/>
-        </w:rPr>
-        <w:t xml:space="preserve">ok/ok/ok</w:t>
-      </w:r>
-      <w:r>
-        <w:t xml:space="preserve"> </w:t>
-      </w:r>
-      <w:r>
-        <w:t xml:space="preserve">for app/database/redis.</w:t>
-      </w:r>
-    </w:p>
-    <w:p>
-      <w:pPr>
-        <w:pStyle w:val="Compact"/>
-        <w:numPr>
-          <w:ilvl w:val="0"/>
-          <w:numId w:val="1302"/>
-        </w:numPr>
-      </w:pPr>
-      <w:r>
-        <w:t xml:space="preserve">PM2:</w:t>
-      </w:r>
-      <w:r>
-        <w:t xml:space="preserve"> </w:t>
-      </w:r>
-      <w:r>
-        <w:rPr>
-          <w:rStyle w:val="VerbatimChar"/>
-        </w:rPr>
-        <w:t xml:space="preserve">sms-api</w:t>
-      </w:r>
-      <w:r>
-        <w:t xml:space="preserve"> </w:t>
-      </w:r>
-      <w:r>
-        <w:t xml:space="preserve">online after restart; restart count</w:t>
-      </w:r>
-      <w:r>
-        <w:t xml:space="preserve"> </w:t>
-      </w:r>
-      <w:r>
-        <w:rPr>
-          <w:rStyle w:val="VerbatimChar"/>
-        </w:rPr>
-        <w:t xml:space="preserve">12</w:t>
-      </w:r>
-      <w:r>
-        <w:t xml:space="preserve">.</w:t>
-      </w:r>
-    </w:p>
-    <w:p>
-      <w:pPr>
-        <w:pStyle w:val="Compact"/>
-        <w:numPr>
-          <w:ilvl w:val="0"/>
-          <w:numId w:val="1302"/>
-        </w:numPr>
-      </w:pPr>
-      <w:r>
-        <w:t xml:space="preserve">Production runtime logs: PM2</w:t>
-      </w:r>
-      <w:r>
-        <w:t xml:space="preserve"> </w:t>
-      </w:r>
-      <w:r>
-        <w:rPr>
-          <w:rStyle w:val="VerbatimChar"/>
-        </w:rPr>
-        <w:t xml:space="preserve">out</w:t>
-      </w:r>
-      <w:r>
-        <w:t xml:space="preserve">/</w:t>
-      </w:r>
-      <w:r>
-        <w:rPr>
-          <w:rStyle w:val="VerbatimChar"/>
-        </w:rPr>
-        <w:t xml:space="preserve">error</w:t>
-      </w:r>
-      <w:r>
-        <w:t xml:space="preserve"> </w:t>
-      </w:r>
-      <w:r>
-        <w:t xml:space="preserve">tails were empty immediately after deploy; no fresh runtime errors were emitted after restart.</w:t>
-      </w:r>
-    </w:p>
-    <w:p>
-      <w:pPr>
-        <w:pStyle w:val="Compact"/>
-        <w:numPr>
-          <w:ilvl w:val="0"/>
-          <w:numId w:val="1302"/>
-        </w:numPr>
-      </w:pPr>
-      <w:r>
-        <w:t xml:space="preserve">Latest CI proof: run</w:t>
-      </w:r>
-      <w:r>
-        <w:t xml:space="preserve"> </w:t>
-      </w:r>
-      <w:r>
-        <w:rPr>
-          <w:rStyle w:val="VerbatimChar"/>
-        </w:rPr>
-        <w:t xml:space="preserve">25068339405</w:t>
-      </w:r>
-      <w:r>
-        <w:t xml:space="preserve">, commit</w:t>
-      </w:r>
-      <w:r>
-        <w:t xml:space="preserve"> </w:t>
-      </w:r>
-      <w:r>
-        <w:rPr>
-          <w:rStyle w:val="VerbatimChar"/>
-        </w:rPr>
-        <w:t xml:space="preserve">b2572de</w:t>
-      </w:r>
-      <w:r>
-        <w:t xml:space="preserve">, jobs completed successfully.</w:t>
-      </w:r>
-    </w:p>
-    <w:p>
-      <w:pPr>
-        <w:pStyle w:val="Compact"/>
-        <w:numPr>
-          <w:ilvl w:val="0"/>
-          <w:numId w:val="1302"/>
-        </w:numPr>
-      </w:pPr>
-      <w:r>
-        <w:t xml:space="preserve">Latest production build proof: server build passed; client build passed with known CSS minify warning</w:t>
-      </w:r>
-      <w:r>
-        <w:t xml:space="preserve"> </w:t>
-      </w:r>
-      <w:r>
-        <w:rPr>
-          <w:rStyle w:val="VerbatimChar"/>
-        </w:rPr>
-        <w:t xml:space="preserve">.light .bg-dark-800.border*</w:t>
-      </w:r>
-      <w:r>
-        <w:t xml:space="preserve"> </w:t>
-      </w:r>
-      <w:r>
-        <w:t xml:space="preserve">only.</w:t>
-      </w:r>
-    </w:p>
-    <w:p>
-      <w:pPr>
-        <w:pStyle w:val="Compact"/>
-        <w:numPr>
-          <w:ilvl w:val="0"/>
-          <w:numId w:val="1302"/>
-        </w:numPr>
-      </w:pPr>
-      <w:r>
-        <w:t xml:space="preserve">Public frontend smoke:</w:t>
-      </w:r>
-      <w:r>
-        <w:t xml:space="preserve"> </w:t>
-      </w:r>
-      <w:r>
-        <w:rPr>
-          <w:rStyle w:val="VerbatimChar"/>
-        </w:rPr>
-        <w:t xml:space="preserve">https://app.sclcapital.io/</w:t>
-      </w:r>
-      <w:r>
-        <w:t xml:space="preserve"> </w:t>
-      </w:r>
-      <w:r>
-        <w:t xml:space="preserve">returned</w:t>
-      </w:r>
-      <w:r>
-        <w:t xml:space="preserve"> </w:t>
-      </w:r>
-      <w:r>
-        <w:rPr>
-          <w:rStyle w:val="VerbatimChar"/>
-        </w:rPr>
-        <w:t xml:space="preserve">200 OK</w:t>
-      </w:r>
-      <w:r>
-        <w:t xml:space="preserve"> </w:t>
-      </w:r>
-      <w:r>
-        <w:t xml:space="preserve">and current index timestamp after deploy.</w:t>
-      </w:r>
-    </w:p>
-    <w:p>
-      <w:pPr>
-        <w:pStyle w:val="Compact"/>
-        <w:numPr>
-          <w:ilvl w:val="0"/>
-          <w:numId w:val="1302"/>
-        </w:numPr>
-      </w:pPr>
-      <w:r>
-        <w:t xml:space="preserve">Current unread-badge fix: sidebar Inbox badge now uses unread conversation count, matching Inbox/Admin View and the User Guide contract.</w:t>
-      </w:r>
-    </w:p>
-    <w:p>
-      <w:pPr>
-        <w:pStyle w:val="Compact"/>
-        <w:numPr>
-          <w:ilvl w:val="0"/>
-          <w:numId w:val="1302"/>
-        </w:numPr>
-      </w:pPr>
-      <w:r>
-        <w:t xml:space="preserve">Latest AI suggestion reply-refresh fix: commit</w:t>
-      </w:r>
-      <w:r>
-        <w:t xml:space="preserve"> </w:t>
-      </w:r>
-      <w:r>
-        <w:rPr>
-          <w:rStyle w:val="VerbatimChar"/>
-        </w:rPr>
-        <w:t xml:space="preserve">a5b587f</w:t>
-      </w:r>
-      <w:r>
-        <w:t xml:space="preserve"> </w:t>
-      </w:r>
-      <w:r>
-        <w:t xml:space="preserve">triggers owner-action reclassification after successful outbound reply; targeted regression</w:t>
-      </w:r>
-      <w:r>
-        <w:t xml:space="preserve"> </w:t>
-      </w:r>
-      <w:r>
-        <w:rPr>
-          <w:rStyle w:val="VerbatimChar"/>
-        </w:rPr>
-        <w:t xml:space="preserve">server/tests/inboxReplyReclassification.test.ts</w:t>
-      </w:r>
-      <w:r>
-        <w:t xml:space="preserve"> </w:t>
-      </w:r>
-      <w:r>
-        <w:t xml:space="preserve">passed 2/2;</w:t>
-      </w:r>
-      <w:r>
-        <w:t xml:space="preserve"> </w:t>
-      </w:r>
-      <w:r>
-        <w:rPr>
-          <w:rStyle w:val="VerbatimChar"/>
-        </w:rPr>
-        <w:t xml:space="preserve">server npm run build</w:t>
-      </w:r>
-      <w:r>
-        <w:t xml:space="preserve"> </w:t>
-      </w:r>
-      <w:r>
-        <w:t xml:space="preserve">passed.</w:t>
-      </w:r>
-    </w:p>
-    <w:p>
-      <w:pPr>
-        <w:pStyle w:val="Compact"/>
-        <w:numPr>
-          <w:ilvl w:val="0"/>
-          <w:numId w:val="1302"/>
-        </w:numPr>
-      </w:pPr>
-      <w:r>
-        <w:t xml:space="preserve">Latest AI suggestion restore fix: commit</w:t>
-      </w:r>
-      <w:r>
-        <w:t xml:space="preserve"> </w:t>
-      </w:r>
-      <w:r>
-        <w:rPr>
-          <w:rStyle w:val="VerbatimChar"/>
-        </w:rPr>
-        <w:t xml:space="preserve">9f6e478</w:t>
-      </w:r>
-      <w:r>
-        <w:t xml:space="preserve"> </w:t>
-      </w:r>
-      <w:r>
-        <w:t xml:space="preserve">rebuilds fallback suggestions when classified conversations have an empty</w:t>
-      </w:r>
-      <w:r>
-        <w:t xml:space="preserve"> </w:t>
-      </w:r>
-      <w:r>
-        <w:rPr>
-          <w:rStyle w:val="VerbatimChar"/>
-        </w:rPr>
-        <w:t xml:space="preserve">aiSuggestions</w:t>
-      </w:r>
-      <w:r>
-        <w:t xml:space="preserve"> </w:t>
-      </w:r>
-      <w:r>
-        <w:t xml:space="preserve">array; targeted regression</w:t>
-      </w:r>
-      <w:r>
-        <w:t xml:space="preserve"> </w:t>
-      </w:r>
-      <w:r>
-        <w:rPr>
-          <w:rStyle w:val="VerbatimChar"/>
-        </w:rPr>
-        <w:t xml:space="preserve">server/tests/aiSuggestionPolicy.test.ts</w:t>
-      </w:r>
-      <w:r>
-        <w:t xml:space="preserve"> </w:t>
-      </w:r>
-      <w:r>
-        <w:t xml:space="preserve">passed 5/5;</w:t>
-      </w:r>
-      <w:r>
-        <w:t xml:space="preserve"> </w:t>
-      </w:r>
-      <w:r>
-        <w:rPr>
-          <w:rStyle w:val="VerbatimChar"/>
-        </w:rPr>
-        <w:t xml:space="preserve">server npm run build</w:t>
-      </w:r>
-      <w:r>
-        <w:t xml:space="preserve"> </w:t>
-      </w:r>
-      <w:r>
-        <w:t xml:space="preserve">passed.</w:t>
-      </w:r>
-    </w:p>
-    <w:p>
-      <w:pPr>
-        <w:pStyle w:val="Compact"/>
-        <w:numPr>
-          <w:ilvl w:val="0"/>
-          <w:numId w:val="1302"/>
-        </w:numPr>
-      </w:pPr>
-      <w:r>
-        <w:t xml:space="preserve">Production API verification after deploy: previously broken threads</w:t>
-      </w:r>
-      <w:r>
-        <w:t xml:space="preserve"> </w:t>
-      </w:r>
-      <w:r>
-        <w:rPr>
-          <w:rStyle w:val="VerbatimChar"/>
-        </w:rPr>
-        <w:t xml:space="preserve">Audrey Berry $150,000.00</w:t>
-      </w:r>
-      <w:r>
-        <w:t xml:space="preserve"> </w:t>
-      </w:r>
-      <w:r>
-        <w:t xml:space="preserve">(</w:t>
-      </w:r>
-      <w:r>
-        <w:rPr>
-          <w:rStyle w:val="VerbatimChar"/>
-        </w:rPr>
-        <w:t xml:space="preserve">cmnt61hpb01cxzosfj9e0gj7d</w:t>
-      </w:r>
-      <w:r>
-        <w:t xml:space="preserve">) and</w:t>
-      </w:r>
-      <w:r>
-        <w:t xml:space="preserve"> </w:t>
-      </w:r>
-      <w:r>
-        <w:rPr>
-          <w:rStyle w:val="VerbatimChar"/>
-        </w:rPr>
-        <w:t xml:space="preserve">Jamie Johnson</w:t>
-      </w:r>
-      <w:r>
-        <w:t xml:space="preserve"> </w:t>
-      </w:r>
-      <w:r>
-        <w:t xml:space="preserve">(</w:t>
-      </w:r>
-      <w:r>
-        <w:rPr>
-          <w:rStyle w:val="VerbatimChar"/>
-        </w:rPr>
-        <w:t xml:space="preserve">cmoiqslus0d9tzo5uwqu6c25a</w:t>
-      </w:r>
-      <w:r>
-        <w:t xml:space="preserve">) now return</w:t>
-      </w:r>
-      <w:r>
-        <w:t xml:space="preserve"> </w:t>
-      </w:r>
-      <w:r>
-        <w:rPr>
-          <w:rStyle w:val="VerbatimChar"/>
-        </w:rPr>
-        <w:t xml:space="preserve">aiSuggestionsCount=1</w:t>
-      </w:r>
-      <w:r>
-        <w:t xml:space="preserve"> </w:t>
-      </w:r>
-      <w:r>
-        <w:t xml:space="preserve">with non-empty fallback text.</w:t>
+        <w:t xml:space="preserve">aiSuggestions=null</w:t>
+      </w:r>
+      <w:r>
+        <w:t xml:space="preserve"> </w:t>
+      </w:r>
+      <w:r>
+        <w:t xml:space="preserve">at inspection time, so the generic “predatory MCA” reply shown in the screenshot was not persisted AI output;</w:t>
+      </w:r>
+      <w:r>
+        <w:t xml:space="preserve"> </w:t>
+      </w:r>
+      <w:r>
+        <w:rPr>
+          <w:rStyle w:val="VerbatimChar"/>
+        </w:rPr>
+        <w:t xml:space="preserve">SG ECHO LLC</w:t>
+      </w:r>
+      <w:r>
+        <w:t xml:space="preserve"> </w:t>
+      </w:r>
+      <w:r>
+        <w:t xml:space="preserve">/ Patricia Ann Kaelin (</w:t>
+      </w:r>
+      <w:r>
+        <w:rPr>
+          <w:rStyle w:val="VerbatimChar"/>
+        </w:rPr>
+        <w:t xml:space="preserve">cmoj0561t08a4zo2sugztfeek</w:t>
+      </w:r>
+      <w:r>
+        <w:t xml:space="preserve">) remains assigned to Marcos while the lead is</w:t>
+      </w:r>
+      <w:r>
+        <w:t xml:space="preserve"> </w:t>
+      </w:r>
+      <w:r>
+        <w:rPr>
+          <w:rStyle w:val="VerbatimChar"/>
+        </w:rPr>
+        <w:t xml:space="preserve">DNC</w:t>
+      </w:r>
+      <w:r>
+        <w:t xml:space="preserve"> </w:t>
+      </w:r>
+      <w:r>
+        <w:t xml:space="preserve">+</w:t>
+      </w:r>
+      <w:r>
+        <w:t xml:space="preserve"> </w:t>
+      </w:r>
+      <w:r>
+        <w:rPr>
+          <w:rStyle w:val="VerbatimChar"/>
+        </w:rPr>
+        <w:t xml:space="preserve">optedOut=true</w:t>
+      </w:r>
+      <w:r>
+        <w:t xml:space="preserve">, which explains why the thread dropped out of the normal inbox flow after the removal request.</w:t>
       </w:r>
     </w:p>
     <w:p>
@@ -13412,6 +13664,142 @@
                 <w:rStyle w:val="VerbatimChar"/>
               </w:rPr>
               <w:t xml:space="preserve">aiSuggestionsCount=1</w:t>
+            </w:r>
+          </w:p>
+        </w:tc>
+        <w:tc>
+          <w:tcPr/>
+          <w:p>
+            <w:pPr>
+              <w:pStyle w:val="Compact"/>
+            </w:pPr>
+            <w:r>
+              <w:t xml:space="preserve">Done</w:t>
+            </w:r>
+          </w:p>
+        </w:tc>
+      </w:tr>
+      <w:tr>
+        <w:tc>
+          <w:tcPr/>
+          <w:p>
+            <w:pPr>
+              <w:pStyle w:val="Compact"/>
+            </w:pPr>
+            <w:r>
+              <w:t xml:space="preserve">2026-04-28</w:t>
+            </w:r>
+          </w:p>
+        </w:tc>
+        <w:tc>
+          <w:tcPr/>
+          <w:p>
+            <w:pPr>
+              <w:pStyle w:val="Compact"/>
+            </w:pPr>
+            <w:r>
+              <w:t xml:space="preserve">AI / Inbox Alignment</w:t>
+            </w:r>
+          </w:p>
+        </w:tc>
+        <w:tc>
+          <w:tcPr/>
+          <w:p>
+            <w:pPr>
+              <w:pStyle w:val="Compact"/>
+            </w:pPr>
+            <w:r>
+              <w:t xml:space="preserve">Restored locked-v4 handoff behavior + unread DNC visibility</w:t>
+            </w:r>
+          </w:p>
+        </w:tc>
+        <w:tc>
+          <w:tcPr/>
+          <w:p>
+            <w:pPr>
+              <w:pStyle w:val="Compact"/>
+            </w:pPr>
+            <w:r>
+              <w:t xml:space="preserve">34e62a9</w:t>
+            </w:r>
+          </w:p>
+        </w:tc>
+        <w:tc>
+          <w:tcPr/>
+          <w:p>
+            <w:pPr>
+              <w:pStyle w:val="Compact"/>
+            </w:pPr>
+            <w:r>
+              <w:t xml:space="preserve">AI tests 10/10 + visibility test 1/1 + server build passed</w:t>
+            </w:r>
+          </w:p>
+        </w:tc>
+        <w:tc>
+          <w:tcPr/>
+          <w:p>
+            <w:pPr>
+              <w:pStyle w:val="Compact"/>
+            </w:pPr>
+            <w:r>
+              <w:t xml:space="preserve">Done</w:t>
+            </w:r>
+          </w:p>
+        </w:tc>
+      </w:tr>
+      <w:tr>
+        <w:tc>
+          <w:tcPr/>
+          <w:p>
+            <w:pPr>
+              <w:pStyle w:val="Compact"/>
+            </w:pPr>
+            <w:r>
+              <w:t xml:space="preserve">2026-04-28</w:t>
+            </w:r>
+          </w:p>
+        </w:tc>
+        <w:tc>
+          <w:tcPr/>
+          <w:p>
+            <w:pPr>
+              <w:pStyle w:val="Compact"/>
+            </w:pPr>
+            <w:r>
+              <w:t xml:space="preserve">Production Deploy</w:t>
+            </w:r>
+          </w:p>
+        </w:tc>
+        <w:tc>
+          <w:tcPr/>
+          <w:p>
+            <w:pPr>
+              <w:pStyle w:val="Compact"/>
+            </w:pPr>
+            <w:r>
+              <w:t xml:space="preserve">Deployed handoff-gap-selling / inbox visibility fix</w:t>
+            </w:r>
+          </w:p>
+        </w:tc>
+        <w:tc>
+          <w:tcPr/>
+          <w:p>
+            <w:pPr>
+              <w:pStyle w:val="Compact"/>
+            </w:pPr>
+            <w:r>
+              <w:t xml:space="preserve">34e62a9</w:t>
+            </w:r>
+          </w:p>
+        </w:tc>
+        <w:tc>
+          <w:tcPr/>
+          <w:p>
+            <w:pPr>
+              <w:pStyle w:val="Compact"/>
+            </w:pPr>
+            <w:r>
+              <w:t xml:space="preserve">Production SHA 34e62a9; PM2 online; SG ECHO + Reinforce checks logged</w:t>
             </w:r>
           </w:p>
         </w:tc>

</xml_diff>

<commit_message>
docs(checklist): record dnc inbox follow-up
</commit_message>
<xml_diff>
--- a/CHECKLIST_M1_M2_REMEDIATION_2026-04-28.docx
+++ b/CHECKLIST_M1_M2_REMEDIATION_2026-04-28.docx
@@ -10370,52 +10370,730 @@
         <w:rPr>
           <w:rStyle w:val="VerbatimChar"/>
         </w:rPr>
+        <w:t xml:space="preserve">74f472f</w:t>
+      </w:r>
+      <w:r>
+        <w:t xml:space="preserve"> </w:t>
+      </w:r>
+      <w:r>
+        <w:t xml:space="preserve">on</w:t>
+      </w:r>
+      <w:r>
+        <w:t xml:space="preserve"> </w:t>
+      </w:r>
+      <w:r>
+        <w:rPr>
+          <w:rStyle w:val="VerbatimChar"/>
+        </w:rPr>
+        <w:t xml:space="preserve">deploy/mysql-hosting</w:t>
+      </w:r>
+      <w:r>
+        <w:t xml:space="preserve">; production</w:t>
+      </w:r>
+      <w:r>
+        <w:t xml:space="preserve"> </w:t>
+      </w:r>
+      <w:r>
+        <w:rPr>
+          <w:rStyle w:val="VerbatimChar"/>
+        </w:rPr>
+        <w:t xml:space="preserve">git status --porcelain</w:t>
+      </w:r>
+      <w:r>
+        <w:t xml:space="preserve"> </w:t>
+      </w:r>
+      <w:r>
+        <w:t xml:space="preserve">lines:</w:t>
+      </w:r>
+      <w:r>
+        <w:t xml:space="preserve"> </w:t>
+      </w:r>
+      <w:r>
+        <w:rPr>
+          <w:rStyle w:val="VerbatimChar"/>
+        </w:rPr>
+        <w:t xml:space="preserve">0</w:t>
+      </w:r>
+      <w:r>
+        <w:t xml:space="preserve">.</w:t>
+      </w:r>
+    </w:p>
+    <w:p>
+      <w:pPr>
+        <w:pStyle w:val="Compact"/>
+        <w:numPr>
+          <w:ilvl w:val="0"/>
+          <w:numId w:val="1302"/>
+        </w:numPr>
+      </w:pPr>
+      <w:r>
+        <w:t xml:space="preserve">Production deploy path used committed code only: initial full deploy fast-forwarded</w:t>
+      </w:r>
+      <w:r>
+        <w:t xml:space="preserve"> </w:t>
+      </w:r>
+      <w:r>
+        <w:rPr>
+          <w:rStyle w:val="VerbatimChar"/>
+        </w:rPr>
+        <w:t xml:space="preserve">e596d85..15414cf</w:t>
+      </w:r>
+      <w:r>
+        <w:t xml:space="preserve">, then unread-badge frontend-only fast-forward</w:t>
+      </w:r>
+      <w:r>
+        <w:t xml:space="preserve"> </w:t>
+      </w:r>
+      <w:r>
+        <w:rPr>
+          <w:rStyle w:val="VerbatimChar"/>
+        </w:rPr>
+        <w:t xml:space="preserve">15414cf..b2572de</w:t>
+      </w:r>
+      <w:r>
+        <w:t xml:space="preserve">, then AI-suggestion reply-refresh fast-forward</w:t>
+      </w:r>
+      <w:r>
+        <w:t xml:space="preserve"> </w:t>
+      </w:r>
+      <w:r>
+        <w:rPr>
+          <w:rStyle w:val="VerbatimChar"/>
+        </w:rPr>
+        <w:t xml:space="preserve">b2572de..a5b587f</w:t>
+      </w:r>
+      <w:r>
+        <w:t xml:space="preserve">, then fallback-suggestion restore fast-forward</w:t>
+      </w:r>
+      <w:r>
+        <w:t xml:space="preserve"> </w:t>
+      </w:r>
+      <w:r>
+        <w:rPr>
+          <w:rStyle w:val="VerbatimChar"/>
+        </w:rPr>
+        <w:t xml:space="preserve">a5b587f..9f6e478</w:t>
+      </w:r>
+      <w:r>
+        <w:t xml:space="preserve">, then email-suggestion repair fast-forward</w:t>
+      </w:r>
+      <w:r>
+        <w:t xml:space="preserve"> </w:t>
+      </w:r>
+      <w:r>
+        <w:rPr>
+          <w:rStyle w:val="VerbatimChar"/>
+        </w:rPr>
+        <w:t xml:space="preserve">9f6e478..064b88d</w:t>
+      </w:r>
+      <w:r>
+        <w:t xml:space="preserve">, then handoff-gap-selling restore fast-forward</w:t>
+      </w:r>
+      <w:r>
+        <w:t xml:space="preserve"> </w:t>
+      </w:r>
+      <w:r>
+        <w:rPr>
+          <w:rStyle w:val="VerbatimChar"/>
+        </w:rPr>
+        <w:t xml:space="preserve">064b88d..34e62a9</w:t>
+      </w:r>
+      <w:r>
+        <w:t xml:space="preserve">, then stale-DNC-visibility / opt-in-normalization fast-forward</w:t>
+      </w:r>
+      <w:r>
+        <w:t xml:space="preserve"> </w:t>
+      </w:r>
+      <w:r>
+        <w:rPr>
+          <w:rStyle w:val="VerbatimChar"/>
+        </w:rPr>
+        <w:t xml:space="preserve">34e62a9..74f472f</w:t>
+      </w:r>
+      <w:r>
+        <w:t xml:space="preserve"> </w:t>
+      </w:r>
+      <w:r>
+        <w:t xml:space="preserve">with fresh</w:t>
+      </w:r>
+      <w:r>
+        <w:t xml:space="preserve"> </w:t>
+      </w:r>
+      <w:r>
+        <w:rPr>
+          <w:rStyle w:val="VerbatimChar"/>
+        </w:rPr>
+        <w:t xml:space="preserve">server</w:t>
+      </w:r>
+      <w:r>
+        <w:t xml:space="preserve"> </w:t>
+      </w:r>
+      <w:r>
+        <w:t xml:space="preserve">and</w:t>
+      </w:r>
+      <w:r>
+        <w:t xml:space="preserve"> </w:t>
+      </w:r>
+      <w:r>
+        <w:rPr>
+          <w:rStyle w:val="VerbatimChar"/>
+        </w:rPr>
+        <w:t xml:space="preserve">client</w:t>
+      </w:r>
+      <w:r>
+        <w:t xml:space="preserve"> </w:t>
+      </w:r>
+      <w:r>
+        <w:t xml:space="preserve">builds on production.</w:t>
+      </w:r>
+    </w:p>
+    <w:p>
+      <w:pPr>
+        <w:pStyle w:val="Compact"/>
+        <w:numPr>
+          <w:ilvl w:val="0"/>
+          <w:numId w:val="1302"/>
+        </w:numPr>
+      </w:pPr>
+      <w:r>
+        <w:t xml:space="preserve">Production health:</w:t>
+      </w:r>
+      <w:r>
+        <w:t xml:space="preserve"> </w:t>
+      </w:r>
+      <w:r>
+        <w:rPr>
+          <w:rStyle w:val="VerbatimChar"/>
+        </w:rPr>
+        <w:t xml:space="preserve">http://127.0.0.1:3001/api/health</w:t>
+      </w:r>
+      <w:r>
+        <w:t xml:space="preserve"> </w:t>
+      </w:r>
+      <w:r>
+        <w:t xml:space="preserve">returned</w:t>
+      </w:r>
+      <w:r>
+        <w:t xml:space="preserve"> </w:t>
+      </w:r>
+      <w:r>
+        <w:rPr>
+          <w:rStyle w:val="VerbatimChar"/>
+        </w:rPr>
+        <w:t xml:space="preserve">ok/ok/ok</w:t>
+      </w:r>
+      <w:r>
+        <w:t xml:space="preserve"> </w:t>
+      </w:r>
+      <w:r>
+        <w:t xml:space="preserve">for app/database/redis.</w:t>
+      </w:r>
+    </w:p>
+    <w:p>
+      <w:pPr>
+        <w:pStyle w:val="Compact"/>
+        <w:numPr>
+          <w:ilvl w:val="0"/>
+          <w:numId w:val="1302"/>
+        </w:numPr>
+      </w:pPr>
+      <w:r>
+        <w:t xml:space="preserve">PM2:</w:t>
+      </w:r>
+      <w:r>
+        <w:t xml:space="preserve"> </w:t>
+      </w:r>
+      <w:r>
+        <w:rPr>
+          <w:rStyle w:val="VerbatimChar"/>
+        </w:rPr>
+        <w:t xml:space="preserve">sms-api</w:t>
+      </w:r>
+      <w:r>
+        <w:t xml:space="preserve"> </w:t>
+      </w:r>
+      <w:r>
+        <w:t xml:space="preserve">online after restart; restart count</w:t>
+      </w:r>
+      <w:r>
+        <w:t xml:space="preserve"> </w:t>
+      </w:r>
+      <w:r>
+        <w:rPr>
+          <w:rStyle w:val="VerbatimChar"/>
+        </w:rPr>
+        <w:t xml:space="preserve">16</w:t>
+      </w:r>
+      <w:r>
+        <w:t xml:space="preserve">.</w:t>
+      </w:r>
+    </w:p>
+    <w:p>
+      <w:pPr>
+        <w:pStyle w:val="Compact"/>
+        <w:numPr>
+          <w:ilvl w:val="0"/>
+          <w:numId w:val="1302"/>
+        </w:numPr>
+      </w:pPr>
+      <w:r>
+        <w:t xml:space="preserve">Production runtime logs: PM2</w:t>
+      </w:r>
+      <w:r>
+        <w:t xml:space="preserve"> </w:t>
+      </w:r>
+      <w:r>
+        <w:rPr>
+          <w:rStyle w:val="VerbatimChar"/>
+        </w:rPr>
+        <w:t xml:space="preserve">out</w:t>
+      </w:r>
+      <w:r>
+        <w:t xml:space="preserve">/</w:t>
+      </w:r>
+      <w:r>
+        <w:rPr>
+          <w:rStyle w:val="VerbatimChar"/>
+        </w:rPr>
+        <w:t xml:space="preserve">error</w:t>
+      </w:r>
+      <w:r>
+        <w:t xml:space="preserve"> </w:t>
+      </w:r>
+      <w:r>
+        <w:t xml:space="preserve">tails were empty immediately after deploy; no fresh runtime errors were emitted after restart.</w:t>
+      </w:r>
+    </w:p>
+    <w:p>
+      <w:pPr>
+        <w:pStyle w:val="Compact"/>
+        <w:numPr>
+          <w:ilvl w:val="0"/>
+          <w:numId w:val="1302"/>
+        </w:numPr>
+      </w:pPr>
+      <w:r>
+        <w:t xml:space="preserve">Latest CI proof: run</w:t>
+      </w:r>
+      <w:r>
+        <w:t xml:space="preserve"> </w:t>
+      </w:r>
+      <w:r>
+        <w:rPr>
+          <w:rStyle w:val="VerbatimChar"/>
+        </w:rPr>
+        <w:t xml:space="preserve">25068339405</w:t>
+      </w:r>
+      <w:r>
+        <w:t xml:space="preserve">, commit</w:t>
+      </w:r>
+      <w:r>
+        <w:t xml:space="preserve"> </w:t>
+      </w:r>
+      <w:r>
+        <w:rPr>
+          <w:rStyle w:val="VerbatimChar"/>
+        </w:rPr>
+        <w:t xml:space="preserve">b2572de</w:t>
+      </w:r>
+      <w:r>
+        <w:t xml:space="preserve">, jobs completed successfully.</w:t>
+      </w:r>
+    </w:p>
+    <w:p>
+      <w:pPr>
+        <w:pStyle w:val="Compact"/>
+        <w:numPr>
+          <w:ilvl w:val="0"/>
+          <w:numId w:val="1302"/>
+        </w:numPr>
+      </w:pPr>
+      <w:r>
+        <w:t xml:space="preserve">Latest production build proof: server build passed; client build passed with known CSS minify warning</w:t>
+      </w:r>
+      <w:r>
+        <w:t xml:space="preserve"> </w:t>
+      </w:r>
+      <w:r>
+        <w:rPr>
+          <w:rStyle w:val="VerbatimChar"/>
+        </w:rPr>
+        <w:t xml:space="preserve">.light .bg-dark-800.border*</w:t>
+      </w:r>
+      <w:r>
+        <w:t xml:space="preserve"> </w:t>
+      </w:r>
+      <w:r>
+        <w:t xml:space="preserve">only.</w:t>
+      </w:r>
+    </w:p>
+    <w:p>
+      <w:pPr>
+        <w:pStyle w:val="Compact"/>
+        <w:numPr>
+          <w:ilvl w:val="0"/>
+          <w:numId w:val="1302"/>
+        </w:numPr>
+      </w:pPr>
+      <w:r>
+        <w:t xml:space="preserve">Public frontend smoke:</w:t>
+      </w:r>
+      <w:r>
+        <w:t xml:space="preserve"> </w:t>
+      </w:r>
+      <w:r>
+        <w:rPr>
+          <w:rStyle w:val="VerbatimChar"/>
+        </w:rPr>
+        <w:t xml:space="preserve">https://app.sclcapital.io/</w:t>
+      </w:r>
+      <w:r>
+        <w:t xml:space="preserve"> </w:t>
+      </w:r>
+      <w:r>
+        <w:t xml:space="preserve">returned</w:t>
+      </w:r>
+      <w:r>
+        <w:t xml:space="preserve"> </w:t>
+      </w:r>
+      <w:r>
+        <w:rPr>
+          <w:rStyle w:val="VerbatimChar"/>
+        </w:rPr>
+        <w:t xml:space="preserve">200 OK</w:t>
+      </w:r>
+      <w:r>
+        <w:t xml:space="preserve"> </w:t>
+      </w:r>
+      <w:r>
+        <w:t xml:space="preserve">and current index timestamp after deploy.</w:t>
+      </w:r>
+    </w:p>
+    <w:p>
+      <w:pPr>
+        <w:pStyle w:val="Compact"/>
+        <w:numPr>
+          <w:ilvl w:val="0"/>
+          <w:numId w:val="1302"/>
+        </w:numPr>
+      </w:pPr>
+      <w:r>
+        <w:t xml:space="preserve">Current unread-badge fix: sidebar Inbox badge now uses unread conversation count, matching Inbox/Admin View and the User Guide contract.</w:t>
+      </w:r>
+    </w:p>
+    <w:p>
+      <w:pPr>
+        <w:pStyle w:val="Compact"/>
+        <w:numPr>
+          <w:ilvl w:val="0"/>
+          <w:numId w:val="1302"/>
+        </w:numPr>
+      </w:pPr>
+      <w:r>
+        <w:t xml:space="preserve">Latest AI suggestion reply-refresh fix: commit</w:t>
+      </w:r>
+      <w:r>
+        <w:t xml:space="preserve"> </w:t>
+      </w:r>
+      <w:r>
+        <w:rPr>
+          <w:rStyle w:val="VerbatimChar"/>
+        </w:rPr>
+        <w:t xml:space="preserve">a5b587f</w:t>
+      </w:r>
+      <w:r>
+        <w:t xml:space="preserve"> </w:t>
+      </w:r>
+      <w:r>
+        <w:t xml:space="preserve">triggers owner-action reclassification after successful outbound reply; targeted regression</w:t>
+      </w:r>
+      <w:r>
+        <w:t xml:space="preserve"> </w:t>
+      </w:r>
+      <w:r>
+        <w:rPr>
+          <w:rStyle w:val="VerbatimChar"/>
+        </w:rPr>
+        <w:t xml:space="preserve">server/tests/inboxReplyReclassification.test.ts</w:t>
+      </w:r>
+      <w:r>
+        <w:t xml:space="preserve"> </w:t>
+      </w:r>
+      <w:r>
+        <w:t xml:space="preserve">passed 2/2;</w:t>
+      </w:r>
+      <w:r>
+        <w:t xml:space="preserve"> </w:t>
+      </w:r>
+      <w:r>
+        <w:rPr>
+          <w:rStyle w:val="VerbatimChar"/>
+        </w:rPr>
+        <w:t xml:space="preserve">server npm run build</w:t>
+      </w:r>
+      <w:r>
+        <w:t xml:space="preserve"> </w:t>
+      </w:r>
+      <w:r>
+        <w:t xml:space="preserve">passed.</w:t>
+      </w:r>
+    </w:p>
+    <w:p>
+      <w:pPr>
+        <w:pStyle w:val="Compact"/>
+        <w:numPr>
+          <w:ilvl w:val="0"/>
+          <w:numId w:val="1302"/>
+        </w:numPr>
+      </w:pPr>
+      <w:r>
+        <w:t xml:space="preserve">Latest AI suggestion restore fix: commit</w:t>
+      </w:r>
+      <w:r>
+        <w:t xml:space="preserve"> </w:t>
+      </w:r>
+      <w:r>
+        <w:rPr>
+          <w:rStyle w:val="VerbatimChar"/>
+        </w:rPr>
+        <w:t xml:space="preserve">9f6e478</w:t>
+      </w:r>
+      <w:r>
+        <w:t xml:space="preserve"> </w:t>
+      </w:r>
+      <w:r>
+        <w:t xml:space="preserve">rebuilds fallback suggestions when classified conversations have an empty</w:t>
+      </w:r>
+      <w:r>
+        <w:t xml:space="preserve"> </w:t>
+      </w:r>
+      <w:r>
+        <w:rPr>
+          <w:rStyle w:val="VerbatimChar"/>
+        </w:rPr>
+        <w:t xml:space="preserve">aiSuggestions</w:t>
+      </w:r>
+      <w:r>
+        <w:t xml:space="preserve"> </w:t>
+      </w:r>
+      <w:r>
+        <w:t xml:space="preserve">array; targeted regression</w:t>
+      </w:r>
+      <w:r>
+        <w:t xml:space="preserve"> </w:t>
+      </w:r>
+      <w:r>
+        <w:rPr>
+          <w:rStyle w:val="VerbatimChar"/>
+        </w:rPr>
+        <w:t xml:space="preserve">server/tests/aiSuggestionPolicy.test.ts</w:t>
+      </w:r>
+      <w:r>
+        <w:t xml:space="preserve"> </w:t>
+      </w:r>
+      <w:r>
+        <w:t xml:space="preserve">passed 5/5;</w:t>
+      </w:r>
+      <w:r>
+        <w:t xml:space="preserve"> </w:t>
+      </w:r>
+      <w:r>
+        <w:rPr>
+          <w:rStyle w:val="VerbatimChar"/>
+        </w:rPr>
+        <w:t xml:space="preserve">server npm run build</w:t>
+      </w:r>
+      <w:r>
+        <w:t xml:space="preserve"> </w:t>
+      </w:r>
+      <w:r>
+        <w:t xml:space="preserve">passed.</w:t>
+      </w:r>
+    </w:p>
+    <w:p>
+      <w:pPr>
+        <w:pStyle w:val="Compact"/>
+        <w:numPr>
+          <w:ilvl w:val="0"/>
+          <w:numId w:val="1302"/>
+        </w:numPr>
+      </w:pPr>
+      <w:r>
+        <w:t xml:space="preserve">Production API verification after deploy: previously broken threads</w:t>
+      </w:r>
+      <w:r>
+        <w:t xml:space="preserve"> </w:t>
+      </w:r>
+      <w:r>
+        <w:rPr>
+          <w:rStyle w:val="VerbatimChar"/>
+        </w:rPr>
+        <w:t xml:space="preserve">Audrey Berry $150,000.00</w:t>
+      </w:r>
+      <w:r>
+        <w:t xml:space="preserve"> </w:t>
+      </w:r>
+      <w:r>
+        <w:t xml:space="preserve">(</w:t>
+      </w:r>
+      <w:r>
+        <w:rPr>
+          <w:rStyle w:val="VerbatimChar"/>
+        </w:rPr>
+        <w:t xml:space="preserve">cmnt61hpb01cxzosfj9e0gj7d</w:t>
+      </w:r>
+      <w:r>
+        <w:t xml:space="preserve">) and</w:t>
+      </w:r>
+      <w:r>
+        <w:t xml:space="preserve"> </w:t>
+      </w:r>
+      <w:r>
+        <w:rPr>
+          <w:rStyle w:val="VerbatimChar"/>
+        </w:rPr>
+        <w:t xml:space="preserve">Jamie Johnson</w:t>
+      </w:r>
+      <w:r>
+        <w:t xml:space="preserve"> </w:t>
+      </w:r>
+      <w:r>
+        <w:t xml:space="preserve">(</w:t>
+      </w:r>
+      <w:r>
+        <w:rPr>
+          <w:rStyle w:val="VerbatimChar"/>
+        </w:rPr>
+        <w:t xml:space="preserve">cmoiqslus0d9tzo5uwqu6c25a</w:t>
+      </w:r>
+      <w:r>
+        <w:t xml:space="preserve">) now return</w:t>
+      </w:r>
+      <w:r>
+        <w:t xml:space="preserve"> </w:t>
+      </w:r>
+      <w:r>
+        <w:rPr>
+          <w:rStyle w:val="VerbatimChar"/>
+        </w:rPr>
+        <w:t xml:space="preserve">aiSuggestionsCount=1</w:t>
+      </w:r>
+      <w:r>
+        <w:t xml:space="preserve"> </w:t>
+      </w:r>
+      <w:r>
+        <w:t xml:space="preserve">with non-empty fallback text.</w:t>
+      </w:r>
+    </w:p>
+    <w:p>
+      <w:pPr>
+        <w:pStyle w:val="Compact"/>
+        <w:numPr>
+          <w:ilvl w:val="0"/>
+          <w:numId w:val="1302"/>
+        </w:numPr>
+      </w:pPr>
+      <w:r>
+        <w:t xml:space="preserve">Uploaded handoff archive verification:</w:t>
+      </w:r>
+      <w:r>
+        <w:t xml:space="preserve"> </w:t>
+      </w:r>
+      <w:r>
+        <w:rPr>
+          <w:rStyle w:val="VerbatimChar"/>
+        </w:rPr>
+        <w:t xml:space="preserve">scl-handoff-2026-4-25.rar</w:t>
+      </w:r>
+      <w:r>
+        <w:t xml:space="preserve"> </w:t>
+      </w:r>
+      <w:r>
+        <w:t xml:space="preserve">contains the same</w:t>
+      </w:r>
+      <w:r>
+        <w:t xml:space="preserve"> </w:t>
+      </w:r>
+      <w:r>
+        <w:rPr>
+          <w:rStyle w:val="VerbatimChar"/>
+        </w:rPr>
+        <w:t xml:space="preserve">classifier_prompt_v4_LOCKED.md</w:t>
+      </w:r>
+      <w:r>
+        <w:t xml:space="preserve"> </w:t>
+      </w:r>
+      <w:r>
+        <w:t xml:space="preserve">as the live</w:t>
+      </w:r>
+      <w:r>
+        <w:t xml:space="preserve"> </w:t>
+      </w:r>
+      <w:r>
+        <w:rPr>
+          <w:rStyle w:val="VerbatimChar"/>
+        </w:rPr>
+        <w:t xml:space="preserve">SCL-HandOff/</w:t>
+      </w:r>
+      <w:r>
+        <w:t xml:space="preserve"> </w:t>
+      </w:r>
+      <w:r>
+        <w:t xml:space="preserve">folder, so the prompt file itself was not the regression source.</w:t>
+      </w:r>
+    </w:p>
+    <w:p>
+      <w:pPr>
+        <w:pStyle w:val="Compact"/>
+        <w:numPr>
+          <w:ilvl w:val="0"/>
+          <w:numId w:val="1302"/>
+        </w:numPr>
+      </w:pPr>
+      <w:r>
+        <w:t xml:space="preserve">Latest handoff-alignment fix: commit</w:t>
+      </w:r>
+      <w:r>
+        <w:t xml:space="preserve"> </w:t>
+      </w:r>
+      <w:r>
+        <w:rPr>
+          <w:rStyle w:val="VerbatimChar"/>
+        </w:rPr>
         <w:t xml:space="preserve">34e62a9</w:t>
       </w:r>
       <w:r>
         <w:t xml:space="preserve"> </w:t>
       </w:r>
       <w:r>
-        <w:t xml:space="preserve">on</w:t>
-      </w:r>
-      <w:r>
-        <w:t xml:space="preserve"> </w:t>
-      </w:r>
-      <w:r>
-        <w:rPr>
-          <w:rStyle w:val="VerbatimChar"/>
-        </w:rPr>
-        <w:t xml:space="preserve">deploy/mysql-hosting</w:t>
-      </w:r>
-      <w:r>
-        <w:t xml:space="preserve">; production</w:t>
-      </w:r>
-      <w:r>
-        <w:t xml:space="preserve"> </w:t>
-      </w:r>
-      <w:r>
-        <w:rPr>
-          <w:rStyle w:val="VerbatimChar"/>
-        </w:rPr>
-        <w:t xml:space="preserve">git status --porcelain</w:t>
-      </w:r>
-      <w:r>
-        <w:t xml:space="preserve"> </w:t>
-      </w:r>
-      <w:r>
-        <w:t xml:space="preserve">lines:</w:t>
-      </w:r>
-      <w:r>
-        <w:t xml:space="preserve"> </w:t>
-      </w:r>
-      <w:r>
-        <w:rPr>
-          <w:rStyle w:val="VerbatimChar"/>
-        </w:rPr>
-        <w:t xml:space="preserve">0</w:t>
-      </w:r>
-      <w:r>
-        <w:t xml:space="preserve">.</w:t>
+        <w:t xml:space="preserve">removes old deterministic HOT upgrades that contradicted locked v4 (</w:t>
+      </w:r>
+      <w:r>
+        <w:rPr>
+          <w:rStyle w:val="VerbatimChar"/>
+        </w:rPr>
+        <w:t xml:space="preserve">bare email</w:t>
+      </w:r>
+      <w:r>
+        <w:t xml:space="preserve"> </w:t>
+      </w:r>
+      <w:r>
+        <w:t xml:space="preserve">/</w:t>
+      </w:r>
+      <w:r>
+        <w:t xml:space="preserve"> </w:t>
+      </w:r>
+      <w:r>
+        <w:rPr>
+          <w:rStyle w:val="VerbatimChar"/>
+        </w:rPr>
+        <w:t xml:space="preserve">bare yes</w:t>
+      </w:r>
+      <w:r>
+        <w:t xml:space="preserve"> </w:t>
+      </w:r>
+      <w:r>
+        <w:t xml:space="preserve">no longer auto-promote to HOT), upgrades fallback suggestions to objection-aware Gap Selling phrasing, and keeps unread DNC replies visible in default Inbox filters until they are read.</w:t>
       </w:r>
     </w:p>
     <w:p>
@@ -10427,91 +11105,40 @@
         </w:numPr>
       </w:pPr>
       <w:r>
-        <w:t xml:space="preserve">Production deploy path used committed code only: initial full deploy fast-forwarded</w:t>
-      </w:r>
-      <w:r>
-        <w:t xml:space="preserve"> </w:t>
-      </w:r>
-      <w:r>
-        <w:rPr>
-          <w:rStyle w:val="VerbatimChar"/>
-        </w:rPr>
-        <w:t xml:space="preserve">e596d85..15414cf</w:t>
-      </w:r>
-      <w:r>
-        <w:t xml:space="preserve">, then unread-badge frontend-only fast-forward</w:t>
-      </w:r>
-      <w:r>
-        <w:t xml:space="preserve"> </w:t>
-      </w:r>
-      <w:r>
-        <w:rPr>
-          <w:rStyle w:val="VerbatimChar"/>
-        </w:rPr>
-        <w:t xml:space="preserve">15414cf..b2572de</w:t>
-      </w:r>
-      <w:r>
-        <w:t xml:space="preserve">, then AI-suggestion reply-refresh fast-forward</w:t>
-      </w:r>
-      <w:r>
-        <w:t xml:space="preserve"> </w:t>
-      </w:r>
-      <w:r>
-        <w:rPr>
-          <w:rStyle w:val="VerbatimChar"/>
-        </w:rPr>
-        <w:t xml:space="preserve">b2572de..a5b587f</w:t>
-      </w:r>
-      <w:r>
-        <w:t xml:space="preserve">, then fallback-suggestion restore fast-forward</w:t>
-      </w:r>
-      <w:r>
-        <w:t xml:space="preserve"> </w:t>
-      </w:r>
-      <w:r>
-        <w:rPr>
-          <w:rStyle w:val="VerbatimChar"/>
-        </w:rPr>
-        <w:t xml:space="preserve">a5b587f..9f6e478</w:t>
-      </w:r>
-      <w:r>
-        <w:t xml:space="preserve">, then email-suggestion repair fast-forward</w:t>
-      </w:r>
-      <w:r>
-        <w:t xml:space="preserve"> </w:t>
-      </w:r>
-      <w:r>
-        <w:rPr>
-          <w:rStyle w:val="VerbatimChar"/>
-        </w:rPr>
-        <w:t xml:space="preserve">9f6e478..064b88d</w:t>
-      </w:r>
-      <w:r>
-        <w:t xml:space="preserve">, then handoff-gap-selling restore fast-forward</w:t>
-      </w:r>
-      <w:r>
-        <w:t xml:space="preserve"> </w:t>
-      </w:r>
-      <w:r>
-        <w:rPr>
-          <w:rStyle w:val="VerbatimChar"/>
-        </w:rPr>
-        <w:t xml:space="preserve">064b88d..34e62a9</w:t>
-      </w:r>
-      <w:r>
-        <w:t xml:space="preserve"> </w:t>
-      </w:r>
-      <w:r>
-        <w:t xml:space="preserve">with fresh</w:t>
-      </w:r>
-      <w:r>
-        <w:t xml:space="preserve"> </w:t>
-      </w:r>
-      <w:r>
-        <w:rPr>
-          <w:rStyle w:val="VerbatimChar"/>
-        </w:rPr>
-        <w:t xml:space="preserve">server</w:t>
+        <w:t xml:space="preserve">Production evidence for client screenshots:</w:t>
+      </w:r>
+      <w:r>
+        <w:t xml:space="preserve"> </w:t>
+      </w:r>
+      <w:r>
+        <w:rPr>
+          <w:rStyle w:val="VerbatimChar"/>
+        </w:rPr>
+        <w:t xml:space="preserve">Reinforce Tools</w:t>
+      </w:r>
+      <w:r>
+        <w:t xml:space="preserve"> </w:t>
+      </w:r>
+      <w:r>
+        <w:t xml:space="preserve">(</w:t>
+      </w:r>
+      <w:r>
+        <w:rPr>
+          <w:rStyle w:val="VerbatimChar"/>
+        </w:rPr>
+        <w:t xml:space="preserve">cmo0m0skg04pyzo0ze7y1siwe</w:t>
+      </w:r>
+      <w:r>
+        <w:t xml:space="preserve">) had</w:t>
+      </w:r>
+      <w:r>
+        <w:t xml:space="preserve"> </w:t>
+      </w:r>
+      <w:r>
+        <w:rPr>
+          <w:rStyle w:val="VerbatimChar"/>
+        </w:rPr>
+        <w:t xml:space="preserve">aiClassification=null</w:t>
       </w:r>
       <w:r>
         <w:t xml:space="preserve"> </w:t>
@@ -10526,13 +11153,64 @@
         <w:rPr>
           <w:rStyle w:val="VerbatimChar"/>
         </w:rPr>
-        <w:t xml:space="preserve">client</w:t>
-      </w:r>
-      <w:r>
-        <w:t xml:space="preserve"> </w:t>
-      </w:r>
-      <w:r>
-        <w:t xml:space="preserve">builds on production.</w:t>
+        <w:t xml:space="preserve">aiSuggestions=null</w:t>
+      </w:r>
+      <w:r>
+        <w:t xml:space="preserve"> </w:t>
+      </w:r>
+      <w:r>
+        <w:t xml:space="preserve">at inspection time, so the generic “predatory MCA” reply shown in the screenshot was not persisted AI output;</w:t>
+      </w:r>
+      <w:r>
+        <w:t xml:space="preserve"> </w:t>
+      </w:r>
+      <w:r>
+        <w:rPr>
+          <w:rStyle w:val="VerbatimChar"/>
+        </w:rPr>
+        <w:t xml:space="preserve">SG ECHO LLC</w:t>
+      </w:r>
+      <w:r>
+        <w:t xml:space="preserve"> </w:t>
+      </w:r>
+      <w:r>
+        <w:t xml:space="preserve">/ Patricia Ann Kaelin (</w:t>
+      </w:r>
+      <w:r>
+        <w:rPr>
+          <w:rStyle w:val="VerbatimChar"/>
+        </w:rPr>
+        <w:t xml:space="preserve">cmoj0561t08a4zo2sugztfeek</w:t>
+      </w:r>
+      <w:r>
+        <w:t xml:space="preserve">) remains assigned to Marcos while the lead is</w:t>
+      </w:r>
+      <w:r>
+        <w:t xml:space="preserve"> </w:t>
+      </w:r>
+      <w:r>
+        <w:rPr>
+          <w:rStyle w:val="VerbatimChar"/>
+        </w:rPr>
+        <w:t xml:space="preserve">DNC</w:t>
+      </w:r>
+      <w:r>
+        <w:t xml:space="preserve"> </w:t>
+      </w:r>
+      <w:r>
+        <w:t xml:space="preserve">+</w:t>
+      </w:r>
+      <w:r>
+        <w:t xml:space="preserve"> </w:t>
+      </w:r>
+      <w:r>
+        <w:rPr>
+          <w:rStyle w:val="VerbatimChar"/>
+        </w:rPr>
+        <w:t xml:space="preserve">optedOut=true</w:t>
+      </w:r>
+      <w:r>
+        <w:t xml:space="preserve">, which explains why the thread dropped out of the normal inbox flow after the removal request.</w:t>
       </w:r>
     </w:p>
     <w:p>
@@ -10544,37 +11222,79 @@
         </w:numPr>
       </w:pPr>
       <w:r>
-        <w:t xml:space="preserve">Production health:</w:t>
-      </w:r>
-      <w:r>
-        <w:t xml:space="preserve"> </w:t>
-      </w:r>
-      <w:r>
-        <w:rPr>
-          <w:rStyle w:val="VerbatimChar"/>
-        </w:rPr>
-        <w:t xml:space="preserve">http://127.0.0.1:3001/api/health</w:t>
-      </w:r>
-      <w:r>
-        <w:t xml:space="preserve"> </w:t>
-      </w:r>
-      <w:r>
-        <w:t xml:space="preserve">returned</w:t>
-      </w:r>
-      <w:r>
-        <w:t xml:space="preserve"> </w:t>
-      </w:r>
-      <w:r>
-        <w:rPr>
-          <w:rStyle w:val="VerbatimChar"/>
-        </w:rPr>
-        <w:t xml:space="preserve">ok/ok/ok</w:t>
-      </w:r>
-      <w:r>
-        <w:t xml:space="preserve"> </w:t>
-      </w:r>
-      <w:r>
-        <w:t xml:space="preserve">for app/database/redis.</w:t>
+        <w:t xml:space="preserve">Twilio verification for the newly surfaced inbox replies: both</w:t>
+      </w:r>
+      <w:r>
+        <w:t xml:space="preserve"> </w:t>
+      </w:r>
+      <w:r>
+        <w:rPr>
+          <w:rStyle w:val="VerbatimChar"/>
+        </w:rPr>
+        <w:t xml:space="preserve">ROBBY 2025 / STAINLESS VALVE CO</w:t>
+      </w:r>
+      <w:r>
+        <w:t xml:space="preserve"> </w:t>
+      </w:r>
+      <w:r>
+        <w:t xml:space="preserve">(</w:t>
+      </w:r>
+      <w:r>
+        <w:rPr>
+          <w:rStyle w:val="VerbatimChar"/>
+        </w:rPr>
+        <w:t xml:space="preserve">START</w:t>
+      </w:r>
+      <w:r>
+        <w:t xml:space="preserve">, sid</w:t>
+      </w:r>
+      <w:r>
+        <w:t xml:space="preserve"> </w:t>
+      </w:r>
+      <w:r>
+        <w:rPr>
+          <w:rStyle w:val="VerbatimChar"/>
+        </w:rPr>
+        <w:t xml:space="preserve">SM8a2d22907979efa09bb51f84a18cf83b</w:t>
+      </w:r>
+      <w:r>
+        <w:t xml:space="preserve">) and</w:t>
+      </w:r>
+      <w:r>
+        <w:t xml:space="preserve"> </w:t>
+      </w:r>
+      <w:r>
+        <w:rPr>
+          <w:rStyle w:val="VerbatimChar"/>
+        </w:rPr>
+        <w:t xml:space="preserve">Jason Faraj / Woodland Creek</w:t>
+      </w:r>
+      <w:r>
+        <w:t xml:space="preserve"> </w:t>
+      </w:r>
+      <w:r>
+        <w:t xml:space="preserve">(</w:t>
+      </w:r>
+      <w:r>
+        <w:rPr>
+          <w:rStyle w:val="VerbatimChar"/>
+        </w:rPr>
+        <w:t xml:space="preserve">Okay</w:t>
+      </w:r>
+      <w:r>
+        <w:t xml:space="preserve">, sid</w:t>
+      </w:r>
+      <w:r>
+        <w:t xml:space="preserve"> </w:t>
+      </w:r>
+      <w:r>
+        <w:rPr>
+          <w:rStyle w:val="VerbatimChar"/>
+        </w:rPr>
+        <w:t xml:space="preserve">SM91f71ed97aca21d1561f8ff8f6fdb393</w:t>
+      </w:r>
+      <w:r>
+        <w:t xml:space="preserve">) are real inbound Twilio messages from 2026-04-15, not UI-generated phantom replies.</w:t>
       </w:r>
     </w:p>
     <w:p>
@@ -10586,34 +11306,22 @@
         </w:numPr>
       </w:pPr>
       <w:r>
-        <w:t xml:space="preserve">PM2:</w:t>
-      </w:r>
-      <w:r>
-        <w:t xml:space="preserve"> </w:t>
-      </w:r>
-      <w:r>
-        <w:rPr>
-          <w:rStyle w:val="VerbatimChar"/>
-        </w:rPr>
-        <w:t xml:space="preserve">sms-api</w:t>
-      </w:r>
-      <w:r>
-        <w:t xml:space="preserve"> </w:t>
-      </w:r>
-      <w:r>
-        <w:t xml:space="preserve">online after restart; restart count</w:t>
-      </w:r>
-      <w:r>
-        <w:t xml:space="preserve"> </w:t>
-      </w:r>
-      <w:r>
-        <w:rPr>
-          <w:rStyle w:val="VerbatimChar"/>
-        </w:rPr>
-        <w:t xml:space="preserve">15</w:t>
-      </w:r>
-      <w:r>
-        <w:t xml:space="preserve">.</w:t>
+        <w:t xml:space="preserve">Latest inbox cleanup fix: commit</w:t>
+      </w:r>
+      <w:r>
+        <w:t xml:space="preserve"> </w:t>
+      </w:r>
+      <w:r>
+        <w:rPr>
+          <w:rStyle w:val="VerbatimChar"/>
+        </w:rPr>
+        <w:t xml:space="preserve">74f472f</w:t>
+      </w:r>
+      <w:r>
+        <w:t xml:space="preserve"> </w:t>
+      </w:r>
+      <w:r>
+        <w:t xml:space="preserve">narrows unread DNC visibility in default inbox scopes to a recent 7-day window so old hidden DNC backlog does not suddenly flood reps after the SG ECHO visibility fix.</w:t>
       </w:r>
     </w:p>
     <w:p>
@@ -10625,580 +11333,97 @@
         </w:numPr>
       </w:pPr>
       <w:r>
-        <w:t xml:space="preserve">Production runtime logs: PM2</w:t>
-      </w:r>
-      <w:r>
-        <w:t xml:space="preserve"> </w:t>
-      </w:r>
-      <w:r>
-        <w:rPr>
-          <w:rStyle w:val="VerbatimChar"/>
-        </w:rPr>
-        <w:t xml:space="preserve">out</w:t>
-      </w:r>
-      <w:r>
-        <w:t xml:space="preserve">/</w:t>
-      </w:r>
-      <w:r>
-        <w:rPr>
-          <w:rStyle w:val="VerbatimChar"/>
-        </w:rPr>
-        <w:t xml:space="preserve">error</w:t>
-      </w:r>
-      <w:r>
-        <w:t xml:space="preserve"> </w:t>
-      </w:r>
-      <w:r>
-        <w:t xml:space="preserve">tails were empty immediately after deploy; no fresh runtime errors were emitted after restart.</w:t>
-      </w:r>
-    </w:p>
-    <w:p>
-      <w:pPr>
-        <w:pStyle w:val="Compact"/>
-        <w:numPr>
-          <w:ilvl w:val="0"/>
-          <w:numId w:val="1302"/>
-        </w:numPr>
-      </w:pPr>
-      <w:r>
-        <w:t xml:space="preserve">Latest CI proof: run</w:t>
-      </w:r>
-      <w:r>
-        <w:t xml:space="preserve"> </w:t>
-      </w:r>
-      <w:r>
-        <w:rPr>
-          <w:rStyle w:val="VerbatimChar"/>
-        </w:rPr>
-        <w:t xml:space="preserve">25068339405</w:t>
-      </w:r>
-      <w:r>
-        <w:t xml:space="preserve">, commit</w:t>
-      </w:r>
-      <w:r>
-        <w:t xml:space="preserve"> </w:t>
-      </w:r>
-      <w:r>
-        <w:rPr>
-          <w:rStyle w:val="VerbatimChar"/>
-        </w:rPr>
-        <w:t xml:space="preserve">b2572de</w:t>
-      </w:r>
-      <w:r>
-        <w:t xml:space="preserve">, jobs completed successfully.</w:t>
-      </w:r>
-    </w:p>
-    <w:p>
-      <w:pPr>
-        <w:pStyle w:val="Compact"/>
-        <w:numPr>
-          <w:ilvl w:val="0"/>
-          <w:numId w:val="1302"/>
-        </w:numPr>
-      </w:pPr>
-      <w:r>
-        <w:t xml:space="preserve">Latest production build proof: server build passed; client build passed with known CSS minify warning</w:t>
-      </w:r>
-      <w:r>
-        <w:t xml:space="preserve"> </w:t>
-      </w:r>
-      <w:r>
-        <w:rPr>
-          <w:rStyle w:val="VerbatimChar"/>
-        </w:rPr>
-        <w:t xml:space="preserve">.light .bg-dark-800.border*</w:t>
-      </w:r>
-      <w:r>
-        <w:t xml:space="preserve"> </w:t>
-      </w:r>
-      <w:r>
-        <w:t xml:space="preserve">only.</w:t>
-      </w:r>
-    </w:p>
-    <w:p>
-      <w:pPr>
-        <w:pStyle w:val="Compact"/>
-        <w:numPr>
-          <w:ilvl w:val="0"/>
-          <w:numId w:val="1302"/>
-        </w:numPr>
-      </w:pPr>
-      <w:r>
-        <w:t xml:space="preserve">Public frontend smoke:</w:t>
-      </w:r>
-      <w:r>
-        <w:t xml:space="preserve"> </w:t>
-      </w:r>
-      <w:r>
-        <w:rPr>
-          <w:rStyle w:val="VerbatimChar"/>
-        </w:rPr>
-        <w:t xml:space="preserve">https://app.sclcapital.io/</w:t>
-      </w:r>
-      <w:r>
-        <w:t xml:space="preserve"> </w:t>
-      </w:r>
-      <w:r>
-        <w:t xml:space="preserve">returned</w:t>
-      </w:r>
-      <w:r>
-        <w:t xml:space="preserve"> </w:t>
-      </w:r>
-      <w:r>
-        <w:rPr>
-          <w:rStyle w:val="VerbatimChar"/>
-        </w:rPr>
-        <w:t xml:space="preserve">200 OK</w:t>
-      </w:r>
-      <w:r>
-        <w:t xml:space="preserve"> </w:t>
-      </w:r>
-      <w:r>
-        <w:t xml:space="preserve">and current index timestamp after deploy.</w:t>
-      </w:r>
-    </w:p>
-    <w:p>
-      <w:pPr>
-        <w:pStyle w:val="Compact"/>
-        <w:numPr>
-          <w:ilvl w:val="0"/>
-          <w:numId w:val="1302"/>
-        </w:numPr>
-      </w:pPr>
-      <w:r>
-        <w:t xml:space="preserve">Current unread-badge fix: sidebar Inbox badge now uses unread conversation count, matching Inbox/Admin View and the User Guide contract.</w:t>
-      </w:r>
-    </w:p>
-    <w:p>
-      <w:pPr>
-        <w:pStyle w:val="Compact"/>
-        <w:numPr>
-          <w:ilvl w:val="0"/>
-          <w:numId w:val="1302"/>
-        </w:numPr>
-      </w:pPr>
-      <w:r>
-        <w:t xml:space="preserve">Latest AI suggestion reply-refresh fix: commit</w:t>
-      </w:r>
-      <w:r>
-        <w:t xml:space="preserve"> </w:t>
-      </w:r>
-      <w:r>
-        <w:rPr>
-          <w:rStyle w:val="VerbatimChar"/>
-        </w:rPr>
-        <w:t xml:space="preserve">a5b587f</w:t>
-      </w:r>
-      <w:r>
-        <w:t xml:space="preserve"> </w:t>
-      </w:r>
-      <w:r>
-        <w:t xml:space="preserve">triggers owner-action reclassification after successful outbound reply; targeted regression</w:t>
-      </w:r>
-      <w:r>
-        <w:t xml:space="preserve"> </w:t>
-      </w:r>
-      <w:r>
-        <w:rPr>
-          <w:rStyle w:val="VerbatimChar"/>
-        </w:rPr>
-        <w:t xml:space="preserve">server/tests/inboxReplyReclassification.test.ts</w:t>
-      </w:r>
-      <w:r>
-        <w:t xml:space="preserve"> </w:t>
-      </w:r>
-      <w:r>
-        <w:t xml:space="preserve">passed 2/2;</w:t>
-      </w:r>
-      <w:r>
-        <w:t xml:space="preserve"> </w:t>
-      </w:r>
-      <w:r>
-        <w:rPr>
-          <w:rStyle w:val="VerbatimChar"/>
-        </w:rPr>
-        <w:t xml:space="preserve">server npm run build</w:t>
-      </w:r>
-      <w:r>
-        <w:t xml:space="preserve"> </w:t>
-      </w:r>
-      <w:r>
-        <w:t xml:space="preserve">passed.</w:t>
-      </w:r>
-    </w:p>
-    <w:p>
-      <w:pPr>
-        <w:pStyle w:val="Compact"/>
-        <w:numPr>
-          <w:ilvl w:val="0"/>
-          <w:numId w:val="1302"/>
-        </w:numPr>
-      </w:pPr>
-      <w:r>
-        <w:t xml:space="preserve">Latest AI suggestion restore fix: commit</w:t>
-      </w:r>
-      <w:r>
-        <w:t xml:space="preserve"> </w:t>
-      </w:r>
-      <w:r>
-        <w:rPr>
-          <w:rStyle w:val="VerbatimChar"/>
-        </w:rPr>
-        <w:t xml:space="preserve">9f6e478</w:t>
-      </w:r>
-      <w:r>
-        <w:t xml:space="preserve"> </w:t>
-      </w:r>
-      <w:r>
-        <w:t xml:space="preserve">rebuilds fallback suggestions when classified conversations have an empty</w:t>
-      </w:r>
-      <w:r>
-        <w:t xml:space="preserve"> </w:t>
-      </w:r>
-      <w:r>
-        <w:rPr>
-          <w:rStyle w:val="VerbatimChar"/>
-        </w:rPr>
-        <w:t xml:space="preserve">aiSuggestions</w:t>
-      </w:r>
-      <w:r>
-        <w:t xml:space="preserve"> </w:t>
-      </w:r>
-      <w:r>
-        <w:t xml:space="preserve">array; targeted regression</w:t>
-      </w:r>
-      <w:r>
-        <w:t xml:space="preserve"> </w:t>
-      </w:r>
-      <w:r>
-        <w:rPr>
-          <w:rStyle w:val="VerbatimChar"/>
-        </w:rPr>
-        <w:t xml:space="preserve">server/tests/aiSuggestionPolicy.test.ts</w:t>
-      </w:r>
-      <w:r>
-        <w:t xml:space="preserve"> </w:t>
-      </w:r>
-      <w:r>
-        <w:t xml:space="preserve">passed 5/5;</w:t>
-      </w:r>
-      <w:r>
-        <w:t xml:space="preserve"> </w:t>
-      </w:r>
-      <w:r>
-        <w:rPr>
-          <w:rStyle w:val="VerbatimChar"/>
-        </w:rPr>
-        <w:t xml:space="preserve">server npm run build</w:t>
-      </w:r>
-      <w:r>
-        <w:t xml:space="preserve"> </w:t>
-      </w:r>
-      <w:r>
-        <w:t xml:space="preserve">passed.</w:t>
-      </w:r>
-    </w:p>
-    <w:p>
-      <w:pPr>
-        <w:pStyle w:val="Compact"/>
-        <w:numPr>
-          <w:ilvl w:val="0"/>
-          <w:numId w:val="1302"/>
-        </w:numPr>
-      </w:pPr>
-      <w:r>
-        <w:t xml:space="preserve">Production API verification after deploy: previously broken threads</w:t>
-      </w:r>
-      <w:r>
-        <w:t xml:space="preserve"> </w:t>
-      </w:r>
-      <w:r>
-        <w:rPr>
-          <w:rStyle w:val="VerbatimChar"/>
-        </w:rPr>
-        <w:t xml:space="preserve">Audrey Berry $150,000.00</w:t>
-      </w:r>
-      <w:r>
-        <w:t xml:space="preserve"> </w:t>
-      </w:r>
-      <w:r>
-        <w:t xml:space="preserve">(</w:t>
-      </w:r>
-      <w:r>
-        <w:rPr>
-          <w:rStyle w:val="VerbatimChar"/>
-        </w:rPr>
-        <w:t xml:space="preserve">cmnt61hpb01cxzosfj9e0gj7d</w:t>
-      </w:r>
-      <w:r>
-        <w:t xml:space="preserve">) and</w:t>
-      </w:r>
-      <w:r>
-        <w:t xml:space="preserve"> </w:t>
-      </w:r>
-      <w:r>
-        <w:rPr>
-          <w:rStyle w:val="VerbatimChar"/>
-        </w:rPr>
-        <w:t xml:space="preserve">Jamie Johnson</w:t>
-      </w:r>
-      <w:r>
-        <w:t xml:space="preserve"> </w:t>
-      </w:r>
-      <w:r>
-        <w:t xml:space="preserve">(</w:t>
-      </w:r>
-      <w:r>
-        <w:rPr>
-          <w:rStyle w:val="VerbatimChar"/>
-        </w:rPr>
-        <w:t xml:space="preserve">cmoiqslus0d9tzo5uwqu6c25a</w:t>
-      </w:r>
-      <w:r>
-        <w:t xml:space="preserve">) now return</w:t>
-      </w:r>
-      <w:r>
-        <w:t xml:space="preserve"> </w:t>
-      </w:r>
-      <w:r>
-        <w:rPr>
-          <w:rStyle w:val="VerbatimChar"/>
-        </w:rPr>
-        <w:t xml:space="preserve">aiSuggestionsCount=1</w:t>
-      </w:r>
-      <w:r>
-        <w:t xml:space="preserve"> </w:t>
-      </w:r>
-      <w:r>
-        <w:t xml:space="preserve">with non-empty fallback text.</w:t>
-      </w:r>
-    </w:p>
-    <w:p>
-      <w:pPr>
-        <w:pStyle w:val="Compact"/>
-        <w:numPr>
-          <w:ilvl w:val="0"/>
-          <w:numId w:val="1302"/>
-        </w:numPr>
-      </w:pPr>
-      <w:r>
-        <w:t xml:space="preserve">Uploaded handoff archive verification:</w:t>
-      </w:r>
-      <w:r>
-        <w:t xml:space="preserve"> </w:t>
-      </w:r>
-      <w:r>
-        <w:rPr>
-          <w:rStyle w:val="VerbatimChar"/>
-        </w:rPr>
-        <w:t xml:space="preserve">scl-handoff-2026-4-25.rar</w:t>
-      </w:r>
-      <w:r>
-        <w:t xml:space="preserve"> </w:t>
-      </w:r>
-      <w:r>
-        <w:t xml:space="preserve">contains the same</w:t>
-      </w:r>
-      <w:r>
-        <w:t xml:space="preserve"> </w:t>
-      </w:r>
-      <w:r>
-        <w:rPr>
-          <w:rStyle w:val="VerbatimChar"/>
-        </w:rPr>
-        <w:t xml:space="preserve">classifier_prompt_v4_LOCKED.md</w:t>
-      </w:r>
-      <w:r>
-        <w:t xml:space="preserve"> </w:t>
-      </w:r>
-      <w:r>
-        <w:t xml:space="preserve">as the live</w:t>
-      </w:r>
-      <w:r>
-        <w:t xml:space="preserve"> </w:t>
-      </w:r>
-      <w:r>
-        <w:rPr>
-          <w:rStyle w:val="VerbatimChar"/>
-        </w:rPr>
-        <w:t xml:space="preserve">SCL-HandOff/</w:t>
-      </w:r>
-      <w:r>
-        <w:t xml:space="preserve"> </w:t>
-      </w:r>
-      <w:r>
-        <w:t xml:space="preserve">folder, so the prompt file itself was not the regression source.</w:t>
-      </w:r>
-    </w:p>
-    <w:p>
-      <w:pPr>
-        <w:pStyle w:val="Compact"/>
-        <w:numPr>
-          <w:ilvl w:val="0"/>
-          <w:numId w:val="1302"/>
-        </w:numPr>
-      </w:pPr>
-      <w:r>
-        <w:t xml:space="preserve">Latest handoff-alignment fix: commit</w:t>
-      </w:r>
-      <w:r>
-        <w:t xml:space="preserve"> </w:t>
-      </w:r>
-      <w:r>
-        <w:rPr>
-          <w:rStyle w:val="VerbatimChar"/>
-        </w:rPr>
-        <w:t xml:space="preserve">34e62a9</w:t>
-      </w:r>
-      <w:r>
-        <w:t xml:space="preserve"> </w:t>
-      </w:r>
-      <w:r>
-        <w:t xml:space="preserve">removes old deterministic HOT upgrades that contradicted locked v4 (</w:t>
-      </w:r>
-      <w:r>
-        <w:rPr>
-          <w:rStyle w:val="VerbatimChar"/>
-        </w:rPr>
-        <w:t xml:space="preserve">bare email</w:t>
-      </w:r>
-      <w:r>
-        <w:t xml:space="preserve"> </w:t>
-      </w:r>
-      <w:r>
-        <w:t xml:space="preserve">/</w:t>
-      </w:r>
-      <w:r>
-        <w:t xml:space="preserve"> </w:t>
-      </w:r>
-      <w:r>
-        <w:rPr>
-          <w:rStyle w:val="VerbatimChar"/>
-        </w:rPr>
-        <w:t xml:space="preserve">bare yes</w:t>
-      </w:r>
-      <w:r>
-        <w:t xml:space="preserve"> </w:t>
-      </w:r>
-      <w:r>
-        <w:t xml:space="preserve">no longer auto-promote to HOT), upgrades fallback suggestions to objection-aware Gap Selling phrasing, and keeps unread DNC replies visible in default Inbox filters until they are read.</w:t>
-      </w:r>
-    </w:p>
-    <w:p>
-      <w:pPr>
-        <w:pStyle w:val="Compact"/>
-        <w:numPr>
-          <w:ilvl w:val="0"/>
-          <w:numId w:val="1302"/>
-        </w:numPr>
-      </w:pPr>
-      <w:r>
-        <w:t xml:space="preserve">Production evidence for client screenshots:</w:t>
-      </w:r>
-      <w:r>
-        <w:t xml:space="preserve"> </w:t>
-      </w:r>
-      <w:r>
-        <w:rPr>
-          <w:rStyle w:val="VerbatimChar"/>
-        </w:rPr>
-        <w:t xml:space="preserve">Reinforce Tools</w:t>
-      </w:r>
-      <w:r>
-        <w:t xml:space="preserve"> </w:t>
-      </w:r>
-      <w:r>
-        <w:t xml:space="preserve">(</w:t>
-      </w:r>
-      <w:r>
-        <w:rPr>
-          <w:rStyle w:val="VerbatimChar"/>
-        </w:rPr>
-        <w:t xml:space="preserve">cmo0m0skg04pyzo0ze7y1siwe</w:t>
-      </w:r>
-      <w:r>
-        <w:t xml:space="preserve">) had</w:t>
-      </w:r>
-      <w:r>
-        <w:t xml:space="preserve"> </w:t>
-      </w:r>
-      <w:r>
-        <w:rPr>
-          <w:rStyle w:val="VerbatimChar"/>
-        </w:rPr>
-        <w:t xml:space="preserve">aiClassification=null</w:t>
-      </w:r>
-      <w:r>
-        <w:t xml:space="preserve"> </w:t>
-      </w:r>
-      <w:r>
-        <w:t xml:space="preserve">and</w:t>
-      </w:r>
-      <w:r>
-        <w:t xml:space="preserve"> </w:t>
-      </w:r>
-      <w:r>
-        <w:rPr>
-          <w:rStyle w:val="VerbatimChar"/>
-        </w:rPr>
-        <w:t xml:space="preserve">aiSuggestions=null</w:t>
-      </w:r>
-      <w:r>
-        <w:t xml:space="preserve"> </w:t>
-      </w:r>
-      <w:r>
-        <w:t xml:space="preserve">at inspection time, so the generic “predatory MCA” reply shown in the screenshot was not persisted AI output;</w:t>
-      </w:r>
-      <w:r>
-        <w:t xml:space="preserve"> </w:t>
-      </w:r>
-      <w:r>
-        <w:rPr>
-          <w:rStyle w:val="VerbatimChar"/>
-        </w:rPr>
-        <w:t xml:space="preserve">SG ECHO LLC</w:t>
-      </w:r>
-      <w:r>
-        <w:t xml:space="preserve"> </w:t>
-      </w:r>
-      <w:r>
-        <w:t xml:space="preserve">/ Patricia Ann Kaelin (</w:t>
-      </w:r>
-      <w:r>
-        <w:rPr>
-          <w:rStyle w:val="VerbatimChar"/>
-        </w:rPr>
-        <w:t xml:space="preserve">cmoj0561t08a4zo2sugztfeek</w:t>
-      </w:r>
-      <w:r>
-        <w:t xml:space="preserve">) remains assigned to Marcos while the lead is</w:t>
-      </w:r>
-      <w:r>
-        <w:t xml:space="preserve"> </w:t>
-      </w:r>
-      <w:r>
-        <w:rPr>
-          <w:rStyle w:val="VerbatimChar"/>
-        </w:rPr>
-        <w:t xml:space="preserve">DNC</w:t>
-      </w:r>
-      <w:r>
-        <w:t xml:space="preserve"> </w:t>
-      </w:r>
-      <w:r>
-        <w:t xml:space="preserve">+</w:t>
-      </w:r>
-      <w:r>
-        <w:t xml:space="preserve"> </w:t>
-      </w:r>
-      <w:r>
-        <w:rPr>
-          <w:rStyle w:val="VerbatimChar"/>
-        </w:rPr>
-        <w:t xml:space="preserve">optedOut=true</w:t>
-      </w:r>
-      <w:r>
-        <w:t xml:space="preserve">, which explains why the thread dropped out of the normal inbox flow after the removal request.</w:t>
+        <w:t xml:space="preserve">Latest opt-in normalization fix: commit</w:t>
+      </w:r>
+      <w:r>
+        <w:t xml:space="preserve"> </w:t>
+      </w:r>
+      <w:r>
+        <w:rPr>
+          <w:rStyle w:val="VerbatimChar"/>
+        </w:rPr>
+        <w:t xml:space="preserve">74f472f</w:t>
+      </w:r>
+      <w:r>
+        <w:t xml:space="preserve"> </w:t>
+      </w:r>
+      <w:r>
+        <w:t xml:space="preserve">updates</w:t>
+      </w:r>
+      <w:r>
+        <w:t xml:space="preserve"> </w:t>
+      </w:r>
+      <w:r>
+        <w:rPr>
+          <w:rStyle w:val="VerbatimChar"/>
+        </w:rPr>
+        <w:t xml:space="preserve">ComplianceService.handleOptIn()</w:t>
+      </w:r>
+      <w:r>
+        <w:t xml:space="preserve"> </w:t>
+      </w:r>
+      <w:r>
+        <w:t xml:space="preserve">so</w:t>
+      </w:r>
+      <w:r>
+        <w:t xml:space="preserve"> </w:t>
+      </w:r>
+      <w:r>
+        <w:rPr>
+          <w:rStyle w:val="VerbatimChar"/>
+        </w:rPr>
+        <w:t xml:space="preserve">START/UNSTOP/SUBSCRIBE</w:t>
+      </w:r>
+      <w:r>
+        <w:t xml:space="preserve"> </w:t>
+      </w:r>
+      <w:r>
+        <w:t xml:space="preserve">clears DNC suppression state (</w:t>
+      </w:r>
+      <w:r>
+        <w:rPr>
+          <w:rStyle w:val="VerbatimChar"/>
+        </w:rPr>
+        <w:t xml:space="preserve">optedOut</w:t>
+      </w:r>
+      <w:r>
+        <w:t xml:space="preserve">,</w:t>
+      </w:r>
+      <w:r>
+        <w:t xml:space="preserve"> </w:t>
+      </w:r>
+      <w:r>
+        <w:rPr>
+          <w:rStyle w:val="VerbatimChar"/>
+        </w:rPr>
+        <w:t xml:space="preserve">isSuppressed</w:t>
+      </w:r>
+      <w:r>
+        <w:t xml:space="preserve">,</w:t>
+      </w:r>
+      <w:r>
+        <w:t xml:space="preserve"> </w:t>
+      </w:r>
+      <w:r>
+        <w:rPr>
+          <w:rStyle w:val="VerbatimChar"/>
+        </w:rPr>
+        <w:t xml:space="preserve">suppressionEntry</w:t>
+      </w:r>
+      <w:r>
+        <w:t xml:space="preserve">,</w:t>
+      </w:r>
+      <w:r>
+        <w:t xml:space="preserve"> </w:t>
+      </w:r>
+      <w:r>
+        <w:rPr>
+          <w:rStyle w:val="VerbatimChar"/>
+        </w:rPr>
+        <w:t xml:space="preserve">conversation.leadStatus</w:t>
+      </w:r>
+      <w:r>
+        <w:t xml:space="preserve">) instead of leaving a re-subscribed lead logically stuck in DNC.</w:t>
       </w:r>
     </w:p>
     <w:p>
@@ -13800,6 +14025,210 @@
             </w:pPr>
             <w:r>
               <w:t xml:space="preserve">Production SHA 34e62a9; PM2 online; SG ECHO + Reinforce checks logged</w:t>
+            </w:r>
+          </w:p>
+        </w:tc>
+        <w:tc>
+          <w:tcPr/>
+          <w:p>
+            <w:pPr>
+              <w:pStyle w:val="Compact"/>
+            </w:pPr>
+            <w:r>
+              <w:t xml:space="preserve">Done</w:t>
+            </w:r>
+          </w:p>
+        </w:tc>
+      </w:tr>
+      <w:tr>
+        <w:tc>
+          <w:tcPr/>
+          <w:p>
+            <w:pPr>
+              <w:pStyle w:val="Compact"/>
+            </w:pPr>
+            <w:r>
+              <w:t xml:space="preserve">2026-04-28</w:t>
+            </w:r>
+          </w:p>
+        </w:tc>
+        <w:tc>
+          <w:tcPr/>
+          <w:p>
+            <w:pPr>
+              <w:pStyle w:val="Compact"/>
+            </w:pPr>
+            <w:r>
+              <w:t xml:space="preserve">Inbox Backlog Guard</w:t>
+            </w:r>
+          </w:p>
+        </w:tc>
+        <w:tc>
+          <w:tcPr/>
+          <w:p>
+            <w:pPr>
+              <w:pStyle w:val="Compact"/>
+            </w:pPr>
+            <w:r>
+              <w:t xml:space="preserve">Limited stale unread DNC backlog in default inbox scopes</w:t>
+            </w:r>
+          </w:p>
+        </w:tc>
+        <w:tc>
+          <w:tcPr/>
+          <w:p>
+            <w:pPr>
+              <w:pStyle w:val="Compact"/>
+            </w:pPr>
+            <w:r>
+              <w:t xml:space="preserve">74f472f</w:t>
+            </w:r>
+          </w:p>
+        </w:tc>
+        <w:tc>
+          <w:tcPr/>
+          <w:p>
+            <w:pPr>
+              <w:pStyle w:val="Compact"/>
+            </w:pPr>
+            <w:r>
+              <w:t xml:space="preserve">Visibility test 1/1 + server build passed</w:t>
+            </w:r>
+          </w:p>
+        </w:tc>
+        <w:tc>
+          <w:tcPr/>
+          <w:p>
+            <w:pPr>
+              <w:pStyle w:val="Compact"/>
+            </w:pPr>
+            <w:r>
+              <w:t xml:space="preserve">Done</w:t>
+            </w:r>
+          </w:p>
+        </w:tc>
+      </w:tr>
+      <w:tr>
+        <w:tc>
+          <w:tcPr/>
+          <w:p>
+            <w:pPr>
+              <w:pStyle w:val="Compact"/>
+            </w:pPr>
+            <w:r>
+              <w:t xml:space="preserve">2026-04-28</w:t>
+            </w:r>
+          </w:p>
+        </w:tc>
+        <w:tc>
+          <w:tcPr/>
+          <w:p>
+            <w:pPr>
+              <w:pStyle w:val="Compact"/>
+            </w:pPr>
+            <w:r>
+              <w:t xml:space="preserve">Compliance Opt-In Fix</w:t>
+            </w:r>
+          </w:p>
+        </w:tc>
+        <w:tc>
+          <w:tcPr/>
+          <w:p>
+            <w:pPr>
+              <w:pStyle w:val="Compact"/>
+            </w:pPr>
+            <w:r>
+              <w:t xml:space="preserve">START now clears DNC / suppression state for re-subscribes</w:t>
+            </w:r>
+          </w:p>
+        </w:tc>
+        <w:tc>
+          <w:tcPr/>
+          <w:p>
+            <w:pPr>
+              <w:pStyle w:val="Compact"/>
+            </w:pPr>
+            <w:r>
+              <w:t xml:space="preserve">74f472f</w:t>
+            </w:r>
+          </w:p>
+        </w:tc>
+        <w:tc>
+          <w:tcPr/>
+          <w:p>
+            <w:pPr>
+              <w:pStyle w:val="Compact"/>
+            </w:pPr>
+            <w:r>
+              <w:t xml:space="preserve">Compliance regression added; TS build passed</w:t>
+            </w:r>
+          </w:p>
+        </w:tc>
+        <w:tc>
+          <w:tcPr/>
+          <w:p>
+            <w:pPr>
+              <w:pStyle w:val="Compact"/>
+            </w:pPr>
+            <w:r>
+              <w:t xml:space="preserve">Done</w:t>
+            </w:r>
+          </w:p>
+        </w:tc>
+      </w:tr>
+      <w:tr>
+        <w:tc>
+          <w:tcPr/>
+          <w:p>
+            <w:pPr>
+              <w:pStyle w:val="Compact"/>
+            </w:pPr>
+            <w:r>
+              <w:t xml:space="preserve">2026-04-28</w:t>
+            </w:r>
+          </w:p>
+        </w:tc>
+        <w:tc>
+          <w:tcPr/>
+          <w:p>
+            <w:pPr>
+              <w:pStyle w:val="Compact"/>
+            </w:pPr>
+            <w:r>
+              <w:t xml:space="preserve">Production Deploy</w:t>
+            </w:r>
+          </w:p>
+        </w:tc>
+        <w:tc>
+          <w:tcPr/>
+          <w:p>
+            <w:pPr>
+              <w:pStyle w:val="Compact"/>
+            </w:pPr>
+            <w:r>
+              <w:t xml:space="preserve">Deployed stale-DNC visibility + opt-in normalization fix</w:t>
+            </w:r>
+          </w:p>
+        </w:tc>
+        <w:tc>
+          <w:tcPr/>
+          <w:p>
+            <w:pPr>
+              <w:pStyle w:val="Compact"/>
+            </w:pPr>
+            <w:r>
+              <w:t xml:space="preserve">74f472f</w:t>
+            </w:r>
+          </w:p>
+        </w:tc>
+        <w:tc>
+          <w:tcPr/>
+          <w:p>
+            <w:pPr>
+              <w:pStyle w:val="Compact"/>
+            </w:pPr>
+            <w:r>
+              <w:t xml:space="preserve">Production SHA 74f472f; PM2 online; Twilio SIDs verified</w:t>
             </w:r>
           </w:p>
         </w:tc>

</xml_diff>

<commit_message>
docs(checklist): record unread summary fix
</commit_message>
<xml_diff>
--- a/CHECKLIST_M1_M2_REMEDIATION_2026-04-28.docx
+++ b/CHECKLIST_M1_M2_REMEDIATION_2026-04-28.docx
@@ -10370,52 +10370,1000 @@
         <w:rPr>
           <w:rStyle w:val="VerbatimChar"/>
         </w:rPr>
+        <w:t xml:space="preserve">a54c027</w:t>
+      </w:r>
+      <w:r>
+        <w:t xml:space="preserve"> </w:t>
+      </w:r>
+      <w:r>
+        <w:t xml:space="preserve">on</w:t>
+      </w:r>
+      <w:r>
+        <w:t xml:space="preserve"> </w:t>
+      </w:r>
+      <w:r>
+        <w:rPr>
+          <w:rStyle w:val="VerbatimChar"/>
+        </w:rPr>
+        <w:t xml:space="preserve">deploy/mysql-hosting</w:t>
+      </w:r>
+      <w:r>
+        <w:t xml:space="preserve">; production</w:t>
+      </w:r>
+      <w:r>
+        <w:t xml:space="preserve"> </w:t>
+      </w:r>
+      <w:r>
+        <w:rPr>
+          <w:rStyle w:val="VerbatimChar"/>
+        </w:rPr>
+        <w:t xml:space="preserve">git status --porcelain</w:t>
+      </w:r>
+      <w:r>
+        <w:t xml:space="preserve"> </w:t>
+      </w:r>
+      <w:r>
+        <w:t xml:space="preserve">lines:</w:t>
+      </w:r>
+      <w:r>
+        <w:t xml:space="preserve"> </w:t>
+      </w:r>
+      <w:r>
+        <w:rPr>
+          <w:rStyle w:val="VerbatimChar"/>
+        </w:rPr>
+        <w:t xml:space="preserve">0</w:t>
+      </w:r>
+      <w:r>
+        <w:t xml:space="preserve">.</w:t>
+      </w:r>
+    </w:p>
+    <w:p>
+      <w:pPr>
+        <w:pStyle w:val="Compact"/>
+        <w:numPr>
+          <w:ilvl w:val="0"/>
+          <w:numId w:val="1302"/>
+        </w:numPr>
+      </w:pPr>
+      <w:r>
+        <w:t xml:space="preserve">Production deploy path used committed code only: initial full deploy fast-forwarded</w:t>
+      </w:r>
+      <w:r>
+        <w:t xml:space="preserve"> </w:t>
+      </w:r>
+      <w:r>
+        <w:rPr>
+          <w:rStyle w:val="VerbatimChar"/>
+        </w:rPr>
+        <w:t xml:space="preserve">e596d85..15414cf</w:t>
+      </w:r>
+      <w:r>
+        <w:t xml:space="preserve">, then unread-badge frontend-only fast-forward</w:t>
+      </w:r>
+      <w:r>
+        <w:t xml:space="preserve"> </w:t>
+      </w:r>
+      <w:r>
+        <w:rPr>
+          <w:rStyle w:val="VerbatimChar"/>
+        </w:rPr>
+        <w:t xml:space="preserve">15414cf..b2572de</w:t>
+      </w:r>
+      <w:r>
+        <w:t xml:space="preserve">, then AI-suggestion reply-refresh fast-forward</w:t>
+      </w:r>
+      <w:r>
+        <w:t xml:space="preserve"> </w:t>
+      </w:r>
+      <w:r>
+        <w:rPr>
+          <w:rStyle w:val="VerbatimChar"/>
+        </w:rPr>
+        <w:t xml:space="preserve">b2572de..a5b587f</w:t>
+      </w:r>
+      <w:r>
+        <w:t xml:space="preserve">, then fallback-suggestion restore fast-forward</w:t>
+      </w:r>
+      <w:r>
+        <w:t xml:space="preserve"> </w:t>
+      </w:r>
+      <w:r>
+        <w:rPr>
+          <w:rStyle w:val="VerbatimChar"/>
+        </w:rPr>
+        <w:t xml:space="preserve">a5b587f..9f6e478</w:t>
+      </w:r>
+      <w:r>
+        <w:t xml:space="preserve">, then email-suggestion repair fast-forward</w:t>
+      </w:r>
+      <w:r>
+        <w:t xml:space="preserve"> </w:t>
+      </w:r>
+      <w:r>
+        <w:rPr>
+          <w:rStyle w:val="VerbatimChar"/>
+        </w:rPr>
+        <w:t xml:space="preserve">9f6e478..064b88d</w:t>
+      </w:r>
+      <w:r>
+        <w:t xml:space="preserve">, then handoff-gap-selling restore fast-forward</w:t>
+      </w:r>
+      <w:r>
+        <w:t xml:space="preserve"> </w:t>
+      </w:r>
+      <w:r>
+        <w:rPr>
+          <w:rStyle w:val="VerbatimChar"/>
+        </w:rPr>
+        <w:t xml:space="preserve">064b88d..34e62a9</w:t>
+      </w:r>
+      <w:r>
+        <w:t xml:space="preserve">, then stale-DNC-visibility / opt-in-normalization fast-forward</w:t>
+      </w:r>
+      <w:r>
+        <w:t xml:space="preserve"> </w:t>
+      </w:r>
+      <w:r>
+        <w:rPr>
+          <w:rStyle w:val="VerbatimChar"/>
+        </w:rPr>
+        <w:t xml:space="preserve">34e62a9..74f472f</w:t>
+      </w:r>
+      <w:r>
+        <w:t xml:space="preserve">, then sidebar-unread-summary alignment fast-forward</w:t>
+      </w:r>
+      <w:r>
+        <w:t xml:space="preserve"> </w:t>
+      </w:r>
+      <w:r>
+        <w:rPr>
+          <w:rStyle w:val="VerbatimChar"/>
+        </w:rPr>
+        <w:t xml:space="preserve">74f472f..a54c027</w:t>
+      </w:r>
+      <w:r>
+        <w:t xml:space="preserve"> </w:t>
+      </w:r>
+      <w:r>
+        <w:t xml:space="preserve">with fresh</w:t>
+      </w:r>
+      <w:r>
+        <w:t xml:space="preserve"> </w:t>
+      </w:r>
+      <w:r>
+        <w:rPr>
+          <w:rStyle w:val="VerbatimChar"/>
+        </w:rPr>
+        <w:t xml:space="preserve">server</w:t>
+      </w:r>
+      <w:r>
+        <w:t xml:space="preserve"> </w:t>
+      </w:r>
+      <w:r>
+        <w:t xml:space="preserve">and</w:t>
+      </w:r>
+      <w:r>
+        <w:t xml:space="preserve"> </w:t>
+      </w:r>
+      <w:r>
+        <w:rPr>
+          <w:rStyle w:val="VerbatimChar"/>
+        </w:rPr>
+        <w:t xml:space="preserve">client</w:t>
+      </w:r>
+      <w:r>
+        <w:t xml:space="preserve"> </w:t>
+      </w:r>
+      <w:r>
+        <w:t xml:space="preserve">builds on production.</w:t>
+      </w:r>
+    </w:p>
+    <w:p>
+      <w:pPr>
+        <w:pStyle w:val="Compact"/>
+        <w:numPr>
+          <w:ilvl w:val="0"/>
+          <w:numId w:val="1302"/>
+        </w:numPr>
+      </w:pPr>
+      <w:r>
+        <w:t xml:space="preserve">Production health:</w:t>
+      </w:r>
+      <w:r>
+        <w:t xml:space="preserve"> </w:t>
+      </w:r>
+      <w:r>
+        <w:rPr>
+          <w:rStyle w:val="VerbatimChar"/>
+        </w:rPr>
+        <w:t xml:space="preserve">http://127.0.0.1:3001/api/health</w:t>
+      </w:r>
+      <w:r>
+        <w:t xml:space="preserve"> </w:t>
+      </w:r>
+      <w:r>
+        <w:t xml:space="preserve">returned</w:t>
+      </w:r>
+      <w:r>
+        <w:t xml:space="preserve"> </w:t>
+      </w:r>
+      <w:r>
+        <w:rPr>
+          <w:rStyle w:val="VerbatimChar"/>
+        </w:rPr>
+        <w:t xml:space="preserve">ok/ok/ok</w:t>
+      </w:r>
+      <w:r>
+        <w:t xml:space="preserve"> </w:t>
+      </w:r>
+      <w:r>
+        <w:t xml:space="preserve">for app/database/redis.</w:t>
+      </w:r>
+    </w:p>
+    <w:p>
+      <w:pPr>
+        <w:pStyle w:val="Compact"/>
+        <w:numPr>
+          <w:ilvl w:val="0"/>
+          <w:numId w:val="1302"/>
+        </w:numPr>
+      </w:pPr>
+      <w:r>
+        <w:t xml:space="preserve">PM2:</w:t>
+      </w:r>
+      <w:r>
+        <w:t xml:space="preserve"> </w:t>
+      </w:r>
+      <w:r>
+        <w:rPr>
+          <w:rStyle w:val="VerbatimChar"/>
+        </w:rPr>
+        <w:t xml:space="preserve">sms-api</w:t>
+      </w:r>
+      <w:r>
+        <w:t xml:space="preserve"> </w:t>
+      </w:r>
+      <w:r>
+        <w:t xml:space="preserve">online after restart; restart count</w:t>
+      </w:r>
+      <w:r>
+        <w:t xml:space="preserve"> </w:t>
+      </w:r>
+      <w:r>
+        <w:rPr>
+          <w:rStyle w:val="VerbatimChar"/>
+        </w:rPr>
+        <w:t xml:space="preserve">17</w:t>
+      </w:r>
+      <w:r>
+        <w:t xml:space="preserve">.</w:t>
+      </w:r>
+    </w:p>
+    <w:p>
+      <w:pPr>
+        <w:pStyle w:val="Compact"/>
+        <w:numPr>
+          <w:ilvl w:val="0"/>
+          <w:numId w:val="1302"/>
+        </w:numPr>
+      </w:pPr>
+      <w:r>
+        <w:t xml:space="preserve">Production runtime logs: PM2</w:t>
+      </w:r>
+      <w:r>
+        <w:t xml:space="preserve"> </w:t>
+      </w:r>
+      <w:r>
+        <w:rPr>
+          <w:rStyle w:val="VerbatimChar"/>
+        </w:rPr>
+        <w:t xml:space="preserve">out</w:t>
+      </w:r>
+      <w:r>
+        <w:t xml:space="preserve">/</w:t>
+      </w:r>
+      <w:r>
+        <w:rPr>
+          <w:rStyle w:val="VerbatimChar"/>
+        </w:rPr>
+        <w:t xml:space="preserve">error</w:t>
+      </w:r>
+      <w:r>
+        <w:t xml:space="preserve"> </w:t>
+      </w:r>
+      <w:r>
+        <w:t xml:space="preserve">tails were empty immediately after deploy; no fresh runtime errors were emitted after restart.</w:t>
+      </w:r>
+    </w:p>
+    <w:p>
+      <w:pPr>
+        <w:pStyle w:val="Compact"/>
+        <w:numPr>
+          <w:ilvl w:val="0"/>
+          <w:numId w:val="1302"/>
+        </w:numPr>
+      </w:pPr>
+      <w:r>
+        <w:t xml:space="preserve">Latest CI proof: run</w:t>
+      </w:r>
+      <w:r>
+        <w:t xml:space="preserve"> </w:t>
+      </w:r>
+      <w:r>
+        <w:rPr>
+          <w:rStyle w:val="VerbatimChar"/>
+        </w:rPr>
+        <w:t xml:space="preserve">25068339405</w:t>
+      </w:r>
+      <w:r>
+        <w:t xml:space="preserve">, commit</w:t>
+      </w:r>
+      <w:r>
+        <w:t xml:space="preserve"> </w:t>
+      </w:r>
+      <w:r>
+        <w:rPr>
+          <w:rStyle w:val="VerbatimChar"/>
+        </w:rPr>
+        <w:t xml:space="preserve">b2572de</w:t>
+      </w:r>
+      <w:r>
+        <w:t xml:space="preserve">, jobs completed successfully.</w:t>
+      </w:r>
+    </w:p>
+    <w:p>
+      <w:pPr>
+        <w:pStyle w:val="Compact"/>
+        <w:numPr>
+          <w:ilvl w:val="0"/>
+          <w:numId w:val="1302"/>
+        </w:numPr>
+      </w:pPr>
+      <w:r>
+        <w:t xml:space="preserve">Latest production build proof: server build passed; client build passed with known CSS minify warning</w:t>
+      </w:r>
+      <w:r>
+        <w:t xml:space="preserve"> </w:t>
+      </w:r>
+      <w:r>
+        <w:rPr>
+          <w:rStyle w:val="VerbatimChar"/>
+        </w:rPr>
+        <w:t xml:space="preserve">.light .bg-dark-800.border*</w:t>
+      </w:r>
+      <w:r>
+        <w:t xml:space="preserve"> </w:t>
+      </w:r>
+      <w:r>
+        <w:t xml:space="preserve">only.</w:t>
+      </w:r>
+    </w:p>
+    <w:p>
+      <w:pPr>
+        <w:pStyle w:val="Compact"/>
+        <w:numPr>
+          <w:ilvl w:val="0"/>
+          <w:numId w:val="1302"/>
+        </w:numPr>
+      </w:pPr>
+      <w:r>
+        <w:t xml:space="preserve">Public frontend smoke:</w:t>
+      </w:r>
+      <w:r>
+        <w:t xml:space="preserve"> </w:t>
+      </w:r>
+      <w:r>
+        <w:rPr>
+          <w:rStyle w:val="VerbatimChar"/>
+        </w:rPr>
+        <w:t xml:space="preserve">https://app.sclcapital.io/</w:t>
+      </w:r>
+      <w:r>
+        <w:t xml:space="preserve"> </w:t>
+      </w:r>
+      <w:r>
+        <w:t xml:space="preserve">returned</w:t>
+      </w:r>
+      <w:r>
+        <w:t xml:space="preserve"> </w:t>
+      </w:r>
+      <w:r>
+        <w:rPr>
+          <w:rStyle w:val="VerbatimChar"/>
+        </w:rPr>
+        <w:t xml:space="preserve">200 OK</w:t>
+      </w:r>
+      <w:r>
+        <w:t xml:space="preserve"> </w:t>
+      </w:r>
+      <w:r>
+        <w:t xml:space="preserve">and current index timestamp after deploy.</w:t>
+      </w:r>
+    </w:p>
+    <w:p>
+      <w:pPr>
+        <w:pStyle w:val="Compact"/>
+        <w:numPr>
+          <w:ilvl w:val="0"/>
+          <w:numId w:val="1302"/>
+        </w:numPr>
+      </w:pPr>
+      <w:r>
+        <w:t xml:space="preserve">Current unread-badge fix: sidebar Inbox badge now uses unread conversation count, and commit</w:t>
+      </w:r>
+      <w:r>
+        <w:t xml:space="preserve"> </w:t>
+      </w:r>
+      <w:r>
+        <w:rPr>
+          <w:rStyle w:val="VerbatimChar"/>
+        </w:rPr>
+        <w:t xml:space="preserve">a54c027</w:t>
+      </w:r>
+      <w:r>
+        <w:t xml:space="preserve"> </w:t>
+      </w:r>
+      <w:r>
+        <w:t xml:space="preserve">aligns</w:t>
+      </w:r>
+      <w:r>
+        <w:t xml:space="preserve"> </w:t>
+      </w:r>
+      <w:r>
+        <w:rPr>
+          <w:rStyle w:val="VerbatimChar"/>
+        </w:rPr>
+        <w:t xml:space="preserve">/inbox/unread-summary</w:t>
+      </w:r>
+      <w:r>
+        <w:t xml:space="preserve"> </w:t>
+      </w:r>
+      <w:r>
+        <w:t xml:space="preserve">with the same visibility policy as Inbox/Admin View so the sidebar count no longer includes hidden unread DNC backlog.</w:t>
+      </w:r>
+    </w:p>
+    <w:p>
+      <w:pPr>
+        <w:pStyle w:val="Compact"/>
+        <w:numPr>
+          <w:ilvl w:val="0"/>
+          <w:numId w:val="1302"/>
+        </w:numPr>
+      </w:pPr>
+      <w:r>
+        <w:t xml:space="preserve">Latest AI suggestion reply-refresh fix: commit</w:t>
+      </w:r>
+      <w:r>
+        <w:t xml:space="preserve"> </w:t>
+      </w:r>
+      <w:r>
+        <w:rPr>
+          <w:rStyle w:val="VerbatimChar"/>
+        </w:rPr>
+        <w:t xml:space="preserve">a5b587f</w:t>
+      </w:r>
+      <w:r>
+        <w:t xml:space="preserve"> </w:t>
+      </w:r>
+      <w:r>
+        <w:t xml:space="preserve">triggers owner-action reclassification after successful outbound reply; targeted regression</w:t>
+      </w:r>
+      <w:r>
+        <w:t xml:space="preserve"> </w:t>
+      </w:r>
+      <w:r>
+        <w:rPr>
+          <w:rStyle w:val="VerbatimChar"/>
+        </w:rPr>
+        <w:t xml:space="preserve">server/tests/inboxReplyReclassification.test.ts</w:t>
+      </w:r>
+      <w:r>
+        <w:t xml:space="preserve"> </w:t>
+      </w:r>
+      <w:r>
+        <w:t xml:space="preserve">passed 2/2;</w:t>
+      </w:r>
+      <w:r>
+        <w:t xml:space="preserve"> </w:t>
+      </w:r>
+      <w:r>
+        <w:rPr>
+          <w:rStyle w:val="VerbatimChar"/>
+        </w:rPr>
+        <w:t xml:space="preserve">server npm run build</w:t>
+      </w:r>
+      <w:r>
+        <w:t xml:space="preserve"> </w:t>
+      </w:r>
+      <w:r>
+        <w:t xml:space="preserve">passed.</w:t>
+      </w:r>
+    </w:p>
+    <w:p>
+      <w:pPr>
+        <w:pStyle w:val="Compact"/>
+        <w:numPr>
+          <w:ilvl w:val="0"/>
+          <w:numId w:val="1302"/>
+        </w:numPr>
+      </w:pPr>
+      <w:r>
+        <w:t xml:space="preserve">Latest AI suggestion restore fix: commit</w:t>
+      </w:r>
+      <w:r>
+        <w:t xml:space="preserve"> </w:t>
+      </w:r>
+      <w:r>
+        <w:rPr>
+          <w:rStyle w:val="VerbatimChar"/>
+        </w:rPr>
+        <w:t xml:space="preserve">9f6e478</w:t>
+      </w:r>
+      <w:r>
+        <w:t xml:space="preserve"> </w:t>
+      </w:r>
+      <w:r>
+        <w:t xml:space="preserve">rebuilds fallback suggestions when classified conversations have an empty</w:t>
+      </w:r>
+      <w:r>
+        <w:t xml:space="preserve"> </w:t>
+      </w:r>
+      <w:r>
+        <w:rPr>
+          <w:rStyle w:val="VerbatimChar"/>
+        </w:rPr>
+        <w:t xml:space="preserve">aiSuggestions</w:t>
+      </w:r>
+      <w:r>
+        <w:t xml:space="preserve"> </w:t>
+      </w:r>
+      <w:r>
+        <w:t xml:space="preserve">array; targeted regression</w:t>
+      </w:r>
+      <w:r>
+        <w:t xml:space="preserve"> </w:t>
+      </w:r>
+      <w:r>
+        <w:rPr>
+          <w:rStyle w:val="VerbatimChar"/>
+        </w:rPr>
+        <w:t xml:space="preserve">server/tests/aiSuggestionPolicy.test.ts</w:t>
+      </w:r>
+      <w:r>
+        <w:t xml:space="preserve"> </w:t>
+      </w:r>
+      <w:r>
+        <w:t xml:space="preserve">passed 5/5;</w:t>
+      </w:r>
+      <w:r>
+        <w:t xml:space="preserve"> </w:t>
+      </w:r>
+      <w:r>
+        <w:rPr>
+          <w:rStyle w:val="VerbatimChar"/>
+        </w:rPr>
+        <w:t xml:space="preserve">server npm run build</w:t>
+      </w:r>
+      <w:r>
+        <w:t xml:space="preserve"> </w:t>
+      </w:r>
+      <w:r>
+        <w:t xml:space="preserve">passed.</w:t>
+      </w:r>
+    </w:p>
+    <w:p>
+      <w:pPr>
+        <w:pStyle w:val="Compact"/>
+        <w:numPr>
+          <w:ilvl w:val="0"/>
+          <w:numId w:val="1302"/>
+        </w:numPr>
+      </w:pPr>
+      <w:r>
+        <w:t xml:space="preserve">Production API verification after deploy: previously broken threads</w:t>
+      </w:r>
+      <w:r>
+        <w:t xml:space="preserve"> </w:t>
+      </w:r>
+      <w:r>
+        <w:rPr>
+          <w:rStyle w:val="VerbatimChar"/>
+        </w:rPr>
+        <w:t xml:space="preserve">Audrey Berry $150,000.00</w:t>
+      </w:r>
+      <w:r>
+        <w:t xml:space="preserve"> </w:t>
+      </w:r>
+      <w:r>
+        <w:t xml:space="preserve">(</w:t>
+      </w:r>
+      <w:r>
+        <w:rPr>
+          <w:rStyle w:val="VerbatimChar"/>
+        </w:rPr>
+        <w:t xml:space="preserve">cmnt61hpb01cxzosfj9e0gj7d</w:t>
+      </w:r>
+      <w:r>
+        <w:t xml:space="preserve">) and</w:t>
+      </w:r>
+      <w:r>
+        <w:t xml:space="preserve"> </w:t>
+      </w:r>
+      <w:r>
+        <w:rPr>
+          <w:rStyle w:val="VerbatimChar"/>
+        </w:rPr>
+        <w:t xml:space="preserve">Jamie Johnson</w:t>
+      </w:r>
+      <w:r>
+        <w:t xml:space="preserve"> </w:t>
+      </w:r>
+      <w:r>
+        <w:t xml:space="preserve">(</w:t>
+      </w:r>
+      <w:r>
+        <w:rPr>
+          <w:rStyle w:val="VerbatimChar"/>
+        </w:rPr>
+        <w:t xml:space="preserve">cmoiqslus0d9tzo5uwqu6c25a</w:t>
+      </w:r>
+      <w:r>
+        <w:t xml:space="preserve">) now return</w:t>
+      </w:r>
+      <w:r>
+        <w:t xml:space="preserve"> </w:t>
+      </w:r>
+      <w:r>
+        <w:rPr>
+          <w:rStyle w:val="VerbatimChar"/>
+        </w:rPr>
+        <w:t xml:space="preserve">aiSuggestionsCount=1</w:t>
+      </w:r>
+      <w:r>
+        <w:t xml:space="preserve"> </w:t>
+      </w:r>
+      <w:r>
+        <w:t xml:space="preserve">with non-empty fallback text.</w:t>
+      </w:r>
+    </w:p>
+    <w:p>
+      <w:pPr>
+        <w:pStyle w:val="Compact"/>
+        <w:numPr>
+          <w:ilvl w:val="0"/>
+          <w:numId w:val="1302"/>
+        </w:numPr>
+      </w:pPr>
+      <w:r>
+        <w:t xml:space="preserve">Uploaded handoff archive verification:</w:t>
+      </w:r>
+      <w:r>
+        <w:t xml:space="preserve"> </w:t>
+      </w:r>
+      <w:r>
+        <w:rPr>
+          <w:rStyle w:val="VerbatimChar"/>
+        </w:rPr>
+        <w:t xml:space="preserve">scl-handoff-2026-4-25.rar</w:t>
+      </w:r>
+      <w:r>
+        <w:t xml:space="preserve"> </w:t>
+      </w:r>
+      <w:r>
+        <w:t xml:space="preserve">contains the same</w:t>
+      </w:r>
+      <w:r>
+        <w:t xml:space="preserve"> </w:t>
+      </w:r>
+      <w:r>
+        <w:rPr>
+          <w:rStyle w:val="VerbatimChar"/>
+        </w:rPr>
+        <w:t xml:space="preserve">classifier_prompt_v4_LOCKED.md</w:t>
+      </w:r>
+      <w:r>
+        <w:t xml:space="preserve"> </w:t>
+      </w:r>
+      <w:r>
+        <w:t xml:space="preserve">as the live</w:t>
+      </w:r>
+      <w:r>
+        <w:t xml:space="preserve"> </w:t>
+      </w:r>
+      <w:r>
+        <w:rPr>
+          <w:rStyle w:val="VerbatimChar"/>
+        </w:rPr>
+        <w:t xml:space="preserve">SCL-HandOff/</w:t>
+      </w:r>
+      <w:r>
+        <w:t xml:space="preserve"> </w:t>
+      </w:r>
+      <w:r>
+        <w:t xml:space="preserve">folder, so the prompt file itself was not the regression source.</w:t>
+      </w:r>
+    </w:p>
+    <w:p>
+      <w:pPr>
+        <w:pStyle w:val="Compact"/>
+        <w:numPr>
+          <w:ilvl w:val="0"/>
+          <w:numId w:val="1302"/>
+        </w:numPr>
+      </w:pPr>
+      <w:r>
+        <w:t xml:space="preserve">Latest handoff-alignment fix: commit</w:t>
+      </w:r>
+      <w:r>
+        <w:t xml:space="preserve"> </w:t>
+      </w:r>
+      <w:r>
+        <w:rPr>
+          <w:rStyle w:val="VerbatimChar"/>
+        </w:rPr>
+        <w:t xml:space="preserve">34e62a9</w:t>
+      </w:r>
+      <w:r>
+        <w:t xml:space="preserve"> </w:t>
+      </w:r>
+      <w:r>
+        <w:t xml:space="preserve">removes old deterministic HOT upgrades that contradicted locked v4 (</w:t>
+      </w:r>
+      <w:r>
+        <w:rPr>
+          <w:rStyle w:val="VerbatimChar"/>
+        </w:rPr>
+        <w:t xml:space="preserve">bare email</w:t>
+      </w:r>
+      <w:r>
+        <w:t xml:space="preserve"> </w:t>
+      </w:r>
+      <w:r>
+        <w:t xml:space="preserve">/</w:t>
+      </w:r>
+      <w:r>
+        <w:t xml:space="preserve"> </w:t>
+      </w:r>
+      <w:r>
+        <w:rPr>
+          <w:rStyle w:val="VerbatimChar"/>
+        </w:rPr>
+        <w:t xml:space="preserve">bare yes</w:t>
+      </w:r>
+      <w:r>
+        <w:t xml:space="preserve"> </w:t>
+      </w:r>
+      <w:r>
+        <w:t xml:space="preserve">no longer auto-promote to HOT), upgrades fallback suggestions to objection-aware Gap Selling phrasing, and keeps unread DNC replies visible in default Inbox filters until they are read.</w:t>
+      </w:r>
+    </w:p>
+    <w:p>
+      <w:pPr>
+        <w:pStyle w:val="Compact"/>
+        <w:numPr>
+          <w:ilvl w:val="0"/>
+          <w:numId w:val="1302"/>
+        </w:numPr>
+      </w:pPr>
+      <w:r>
+        <w:t xml:space="preserve">Production evidence for client screenshots:</w:t>
+      </w:r>
+      <w:r>
+        <w:t xml:space="preserve"> </w:t>
+      </w:r>
+      <w:r>
+        <w:rPr>
+          <w:rStyle w:val="VerbatimChar"/>
+        </w:rPr>
+        <w:t xml:space="preserve">Reinforce Tools</w:t>
+      </w:r>
+      <w:r>
+        <w:t xml:space="preserve"> </w:t>
+      </w:r>
+      <w:r>
+        <w:t xml:space="preserve">(</w:t>
+      </w:r>
+      <w:r>
+        <w:rPr>
+          <w:rStyle w:val="VerbatimChar"/>
+        </w:rPr>
+        <w:t xml:space="preserve">cmo0m0skg04pyzo0ze7y1siwe</w:t>
+      </w:r>
+      <w:r>
+        <w:t xml:space="preserve">) had</w:t>
+      </w:r>
+      <w:r>
+        <w:t xml:space="preserve"> </w:t>
+      </w:r>
+      <w:r>
+        <w:rPr>
+          <w:rStyle w:val="VerbatimChar"/>
+        </w:rPr>
+        <w:t xml:space="preserve">aiClassification=null</w:t>
+      </w:r>
+      <w:r>
+        <w:t xml:space="preserve"> </w:t>
+      </w:r>
+      <w:r>
+        <w:t xml:space="preserve">and</w:t>
+      </w:r>
+      <w:r>
+        <w:t xml:space="preserve"> </w:t>
+      </w:r>
+      <w:r>
+        <w:rPr>
+          <w:rStyle w:val="VerbatimChar"/>
+        </w:rPr>
+        <w:t xml:space="preserve">aiSuggestions=null</w:t>
+      </w:r>
+      <w:r>
+        <w:t xml:space="preserve"> </w:t>
+      </w:r>
+      <w:r>
+        <w:t xml:space="preserve">at inspection time, so the generic “predatory MCA” reply shown in the screenshot was not persisted AI output;</w:t>
+      </w:r>
+      <w:r>
+        <w:t xml:space="preserve"> </w:t>
+      </w:r>
+      <w:r>
+        <w:rPr>
+          <w:rStyle w:val="VerbatimChar"/>
+        </w:rPr>
+        <w:t xml:space="preserve">SG ECHO LLC</w:t>
+      </w:r>
+      <w:r>
+        <w:t xml:space="preserve"> </w:t>
+      </w:r>
+      <w:r>
+        <w:t xml:space="preserve">/ Patricia Ann Kaelin (</w:t>
+      </w:r>
+      <w:r>
+        <w:rPr>
+          <w:rStyle w:val="VerbatimChar"/>
+        </w:rPr>
+        <w:t xml:space="preserve">cmoj0561t08a4zo2sugztfeek</w:t>
+      </w:r>
+      <w:r>
+        <w:t xml:space="preserve">) remains assigned to Marcos while the lead is</w:t>
+      </w:r>
+      <w:r>
+        <w:t xml:space="preserve"> </w:t>
+      </w:r>
+      <w:r>
+        <w:rPr>
+          <w:rStyle w:val="VerbatimChar"/>
+        </w:rPr>
+        <w:t xml:space="preserve">DNC</w:t>
+      </w:r>
+      <w:r>
+        <w:t xml:space="preserve"> </w:t>
+      </w:r>
+      <w:r>
+        <w:t xml:space="preserve">+</w:t>
+      </w:r>
+      <w:r>
+        <w:t xml:space="preserve"> </w:t>
+      </w:r>
+      <w:r>
+        <w:rPr>
+          <w:rStyle w:val="VerbatimChar"/>
+        </w:rPr>
+        <w:t xml:space="preserve">optedOut=true</w:t>
+      </w:r>
+      <w:r>
+        <w:t xml:space="preserve">, which explains why the thread dropped out of the normal inbox flow after the removal request.</w:t>
+      </w:r>
+    </w:p>
+    <w:p>
+      <w:pPr>
+        <w:pStyle w:val="Compact"/>
+        <w:numPr>
+          <w:ilvl w:val="0"/>
+          <w:numId w:val="1302"/>
+        </w:numPr>
+      </w:pPr>
+      <w:r>
+        <w:t xml:space="preserve">Twilio verification for the newly surfaced inbox replies: both</w:t>
+      </w:r>
+      <w:r>
+        <w:t xml:space="preserve"> </w:t>
+      </w:r>
+      <w:r>
+        <w:rPr>
+          <w:rStyle w:val="VerbatimChar"/>
+        </w:rPr>
+        <w:t xml:space="preserve">ROBBY 2025 / STAINLESS VALVE CO</w:t>
+      </w:r>
+      <w:r>
+        <w:t xml:space="preserve"> </w:t>
+      </w:r>
+      <w:r>
+        <w:t xml:space="preserve">(</w:t>
+      </w:r>
+      <w:r>
+        <w:rPr>
+          <w:rStyle w:val="VerbatimChar"/>
+        </w:rPr>
+        <w:t xml:space="preserve">START</w:t>
+      </w:r>
+      <w:r>
+        <w:t xml:space="preserve">, sid</w:t>
+      </w:r>
+      <w:r>
+        <w:t xml:space="preserve"> </w:t>
+      </w:r>
+      <w:r>
+        <w:rPr>
+          <w:rStyle w:val="VerbatimChar"/>
+        </w:rPr>
+        <w:t xml:space="preserve">SM8a2d22907979efa09bb51f84a18cf83b</w:t>
+      </w:r>
+      <w:r>
+        <w:t xml:space="preserve">) and</w:t>
+      </w:r>
+      <w:r>
+        <w:t xml:space="preserve"> </w:t>
+      </w:r>
+      <w:r>
+        <w:rPr>
+          <w:rStyle w:val="VerbatimChar"/>
+        </w:rPr>
+        <w:t xml:space="preserve">Jason Faraj / Woodland Creek</w:t>
+      </w:r>
+      <w:r>
+        <w:t xml:space="preserve"> </w:t>
+      </w:r>
+      <w:r>
+        <w:t xml:space="preserve">(</w:t>
+      </w:r>
+      <w:r>
+        <w:rPr>
+          <w:rStyle w:val="VerbatimChar"/>
+        </w:rPr>
+        <w:t xml:space="preserve">Okay</w:t>
+      </w:r>
+      <w:r>
+        <w:t xml:space="preserve">, sid</w:t>
+      </w:r>
+      <w:r>
+        <w:t xml:space="preserve"> </w:t>
+      </w:r>
+      <w:r>
+        <w:rPr>
+          <w:rStyle w:val="VerbatimChar"/>
+        </w:rPr>
+        <w:t xml:space="preserve">SM91f71ed97aca21d1561f8ff8f6fdb393</w:t>
+      </w:r>
+      <w:r>
+        <w:t xml:space="preserve">) are real inbound Twilio messages from 2026-04-15, not UI-generated phantom replies.</w:t>
+      </w:r>
+    </w:p>
+    <w:p>
+      <w:pPr>
+        <w:pStyle w:val="Compact"/>
+        <w:numPr>
+          <w:ilvl w:val="0"/>
+          <w:numId w:val="1302"/>
+        </w:numPr>
+      </w:pPr>
+      <w:r>
+        <w:t xml:space="preserve">Latest inbox cleanup fix: commit</w:t>
+      </w:r>
+      <w:r>
+        <w:t xml:space="preserve"> </w:t>
+      </w:r>
+      <w:r>
+        <w:rPr>
+          <w:rStyle w:val="VerbatimChar"/>
+        </w:rPr>
         <w:t xml:space="preserve">74f472f</w:t>
       </w:r>
       <w:r>
         <w:t xml:space="preserve"> </w:t>
       </w:r>
       <w:r>
-        <w:t xml:space="preserve">on</w:t>
-      </w:r>
-      <w:r>
-        <w:t xml:space="preserve"> </w:t>
-      </w:r>
-      <w:r>
-        <w:rPr>
-          <w:rStyle w:val="VerbatimChar"/>
-        </w:rPr>
-        <w:t xml:space="preserve">deploy/mysql-hosting</w:t>
-      </w:r>
-      <w:r>
-        <w:t xml:space="preserve">; production</w:t>
-      </w:r>
-      <w:r>
-        <w:t xml:space="preserve"> </w:t>
-      </w:r>
-      <w:r>
-        <w:rPr>
-          <w:rStyle w:val="VerbatimChar"/>
-        </w:rPr>
-        <w:t xml:space="preserve">git status --porcelain</w:t>
-      </w:r>
-      <w:r>
-        <w:t xml:space="preserve"> </w:t>
-      </w:r>
-      <w:r>
-        <w:t xml:space="preserve">lines:</w:t>
-      </w:r>
-      <w:r>
-        <w:t xml:space="preserve"> </w:t>
-      </w:r>
-      <w:r>
-        <w:rPr>
-          <w:rStyle w:val="VerbatimChar"/>
-        </w:rPr>
-        <w:t xml:space="preserve">0</w:t>
-      </w:r>
-      <w:r>
-        <w:t xml:space="preserve">.</w:t>
+        <w:t xml:space="preserve">narrows unread DNC visibility in default inbox scopes to a recent 7-day window so old hidden DNC backlog does not suddenly flood reps after the SG ECHO visibility fix.</w:t>
       </w:r>
     </w:p>
     <w:p>
@@ -10427,124 +11375,97 @@
         </w:numPr>
       </w:pPr>
       <w:r>
-        <w:t xml:space="preserve">Production deploy path used committed code only: initial full deploy fast-forwarded</w:t>
-      </w:r>
-      <w:r>
-        <w:t xml:space="preserve"> </w:t>
-      </w:r>
-      <w:r>
-        <w:rPr>
-          <w:rStyle w:val="VerbatimChar"/>
-        </w:rPr>
-        <w:t xml:space="preserve">e596d85..15414cf</w:t>
-      </w:r>
-      <w:r>
-        <w:t xml:space="preserve">, then unread-badge frontend-only fast-forward</w:t>
-      </w:r>
-      <w:r>
-        <w:t xml:space="preserve"> </w:t>
-      </w:r>
-      <w:r>
-        <w:rPr>
-          <w:rStyle w:val="VerbatimChar"/>
-        </w:rPr>
-        <w:t xml:space="preserve">15414cf..b2572de</w:t>
-      </w:r>
-      <w:r>
-        <w:t xml:space="preserve">, then AI-suggestion reply-refresh fast-forward</w:t>
-      </w:r>
-      <w:r>
-        <w:t xml:space="preserve"> </w:t>
-      </w:r>
-      <w:r>
-        <w:rPr>
-          <w:rStyle w:val="VerbatimChar"/>
-        </w:rPr>
-        <w:t xml:space="preserve">b2572de..a5b587f</w:t>
-      </w:r>
-      <w:r>
-        <w:t xml:space="preserve">, then fallback-suggestion restore fast-forward</w:t>
-      </w:r>
-      <w:r>
-        <w:t xml:space="preserve"> </w:t>
-      </w:r>
-      <w:r>
-        <w:rPr>
-          <w:rStyle w:val="VerbatimChar"/>
-        </w:rPr>
-        <w:t xml:space="preserve">a5b587f..9f6e478</w:t>
-      </w:r>
-      <w:r>
-        <w:t xml:space="preserve">, then email-suggestion repair fast-forward</w:t>
-      </w:r>
-      <w:r>
-        <w:t xml:space="preserve"> </w:t>
-      </w:r>
-      <w:r>
-        <w:rPr>
-          <w:rStyle w:val="VerbatimChar"/>
-        </w:rPr>
-        <w:t xml:space="preserve">9f6e478..064b88d</w:t>
-      </w:r>
-      <w:r>
-        <w:t xml:space="preserve">, then handoff-gap-selling restore fast-forward</w:t>
-      </w:r>
-      <w:r>
-        <w:t xml:space="preserve"> </w:t>
-      </w:r>
-      <w:r>
-        <w:rPr>
-          <w:rStyle w:val="VerbatimChar"/>
-        </w:rPr>
-        <w:t xml:space="preserve">064b88d..34e62a9</w:t>
-      </w:r>
-      <w:r>
-        <w:t xml:space="preserve">, then stale-DNC-visibility / opt-in-normalization fast-forward</w:t>
-      </w:r>
-      <w:r>
-        <w:t xml:space="preserve"> </w:t>
-      </w:r>
-      <w:r>
-        <w:rPr>
-          <w:rStyle w:val="VerbatimChar"/>
-        </w:rPr>
-        <w:t xml:space="preserve">34e62a9..74f472f</w:t>
-      </w:r>
-      <w:r>
-        <w:t xml:space="preserve"> </w:t>
-      </w:r>
-      <w:r>
-        <w:t xml:space="preserve">with fresh</w:t>
-      </w:r>
-      <w:r>
-        <w:t xml:space="preserve"> </w:t>
-      </w:r>
-      <w:r>
-        <w:rPr>
-          <w:rStyle w:val="VerbatimChar"/>
-        </w:rPr>
-        <w:t xml:space="preserve">server</w:t>
-      </w:r>
-      <w:r>
-        <w:t xml:space="preserve"> </w:t>
-      </w:r>
-      <w:r>
-        <w:t xml:space="preserve">and</w:t>
-      </w:r>
-      <w:r>
-        <w:t xml:space="preserve"> </w:t>
-      </w:r>
-      <w:r>
-        <w:rPr>
-          <w:rStyle w:val="VerbatimChar"/>
-        </w:rPr>
-        <w:t xml:space="preserve">client</w:t>
-      </w:r>
-      <w:r>
-        <w:t xml:space="preserve"> </w:t>
-      </w:r>
-      <w:r>
-        <w:t xml:space="preserve">builds on production.</w:t>
+        <w:t xml:space="preserve">Latest opt-in normalization fix: commit</w:t>
+      </w:r>
+      <w:r>
+        <w:t xml:space="preserve"> </w:t>
+      </w:r>
+      <w:r>
+        <w:rPr>
+          <w:rStyle w:val="VerbatimChar"/>
+        </w:rPr>
+        <w:t xml:space="preserve">74f472f</w:t>
+      </w:r>
+      <w:r>
+        <w:t xml:space="preserve"> </w:t>
+      </w:r>
+      <w:r>
+        <w:t xml:space="preserve">updates</w:t>
+      </w:r>
+      <w:r>
+        <w:t xml:space="preserve"> </w:t>
+      </w:r>
+      <w:r>
+        <w:rPr>
+          <w:rStyle w:val="VerbatimChar"/>
+        </w:rPr>
+        <w:t xml:space="preserve">ComplianceService.handleOptIn()</w:t>
+      </w:r>
+      <w:r>
+        <w:t xml:space="preserve"> </w:t>
+      </w:r>
+      <w:r>
+        <w:t xml:space="preserve">so</w:t>
+      </w:r>
+      <w:r>
+        <w:t xml:space="preserve"> </w:t>
+      </w:r>
+      <w:r>
+        <w:rPr>
+          <w:rStyle w:val="VerbatimChar"/>
+        </w:rPr>
+        <w:t xml:space="preserve">START/UNSTOP/SUBSCRIBE</w:t>
+      </w:r>
+      <w:r>
+        <w:t xml:space="preserve"> </w:t>
+      </w:r>
+      <w:r>
+        <w:t xml:space="preserve">clears DNC suppression state (</w:t>
+      </w:r>
+      <w:r>
+        <w:rPr>
+          <w:rStyle w:val="VerbatimChar"/>
+        </w:rPr>
+        <w:t xml:space="preserve">optedOut</w:t>
+      </w:r>
+      <w:r>
+        <w:t xml:space="preserve">,</w:t>
+      </w:r>
+      <w:r>
+        <w:t xml:space="preserve"> </w:t>
+      </w:r>
+      <w:r>
+        <w:rPr>
+          <w:rStyle w:val="VerbatimChar"/>
+        </w:rPr>
+        <w:t xml:space="preserve">isSuppressed</w:t>
+      </w:r>
+      <w:r>
+        <w:t xml:space="preserve">,</w:t>
+      </w:r>
+      <w:r>
+        <w:t xml:space="preserve"> </w:t>
+      </w:r>
+      <w:r>
+        <w:rPr>
+          <w:rStyle w:val="VerbatimChar"/>
+        </w:rPr>
+        <w:t xml:space="preserve">suppressionEntry</w:t>
+      </w:r>
+      <w:r>
+        <w:t xml:space="preserve">,</w:t>
+      </w:r>
+      <w:r>
+        <w:t xml:space="preserve"> </w:t>
+      </w:r>
+      <w:r>
+        <w:rPr>
+          <w:rStyle w:val="VerbatimChar"/>
+        </w:rPr>
+        <w:t xml:space="preserve">conversation.leadStatus</w:t>
+      </w:r>
+      <w:r>
+        <w:t xml:space="preserve">) instead of leaving a re-subscribed lead logically stuck in DNC.</w:t>
       </w:r>
     </w:p>
     <w:p>
@@ -10556,37 +11477,67 @@
         </w:numPr>
       </w:pPr>
       <w:r>
-        <w:t xml:space="preserve">Production health:</w:t>
-      </w:r>
-      <w:r>
-        <w:t xml:space="preserve"> </w:t>
-      </w:r>
-      <w:r>
-        <w:rPr>
-          <w:rStyle w:val="VerbatimChar"/>
-        </w:rPr>
-        <w:t xml:space="preserve">http://127.0.0.1:3001/api/health</w:t>
-      </w:r>
-      <w:r>
-        <w:t xml:space="preserve"> </w:t>
-      </w:r>
-      <w:r>
-        <w:t xml:space="preserve">returned</w:t>
-      </w:r>
-      <w:r>
-        <w:t xml:space="preserve"> </w:t>
-      </w:r>
-      <w:r>
-        <w:rPr>
-          <w:rStyle w:val="VerbatimChar"/>
-        </w:rPr>
-        <w:t xml:space="preserve">ok/ok/ok</w:t>
-      </w:r>
-      <w:r>
-        <w:t xml:space="preserve"> </w:t>
-      </w:r>
-      <w:r>
-        <w:t xml:space="preserve">for app/database/redis.</w:t>
+        <w:t xml:space="preserve">Latest unread-summary alignment fix: commit</w:t>
+      </w:r>
+      <w:r>
+        <w:t xml:space="preserve"> </w:t>
+      </w:r>
+      <w:r>
+        <w:rPr>
+          <w:rStyle w:val="VerbatimChar"/>
+        </w:rPr>
+        <w:t xml:space="preserve">a54c027</w:t>
+      </w:r>
+      <w:r>
+        <w:t xml:space="preserve"> </w:t>
+      </w:r>
+      <w:r>
+        <w:t xml:space="preserve">makes</w:t>
+      </w:r>
+      <w:r>
+        <w:t xml:space="preserve"> </w:t>
+      </w:r>
+      <w:r>
+        <w:rPr>
+          <w:rStyle w:val="VerbatimChar"/>
+        </w:rPr>
+        <w:t xml:space="preserve">/inbox/unread-summary</w:t>
+      </w:r>
+      <w:r>
+        <w:t xml:space="preserve"> </w:t>
+      </w:r>
+      <w:r>
+        <w:t xml:space="preserve">reuse the same</w:t>
+      </w:r>
+      <w:r>
+        <w:t xml:space="preserve"> </w:t>
+      </w:r>
+      <w:r>
+        <w:rPr>
+          <w:rStyle w:val="VerbatimChar"/>
+        </w:rPr>
+        <w:t xml:space="preserve">buildVisibilityConditions()</w:t>
+      </w:r>
+      <w:r>
+        <w:t xml:space="preserve"> </w:t>
+      </w:r>
+      <w:r>
+        <w:t xml:space="preserve">logic as Inbox/Admin View, eliminating the server-side mismatch that previously showed sidebar</w:t>
+      </w:r>
+      <w:r>
+        <w:t xml:space="preserve"> </w:t>
+      </w:r>
+      <w:r>
+        <w:rPr>
+          <w:rStyle w:val="VerbatimChar"/>
+        </w:rPr>
+        <w:t xml:space="preserve">9+</w:t>
+      </w:r>
+      <w:r>
+        <w:t xml:space="preserve"> </w:t>
+      </w:r>
+      <w:r>
+        <w:t xml:space="preserve">while the visible inbox unread count was lower.</w:t>
       </w:r>
     </w:p>
     <w:p>
@@ -10598,832 +11549,49 @@
         </w:numPr>
       </w:pPr>
       <w:r>
-        <w:t xml:space="preserve">PM2:</w:t>
-      </w:r>
-      <w:r>
-        <w:t xml:space="preserve"> </w:t>
-      </w:r>
-      <w:r>
-        <w:rPr>
-          <w:rStyle w:val="VerbatimChar"/>
-        </w:rPr>
-        <w:t xml:space="preserve">sms-api</w:t>
-      </w:r>
-      <w:r>
-        <w:t xml:space="preserve"> </w:t>
-      </w:r>
-      <w:r>
-        <w:t xml:space="preserve">online after restart; restart count</w:t>
-      </w:r>
-      <w:r>
-        <w:t xml:space="preserve"> </w:t>
-      </w:r>
-      <w:r>
-        <w:rPr>
-          <w:rStyle w:val="VerbatimChar"/>
-        </w:rPr>
-        <w:t xml:space="preserve">16</w:t>
-      </w:r>
-      <w:r>
-        <w:t xml:space="preserve">.</w:t>
-      </w:r>
-    </w:p>
-    <w:p>
-      <w:pPr>
-        <w:pStyle w:val="Compact"/>
-        <w:numPr>
-          <w:ilvl w:val="0"/>
-          <w:numId w:val="1302"/>
-        </w:numPr>
-      </w:pPr>
-      <w:r>
-        <w:t xml:space="preserve">Production runtime logs: PM2</w:t>
-      </w:r>
-      <w:r>
-        <w:t xml:space="preserve"> </w:t>
-      </w:r>
-      <w:r>
-        <w:rPr>
-          <w:rStyle w:val="VerbatimChar"/>
-        </w:rPr>
-        <w:t xml:space="preserve">out</w:t>
-      </w:r>
-      <w:r>
-        <w:t xml:space="preserve">/</w:t>
-      </w:r>
-      <w:r>
-        <w:rPr>
-          <w:rStyle w:val="VerbatimChar"/>
-        </w:rPr>
-        <w:t xml:space="preserve">error</w:t>
-      </w:r>
-      <w:r>
-        <w:t xml:space="preserve"> </w:t>
-      </w:r>
-      <w:r>
-        <w:t xml:space="preserve">tails were empty immediately after deploy; no fresh runtime errors were emitted after restart.</w:t>
-      </w:r>
-    </w:p>
-    <w:p>
-      <w:pPr>
-        <w:pStyle w:val="Compact"/>
-        <w:numPr>
-          <w:ilvl w:val="0"/>
-          <w:numId w:val="1302"/>
-        </w:numPr>
-      </w:pPr>
-      <w:r>
-        <w:t xml:space="preserve">Latest CI proof: run</w:t>
-      </w:r>
-      <w:r>
-        <w:t xml:space="preserve"> </w:t>
-      </w:r>
-      <w:r>
-        <w:rPr>
-          <w:rStyle w:val="VerbatimChar"/>
-        </w:rPr>
-        <w:t xml:space="preserve">25068339405</w:t>
-      </w:r>
-      <w:r>
-        <w:t xml:space="preserve">, commit</w:t>
-      </w:r>
-      <w:r>
-        <w:t xml:space="preserve"> </w:t>
-      </w:r>
-      <w:r>
-        <w:rPr>
-          <w:rStyle w:val="VerbatimChar"/>
-        </w:rPr>
-        <w:t xml:space="preserve">b2572de</w:t>
-      </w:r>
-      <w:r>
-        <w:t xml:space="preserve">, jobs completed successfully.</w:t>
-      </w:r>
-    </w:p>
-    <w:p>
-      <w:pPr>
-        <w:pStyle w:val="Compact"/>
-        <w:numPr>
-          <w:ilvl w:val="0"/>
-          <w:numId w:val="1302"/>
-        </w:numPr>
-      </w:pPr>
-      <w:r>
-        <w:t xml:space="preserve">Latest production build proof: server build passed; client build passed with known CSS minify warning</w:t>
-      </w:r>
-      <w:r>
-        <w:t xml:space="preserve"> </w:t>
-      </w:r>
-      <w:r>
-        <w:rPr>
-          <w:rStyle w:val="VerbatimChar"/>
-        </w:rPr>
-        <w:t xml:space="preserve">.light .bg-dark-800.border*</w:t>
-      </w:r>
-      <w:r>
-        <w:t xml:space="preserve"> </w:t>
-      </w:r>
-      <w:r>
-        <w:t xml:space="preserve">only.</w:t>
-      </w:r>
-    </w:p>
-    <w:p>
-      <w:pPr>
-        <w:pStyle w:val="Compact"/>
-        <w:numPr>
-          <w:ilvl w:val="0"/>
-          <w:numId w:val="1302"/>
-        </w:numPr>
-      </w:pPr>
-      <w:r>
-        <w:t xml:space="preserve">Public frontend smoke:</w:t>
-      </w:r>
-      <w:r>
-        <w:t xml:space="preserve"> </w:t>
-      </w:r>
-      <w:r>
-        <w:rPr>
-          <w:rStyle w:val="VerbatimChar"/>
-        </w:rPr>
-        <w:t xml:space="preserve">https://app.sclcapital.io/</w:t>
-      </w:r>
-      <w:r>
-        <w:t xml:space="preserve"> </w:t>
-      </w:r>
-      <w:r>
-        <w:t xml:space="preserve">returned</w:t>
-      </w:r>
-      <w:r>
-        <w:t xml:space="preserve"> </w:t>
-      </w:r>
-      <w:r>
-        <w:rPr>
-          <w:rStyle w:val="VerbatimChar"/>
-        </w:rPr>
-        <w:t xml:space="preserve">200 OK</w:t>
-      </w:r>
-      <w:r>
-        <w:t xml:space="preserve"> </w:t>
-      </w:r>
-      <w:r>
-        <w:t xml:space="preserve">and current index timestamp after deploy.</w:t>
-      </w:r>
-    </w:p>
-    <w:p>
-      <w:pPr>
-        <w:pStyle w:val="Compact"/>
-        <w:numPr>
-          <w:ilvl w:val="0"/>
-          <w:numId w:val="1302"/>
-        </w:numPr>
-      </w:pPr>
-      <w:r>
-        <w:t xml:space="preserve">Current unread-badge fix: sidebar Inbox badge now uses unread conversation count, matching Inbox/Admin View and the User Guide contract.</w:t>
-      </w:r>
-    </w:p>
-    <w:p>
-      <w:pPr>
-        <w:pStyle w:val="Compact"/>
-        <w:numPr>
-          <w:ilvl w:val="0"/>
-          <w:numId w:val="1302"/>
-        </w:numPr>
-      </w:pPr>
-      <w:r>
-        <w:t xml:space="preserve">Latest AI suggestion reply-refresh fix: commit</w:t>
-      </w:r>
-      <w:r>
-        <w:t xml:space="preserve"> </w:t>
-      </w:r>
-      <w:r>
-        <w:rPr>
-          <w:rStyle w:val="VerbatimChar"/>
-        </w:rPr>
-        <w:t xml:space="preserve">a5b587f</w:t>
-      </w:r>
-      <w:r>
-        <w:t xml:space="preserve"> </w:t>
-      </w:r>
-      <w:r>
-        <w:t xml:space="preserve">triggers owner-action reclassification after successful outbound reply; targeted regression</w:t>
-      </w:r>
-      <w:r>
-        <w:t xml:space="preserve"> </w:t>
-      </w:r>
-      <w:r>
-        <w:rPr>
-          <w:rStyle w:val="VerbatimChar"/>
-        </w:rPr>
-        <w:t xml:space="preserve">server/tests/inboxReplyReclassification.test.ts</w:t>
-      </w:r>
-      <w:r>
-        <w:t xml:space="preserve"> </w:t>
-      </w:r>
-      <w:r>
-        <w:t xml:space="preserve">passed 2/2;</w:t>
-      </w:r>
-      <w:r>
-        <w:t xml:space="preserve"> </w:t>
-      </w:r>
-      <w:r>
-        <w:rPr>
-          <w:rStyle w:val="VerbatimChar"/>
-        </w:rPr>
-        <w:t xml:space="preserve">server npm run build</w:t>
-      </w:r>
-      <w:r>
-        <w:t xml:space="preserve"> </w:t>
-      </w:r>
-      <w:r>
-        <w:t xml:space="preserve">passed.</w:t>
-      </w:r>
-    </w:p>
-    <w:p>
-      <w:pPr>
-        <w:pStyle w:val="Compact"/>
-        <w:numPr>
-          <w:ilvl w:val="0"/>
-          <w:numId w:val="1302"/>
-        </w:numPr>
-      </w:pPr>
-      <w:r>
-        <w:t xml:space="preserve">Latest AI suggestion restore fix: commit</w:t>
-      </w:r>
-      <w:r>
-        <w:t xml:space="preserve"> </w:t>
-      </w:r>
-      <w:r>
-        <w:rPr>
-          <w:rStyle w:val="VerbatimChar"/>
-        </w:rPr>
-        <w:t xml:space="preserve">9f6e478</w:t>
-      </w:r>
-      <w:r>
-        <w:t xml:space="preserve"> </w:t>
-      </w:r>
-      <w:r>
-        <w:t xml:space="preserve">rebuilds fallback suggestions when classified conversations have an empty</w:t>
-      </w:r>
-      <w:r>
-        <w:t xml:space="preserve"> </w:t>
-      </w:r>
-      <w:r>
-        <w:rPr>
-          <w:rStyle w:val="VerbatimChar"/>
-        </w:rPr>
-        <w:t xml:space="preserve">aiSuggestions</w:t>
-      </w:r>
-      <w:r>
-        <w:t xml:space="preserve"> </w:t>
-      </w:r>
-      <w:r>
-        <w:t xml:space="preserve">array; targeted regression</w:t>
-      </w:r>
-      <w:r>
-        <w:t xml:space="preserve"> </w:t>
-      </w:r>
-      <w:r>
-        <w:rPr>
-          <w:rStyle w:val="VerbatimChar"/>
-        </w:rPr>
-        <w:t xml:space="preserve">server/tests/aiSuggestionPolicy.test.ts</w:t>
-      </w:r>
-      <w:r>
-        <w:t xml:space="preserve"> </w:t>
-      </w:r>
-      <w:r>
-        <w:t xml:space="preserve">passed 5/5;</w:t>
-      </w:r>
-      <w:r>
-        <w:t xml:space="preserve"> </w:t>
-      </w:r>
-      <w:r>
-        <w:rPr>
-          <w:rStyle w:val="VerbatimChar"/>
-        </w:rPr>
-        <w:t xml:space="preserve">server npm run build</w:t>
-      </w:r>
-      <w:r>
-        <w:t xml:space="preserve"> </w:t>
-      </w:r>
-      <w:r>
-        <w:t xml:space="preserve">passed.</w:t>
-      </w:r>
-    </w:p>
-    <w:p>
-      <w:pPr>
-        <w:pStyle w:val="Compact"/>
-        <w:numPr>
-          <w:ilvl w:val="0"/>
-          <w:numId w:val="1302"/>
-        </w:numPr>
-      </w:pPr>
-      <w:r>
-        <w:t xml:space="preserve">Production API verification after deploy: previously broken threads</w:t>
-      </w:r>
-      <w:r>
-        <w:t xml:space="preserve"> </w:t>
-      </w:r>
-      <w:r>
-        <w:rPr>
-          <w:rStyle w:val="VerbatimChar"/>
-        </w:rPr>
-        <w:t xml:space="preserve">Audrey Berry $150,000.00</w:t>
-      </w:r>
-      <w:r>
-        <w:t xml:space="preserve"> </w:t>
-      </w:r>
-      <w:r>
-        <w:t xml:space="preserve">(</w:t>
-      </w:r>
-      <w:r>
-        <w:rPr>
-          <w:rStyle w:val="VerbatimChar"/>
-        </w:rPr>
-        <w:t xml:space="preserve">cmnt61hpb01cxzosfj9e0gj7d</w:t>
-      </w:r>
-      <w:r>
-        <w:t xml:space="preserve">) and</w:t>
-      </w:r>
-      <w:r>
-        <w:t xml:space="preserve"> </w:t>
-      </w:r>
-      <w:r>
-        <w:rPr>
-          <w:rStyle w:val="VerbatimChar"/>
-        </w:rPr>
-        <w:t xml:space="preserve">Jamie Johnson</w:t>
-      </w:r>
-      <w:r>
-        <w:t xml:space="preserve"> </w:t>
-      </w:r>
-      <w:r>
-        <w:t xml:space="preserve">(</w:t>
-      </w:r>
-      <w:r>
-        <w:rPr>
-          <w:rStyle w:val="VerbatimChar"/>
-        </w:rPr>
-        <w:t xml:space="preserve">cmoiqslus0d9tzo5uwqu6c25a</w:t>
-      </w:r>
-      <w:r>
-        <w:t xml:space="preserve">) now return</w:t>
-      </w:r>
-      <w:r>
-        <w:t xml:space="preserve"> </w:t>
-      </w:r>
-      <w:r>
-        <w:rPr>
-          <w:rStyle w:val="VerbatimChar"/>
-        </w:rPr>
-        <w:t xml:space="preserve">aiSuggestionsCount=1</w:t>
-      </w:r>
-      <w:r>
-        <w:t xml:space="preserve"> </w:t>
-      </w:r>
-      <w:r>
-        <w:t xml:space="preserve">with non-empty fallback text.</w:t>
-      </w:r>
-    </w:p>
-    <w:p>
-      <w:pPr>
-        <w:pStyle w:val="Compact"/>
-        <w:numPr>
-          <w:ilvl w:val="0"/>
-          <w:numId w:val="1302"/>
-        </w:numPr>
-      </w:pPr>
-      <w:r>
-        <w:t xml:space="preserve">Uploaded handoff archive verification:</w:t>
-      </w:r>
-      <w:r>
-        <w:t xml:space="preserve"> </w:t>
-      </w:r>
-      <w:r>
-        <w:rPr>
-          <w:rStyle w:val="VerbatimChar"/>
-        </w:rPr>
-        <w:t xml:space="preserve">scl-handoff-2026-4-25.rar</w:t>
-      </w:r>
-      <w:r>
-        <w:t xml:space="preserve"> </w:t>
-      </w:r>
-      <w:r>
-        <w:t xml:space="preserve">contains the same</w:t>
-      </w:r>
-      <w:r>
-        <w:t xml:space="preserve"> </w:t>
-      </w:r>
-      <w:r>
-        <w:rPr>
-          <w:rStyle w:val="VerbatimChar"/>
-        </w:rPr>
-        <w:t xml:space="preserve">classifier_prompt_v4_LOCKED.md</w:t>
-      </w:r>
-      <w:r>
-        <w:t xml:space="preserve"> </w:t>
-      </w:r>
-      <w:r>
-        <w:t xml:space="preserve">as the live</w:t>
-      </w:r>
-      <w:r>
-        <w:t xml:space="preserve"> </w:t>
-      </w:r>
-      <w:r>
-        <w:rPr>
-          <w:rStyle w:val="VerbatimChar"/>
-        </w:rPr>
-        <w:t xml:space="preserve">SCL-HandOff/</w:t>
-      </w:r>
-      <w:r>
-        <w:t xml:space="preserve"> </w:t>
-      </w:r>
-      <w:r>
-        <w:t xml:space="preserve">folder, so the prompt file itself was not the regression source.</w:t>
-      </w:r>
-    </w:p>
-    <w:p>
-      <w:pPr>
-        <w:pStyle w:val="Compact"/>
-        <w:numPr>
-          <w:ilvl w:val="0"/>
-          <w:numId w:val="1302"/>
-        </w:numPr>
-      </w:pPr>
-      <w:r>
-        <w:t xml:space="preserve">Latest handoff-alignment fix: commit</w:t>
-      </w:r>
-      <w:r>
-        <w:t xml:space="preserve"> </w:t>
-      </w:r>
-      <w:r>
-        <w:rPr>
-          <w:rStyle w:val="VerbatimChar"/>
-        </w:rPr>
-        <w:t xml:space="preserve">34e62a9</w:t>
-      </w:r>
-      <w:r>
-        <w:t xml:space="preserve"> </w:t>
-      </w:r>
-      <w:r>
-        <w:t xml:space="preserve">removes old deterministic HOT upgrades that contradicted locked v4 (</w:t>
-      </w:r>
-      <w:r>
-        <w:rPr>
-          <w:rStyle w:val="VerbatimChar"/>
-        </w:rPr>
-        <w:t xml:space="preserve">bare email</w:t>
-      </w:r>
-      <w:r>
-        <w:t xml:space="preserve"> </w:t>
-      </w:r>
-      <w:r>
-        <w:t xml:space="preserve">/</w:t>
-      </w:r>
-      <w:r>
-        <w:t xml:space="preserve"> </w:t>
-      </w:r>
-      <w:r>
-        <w:rPr>
-          <w:rStyle w:val="VerbatimChar"/>
-        </w:rPr>
-        <w:t xml:space="preserve">bare yes</w:t>
-      </w:r>
-      <w:r>
-        <w:t xml:space="preserve"> </w:t>
-      </w:r>
-      <w:r>
-        <w:t xml:space="preserve">no longer auto-promote to HOT), upgrades fallback suggestions to objection-aware Gap Selling phrasing, and keeps unread DNC replies visible in default Inbox filters until they are read.</w:t>
-      </w:r>
-    </w:p>
-    <w:p>
-      <w:pPr>
-        <w:pStyle w:val="Compact"/>
-        <w:numPr>
-          <w:ilvl w:val="0"/>
-          <w:numId w:val="1302"/>
-        </w:numPr>
-      </w:pPr>
-      <w:r>
-        <w:t xml:space="preserve">Production evidence for client screenshots:</w:t>
-      </w:r>
-      <w:r>
-        <w:t xml:space="preserve"> </w:t>
-      </w:r>
-      <w:r>
-        <w:rPr>
-          <w:rStyle w:val="VerbatimChar"/>
-        </w:rPr>
-        <w:t xml:space="preserve">Reinforce Tools</w:t>
-      </w:r>
-      <w:r>
-        <w:t xml:space="preserve"> </w:t>
-      </w:r>
-      <w:r>
-        <w:t xml:space="preserve">(</w:t>
-      </w:r>
-      <w:r>
-        <w:rPr>
-          <w:rStyle w:val="VerbatimChar"/>
-        </w:rPr>
-        <w:t xml:space="preserve">cmo0m0skg04pyzo0ze7y1siwe</w:t>
-      </w:r>
-      <w:r>
-        <w:t xml:space="preserve">) had</w:t>
-      </w:r>
-      <w:r>
-        <w:t xml:space="preserve"> </w:t>
-      </w:r>
-      <w:r>
-        <w:rPr>
-          <w:rStyle w:val="VerbatimChar"/>
-        </w:rPr>
-        <w:t xml:space="preserve">aiClassification=null</w:t>
-      </w:r>
-      <w:r>
-        <w:t xml:space="preserve"> </w:t>
-      </w:r>
-      <w:r>
-        <w:t xml:space="preserve">and</w:t>
-      </w:r>
-      <w:r>
-        <w:t xml:space="preserve"> </w:t>
-      </w:r>
-      <w:r>
-        <w:rPr>
-          <w:rStyle w:val="VerbatimChar"/>
-        </w:rPr>
-        <w:t xml:space="preserve">aiSuggestions=null</w:t>
-      </w:r>
-      <w:r>
-        <w:t xml:space="preserve"> </w:t>
-      </w:r>
-      <w:r>
-        <w:t xml:space="preserve">at inspection time, so the generic “predatory MCA” reply shown in the screenshot was not persisted AI output;</w:t>
-      </w:r>
-      <w:r>
-        <w:t xml:space="preserve"> </w:t>
-      </w:r>
-      <w:r>
-        <w:rPr>
-          <w:rStyle w:val="VerbatimChar"/>
-        </w:rPr>
-        <w:t xml:space="preserve">SG ECHO LLC</w:t>
-      </w:r>
-      <w:r>
-        <w:t xml:space="preserve"> </w:t>
-      </w:r>
-      <w:r>
-        <w:t xml:space="preserve">/ Patricia Ann Kaelin (</w:t>
-      </w:r>
-      <w:r>
-        <w:rPr>
-          <w:rStyle w:val="VerbatimChar"/>
-        </w:rPr>
-        <w:t xml:space="preserve">cmoj0561t08a4zo2sugztfeek</w:t>
-      </w:r>
-      <w:r>
-        <w:t xml:space="preserve">) remains assigned to Marcos while the lead is</w:t>
-      </w:r>
-      <w:r>
-        <w:t xml:space="preserve"> </w:t>
-      </w:r>
-      <w:r>
-        <w:rPr>
-          <w:rStyle w:val="VerbatimChar"/>
-        </w:rPr>
-        <w:t xml:space="preserve">DNC</w:t>
-      </w:r>
-      <w:r>
-        <w:t xml:space="preserve"> </w:t>
-      </w:r>
-      <w:r>
-        <w:t xml:space="preserve">+</w:t>
-      </w:r>
-      <w:r>
-        <w:t xml:space="preserve"> </w:t>
-      </w:r>
-      <w:r>
-        <w:rPr>
-          <w:rStyle w:val="VerbatimChar"/>
-        </w:rPr>
-        <w:t xml:space="preserve">optedOut=true</w:t>
-      </w:r>
-      <w:r>
-        <w:t xml:space="preserve">, which explains why the thread dropped out of the normal inbox flow after the removal request.</w:t>
-      </w:r>
-    </w:p>
-    <w:p>
-      <w:pPr>
-        <w:pStyle w:val="Compact"/>
-        <w:numPr>
-          <w:ilvl w:val="0"/>
-          <w:numId w:val="1302"/>
-        </w:numPr>
-      </w:pPr>
-      <w:r>
-        <w:t xml:space="preserve">Twilio verification for the newly surfaced inbox replies: both</w:t>
-      </w:r>
-      <w:r>
-        <w:t xml:space="preserve"> </w:t>
-      </w:r>
-      <w:r>
-        <w:rPr>
-          <w:rStyle w:val="VerbatimChar"/>
-        </w:rPr>
-        <w:t xml:space="preserve">ROBBY 2025 / STAINLESS VALVE CO</w:t>
-      </w:r>
-      <w:r>
-        <w:t xml:space="preserve"> </w:t>
-      </w:r>
-      <w:r>
-        <w:t xml:space="preserve">(</w:t>
-      </w:r>
-      <w:r>
-        <w:rPr>
-          <w:rStyle w:val="VerbatimChar"/>
-        </w:rPr>
-        <w:t xml:space="preserve">START</w:t>
-      </w:r>
-      <w:r>
-        <w:t xml:space="preserve">, sid</w:t>
-      </w:r>
-      <w:r>
-        <w:t xml:space="preserve"> </w:t>
-      </w:r>
-      <w:r>
-        <w:rPr>
-          <w:rStyle w:val="VerbatimChar"/>
-        </w:rPr>
-        <w:t xml:space="preserve">SM8a2d22907979efa09bb51f84a18cf83b</w:t>
-      </w:r>
-      <w:r>
-        <w:t xml:space="preserve">) and</w:t>
-      </w:r>
-      <w:r>
-        <w:t xml:space="preserve"> </w:t>
-      </w:r>
-      <w:r>
-        <w:rPr>
-          <w:rStyle w:val="VerbatimChar"/>
-        </w:rPr>
-        <w:t xml:space="preserve">Jason Faraj / Woodland Creek</w:t>
-      </w:r>
-      <w:r>
-        <w:t xml:space="preserve"> </w:t>
-      </w:r>
-      <w:r>
-        <w:t xml:space="preserve">(</w:t>
-      </w:r>
-      <w:r>
-        <w:rPr>
-          <w:rStyle w:val="VerbatimChar"/>
-        </w:rPr>
-        <w:t xml:space="preserve">Okay</w:t>
-      </w:r>
-      <w:r>
-        <w:t xml:space="preserve">, sid</w:t>
-      </w:r>
-      <w:r>
-        <w:t xml:space="preserve"> </w:t>
-      </w:r>
-      <w:r>
-        <w:rPr>
-          <w:rStyle w:val="VerbatimChar"/>
-        </w:rPr>
-        <w:t xml:space="preserve">SM91f71ed97aca21d1561f8ff8f6fdb393</w:t>
-      </w:r>
-      <w:r>
-        <w:t xml:space="preserve">) are real inbound Twilio messages from 2026-04-15, not UI-generated phantom replies.</w:t>
-      </w:r>
-    </w:p>
-    <w:p>
-      <w:pPr>
-        <w:pStyle w:val="Compact"/>
-        <w:numPr>
-          <w:ilvl w:val="0"/>
-          <w:numId w:val="1302"/>
-        </w:numPr>
-      </w:pPr>
-      <w:r>
-        <w:t xml:space="preserve">Latest inbox cleanup fix: commit</w:t>
-      </w:r>
-      <w:r>
-        <w:t xml:space="preserve"> </w:t>
-      </w:r>
-      <w:r>
-        <w:rPr>
-          <w:rStyle w:val="VerbatimChar"/>
-        </w:rPr>
-        <w:t xml:space="preserve">74f472f</w:t>
-      </w:r>
-      <w:r>
-        <w:t xml:space="preserve"> </w:t>
-      </w:r>
-      <w:r>
-        <w:t xml:space="preserve">narrows unread DNC visibility in default inbox scopes to a recent 7-day window so old hidden DNC backlog does not suddenly flood reps after the SG ECHO visibility fix.</w:t>
-      </w:r>
-    </w:p>
-    <w:p>
-      <w:pPr>
-        <w:pStyle w:val="Compact"/>
-        <w:numPr>
-          <w:ilvl w:val="0"/>
-          <w:numId w:val="1302"/>
-        </w:numPr>
-      </w:pPr>
-      <w:r>
-        <w:t xml:space="preserve">Latest opt-in normalization fix: commit</w:t>
-      </w:r>
-      <w:r>
-        <w:t xml:space="preserve"> </w:t>
-      </w:r>
-      <w:r>
-        <w:rPr>
-          <w:rStyle w:val="VerbatimChar"/>
-        </w:rPr>
-        <w:t xml:space="preserve">74f472f</w:t>
-      </w:r>
-      <w:r>
-        <w:t xml:space="preserve"> </w:t>
-      </w:r>
-      <w:r>
-        <w:t xml:space="preserve">updates</w:t>
-      </w:r>
-      <w:r>
-        <w:t xml:space="preserve"> </w:t>
-      </w:r>
-      <w:r>
-        <w:rPr>
-          <w:rStyle w:val="VerbatimChar"/>
-        </w:rPr>
-        <w:t xml:space="preserve">ComplianceService.handleOptIn()</w:t>
-      </w:r>
-      <w:r>
-        <w:t xml:space="preserve"> </w:t>
-      </w:r>
-      <w:r>
-        <w:t xml:space="preserve">so</w:t>
-      </w:r>
-      <w:r>
-        <w:t xml:space="preserve"> </w:t>
-      </w:r>
-      <w:r>
-        <w:rPr>
-          <w:rStyle w:val="VerbatimChar"/>
-        </w:rPr>
-        <w:t xml:space="preserve">START/UNSTOP/SUBSCRIBE</w:t>
-      </w:r>
-      <w:r>
-        <w:t xml:space="preserve"> </w:t>
-      </w:r>
-      <w:r>
-        <w:t xml:space="preserve">clears DNC suppression state (</w:t>
-      </w:r>
-      <w:r>
-        <w:rPr>
-          <w:rStyle w:val="VerbatimChar"/>
-        </w:rPr>
-        <w:t xml:space="preserve">optedOut</w:t>
-      </w:r>
-      <w:r>
-        <w:t xml:space="preserve">,</w:t>
-      </w:r>
-      <w:r>
-        <w:t xml:space="preserve"> </w:t>
-      </w:r>
-      <w:r>
-        <w:rPr>
-          <w:rStyle w:val="VerbatimChar"/>
-        </w:rPr>
-        <w:t xml:space="preserve">isSuppressed</w:t>
-      </w:r>
-      <w:r>
-        <w:t xml:space="preserve">,</w:t>
-      </w:r>
-      <w:r>
-        <w:t xml:space="preserve"> </w:t>
-      </w:r>
-      <w:r>
-        <w:rPr>
-          <w:rStyle w:val="VerbatimChar"/>
-        </w:rPr>
-        <w:t xml:space="preserve">suppressionEntry</w:t>
-      </w:r>
-      <w:r>
-        <w:t xml:space="preserve">,</w:t>
-      </w:r>
-      <w:r>
-        <w:t xml:space="preserve"> </w:t>
-      </w:r>
-      <w:r>
-        <w:rPr>
-          <w:rStyle w:val="VerbatimChar"/>
-        </w:rPr>
-        <w:t xml:space="preserve">conversation.leadStatus</w:t>
-      </w:r>
-      <w:r>
-        <w:t xml:space="preserve">) instead of leaving a re-subscribed lead logically stuck in DNC.</w:t>
+        <w:t xml:space="preserve">Production verification after unread-summary deploy: built backend helper</w:t>
+      </w:r>
+      <w:r>
+        <w:t xml:space="preserve"> </w:t>
+      </w:r>
+      <w:r>
+        <w:rPr>
+          <w:rStyle w:val="VerbatimChar"/>
+        </w:rPr>
+        <w:t xml:space="preserve">buildUnreadSummaryWhere()</w:t>
+      </w:r>
+      <w:r>
+        <w:t xml:space="preserve"> </w:t>
+      </w:r>
+      <w:r>
+        <w:t xml:space="preserve">and the Inbox list visibility path both now count the same</w:t>
+      </w:r>
+      <w:r>
+        <w:t xml:space="preserve"> </w:t>
+      </w:r>
+      <w:r>
+        <w:rPr>
+          <w:rStyle w:val="VerbatimChar"/>
+        </w:rPr>
+        <w:t xml:space="preserve">7</w:t>
+      </w:r>
+      <w:r>
+        <w:t xml:space="preserve"> </w:t>
+      </w:r>
+      <w:r>
+        <w:t xml:space="preserve">visible unread conversations (</w:t>
+      </w:r>
+      <w:r>
+        <w:rPr>
+          <w:rStyle w:val="VerbatimChar"/>
+        </w:rPr>
+        <w:t xml:space="preserve">10</w:t>
+      </w:r>
+      <w:r>
+        <w:t xml:space="preserve"> </w:t>
+      </w:r>
+      <w:r>
+        <w:t xml:space="preserve">unread messages) in Admin scope, confirming the badge/list logic is aligned even though live counts continue to change with new inbound traffic.</w:t>
       </w:r>
     </w:p>
     <w:p>
@@ -14229,6 +14397,142 @@
             </w:pPr>
             <w:r>
               <w:t xml:space="preserve">Production SHA 74f472f; PM2 online; Twilio SIDs verified</w:t>
+            </w:r>
+          </w:p>
+        </w:tc>
+        <w:tc>
+          <w:tcPr/>
+          <w:p>
+            <w:pPr>
+              <w:pStyle w:val="Compact"/>
+            </w:pPr>
+            <w:r>
+              <w:t xml:space="preserve">Done</w:t>
+            </w:r>
+          </w:p>
+        </w:tc>
+      </w:tr>
+      <w:tr>
+        <w:tc>
+          <w:tcPr/>
+          <w:p>
+            <w:pPr>
+              <w:pStyle w:val="Compact"/>
+            </w:pPr>
+            <w:r>
+              <w:t xml:space="preserve">2026-04-28</w:t>
+            </w:r>
+          </w:p>
+        </w:tc>
+        <w:tc>
+          <w:tcPr/>
+          <w:p>
+            <w:pPr>
+              <w:pStyle w:val="Compact"/>
+            </w:pPr>
+            <w:r>
+              <w:t xml:space="preserve">Sidebar Unread Fix</w:t>
+            </w:r>
+          </w:p>
+        </w:tc>
+        <w:tc>
+          <w:tcPr/>
+          <w:p>
+            <w:pPr>
+              <w:pStyle w:val="Compact"/>
+            </w:pPr>
+            <w:r>
+              <w:t xml:space="preserve">Aligned sidebar unread-summary with Inbox visibility rules</w:t>
+            </w:r>
+          </w:p>
+        </w:tc>
+        <w:tc>
+          <w:tcPr/>
+          <w:p>
+            <w:pPr>
+              <w:pStyle w:val="Compact"/>
+            </w:pPr>
+            <w:r>
+              <w:t xml:space="preserve">a54c027</w:t>
+            </w:r>
+          </w:p>
+        </w:tc>
+        <w:tc>
+          <w:tcPr/>
+          <w:p>
+            <w:pPr>
+              <w:pStyle w:val="Compact"/>
+            </w:pPr>
+            <w:r>
+              <w:t xml:space="preserve">Visibility tests 2/2 + server build passed</w:t>
+            </w:r>
+          </w:p>
+        </w:tc>
+        <w:tc>
+          <w:tcPr/>
+          <w:p>
+            <w:pPr>
+              <w:pStyle w:val="Compact"/>
+            </w:pPr>
+            <w:r>
+              <w:t xml:space="preserve">Done</w:t>
+            </w:r>
+          </w:p>
+        </w:tc>
+      </w:tr>
+      <w:tr>
+        <w:tc>
+          <w:tcPr/>
+          <w:p>
+            <w:pPr>
+              <w:pStyle w:val="Compact"/>
+            </w:pPr>
+            <w:r>
+              <w:t xml:space="preserve">2026-04-28</w:t>
+            </w:r>
+          </w:p>
+        </w:tc>
+        <w:tc>
+          <w:tcPr/>
+          <w:p>
+            <w:pPr>
+              <w:pStyle w:val="Compact"/>
+            </w:pPr>
+            <w:r>
+              <w:t xml:space="preserve">Production Deploy</w:t>
+            </w:r>
+          </w:p>
+        </w:tc>
+        <w:tc>
+          <w:tcPr/>
+          <w:p>
+            <w:pPr>
+              <w:pStyle w:val="Compact"/>
+            </w:pPr>
+            <w:r>
+              <w:t xml:space="preserve">Deployed sidebar unread-summary alignment fix</w:t>
+            </w:r>
+          </w:p>
+        </w:tc>
+        <w:tc>
+          <w:tcPr/>
+          <w:p>
+            <w:pPr>
+              <w:pStyle w:val="Compact"/>
+            </w:pPr>
+            <w:r>
+              <w:t xml:space="preserve">a54c027</w:t>
+            </w:r>
+          </w:p>
+        </w:tc>
+        <w:tc>
+          <w:tcPr/>
+          <w:p>
+            <w:pPr>
+              <w:pStyle w:val="Compact"/>
+            </w:pPr>
+            <w:r>
+              <w:t xml:space="preserve">Production SHA a54c027; PM2 online; helper/list counts both return 7</w:t>
             </w:r>
           </w:p>
         </w:tc>

</xml_diff>

<commit_message>
docs: update ai remediation checklist
</commit_message>
<xml_diff>
--- a/CHECKLIST_M1_M2_REMEDIATION_2026-04-28.docx
+++ b/CHECKLIST_M1_M2_REMEDIATION_2026-04-28.docx
@@ -10370,40 +10370,1603 @@
         <w:rPr>
           <w:rStyle w:val="VerbatimChar"/>
         </w:rPr>
+        <w:t xml:space="preserve">56f4a8b</w:t>
+      </w:r>
+      <w:r>
+        <w:t xml:space="preserve"> </w:t>
+      </w:r>
+      <w:r>
+        <w:t xml:space="preserve">on</w:t>
+      </w:r>
+      <w:r>
+        <w:t xml:space="preserve"> </w:t>
+      </w:r>
+      <w:r>
+        <w:rPr>
+          <w:rStyle w:val="VerbatimChar"/>
+        </w:rPr>
+        <w:t xml:space="preserve">deploy/mysql-hosting</w:t>
+      </w:r>
+      <w:r>
+        <w:t xml:space="preserve">; production</w:t>
+      </w:r>
+      <w:r>
+        <w:t xml:space="preserve"> </w:t>
+      </w:r>
+      <w:r>
+        <w:rPr>
+          <w:rStyle w:val="VerbatimChar"/>
+        </w:rPr>
+        <w:t xml:space="preserve">git status --porcelain</w:t>
+      </w:r>
+      <w:r>
+        <w:t xml:space="preserve"> </w:t>
+      </w:r>
+      <w:r>
+        <w:t xml:space="preserve">lines:</w:t>
+      </w:r>
+      <w:r>
+        <w:t xml:space="preserve"> </w:t>
+      </w:r>
+      <w:r>
+        <w:rPr>
+          <w:rStyle w:val="VerbatimChar"/>
+        </w:rPr>
+        <w:t xml:space="preserve">0</w:t>
+      </w:r>
+      <w:r>
+        <w:t xml:space="preserve">.</w:t>
+      </w:r>
+    </w:p>
+    <w:p>
+      <w:pPr>
+        <w:pStyle w:val="Compact"/>
+        <w:numPr>
+          <w:ilvl w:val="0"/>
+          <w:numId w:val="1302"/>
+        </w:numPr>
+      </w:pPr>
+      <w:r>
+        <w:t xml:space="preserve">Production deploy path used committed code only: initial full deploy fast-forwarded</w:t>
+      </w:r>
+      <w:r>
+        <w:t xml:space="preserve"> </w:t>
+      </w:r>
+      <w:r>
+        <w:rPr>
+          <w:rStyle w:val="VerbatimChar"/>
+        </w:rPr>
+        <w:t xml:space="preserve">e596d85..15414cf</w:t>
+      </w:r>
+      <w:r>
+        <w:t xml:space="preserve">, then unread-badge frontend-only fast-forward</w:t>
+      </w:r>
+      <w:r>
+        <w:t xml:space="preserve"> </w:t>
+      </w:r>
+      <w:r>
+        <w:rPr>
+          <w:rStyle w:val="VerbatimChar"/>
+        </w:rPr>
+        <w:t xml:space="preserve">15414cf..b2572de</w:t>
+      </w:r>
+      <w:r>
+        <w:t xml:space="preserve">, then AI-suggestion reply-refresh fast-forward</w:t>
+      </w:r>
+      <w:r>
+        <w:t xml:space="preserve"> </w:t>
+      </w:r>
+      <w:r>
+        <w:rPr>
+          <w:rStyle w:val="VerbatimChar"/>
+        </w:rPr>
+        <w:t xml:space="preserve">b2572de..a5b587f</w:t>
+      </w:r>
+      <w:r>
+        <w:t xml:space="preserve">, then fallback-suggestion restore fast-forward</w:t>
+      </w:r>
+      <w:r>
+        <w:t xml:space="preserve"> </w:t>
+      </w:r>
+      <w:r>
+        <w:rPr>
+          <w:rStyle w:val="VerbatimChar"/>
+        </w:rPr>
+        <w:t xml:space="preserve">a5b587f..9f6e478</w:t>
+      </w:r>
+      <w:r>
+        <w:t xml:space="preserve">, then email-suggestion repair fast-forward</w:t>
+      </w:r>
+      <w:r>
+        <w:t xml:space="preserve"> </w:t>
+      </w:r>
+      <w:r>
+        <w:rPr>
+          <w:rStyle w:val="VerbatimChar"/>
+        </w:rPr>
+        <w:t xml:space="preserve">9f6e478..064b88d</w:t>
+      </w:r>
+      <w:r>
+        <w:t xml:space="preserve">, then handoff-gap-selling restore fast-forward</w:t>
+      </w:r>
+      <w:r>
+        <w:t xml:space="preserve"> </w:t>
+      </w:r>
+      <w:r>
+        <w:rPr>
+          <w:rStyle w:val="VerbatimChar"/>
+        </w:rPr>
+        <w:t xml:space="preserve">064b88d..34e62a9</w:t>
+      </w:r>
+      <w:r>
+        <w:t xml:space="preserve">, then stale-DNC-visibility / opt-in-normalization fast-forward</w:t>
+      </w:r>
+      <w:r>
+        <w:t xml:space="preserve"> </w:t>
+      </w:r>
+      <w:r>
+        <w:rPr>
+          <w:rStyle w:val="VerbatimChar"/>
+        </w:rPr>
+        <w:t xml:space="preserve">34e62a9..74f472f</w:t>
+      </w:r>
+      <w:r>
+        <w:t xml:space="preserve">, then sidebar-unread-summary alignment fast-forward</w:t>
+      </w:r>
+      <w:r>
+        <w:t xml:space="preserve"> </w:t>
+      </w:r>
+      <w:r>
+        <w:rPr>
+          <w:rStyle w:val="VerbatimChar"/>
+        </w:rPr>
+        <w:t xml:space="preserve">74f472f..a54c027</w:t>
+      </w:r>
+      <w:r>
+        <w:t xml:space="preserve">, then fenced-JSON parser compatibility fast-forward</w:t>
+      </w:r>
+      <w:r>
+        <w:t xml:space="preserve"> </w:t>
+      </w:r>
+      <w:r>
+        <w:rPr>
+          <w:rStyle w:val="VerbatimChar"/>
+        </w:rPr>
+        <w:t xml:space="preserve">a54c027..cc50ca6</w:t>
+      </w:r>
+      <w:r>
+        <w:t xml:space="preserve">, then classifier schema-drift tolerance fast-forward</w:t>
+      </w:r>
+      <w:r>
+        <w:t xml:space="preserve"> </w:t>
+      </w:r>
+      <w:r>
+        <w:rPr>
+          <w:rStyle w:val="VerbatimChar"/>
+        </w:rPr>
+        <w:t xml:space="preserve">cc50ca6..56f4a8b</w:t>
+      </w:r>
+      <w:r>
+        <w:t xml:space="preserve"> </w:t>
+      </w:r>
+      <w:r>
+        <w:t xml:space="preserve">with fresh</w:t>
+      </w:r>
+      <w:r>
+        <w:t xml:space="preserve"> </w:t>
+      </w:r>
+      <w:r>
+        <w:rPr>
+          <w:rStyle w:val="VerbatimChar"/>
+        </w:rPr>
+        <w:t xml:space="preserve">server</w:t>
+      </w:r>
+      <w:r>
+        <w:t xml:space="preserve"> </w:t>
+      </w:r>
+      <w:r>
+        <w:t xml:space="preserve">and</w:t>
+      </w:r>
+      <w:r>
+        <w:t xml:space="preserve"> </w:t>
+      </w:r>
+      <w:r>
+        <w:rPr>
+          <w:rStyle w:val="VerbatimChar"/>
+        </w:rPr>
+        <w:t xml:space="preserve">client</w:t>
+      </w:r>
+      <w:r>
+        <w:t xml:space="preserve"> </w:t>
+      </w:r>
+      <w:r>
+        <w:t xml:space="preserve">builds on production.</w:t>
+      </w:r>
+    </w:p>
+    <w:p>
+      <w:pPr>
+        <w:pStyle w:val="Compact"/>
+        <w:numPr>
+          <w:ilvl w:val="0"/>
+          <w:numId w:val="1302"/>
+        </w:numPr>
+      </w:pPr>
+      <w:r>
+        <w:t xml:space="preserve">Production health:</w:t>
+      </w:r>
+      <w:r>
+        <w:t xml:space="preserve"> </w:t>
+      </w:r>
+      <w:r>
+        <w:rPr>
+          <w:rStyle w:val="VerbatimChar"/>
+        </w:rPr>
+        <w:t xml:space="preserve">http://127.0.0.1:3001/api/health</w:t>
+      </w:r>
+      <w:r>
+        <w:t xml:space="preserve"> </w:t>
+      </w:r>
+      <w:r>
+        <w:t xml:space="preserve">returned</w:t>
+      </w:r>
+      <w:r>
+        <w:t xml:space="preserve"> </w:t>
+      </w:r>
+      <w:r>
+        <w:rPr>
+          <w:rStyle w:val="VerbatimChar"/>
+        </w:rPr>
+        <w:t xml:space="preserve">ok/ok/ok</w:t>
+      </w:r>
+      <w:r>
+        <w:t xml:space="preserve"> </w:t>
+      </w:r>
+      <w:r>
+        <w:t xml:space="preserve">for app/database/redis.</w:t>
+      </w:r>
+    </w:p>
+    <w:p>
+      <w:pPr>
+        <w:pStyle w:val="Compact"/>
+        <w:numPr>
+          <w:ilvl w:val="0"/>
+          <w:numId w:val="1302"/>
+        </w:numPr>
+      </w:pPr>
+      <w:r>
+        <w:t xml:space="preserve">PM2:</w:t>
+      </w:r>
+      <w:r>
+        <w:t xml:space="preserve"> </w:t>
+      </w:r>
+      <w:r>
+        <w:rPr>
+          <w:rStyle w:val="VerbatimChar"/>
+        </w:rPr>
+        <w:t xml:space="preserve">sms-api</w:t>
+      </w:r>
+      <w:r>
+        <w:t xml:space="preserve"> </w:t>
+      </w:r>
+      <w:r>
+        <w:t xml:space="preserve">online after restart; restart count</w:t>
+      </w:r>
+      <w:r>
+        <w:t xml:space="preserve"> </w:t>
+      </w:r>
+      <w:r>
+        <w:rPr>
+          <w:rStyle w:val="VerbatimChar"/>
+        </w:rPr>
+        <w:t xml:space="preserve">17</w:t>
+      </w:r>
+      <w:r>
+        <w:t xml:space="preserve">.</w:t>
+      </w:r>
+    </w:p>
+    <w:p>
+      <w:pPr>
+        <w:pStyle w:val="Compact"/>
+        <w:numPr>
+          <w:ilvl w:val="0"/>
+          <w:numId w:val="1302"/>
+        </w:numPr>
+      </w:pPr>
+      <w:r>
+        <w:t xml:space="preserve">Production runtime logs: PM2</w:t>
+      </w:r>
+      <w:r>
+        <w:t xml:space="preserve"> </w:t>
+      </w:r>
+      <w:r>
+        <w:rPr>
+          <w:rStyle w:val="VerbatimChar"/>
+        </w:rPr>
+        <w:t xml:space="preserve">out</w:t>
+      </w:r>
+      <w:r>
+        <w:t xml:space="preserve">/</w:t>
+      </w:r>
+      <w:r>
+        <w:rPr>
+          <w:rStyle w:val="VerbatimChar"/>
+        </w:rPr>
+        <w:t xml:space="preserve">error</w:t>
+      </w:r>
+      <w:r>
+        <w:t xml:space="preserve"> </w:t>
+      </w:r>
+      <w:r>
+        <w:t xml:space="preserve">tails were empty immediately after deploy; no fresh runtime errors were emitted after restart.</w:t>
+      </w:r>
+    </w:p>
+    <w:p>
+      <w:pPr>
+        <w:pStyle w:val="Compact"/>
+        <w:numPr>
+          <w:ilvl w:val="0"/>
+          <w:numId w:val="1302"/>
+        </w:numPr>
+      </w:pPr>
+      <w:r>
+        <w:t xml:space="preserve">Latest CI proof: run</w:t>
+      </w:r>
+      <w:r>
+        <w:t xml:space="preserve"> </w:t>
+      </w:r>
+      <w:r>
+        <w:rPr>
+          <w:rStyle w:val="VerbatimChar"/>
+        </w:rPr>
+        <w:t xml:space="preserve">25068339405</w:t>
+      </w:r>
+      <w:r>
+        <w:t xml:space="preserve">, commit</w:t>
+      </w:r>
+      <w:r>
+        <w:t xml:space="preserve"> </w:t>
+      </w:r>
+      <w:r>
+        <w:rPr>
+          <w:rStyle w:val="VerbatimChar"/>
+        </w:rPr>
+        <w:t xml:space="preserve">b2572de</w:t>
+      </w:r>
+      <w:r>
+        <w:t xml:space="preserve">, jobs completed successfully.</w:t>
+      </w:r>
+    </w:p>
+    <w:p>
+      <w:pPr>
+        <w:pStyle w:val="Compact"/>
+        <w:numPr>
+          <w:ilvl w:val="0"/>
+          <w:numId w:val="1302"/>
+        </w:numPr>
+      </w:pPr>
+      <w:r>
+        <w:t xml:space="preserve">Latest production build proof: server build passed; client build passed with known CSS minify warning</w:t>
+      </w:r>
+      <w:r>
+        <w:t xml:space="preserve"> </w:t>
+      </w:r>
+      <w:r>
+        <w:rPr>
+          <w:rStyle w:val="VerbatimChar"/>
+        </w:rPr>
+        <w:t xml:space="preserve">.light .bg-dark-800.border*</w:t>
+      </w:r>
+      <w:r>
+        <w:t xml:space="preserve"> </w:t>
+      </w:r>
+      <w:r>
+        <w:t xml:space="preserve">only.</w:t>
+      </w:r>
+    </w:p>
+    <w:p>
+      <w:pPr>
+        <w:pStyle w:val="Compact"/>
+        <w:numPr>
+          <w:ilvl w:val="0"/>
+          <w:numId w:val="1302"/>
+        </w:numPr>
+      </w:pPr>
+      <w:r>
+        <w:t xml:space="preserve">Public frontend smoke:</w:t>
+      </w:r>
+      <w:r>
+        <w:t xml:space="preserve"> </w:t>
+      </w:r>
+      <w:r>
+        <w:rPr>
+          <w:rStyle w:val="VerbatimChar"/>
+        </w:rPr>
+        <w:t xml:space="preserve">https://app.sclcapital.io/</w:t>
+      </w:r>
+      <w:r>
+        <w:t xml:space="preserve"> </w:t>
+      </w:r>
+      <w:r>
+        <w:t xml:space="preserve">returned</w:t>
+      </w:r>
+      <w:r>
+        <w:t xml:space="preserve"> </w:t>
+      </w:r>
+      <w:r>
+        <w:rPr>
+          <w:rStyle w:val="VerbatimChar"/>
+        </w:rPr>
+        <w:t xml:space="preserve">200 OK</w:t>
+      </w:r>
+      <w:r>
+        <w:t xml:space="preserve"> </w:t>
+      </w:r>
+      <w:r>
+        <w:t xml:space="preserve">and current index timestamp after deploy.</w:t>
+      </w:r>
+    </w:p>
+    <w:p>
+      <w:pPr>
+        <w:pStyle w:val="Compact"/>
+        <w:numPr>
+          <w:ilvl w:val="0"/>
+          <w:numId w:val="1302"/>
+        </w:numPr>
+      </w:pPr>
+      <w:r>
+        <w:t xml:space="preserve">Current unread-badge fix: sidebar Inbox badge now uses unread conversation count, and commit</w:t>
+      </w:r>
+      <w:r>
+        <w:t xml:space="preserve"> </w:t>
+      </w:r>
+      <w:r>
+        <w:rPr>
+          <w:rStyle w:val="VerbatimChar"/>
+        </w:rPr>
         <w:t xml:space="preserve">a54c027</w:t>
       </w:r>
       <w:r>
         <w:t xml:space="preserve"> </w:t>
       </w:r>
       <w:r>
-        <w:t xml:space="preserve">on</w:t>
-      </w:r>
-      <w:r>
-        <w:t xml:space="preserve"> </w:t>
-      </w:r>
-      <w:r>
-        <w:rPr>
-          <w:rStyle w:val="VerbatimChar"/>
-        </w:rPr>
-        <w:t xml:space="preserve">deploy/mysql-hosting</w:t>
-      </w:r>
-      <w:r>
-        <w:t xml:space="preserve">; production</w:t>
-      </w:r>
-      <w:r>
-        <w:t xml:space="preserve"> </w:t>
-      </w:r>
-      <w:r>
-        <w:rPr>
-          <w:rStyle w:val="VerbatimChar"/>
-        </w:rPr>
-        <w:t xml:space="preserve">git status --porcelain</w:t>
-      </w:r>
-      <w:r>
-        <w:t xml:space="preserve"> </w:t>
-      </w:r>
-      <w:r>
-        <w:t xml:space="preserve">lines:</w:t>
+        <w:t xml:space="preserve">aligns</w:t>
+      </w:r>
+      <w:r>
+        <w:t xml:space="preserve"> </w:t>
+      </w:r>
+      <w:r>
+        <w:rPr>
+          <w:rStyle w:val="VerbatimChar"/>
+        </w:rPr>
+        <w:t xml:space="preserve">/inbox/unread-summary</w:t>
+      </w:r>
+      <w:r>
+        <w:t xml:space="preserve"> </w:t>
+      </w:r>
+      <w:r>
+        <w:t xml:space="preserve">with the same visibility policy as Inbox/Admin View so the sidebar count no longer includes hidden unread DNC backlog.</w:t>
+      </w:r>
+    </w:p>
+    <w:p>
+      <w:pPr>
+        <w:pStyle w:val="Compact"/>
+        <w:numPr>
+          <w:ilvl w:val="0"/>
+          <w:numId w:val="1302"/>
+        </w:numPr>
+      </w:pPr>
+      <w:r>
+        <w:t xml:space="preserve">Latest AI suggestion reply-refresh fix: commit</w:t>
+      </w:r>
+      <w:r>
+        <w:t xml:space="preserve"> </w:t>
+      </w:r>
+      <w:r>
+        <w:rPr>
+          <w:rStyle w:val="VerbatimChar"/>
+        </w:rPr>
+        <w:t xml:space="preserve">a5b587f</w:t>
+      </w:r>
+      <w:r>
+        <w:t xml:space="preserve"> </w:t>
+      </w:r>
+      <w:r>
+        <w:t xml:space="preserve">triggers owner-action reclassification after successful outbound reply; targeted regression</w:t>
+      </w:r>
+      <w:r>
+        <w:t xml:space="preserve"> </w:t>
+      </w:r>
+      <w:r>
+        <w:rPr>
+          <w:rStyle w:val="VerbatimChar"/>
+        </w:rPr>
+        <w:t xml:space="preserve">server/tests/inboxReplyReclassification.test.ts</w:t>
+      </w:r>
+      <w:r>
+        <w:t xml:space="preserve"> </w:t>
+      </w:r>
+      <w:r>
+        <w:t xml:space="preserve">passed 2/2;</w:t>
+      </w:r>
+      <w:r>
+        <w:t xml:space="preserve"> </w:t>
+      </w:r>
+      <w:r>
+        <w:rPr>
+          <w:rStyle w:val="VerbatimChar"/>
+        </w:rPr>
+        <w:t xml:space="preserve">server npm run build</w:t>
+      </w:r>
+      <w:r>
+        <w:t xml:space="preserve"> </w:t>
+      </w:r>
+      <w:r>
+        <w:t xml:space="preserve">passed.</w:t>
+      </w:r>
+    </w:p>
+    <w:p>
+      <w:pPr>
+        <w:pStyle w:val="Compact"/>
+        <w:numPr>
+          <w:ilvl w:val="0"/>
+          <w:numId w:val="1302"/>
+        </w:numPr>
+      </w:pPr>
+      <w:r>
+        <w:t xml:space="preserve">Latest AI suggestion restore fix: commit</w:t>
+      </w:r>
+      <w:r>
+        <w:t xml:space="preserve"> </w:t>
+      </w:r>
+      <w:r>
+        <w:rPr>
+          <w:rStyle w:val="VerbatimChar"/>
+        </w:rPr>
+        <w:t xml:space="preserve">9f6e478</w:t>
+      </w:r>
+      <w:r>
+        <w:t xml:space="preserve"> </w:t>
+      </w:r>
+      <w:r>
+        <w:t xml:space="preserve">rebuilds fallback suggestions when classified conversations have an empty</w:t>
+      </w:r>
+      <w:r>
+        <w:t xml:space="preserve"> </w:t>
+      </w:r>
+      <w:r>
+        <w:rPr>
+          <w:rStyle w:val="VerbatimChar"/>
+        </w:rPr>
+        <w:t xml:space="preserve">aiSuggestions</w:t>
+      </w:r>
+      <w:r>
+        <w:t xml:space="preserve"> </w:t>
+      </w:r>
+      <w:r>
+        <w:t xml:space="preserve">array; targeted regression</w:t>
+      </w:r>
+      <w:r>
+        <w:t xml:space="preserve"> </w:t>
+      </w:r>
+      <w:r>
+        <w:rPr>
+          <w:rStyle w:val="VerbatimChar"/>
+        </w:rPr>
+        <w:t xml:space="preserve">server/tests/aiSuggestionPolicy.test.ts</w:t>
+      </w:r>
+      <w:r>
+        <w:t xml:space="preserve"> </w:t>
+      </w:r>
+      <w:r>
+        <w:t xml:space="preserve">passed 5/5;</w:t>
+      </w:r>
+      <w:r>
+        <w:t xml:space="preserve"> </w:t>
+      </w:r>
+      <w:r>
+        <w:rPr>
+          <w:rStyle w:val="VerbatimChar"/>
+        </w:rPr>
+        <w:t xml:space="preserve">server npm run build</w:t>
+      </w:r>
+      <w:r>
+        <w:t xml:space="preserve"> </w:t>
+      </w:r>
+      <w:r>
+        <w:t xml:space="preserve">passed.</w:t>
+      </w:r>
+    </w:p>
+    <w:p>
+      <w:pPr>
+        <w:pStyle w:val="Compact"/>
+        <w:numPr>
+          <w:ilvl w:val="0"/>
+          <w:numId w:val="1302"/>
+        </w:numPr>
+      </w:pPr>
+      <w:r>
+        <w:t xml:space="preserve">Production API verification after deploy: previously broken threads</w:t>
+      </w:r>
+      <w:r>
+        <w:t xml:space="preserve"> </w:t>
+      </w:r>
+      <w:r>
+        <w:rPr>
+          <w:rStyle w:val="VerbatimChar"/>
+        </w:rPr>
+        <w:t xml:space="preserve">Audrey Berry $150,000.00</w:t>
+      </w:r>
+      <w:r>
+        <w:t xml:space="preserve"> </w:t>
+      </w:r>
+      <w:r>
+        <w:t xml:space="preserve">(</w:t>
+      </w:r>
+      <w:r>
+        <w:rPr>
+          <w:rStyle w:val="VerbatimChar"/>
+        </w:rPr>
+        <w:t xml:space="preserve">cmnt61hpb01cxzosfj9e0gj7d</w:t>
+      </w:r>
+      <w:r>
+        <w:t xml:space="preserve">) and</w:t>
+      </w:r>
+      <w:r>
+        <w:t xml:space="preserve"> </w:t>
+      </w:r>
+      <w:r>
+        <w:rPr>
+          <w:rStyle w:val="VerbatimChar"/>
+        </w:rPr>
+        <w:t xml:space="preserve">Jamie Johnson</w:t>
+      </w:r>
+      <w:r>
+        <w:t xml:space="preserve"> </w:t>
+      </w:r>
+      <w:r>
+        <w:t xml:space="preserve">(</w:t>
+      </w:r>
+      <w:r>
+        <w:rPr>
+          <w:rStyle w:val="VerbatimChar"/>
+        </w:rPr>
+        <w:t xml:space="preserve">cmoiqslus0d9tzo5uwqu6c25a</w:t>
+      </w:r>
+      <w:r>
+        <w:t xml:space="preserve">) now return</w:t>
+      </w:r>
+      <w:r>
+        <w:t xml:space="preserve"> </w:t>
+      </w:r>
+      <w:r>
+        <w:rPr>
+          <w:rStyle w:val="VerbatimChar"/>
+        </w:rPr>
+        <w:t xml:space="preserve">aiSuggestionsCount=1</w:t>
+      </w:r>
+      <w:r>
+        <w:t xml:space="preserve"> </w:t>
+      </w:r>
+      <w:r>
+        <w:t xml:space="preserve">with non-empty fallback text.</w:t>
+      </w:r>
+    </w:p>
+    <w:p>
+      <w:pPr>
+        <w:pStyle w:val="Compact"/>
+        <w:numPr>
+          <w:ilvl w:val="0"/>
+          <w:numId w:val="1302"/>
+        </w:numPr>
+      </w:pPr>
+      <w:r>
+        <w:t xml:space="preserve">Uploaded handoff archive verification:</w:t>
+      </w:r>
+      <w:r>
+        <w:t xml:space="preserve"> </w:t>
+      </w:r>
+      <w:r>
+        <w:rPr>
+          <w:rStyle w:val="VerbatimChar"/>
+        </w:rPr>
+        <w:t xml:space="preserve">scl-handoff-2026-4-25.rar</w:t>
+      </w:r>
+      <w:r>
+        <w:t xml:space="preserve"> </w:t>
+      </w:r>
+      <w:r>
+        <w:t xml:space="preserve">contains the same</w:t>
+      </w:r>
+      <w:r>
+        <w:t xml:space="preserve"> </w:t>
+      </w:r>
+      <w:r>
+        <w:rPr>
+          <w:rStyle w:val="VerbatimChar"/>
+        </w:rPr>
+        <w:t xml:space="preserve">classifier_prompt_v4_LOCKED.md</w:t>
+      </w:r>
+      <w:r>
+        <w:t xml:space="preserve"> </w:t>
+      </w:r>
+      <w:r>
+        <w:t xml:space="preserve">as the live</w:t>
+      </w:r>
+      <w:r>
+        <w:t xml:space="preserve"> </w:t>
+      </w:r>
+      <w:r>
+        <w:rPr>
+          <w:rStyle w:val="VerbatimChar"/>
+        </w:rPr>
+        <w:t xml:space="preserve">SCL-HandOff/</w:t>
+      </w:r>
+      <w:r>
+        <w:t xml:space="preserve"> </w:t>
+      </w:r>
+      <w:r>
+        <w:t xml:space="preserve">folder, so the prompt file itself was not the regression source.</w:t>
+      </w:r>
+    </w:p>
+    <w:p>
+      <w:pPr>
+        <w:pStyle w:val="Compact"/>
+        <w:numPr>
+          <w:ilvl w:val="0"/>
+          <w:numId w:val="1302"/>
+        </w:numPr>
+      </w:pPr>
+      <w:r>
+        <w:t xml:space="preserve">Latest handoff-alignment fix: commit</w:t>
+      </w:r>
+      <w:r>
+        <w:t xml:space="preserve"> </w:t>
+      </w:r>
+      <w:r>
+        <w:rPr>
+          <w:rStyle w:val="VerbatimChar"/>
+        </w:rPr>
+        <w:t xml:space="preserve">34e62a9</w:t>
+      </w:r>
+      <w:r>
+        <w:t xml:space="preserve"> </w:t>
+      </w:r>
+      <w:r>
+        <w:t xml:space="preserve">removes old deterministic HOT upgrades that contradicted locked v4 (</w:t>
+      </w:r>
+      <w:r>
+        <w:rPr>
+          <w:rStyle w:val="VerbatimChar"/>
+        </w:rPr>
+        <w:t xml:space="preserve">bare email</w:t>
+      </w:r>
+      <w:r>
+        <w:t xml:space="preserve"> </w:t>
+      </w:r>
+      <w:r>
+        <w:t xml:space="preserve">/</w:t>
+      </w:r>
+      <w:r>
+        <w:t xml:space="preserve"> </w:t>
+      </w:r>
+      <w:r>
+        <w:rPr>
+          <w:rStyle w:val="VerbatimChar"/>
+        </w:rPr>
+        <w:t xml:space="preserve">bare yes</w:t>
+      </w:r>
+      <w:r>
+        <w:t xml:space="preserve"> </w:t>
+      </w:r>
+      <w:r>
+        <w:t xml:space="preserve">no longer auto-promote to HOT), upgrades fallback suggestions to objection-aware Gap Selling phrasing, and keeps unread DNC replies visible in default Inbox filters until they are read.</w:t>
+      </w:r>
+    </w:p>
+    <w:p>
+      <w:pPr>
+        <w:pStyle w:val="Compact"/>
+        <w:numPr>
+          <w:ilvl w:val="0"/>
+          <w:numId w:val="1302"/>
+        </w:numPr>
+      </w:pPr>
+      <w:r>
+        <w:t xml:space="preserve">Production evidence for client screenshots:</w:t>
+      </w:r>
+      <w:r>
+        <w:t xml:space="preserve"> </w:t>
+      </w:r>
+      <w:r>
+        <w:rPr>
+          <w:rStyle w:val="VerbatimChar"/>
+        </w:rPr>
+        <w:t xml:space="preserve">Reinforce Tools</w:t>
+      </w:r>
+      <w:r>
+        <w:t xml:space="preserve"> </w:t>
+      </w:r>
+      <w:r>
+        <w:t xml:space="preserve">(</w:t>
+      </w:r>
+      <w:r>
+        <w:rPr>
+          <w:rStyle w:val="VerbatimChar"/>
+        </w:rPr>
+        <w:t xml:space="preserve">cmo0m0skg04pyzo0ze7y1siwe</w:t>
+      </w:r>
+      <w:r>
+        <w:t xml:space="preserve">) had</w:t>
+      </w:r>
+      <w:r>
+        <w:t xml:space="preserve"> </w:t>
+      </w:r>
+      <w:r>
+        <w:rPr>
+          <w:rStyle w:val="VerbatimChar"/>
+        </w:rPr>
+        <w:t xml:space="preserve">aiClassification=null</w:t>
+      </w:r>
+      <w:r>
+        <w:t xml:space="preserve"> </w:t>
+      </w:r>
+      <w:r>
+        <w:t xml:space="preserve">and</w:t>
+      </w:r>
+      <w:r>
+        <w:t xml:space="preserve"> </w:t>
+      </w:r>
+      <w:r>
+        <w:rPr>
+          <w:rStyle w:val="VerbatimChar"/>
+        </w:rPr>
+        <w:t xml:space="preserve">aiSuggestions=null</w:t>
+      </w:r>
+      <w:r>
+        <w:t xml:space="preserve"> </w:t>
+      </w:r>
+      <w:r>
+        <w:t xml:space="preserve">at inspection time, so the generic “predatory MCA” reply shown in the screenshot was not persisted AI output;</w:t>
+      </w:r>
+      <w:r>
+        <w:t xml:space="preserve"> </w:t>
+      </w:r>
+      <w:r>
+        <w:rPr>
+          <w:rStyle w:val="VerbatimChar"/>
+        </w:rPr>
+        <w:t xml:space="preserve">SG ECHO LLC</w:t>
+      </w:r>
+      <w:r>
+        <w:t xml:space="preserve"> </w:t>
+      </w:r>
+      <w:r>
+        <w:t xml:space="preserve">/ Patricia Ann Kaelin (</w:t>
+      </w:r>
+      <w:r>
+        <w:rPr>
+          <w:rStyle w:val="VerbatimChar"/>
+        </w:rPr>
+        <w:t xml:space="preserve">cmoj0561t08a4zo2sugztfeek</w:t>
+      </w:r>
+      <w:r>
+        <w:t xml:space="preserve">) remains assigned to Marcos while the lead is</w:t>
+      </w:r>
+      <w:r>
+        <w:t xml:space="preserve"> </w:t>
+      </w:r>
+      <w:r>
+        <w:rPr>
+          <w:rStyle w:val="VerbatimChar"/>
+        </w:rPr>
+        <w:t xml:space="preserve">DNC</w:t>
+      </w:r>
+      <w:r>
+        <w:t xml:space="preserve"> </w:t>
+      </w:r>
+      <w:r>
+        <w:t xml:space="preserve">+</w:t>
+      </w:r>
+      <w:r>
+        <w:t xml:space="preserve"> </w:t>
+      </w:r>
+      <w:r>
+        <w:rPr>
+          <w:rStyle w:val="VerbatimChar"/>
+        </w:rPr>
+        <w:t xml:space="preserve">optedOut=true</w:t>
+      </w:r>
+      <w:r>
+        <w:t xml:space="preserve">, which explains why the thread dropped out of the normal inbox flow after the removal request.</w:t>
+      </w:r>
+    </w:p>
+    <w:p>
+      <w:pPr>
+        <w:pStyle w:val="Compact"/>
+        <w:numPr>
+          <w:ilvl w:val="0"/>
+          <w:numId w:val="1302"/>
+        </w:numPr>
+      </w:pPr>
+      <w:r>
+        <w:t xml:space="preserve">Twilio verification for the newly surfaced inbox replies: both</w:t>
+      </w:r>
+      <w:r>
+        <w:t xml:space="preserve"> </w:t>
+      </w:r>
+      <w:r>
+        <w:rPr>
+          <w:rStyle w:val="VerbatimChar"/>
+        </w:rPr>
+        <w:t xml:space="preserve">ROBBY 2025 / STAINLESS VALVE CO</w:t>
+      </w:r>
+      <w:r>
+        <w:t xml:space="preserve"> </w:t>
+      </w:r>
+      <w:r>
+        <w:t xml:space="preserve">(</w:t>
+      </w:r>
+      <w:r>
+        <w:rPr>
+          <w:rStyle w:val="VerbatimChar"/>
+        </w:rPr>
+        <w:t xml:space="preserve">START</w:t>
+      </w:r>
+      <w:r>
+        <w:t xml:space="preserve">, sid</w:t>
+      </w:r>
+      <w:r>
+        <w:t xml:space="preserve"> </w:t>
+      </w:r>
+      <w:r>
+        <w:rPr>
+          <w:rStyle w:val="VerbatimChar"/>
+        </w:rPr>
+        <w:t xml:space="preserve">SM8a2d22907979efa09bb51f84a18cf83b</w:t>
+      </w:r>
+      <w:r>
+        <w:t xml:space="preserve">) and</w:t>
+      </w:r>
+      <w:r>
+        <w:t xml:space="preserve"> </w:t>
+      </w:r>
+      <w:r>
+        <w:rPr>
+          <w:rStyle w:val="VerbatimChar"/>
+        </w:rPr>
+        <w:t xml:space="preserve">Jason Faraj / Woodland Creek</w:t>
+      </w:r>
+      <w:r>
+        <w:t xml:space="preserve"> </w:t>
+      </w:r>
+      <w:r>
+        <w:t xml:space="preserve">(</w:t>
+      </w:r>
+      <w:r>
+        <w:rPr>
+          <w:rStyle w:val="VerbatimChar"/>
+        </w:rPr>
+        <w:t xml:space="preserve">Okay</w:t>
+      </w:r>
+      <w:r>
+        <w:t xml:space="preserve">, sid</w:t>
+      </w:r>
+      <w:r>
+        <w:t xml:space="preserve"> </w:t>
+      </w:r>
+      <w:r>
+        <w:rPr>
+          <w:rStyle w:val="VerbatimChar"/>
+        </w:rPr>
+        <w:t xml:space="preserve">SM91f71ed97aca21d1561f8ff8f6fdb393</w:t>
+      </w:r>
+      <w:r>
+        <w:t xml:space="preserve">) are real inbound Twilio messages from 2026-04-15, not UI-generated phantom replies.</w:t>
+      </w:r>
+    </w:p>
+    <w:p>
+      <w:pPr>
+        <w:pStyle w:val="Compact"/>
+        <w:numPr>
+          <w:ilvl w:val="0"/>
+          <w:numId w:val="1302"/>
+        </w:numPr>
+      </w:pPr>
+      <w:r>
+        <w:t xml:space="preserve">Latest inbox cleanup fix: commit</w:t>
+      </w:r>
+      <w:r>
+        <w:t xml:space="preserve"> </w:t>
+      </w:r>
+      <w:r>
+        <w:rPr>
+          <w:rStyle w:val="VerbatimChar"/>
+        </w:rPr>
+        <w:t xml:space="preserve">74f472f</w:t>
+      </w:r>
+      <w:r>
+        <w:t xml:space="preserve"> </w:t>
+      </w:r>
+      <w:r>
+        <w:t xml:space="preserve">narrows unread DNC visibility in default inbox scopes to a recent 7-day window so old hidden DNC backlog does not suddenly flood reps after the SG ECHO visibility fix.</w:t>
+      </w:r>
+    </w:p>
+    <w:p>
+      <w:pPr>
+        <w:pStyle w:val="Compact"/>
+        <w:numPr>
+          <w:ilvl w:val="0"/>
+          <w:numId w:val="1302"/>
+        </w:numPr>
+      </w:pPr>
+      <w:r>
+        <w:t xml:space="preserve">Latest opt-in normalization fix: commit</w:t>
+      </w:r>
+      <w:r>
+        <w:t xml:space="preserve"> </w:t>
+      </w:r>
+      <w:r>
+        <w:rPr>
+          <w:rStyle w:val="VerbatimChar"/>
+        </w:rPr>
+        <w:t xml:space="preserve">74f472f</w:t>
+      </w:r>
+      <w:r>
+        <w:t xml:space="preserve"> </w:t>
+      </w:r>
+      <w:r>
+        <w:t xml:space="preserve">updates</w:t>
+      </w:r>
+      <w:r>
+        <w:t xml:space="preserve"> </w:t>
+      </w:r>
+      <w:r>
+        <w:rPr>
+          <w:rStyle w:val="VerbatimChar"/>
+        </w:rPr>
+        <w:t xml:space="preserve">ComplianceService.handleOptIn()</w:t>
+      </w:r>
+      <w:r>
+        <w:t xml:space="preserve"> </w:t>
+      </w:r>
+      <w:r>
+        <w:t xml:space="preserve">so</w:t>
+      </w:r>
+      <w:r>
+        <w:t xml:space="preserve"> </w:t>
+      </w:r>
+      <w:r>
+        <w:rPr>
+          <w:rStyle w:val="VerbatimChar"/>
+        </w:rPr>
+        <w:t xml:space="preserve">START/UNSTOP/SUBSCRIBE</w:t>
+      </w:r>
+      <w:r>
+        <w:t xml:space="preserve"> </w:t>
+      </w:r>
+      <w:r>
+        <w:t xml:space="preserve">clears DNC suppression state (</w:t>
+      </w:r>
+      <w:r>
+        <w:rPr>
+          <w:rStyle w:val="VerbatimChar"/>
+        </w:rPr>
+        <w:t xml:space="preserve">optedOut</w:t>
+      </w:r>
+      <w:r>
+        <w:t xml:space="preserve">,</w:t>
+      </w:r>
+      <w:r>
+        <w:t xml:space="preserve"> </w:t>
+      </w:r>
+      <w:r>
+        <w:rPr>
+          <w:rStyle w:val="VerbatimChar"/>
+        </w:rPr>
+        <w:t xml:space="preserve">isSuppressed</w:t>
+      </w:r>
+      <w:r>
+        <w:t xml:space="preserve">,</w:t>
+      </w:r>
+      <w:r>
+        <w:t xml:space="preserve"> </w:t>
+      </w:r>
+      <w:r>
+        <w:rPr>
+          <w:rStyle w:val="VerbatimChar"/>
+        </w:rPr>
+        <w:t xml:space="preserve">suppressionEntry</w:t>
+      </w:r>
+      <w:r>
+        <w:t xml:space="preserve">,</w:t>
+      </w:r>
+      <w:r>
+        <w:t xml:space="preserve"> </w:t>
+      </w:r>
+      <w:r>
+        <w:rPr>
+          <w:rStyle w:val="VerbatimChar"/>
+        </w:rPr>
+        <w:t xml:space="preserve">conversation.leadStatus</w:t>
+      </w:r>
+      <w:r>
+        <w:t xml:space="preserve">) instead of leaving a re-subscribed lead logically stuck in DNC.</w:t>
+      </w:r>
+    </w:p>
+    <w:p>
+      <w:pPr>
+        <w:pStyle w:val="Compact"/>
+        <w:numPr>
+          <w:ilvl w:val="0"/>
+          <w:numId w:val="1302"/>
+        </w:numPr>
+      </w:pPr>
+      <w:r>
+        <w:t xml:space="preserve">Latest unread-summary alignment fix: commit</w:t>
+      </w:r>
+      <w:r>
+        <w:t xml:space="preserve"> </w:t>
+      </w:r>
+      <w:r>
+        <w:rPr>
+          <w:rStyle w:val="VerbatimChar"/>
+        </w:rPr>
+        <w:t xml:space="preserve">a54c027</w:t>
+      </w:r>
+      <w:r>
+        <w:t xml:space="preserve"> </w:t>
+      </w:r>
+      <w:r>
+        <w:t xml:space="preserve">makes</w:t>
+      </w:r>
+      <w:r>
+        <w:t xml:space="preserve"> </w:t>
+      </w:r>
+      <w:r>
+        <w:rPr>
+          <w:rStyle w:val="VerbatimChar"/>
+        </w:rPr>
+        <w:t xml:space="preserve">/inbox/unread-summary</w:t>
+      </w:r>
+      <w:r>
+        <w:t xml:space="preserve"> </w:t>
+      </w:r>
+      <w:r>
+        <w:t xml:space="preserve">reuse the same</w:t>
+      </w:r>
+      <w:r>
+        <w:t xml:space="preserve"> </w:t>
+      </w:r>
+      <w:r>
+        <w:rPr>
+          <w:rStyle w:val="VerbatimChar"/>
+        </w:rPr>
+        <w:t xml:space="preserve">buildVisibilityConditions()</w:t>
+      </w:r>
+      <w:r>
+        <w:t xml:space="preserve"> </w:t>
+      </w:r>
+      <w:r>
+        <w:t xml:space="preserve">logic as Inbox/Admin View, eliminating the server-side mismatch that previously showed sidebar</w:t>
+      </w:r>
+      <w:r>
+        <w:t xml:space="preserve"> </w:t>
+      </w:r>
+      <w:r>
+        <w:rPr>
+          <w:rStyle w:val="VerbatimChar"/>
+        </w:rPr>
+        <w:t xml:space="preserve">9+</w:t>
+      </w:r>
+      <w:r>
+        <w:t xml:space="preserve"> </w:t>
+      </w:r>
+      <w:r>
+        <w:t xml:space="preserve">while the visible inbox unread count was lower.</w:t>
+      </w:r>
+    </w:p>
+    <w:p>
+      <w:pPr>
+        <w:pStyle w:val="Compact"/>
+        <w:numPr>
+          <w:ilvl w:val="0"/>
+          <w:numId w:val="1302"/>
+        </w:numPr>
+      </w:pPr>
+      <w:r>
+        <w:t xml:space="preserve">Production verification after unread-summary deploy: built backend helper</w:t>
+      </w:r>
+      <w:r>
+        <w:t xml:space="preserve"> </w:t>
+      </w:r>
+      <w:r>
+        <w:rPr>
+          <w:rStyle w:val="VerbatimChar"/>
+        </w:rPr>
+        <w:t xml:space="preserve">buildUnreadSummaryWhere()</w:t>
+      </w:r>
+      <w:r>
+        <w:t xml:space="preserve"> </w:t>
+      </w:r>
+      <w:r>
+        <w:t xml:space="preserve">and the Inbox list visibility path both now count the same</w:t>
+      </w:r>
+      <w:r>
+        <w:t xml:space="preserve"> </w:t>
+      </w:r>
+      <w:r>
+        <w:rPr>
+          <w:rStyle w:val="VerbatimChar"/>
+        </w:rPr>
+        <w:t xml:space="preserve">7</w:t>
+      </w:r>
+      <w:r>
+        <w:t xml:space="preserve"> </w:t>
+      </w:r>
+      <w:r>
+        <w:t xml:space="preserve">visible unread conversations (</w:t>
+      </w:r>
+      <w:r>
+        <w:rPr>
+          <w:rStyle w:val="VerbatimChar"/>
+        </w:rPr>
+        <w:t xml:space="preserve">10</w:t>
+      </w:r>
+      <w:r>
+        <w:t xml:space="preserve"> </w:t>
+      </w:r>
+      <w:r>
+        <w:t xml:space="preserve">unread messages) in Admin scope, confirming the badge/list logic is aligned even though live counts continue to change with new inbound traffic.</w:t>
+      </w:r>
+    </w:p>
+    <w:p>
+      <w:pPr>
+        <w:pStyle w:val="Compact"/>
+        <w:numPr>
+          <w:ilvl w:val="0"/>
+          <w:numId w:val="1302"/>
+        </w:numPr>
+      </w:pPr>
+      <w:r>
+        <w:t xml:space="preserve">Latest AI parser compatibility fix: commit</w:t>
+      </w:r>
+      <w:r>
+        <w:t xml:space="preserve"> </w:t>
+      </w:r>
+      <w:r>
+        <w:rPr>
+          <w:rStyle w:val="VerbatimChar"/>
+        </w:rPr>
+        <w:t xml:space="preserve">cc50ca6</w:t>
+      </w:r>
+      <w:r>
+        <w:t xml:space="preserve"> </w:t>
+      </w:r>
+      <w:r>
+        <w:t xml:space="preserve">extracts the fenced JSON object from Anthropic responses even when the model appends prose like</w:t>
+      </w:r>
+      <w:r>
+        <w:t xml:space="preserve"> </w:t>
+      </w:r>
+      <w:r>
+        <w:rPr>
+          <w:rStyle w:val="VerbatimChar"/>
+        </w:rPr>
+        <w:t xml:space="preserve">Reply Option 1</w:t>
+      </w:r>
+      <w:r>
+        <w:t xml:space="preserve"> </w:t>
+      </w:r>
+      <w:r>
+        <w:t xml:space="preserve">after the JSON block; targeted regression</w:t>
+      </w:r>
+      <w:r>
+        <w:t xml:space="preserve"> </w:t>
+      </w:r>
+      <w:r>
+        <w:rPr>
+          <w:rStyle w:val="VerbatimChar"/>
+        </w:rPr>
+        <w:t xml:space="preserve">server/tests/aiSuggestionPolicy.test.ts</w:t>
+      </w:r>
+      <w:r>
+        <w:t xml:space="preserve"> </w:t>
+      </w:r>
+      <w:r>
+        <w:t xml:space="preserve">passed 11/11 and</w:t>
+      </w:r>
+      <w:r>
+        <w:t xml:space="preserve"> </w:t>
+      </w:r>
+      <w:r>
+        <w:rPr>
+          <w:rStyle w:val="VerbatimChar"/>
+        </w:rPr>
+        <w:t xml:space="preserve">server npm run build</w:t>
+      </w:r>
+      <w:r>
+        <w:t xml:space="preserve"> </w:t>
+      </w:r>
+      <w:r>
+        <w:t xml:space="preserve">passed before deploy.</w:t>
+      </w:r>
+    </w:p>
+    <w:p>
+      <w:pPr>
+        <w:pStyle w:val="Compact"/>
+        <w:numPr>
+          <w:ilvl w:val="0"/>
+          <w:numId w:val="1302"/>
+        </w:numPr>
+      </w:pPr>
+      <w:r>
+        <w:t xml:space="preserve">Latest AI schema-drift tolerance fix: commit</w:t>
+      </w:r>
+      <w:r>
+        <w:t xml:space="preserve"> </w:t>
+      </w:r>
+      <w:r>
+        <w:rPr>
+          <w:rStyle w:val="VerbatimChar"/>
+        </w:rPr>
+        <w:t xml:space="preserve">56f4a8b</w:t>
+      </w:r>
+      <w:r>
+        <w:t xml:space="preserve"> </w:t>
+      </w:r>
+      <w:r>
+        <w:t xml:space="preserve">normalizes near-valid locked payloads instead of returning</w:t>
+      </w:r>
+      <w:r>
+        <w:t xml:space="preserve"> </w:t>
+      </w:r>
+      <w:r>
+        <w:rPr>
+          <w:rStyle w:val="VerbatimChar"/>
+        </w:rPr>
+        <w:t xml:space="preserve">null</w:t>
+      </w:r>
+      <w:r>
+        <w:t xml:space="preserve"> </w:t>
+      </w:r>
+      <w:r>
+        <w:t xml:space="preserve">when Anthropic emits</w:t>
+      </w:r>
+      <w:r>
+        <w:t xml:space="preserve"> </w:t>
+      </w:r>
+      <w:r>
+        <w:rPr>
+          <w:rStyle w:val="VerbatimChar"/>
+        </w:rPr>
+        <w:t xml:space="preserve">inferredProduct</w:t>
+      </w:r>
+      <w:r>
+        <w:t xml:space="preserve"> </w:t>
+      </w:r>
+      <w:r>
+        <w:t xml:space="preserve">rather than schema-required</w:t>
+      </w:r>
+      <w:r>
+        <w:t xml:space="preserve"> </w:t>
+      </w:r>
+      <w:r>
+        <w:rPr>
+          <w:rStyle w:val="VerbatimChar"/>
+        </w:rPr>
+        <w:t xml:space="preserve">product</w:t>
+      </w:r>
+      <w:r>
+        <w:t xml:space="preserve">; targeted regression</w:t>
+      </w:r>
+      <w:r>
+        <w:t xml:space="preserve"> </w:t>
+      </w:r>
+      <w:r>
+        <w:rPr>
+          <w:rStyle w:val="VerbatimChar"/>
+        </w:rPr>
+        <w:t xml:space="preserve">server/tests/aiSuggestionPolicy.test.ts</w:t>
+      </w:r>
+      <w:r>
+        <w:t xml:space="preserve"> </w:t>
+      </w:r>
+      <w:r>
+        <w:t xml:space="preserve">passed 12/12 and</w:t>
+      </w:r>
+      <w:r>
+        <w:t xml:space="preserve"> </w:t>
+      </w:r>
+      <w:r>
+        <w:rPr>
+          <w:rStyle w:val="VerbatimChar"/>
+        </w:rPr>
+        <w:t xml:space="preserve">server npm run build</w:t>
+      </w:r>
+      <w:r>
+        <w:t xml:space="preserve"> </w:t>
+      </w:r>
+      <w:r>
+        <w:t xml:space="preserve">passed before deploy.</w:t>
+      </w:r>
+    </w:p>
+    <w:p>
+      <w:pPr>
+        <w:pStyle w:val="Compact"/>
+        <w:numPr>
+          <w:ilvl w:val="0"/>
+          <w:numId w:val="1302"/>
+        </w:numPr>
+      </w:pPr>
+      <w:r>
+        <w:t xml:space="preserve">Production direct-call verification after the final AI fix:</w:t>
+      </w:r>
+      <w:r>
+        <w:t xml:space="preserve"> </w:t>
+      </w:r>
+      <w:r>
+        <w:rPr>
+          <w:rStyle w:val="VerbatimChar"/>
+        </w:rPr>
+        <w:t xml:space="preserve">AIService.classifyInbound()</w:t>
+      </w:r>
+      <w:r>
+        <w:t xml:space="preserve"> </w:t>
+      </w:r>
+      <w:r>
+        <w:t xml:space="preserve">now returns structured non-null results for fresh non-DNC conversations</w:t>
+      </w:r>
+      <w:r>
+        <w:t xml:space="preserve"> </w:t>
+      </w:r>
+      <w:r>
+        <w:rPr>
+          <w:rStyle w:val="VerbatimChar"/>
+        </w:rPr>
+        <w:t xml:space="preserve">cmoabo8yd099wzopu72j9b11r</w:t>
+      </w:r>
+      <w:r>
+        <w:t xml:space="preserve"> </w:t>
+      </w:r>
+      <w:r>
+        <w:t xml:space="preserve">(HOT) and</w:t>
+      </w:r>
+      <w:r>
+        <w:t xml:space="preserve"> </w:t>
+      </w:r>
+      <w:r>
+        <w:rPr>
+          <w:rStyle w:val="VerbatimChar"/>
+        </w:rPr>
+        <w:t xml:space="preserve">cmoizm3xv02ztzo2sraq9v8x1</w:t>
+      </w:r>
+      <w:r>
+        <w:t xml:space="preserve"> </w:t>
+      </w:r>
+      <w:r>
+        <w:t xml:space="preserve">(WARM), proving the live classification path is healthy again for eligible inbound threads.</w:t>
+      </w:r>
+    </w:p>
+    <w:p>
+      <w:pPr>
+        <w:pStyle w:val="Compact"/>
+        <w:numPr>
+          <w:ilvl w:val="0"/>
+          <w:numId w:val="1302"/>
+        </w:numPr>
+      </w:pPr>
+      <w:r>
+        <w:t xml:space="preserve">Production eligibility note: Gordon (</w:t>
+      </w:r>
+      <w:r>
+        <w:rPr>
+          <w:rStyle w:val="VerbatimChar"/>
+        </w:rPr>
+        <w:t xml:space="preserve">cmnes2ipl024ezopaelyfluui</w:t>
+      </w:r>
+      <w:r>
+        <w:t xml:space="preserve">) still returns</w:t>
+      </w:r>
+      <w:r>
+        <w:t xml:space="preserve"> </w:t>
+      </w:r>
+      <w:r>
+        <w:rPr>
+          <w:rStyle w:val="VerbatimChar"/>
+        </w:rPr>
+        <w:t xml:space="preserve">null</w:t>
+      </w:r>
+      <w:r>
+        <w:t xml:space="preserve"> </w:t>
+      </w:r>
+      <w:r>
+        <w:t xml:space="preserve">by design because the conversation is</w:t>
+      </w:r>
+      <w:r>
+        <w:t xml:space="preserve"> </w:t>
+      </w:r>
+      <w:r>
+        <w:rPr>
+          <w:rStyle w:val="VerbatimChar"/>
+        </w:rPr>
+        <w:t xml:space="preserve">leadStatus=DNC</w:t>
+      </w:r>
+      <w:r>
+        <w:t xml:space="preserve">,</w:t>
+      </w:r>
+      <w:r>
+        <w:t xml:space="preserve"> </w:t>
+      </w:r>
+      <w:r>
+        <w:rPr>
+          <w:rStyle w:val="VerbatimChar"/>
+        </w:rPr>
+        <w:t xml:space="preserve">optedOut=true</w:t>
+      </w:r>
+      <w:r>
+        <w:t xml:space="preserve">;</w:t>
+      </w:r>
+      <w:r>
+        <w:t xml:space="preserve"> </w:t>
+      </w:r>
+      <w:r>
+        <w:rPr>
+          <w:rStyle w:val="VerbatimChar"/>
+        </w:rPr>
+        <w:t xml:space="preserve">getClassificationSkipReason()</w:t>
+      </w:r>
+      <w:r>
+        <w:t xml:space="preserve"> </w:t>
+      </w:r>
+      <w:r>
+        <w:t xml:space="preserve">intentionally skips DNC/opt-out threads before any AI parsing.</w:t>
+      </w:r>
+    </w:p>
+    <w:p>
+      <w:pPr>
+        <w:pStyle w:val="Compact"/>
+        <w:numPr>
+          <w:ilvl w:val="0"/>
+          <w:numId w:val="1302"/>
+        </w:numPr>
+      </w:pPr>
+      <w:r>
+        <w:t xml:space="preserve">Production AI recovery backfill: a safe one-off replay persisted AI state for 5 recent inbound conversations with</w:t>
+      </w:r>
+      <w:r>
+        <w:t xml:space="preserve"> </w:t>
+      </w:r>
+      <w:r>
+        <w:rPr>
+          <w:rStyle w:val="VerbatimChar"/>
+        </w:rPr>
+        <w:t xml:space="preserve">optedOut=false</w:t>
+      </w:r>
+      <w:r>
+        <w:t xml:space="preserve">,</w:t>
+      </w:r>
+      <w:r>
+        <w:t xml:space="preserve"> </w:t>
+      </w:r>
+      <w:r>
+        <w:rPr>
+          <w:rStyle w:val="VerbatimChar"/>
+        </w:rPr>
+        <w:t xml:space="preserve">status!=DNC</w:t>
+      </w:r>
+      <w:r>
+        <w:t xml:space="preserve">, and previously empty</w:t>
+      </w:r>
+      <w:r>
+        <w:t xml:space="preserve"> </w:t>
+      </w:r>
+      <w:r>
+        <w:rPr>
+          <w:rStyle w:val="VerbatimChar"/>
+        </w:rPr>
+        <w:t xml:space="preserve">aiClassification</w:t>
+      </w:r>
+      <w:r>
+        <w:t xml:space="preserve">; delayed HOT mobile alerts were intentionally not replayed during this backfill to avoid rep spam, and the post-check showed</w:t>
       </w:r>
       <w:r>
         <w:t xml:space="preserve"> </w:t>
@@ -10415,1183 +11978,10 @@
         <w:t xml:space="preserve">0</w:t>
       </w:r>
       <w:r>
-        <w:t xml:space="preserve">.</w:t>
-      </w:r>
-    </w:p>
-    <w:p>
-      <w:pPr>
-        <w:pStyle w:val="Compact"/>
-        <w:numPr>
-          <w:ilvl w:val="0"/>
-          <w:numId w:val="1302"/>
-        </w:numPr>
-      </w:pPr>
-      <w:r>
-        <w:t xml:space="preserve">Production deploy path used committed code only: initial full deploy fast-forwarded</w:t>
-      </w:r>
-      <w:r>
-        <w:t xml:space="preserve"> </w:t>
-      </w:r>
-      <w:r>
-        <w:rPr>
-          <w:rStyle w:val="VerbatimChar"/>
-        </w:rPr>
-        <w:t xml:space="preserve">e596d85..15414cf</w:t>
-      </w:r>
-      <w:r>
-        <w:t xml:space="preserve">, then unread-badge frontend-only fast-forward</w:t>
-      </w:r>
-      <w:r>
-        <w:t xml:space="preserve"> </w:t>
-      </w:r>
-      <w:r>
-        <w:rPr>
-          <w:rStyle w:val="VerbatimChar"/>
-        </w:rPr>
-        <w:t xml:space="preserve">15414cf..b2572de</w:t>
-      </w:r>
-      <w:r>
-        <w:t xml:space="preserve">, then AI-suggestion reply-refresh fast-forward</w:t>
-      </w:r>
-      <w:r>
-        <w:t xml:space="preserve"> </w:t>
-      </w:r>
-      <w:r>
-        <w:rPr>
-          <w:rStyle w:val="VerbatimChar"/>
-        </w:rPr>
-        <w:t xml:space="preserve">b2572de..a5b587f</w:t>
-      </w:r>
-      <w:r>
-        <w:t xml:space="preserve">, then fallback-suggestion restore fast-forward</w:t>
-      </w:r>
-      <w:r>
-        <w:t xml:space="preserve"> </w:t>
-      </w:r>
-      <w:r>
-        <w:rPr>
-          <w:rStyle w:val="VerbatimChar"/>
-        </w:rPr>
-        <w:t xml:space="preserve">a5b587f..9f6e478</w:t>
-      </w:r>
-      <w:r>
-        <w:t xml:space="preserve">, then email-suggestion repair fast-forward</w:t>
-      </w:r>
-      <w:r>
-        <w:t xml:space="preserve"> </w:t>
-      </w:r>
-      <w:r>
-        <w:rPr>
-          <w:rStyle w:val="VerbatimChar"/>
-        </w:rPr>
-        <w:t xml:space="preserve">9f6e478..064b88d</w:t>
-      </w:r>
-      <w:r>
-        <w:t xml:space="preserve">, then handoff-gap-selling restore fast-forward</w:t>
-      </w:r>
-      <w:r>
-        <w:t xml:space="preserve"> </w:t>
-      </w:r>
-      <w:r>
-        <w:rPr>
-          <w:rStyle w:val="VerbatimChar"/>
-        </w:rPr>
-        <w:t xml:space="preserve">064b88d..34e62a9</w:t>
-      </w:r>
-      <w:r>
-        <w:t xml:space="preserve">, then stale-DNC-visibility / opt-in-normalization fast-forward</w:t>
-      </w:r>
-      <w:r>
-        <w:t xml:space="preserve"> </w:t>
-      </w:r>
-      <w:r>
-        <w:rPr>
-          <w:rStyle w:val="VerbatimChar"/>
-        </w:rPr>
-        <w:t xml:space="preserve">34e62a9..74f472f</w:t>
-      </w:r>
-      <w:r>
-        <w:t xml:space="preserve">, then sidebar-unread-summary alignment fast-forward</w:t>
-      </w:r>
-      <w:r>
-        <w:t xml:space="preserve"> </w:t>
-      </w:r>
-      <w:r>
-        <w:rPr>
-          <w:rStyle w:val="VerbatimChar"/>
-        </w:rPr>
-        <w:t xml:space="preserve">74f472f..a54c027</w:t>
-      </w:r>
-      <w:r>
-        <w:t xml:space="preserve"> </w:t>
-      </w:r>
-      <w:r>
-        <w:t xml:space="preserve">with fresh</w:t>
-      </w:r>
-      <w:r>
-        <w:t xml:space="preserve"> </w:t>
-      </w:r>
-      <w:r>
-        <w:rPr>
-          <w:rStyle w:val="VerbatimChar"/>
-        </w:rPr>
-        <w:t xml:space="preserve">server</w:t>
-      </w:r>
-      <w:r>
-        <w:t xml:space="preserve"> </w:t>
-      </w:r>
-      <w:r>
-        <w:t xml:space="preserve">and</w:t>
-      </w:r>
-      <w:r>
-        <w:t xml:space="preserve"> </w:t>
-      </w:r>
-      <w:r>
-        <w:rPr>
-          <w:rStyle w:val="VerbatimChar"/>
-        </w:rPr>
-        <w:t xml:space="preserve">client</w:t>
-      </w:r>
-      <w:r>
-        <w:t xml:space="preserve"> </w:t>
-      </w:r>
-      <w:r>
-        <w:t xml:space="preserve">builds on production.</w:t>
-      </w:r>
-    </w:p>
-    <w:p>
-      <w:pPr>
-        <w:pStyle w:val="Compact"/>
-        <w:numPr>
-          <w:ilvl w:val="0"/>
-          <w:numId w:val="1302"/>
-        </w:numPr>
-      </w:pPr>
-      <w:r>
-        <w:t xml:space="preserve">Production health:</w:t>
-      </w:r>
-      <w:r>
-        <w:t xml:space="preserve"> </w:t>
-      </w:r>
-      <w:r>
-        <w:rPr>
-          <w:rStyle w:val="VerbatimChar"/>
-        </w:rPr>
-        <w:t xml:space="preserve">http://127.0.0.1:3001/api/health</w:t>
-      </w:r>
-      <w:r>
-        <w:t xml:space="preserve"> </w:t>
-      </w:r>
-      <w:r>
-        <w:t xml:space="preserve">returned</w:t>
-      </w:r>
-      <w:r>
-        <w:t xml:space="preserve"> </w:t>
-      </w:r>
-      <w:r>
-        <w:rPr>
-          <w:rStyle w:val="VerbatimChar"/>
-        </w:rPr>
-        <w:t xml:space="preserve">ok/ok/ok</w:t>
-      </w:r>
-      <w:r>
-        <w:t xml:space="preserve"> </w:t>
-      </w:r>
-      <w:r>
-        <w:t xml:space="preserve">for app/database/redis.</w:t>
-      </w:r>
-    </w:p>
-    <w:p>
-      <w:pPr>
-        <w:pStyle w:val="Compact"/>
-        <w:numPr>
-          <w:ilvl w:val="0"/>
-          <w:numId w:val="1302"/>
-        </w:numPr>
-      </w:pPr>
-      <w:r>
-        <w:t xml:space="preserve">PM2:</w:t>
-      </w:r>
-      <w:r>
-        <w:t xml:space="preserve"> </w:t>
-      </w:r>
-      <w:r>
-        <w:rPr>
-          <w:rStyle w:val="VerbatimChar"/>
-        </w:rPr>
-        <w:t xml:space="preserve">sms-api</w:t>
-      </w:r>
-      <w:r>
-        <w:t xml:space="preserve"> </w:t>
-      </w:r>
-      <w:r>
-        <w:t xml:space="preserve">online after restart; restart count</w:t>
-      </w:r>
-      <w:r>
-        <w:t xml:space="preserve"> </w:t>
-      </w:r>
-      <w:r>
-        <w:rPr>
-          <w:rStyle w:val="VerbatimChar"/>
-        </w:rPr>
-        <w:t xml:space="preserve">17</w:t>
-      </w:r>
-      <w:r>
-        <w:t xml:space="preserve">.</w:t>
-      </w:r>
-    </w:p>
-    <w:p>
-      <w:pPr>
-        <w:pStyle w:val="Compact"/>
-        <w:numPr>
-          <w:ilvl w:val="0"/>
-          <w:numId w:val="1302"/>
-        </w:numPr>
-      </w:pPr>
-      <w:r>
-        <w:t xml:space="preserve">Production runtime logs: PM2</w:t>
-      </w:r>
-      <w:r>
-        <w:t xml:space="preserve"> </w:t>
-      </w:r>
-      <w:r>
-        <w:rPr>
-          <w:rStyle w:val="VerbatimChar"/>
-        </w:rPr>
-        <w:t xml:space="preserve">out</w:t>
-      </w:r>
-      <w:r>
-        <w:t xml:space="preserve">/</w:t>
-      </w:r>
-      <w:r>
-        <w:rPr>
-          <w:rStyle w:val="VerbatimChar"/>
-        </w:rPr>
-        <w:t xml:space="preserve">error</w:t>
-      </w:r>
-      <w:r>
-        <w:t xml:space="preserve"> </w:t>
-      </w:r>
-      <w:r>
-        <w:t xml:space="preserve">tails were empty immediately after deploy; no fresh runtime errors were emitted after restart.</w:t>
-      </w:r>
-    </w:p>
-    <w:p>
-      <w:pPr>
-        <w:pStyle w:val="Compact"/>
-        <w:numPr>
-          <w:ilvl w:val="0"/>
-          <w:numId w:val="1302"/>
-        </w:numPr>
-      </w:pPr>
-      <w:r>
-        <w:t xml:space="preserve">Latest CI proof: run</w:t>
-      </w:r>
-      <w:r>
-        <w:t xml:space="preserve"> </w:t>
-      </w:r>
-      <w:r>
-        <w:rPr>
-          <w:rStyle w:val="VerbatimChar"/>
-        </w:rPr>
-        <w:t xml:space="preserve">25068339405</w:t>
-      </w:r>
-      <w:r>
-        <w:t xml:space="preserve">, commit</w:t>
-      </w:r>
-      <w:r>
-        <w:t xml:space="preserve"> </w:t>
-      </w:r>
-      <w:r>
-        <w:rPr>
-          <w:rStyle w:val="VerbatimChar"/>
-        </w:rPr>
-        <w:t xml:space="preserve">b2572de</w:t>
-      </w:r>
-      <w:r>
-        <w:t xml:space="preserve">, jobs completed successfully.</w:t>
-      </w:r>
-    </w:p>
-    <w:p>
-      <w:pPr>
-        <w:pStyle w:val="Compact"/>
-        <w:numPr>
-          <w:ilvl w:val="0"/>
-          <w:numId w:val="1302"/>
-        </w:numPr>
-      </w:pPr>
-      <w:r>
-        <w:t xml:space="preserve">Latest production build proof: server build passed; client build passed with known CSS minify warning</w:t>
-      </w:r>
-      <w:r>
-        <w:t xml:space="preserve"> </w:t>
-      </w:r>
-      <w:r>
-        <w:rPr>
-          <w:rStyle w:val="VerbatimChar"/>
-        </w:rPr>
-        <w:t xml:space="preserve">.light .bg-dark-800.border*</w:t>
-      </w:r>
-      <w:r>
-        <w:t xml:space="preserve"> </w:t>
-      </w:r>
-      <w:r>
-        <w:t xml:space="preserve">only.</w:t>
-      </w:r>
-    </w:p>
-    <w:p>
-      <w:pPr>
-        <w:pStyle w:val="Compact"/>
-        <w:numPr>
-          <w:ilvl w:val="0"/>
-          <w:numId w:val="1302"/>
-        </w:numPr>
-      </w:pPr>
-      <w:r>
-        <w:t xml:space="preserve">Public frontend smoke:</w:t>
-      </w:r>
-      <w:r>
-        <w:t xml:space="preserve"> </w:t>
-      </w:r>
-      <w:r>
-        <w:rPr>
-          <w:rStyle w:val="VerbatimChar"/>
-        </w:rPr>
-        <w:t xml:space="preserve">https://app.sclcapital.io/</w:t>
-      </w:r>
-      <w:r>
-        <w:t xml:space="preserve"> </w:t>
-      </w:r>
-      <w:r>
-        <w:t xml:space="preserve">returned</w:t>
-      </w:r>
-      <w:r>
-        <w:t xml:space="preserve"> </w:t>
-      </w:r>
-      <w:r>
-        <w:rPr>
-          <w:rStyle w:val="VerbatimChar"/>
-        </w:rPr>
-        <w:t xml:space="preserve">200 OK</w:t>
-      </w:r>
-      <w:r>
-        <w:t xml:space="preserve"> </w:t>
-      </w:r>
-      <w:r>
-        <w:t xml:space="preserve">and current index timestamp after deploy.</w:t>
-      </w:r>
-    </w:p>
-    <w:p>
-      <w:pPr>
-        <w:pStyle w:val="Compact"/>
-        <w:numPr>
-          <w:ilvl w:val="0"/>
-          <w:numId w:val="1302"/>
-        </w:numPr>
-      </w:pPr>
-      <w:r>
-        <w:t xml:space="preserve">Current unread-badge fix: sidebar Inbox badge now uses unread conversation count, and commit</w:t>
-      </w:r>
-      <w:r>
-        <w:t xml:space="preserve"> </w:t>
-      </w:r>
-      <w:r>
-        <w:rPr>
-          <w:rStyle w:val="VerbatimChar"/>
-        </w:rPr>
-        <w:t xml:space="preserve">a54c027</w:t>
-      </w:r>
-      <w:r>
-        <w:t xml:space="preserve"> </w:t>
-      </w:r>
-      <w:r>
-        <w:t xml:space="preserve">aligns</w:t>
-      </w:r>
-      <w:r>
-        <w:t xml:space="preserve"> </w:t>
-      </w:r>
-      <w:r>
-        <w:rPr>
-          <w:rStyle w:val="VerbatimChar"/>
-        </w:rPr>
-        <w:t xml:space="preserve">/inbox/unread-summary</w:t>
-      </w:r>
-      <w:r>
-        <w:t xml:space="preserve"> </w:t>
-      </w:r>
-      <w:r>
-        <w:t xml:space="preserve">with the same visibility policy as Inbox/Admin View so the sidebar count no longer includes hidden unread DNC backlog.</w:t>
-      </w:r>
-    </w:p>
-    <w:p>
-      <w:pPr>
-        <w:pStyle w:val="Compact"/>
-        <w:numPr>
-          <w:ilvl w:val="0"/>
-          <w:numId w:val="1302"/>
-        </w:numPr>
-      </w:pPr>
-      <w:r>
-        <w:t xml:space="preserve">Latest AI suggestion reply-refresh fix: commit</w:t>
-      </w:r>
-      <w:r>
-        <w:t xml:space="preserve"> </w:t>
-      </w:r>
-      <w:r>
-        <w:rPr>
-          <w:rStyle w:val="VerbatimChar"/>
-        </w:rPr>
-        <w:t xml:space="preserve">a5b587f</w:t>
-      </w:r>
-      <w:r>
-        <w:t xml:space="preserve"> </w:t>
-      </w:r>
-      <w:r>
-        <w:t xml:space="preserve">triggers owner-action reclassification after successful outbound reply; targeted regression</w:t>
-      </w:r>
-      <w:r>
-        <w:t xml:space="preserve"> </w:t>
-      </w:r>
-      <w:r>
-        <w:rPr>
-          <w:rStyle w:val="VerbatimChar"/>
-        </w:rPr>
-        <w:t xml:space="preserve">server/tests/inboxReplyReclassification.test.ts</w:t>
-      </w:r>
-      <w:r>
-        <w:t xml:space="preserve"> </w:t>
-      </w:r>
-      <w:r>
-        <w:t xml:space="preserve">passed 2/2;</w:t>
-      </w:r>
-      <w:r>
-        <w:t xml:space="preserve"> </w:t>
-      </w:r>
-      <w:r>
-        <w:rPr>
-          <w:rStyle w:val="VerbatimChar"/>
-        </w:rPr>
-        <w:t xml:space="preserve">server npm run build</w:t>
-      </w:r>
-      <w:r>
-        <w:t xml:space="preserve"> </w:t>
-      </w:r>
-      <w:r>
-        <w:t xml:space="preserve">passed.</w:t>
-      </w:r>
-    </w:p>
-    <w:p>
-      <w:pPr>
-        <w:pStyle w:val="Compact"/>
-        <w:numPr>
-          <w:ilvl w:val="0"/>
-          <w:numId w:val="1302"/>
-        </w:numPr>
-      </w:pPr>
-      <w:r>
-        <w:t xml:space="preserve">Latest AI suggestion restore fix: commit</w:t>
-      </w:r>
-      <w:r>
-        <w:t xml:space="preserve"> </w:t>
-      </w:r>
-      <w:r>
-        <w:rPr>
-          <w:rStyle w:val="VerbatimChar"/>
-        </w:rPr>
-        <w:t xml:space="preserve">9f6e478</w:t>
-      </w:r>
-      <w:r>
-        <w:t xml:space="preserve"> </w:t>
-      </w:r>
-      <w:r>
-        <w:t xml:space="preserve">rebuilds fallback suggestions when classified conversations have an empty</w:t>
-      </w:r>
-      <w:r>
-        <w:t xml:space="preserve"> </w:t>
-      </w:r>
-      <w:r>
-        <w:rPr>
-          <w:rStyle w:val="VerbatimChar"/>
-        </w:rPr>
-        <w:t xml:space="preserve">aiSuggestions</w:t>
-      </w:r>
-      <w:r>
-        <w:t xml:space="preserve"> </w:t>
-      </w:r>
-      <w:r>
-        <w:t xml:space="preserve">array; targeted regression</w:t>
-      </w:r>
-      <w:r>
-        <w:t xml:space="preserve"> </w:t>
-      </w:r>
-      <w:r>
-        <w:rPr>
-          <w:rStyle w:val="VerbatimChar"/>
-        </w:rPr>
-        <w:t xml:space="preserve">server/tests/aiSuggestionPolicy.test.ts</w:t>
-      </w:r>
-      <w:r>
-        <w:t xml:space="preserve"> </w:t>
-      </w:r>
-      <w:r>
-        <w:t xml:space="preserve">passed 5/5;</w:t>
-      </w:r>
-      <w:r>
-        <w:t xml:space="preserve"> </w:t>
-      </w:r>
-      <w:r>
-        <w:rPr>
-          <w:rStyle w:val="VerbatimChar"/>
-        </w:rPr>
-        <w:t xml:space="preserve">server npm run build</w:t>
-      </w:r>
-      <w:r>
-        <w:t xml:space="preserve"> </w:t>
-      </w:r>
-      <w:r>
-        <w:t xml:space="preserve">passed.</w:t>
-      </w:r>
-    </w:p>
-    <w:p>
-      <w:pPr>
-        <w:pStyle w:val="Compact"/>
-        <w:numPr>
-          <w:ilvl w:val="0"/>
-          <w:numId w:val="1302"/>
-        </w:numPr>
-      </w:pPr>
-      <w:r>
-        <w:t xml:space="preserve">Production API verification after deploy: previously broken threads</w:t>
-      </w:r>
-      <w:r>
-        <w:t xml:space="preserve"> </w:t>
-      </w:r>
-      <w:r>
-        <w:rPr>
-          <w:rStyle w:val="VerbatimChar"/>
-        </w:rPr>
-        <w:t xml:space="preserve">Audrey Berry $150,000.00</w:t>
-      </w:r>
-      <w:r>
-        <w:t xml:space="preserve"> </w:t>
-      </w:r>
-      <w:r>
-        <w:t xml:space="preserve">(</w:t>
-      </w:r>
-      <w:r>
-        <w:rPr>
-          <w:rStyle w:val="VerbatimChar"/>
-        </w:rPr>
-        <w:t xml:space="preserve">cmnt61hpb01cxzosfj9e0gj7d</w:t>
-      </w:r>
-      <w:r>
-        <w:t xml:space="preserve">) and</w:t>
-      </w:r>
-      <w:r>
-        <w:t xml:space="preserve"> </w:t>
-      </w:r>
-      <w:r>
-        <w:rPr>
-          <w:rStyle w:val="VerbatimChar"/>
-        </w:rPr>
-        <w:t xml:space="preserve">Jamie Johnson</w:t>
-      </w:r>
-      <w:r>
-        <w:t xml:space="preserve"> </w:t>
-      </w:r>
-      <w:r>
-        <w:t xml:space="preserve">(</w:t>
-      </w:r>
-      <w:r>
-        <w:rPr>
-          <w:rStyle w:val="VerbatimChar"/>
-        </w:rPr>
-        <w:t xml:space="preserve">cmoiqslus0d9tzo5uwqu6c25a</w:t>
-      </w:r>
-      <w:r>
-        <w:t xml:space="preserve">) now return</w:t>
-      </w:r>
-      <w:r>
-        <w:t xml:space="preserve"> </w:t>
-      </w:r>
-      <w:r>
-        <w:rPr>
-          <w:rStyle w:val="VerbatimChar"/>
-        </w:rPr>
-        <w:t xml:space="preserve">aiSuggestionsCount=1</w:t>
-      </w:r>
-      <w:r>
-        <w:t xml:space="preserve"> </w:t>
-      </w:r>
-      <w:r>
-        <w:t xml:space="preserve">with non-empty fallback text.</w:t>
-      </w:r>
-    </w:p>
-    <w:p>
-      <w:pPr>
-        <w:pStyle w:val="Compact"/>
-        <w:numPr>
-          <w:ilvl w:val="0"/>
-          <w:numId w:val="1302"/>
-        </w:numPr>
-      </w:pPr>
-      <w:r>
-        <w:t xml:space="preserve">Uploaded handoff archive verification:</w:t>
-      </w:r>
-      <w:r>
-        <w:t xml:space="preserve"> </w:t>
-      </w:r>
-      <w:r>
-        <w:rPr>
-          <w:rStyle w:val="VerbatimChar"/>
-        </w:rPr>
-        <w:t xml:space="preserve">scl-handoff-2026-4-25.rar</w:t>
-      </w:r>
-      <w:r>
-        <w:t xml:space="preserve"> </w:t>
-      </w:r>
-      <w:r>
-        <w:t xml:space="preserve">contains the same</w:t>
-      </w:r>
-      <w:r>
-        <w:t xml:space="preserve"> </w:t>
-      </w:r>
-      <w:r>
-        <w:rPr>
-          <w:rStyle w:val="VerbatimChar"/>
-        </w:rPr>
-        <w:t xml:space="preserve">classifier_prompt_v4_LOCKED.md</w:t>
-      </w:r>
-      <w:r>
-        <w:t xml:space="preserve"> </w:t>
-      </w:r>
-      <w:r>
-        <w:t xml:space="preserve">as the live</w:t>
-      </w:r>
-      <w:r>
-        <w:t xml:space="preserve"> </w:t>
-      </w:r>
-      <w:r>
-        <w:rPr>
-          <w:rStyle w:val="VerbatimChar"/>
-        </w:rPr>
-        <w:t xml:space="preserve">SCL-HandOff/</w:t>
-      </w:r>
-      <w:r>
-        <w:t xml:space="preserve"> </w:t>
-      </w:r>
-      <w:r>
-        <w:t xml:space="preserve">folder, so the prompt file itself was not the regression source.</w:t>
-      </w:r>
-    </w:p>
-    <w:p>
-      <w:pPr>
-        <w:pStyle w:val="Compact"/>
-        <w:numPr>
-          <w:ilvl w:val="0"/>
-          <w:numId w:val="1302"/>
-        </w:numPr>
-      </w:pPr>
-      <w:r>
-        <w:t xml:space="preserve">Latest handoff-alignment fix: commit</w:t>
-      </w:r>
-      <w:r>
-        <w:t xml:space="preserve"> </w:t>
-      </w:r>
-      <w:r>
-        <w:rPr>
-          <w:rStyle w:val="VerbatimChar"/>
-        </w:rPr>
-        <w:t xml:space="preserve">34e62a9</w:t>
-      </w:r>
-      <w:r>
-        <w:t xml:space="preserve"> </w:t>
-      </w:r>
-      <w:r>
-        <w:t xml:space="preserve">removes old deterministic HOT upgrades that contradicted locked v4 (</w:t>
-      </w:r>
-      <w:r>
-        <w:rPr>
-          <w:rStyle w:val="VerbatimChar"/>
-        </w:rPr>
-        <w:t xml:space="preserve">bare email</w:t>
-      </w:r>
-      <w:r>
-        <w:t xml:space="preserve"> </w:t>
-      </w:r>
-      <w:r>
-        <w:t xml:space="preserve">/</w:t>
-      </w:r>
-      <w:r>
-        <w:t xml:space="preserve"> </w:t>
-      </w:r>
-      <w:r>
-        <w:rPr>
-          <w:rStyle w:val="VerbatimChar"/>
-        </w:rPr>
-        <w:t xml:space="preserve">bare yes</w:t>
-      </w:r>
-      <w:r>
-        <w:t xml:space="preserve"> </w:t>
-      </w:r>
-      <w:r>
-        <w:t xml:space="preserve">no longer auto-promote to HOT), upgrades fallback suggestions to objection-aware Gap Selling phrasing, and keeps unread DNC replies visible in default Inbox filters until they are read.</w:t>
-      </w:r>
-    </w:p>
-    <w:p>
-      <w:pPr>
-        <w:pStyle w:val="Compact"/>
-        <w:numPr>
-          <w:ilvl w:val="0"/>
-          <w:numId w:val="1302"/>
-        </w:numPr>
-      </w:pPr>
-      <w:r>
-        <w:t xml:space="preserve">Production evidence for client screenshots:</w:t>
-      </w:r>
-      <w:r>
-        <w:t xml:space="preserve"> </w:t>
-      </w:r>
-      <w:r>
-        <w:rPr>
-          <w:rStyle w:val="VerbatimChar"/>
-        </w:rPr>
-        <w:t xml:space="preserve">Reinforce Tools</w:t>
-      </w:r>
-      <w:r>
-        <w:t xml:space="preserve"> </w:t>
-      </w:r>
-      <w:r>
-        <w:t xml:space="preserve">(</w:t>
-      </w:r>
-      <w:r>
-        <w:rPr>
-          <w:rStyle w:val="VerbatimChar"/>
-        </w:rPr>
-        <w:t xml:space="preserve">cmo0m0skg04pyzo0ze7y1siwe</w:t>
-      </w:r>
-      <w:r>
-        <w:t xml:space="preserve">) had</w:t>
-      </w:r>
-      <w:r>
-        <w:t xml:space="preserve"> </w:t>
-      </w:r>
-      <w:r>
-        <w:rPr>
-          <w:rStyle w:val="VerbatimChar"/>
-        </w:rPr>
-        <w:t xml:space="preserve">aiClassification=null</w:t>
-      </w:r>
-      <w:r>
-        <w:t xml:space="preserve"> </w:t>
-      </w:r>
-      <w:r>
-        <w:t xml:space="preserve">and</w:t>
-      </w:r>
-      <w:r>
-        <w:t xml:space="preserve"> </w:t>
-      </w:r>
-      <w:r>
-        <w:rPr>
-          <w:rStyle w:val="VerbatimChar"/>
-        </w:rPr>
-        <w:t xml:space="preserve">aiSuggestions=null</w:t>
-      </w:r>
-      <w:r>
-        <w:t xml:space="preserve"> </w:t>
-      </w:r>
-      <w:r>
-        <w:t xml:space="preserve">at inspection time, so the generic “predatory MCA” reply shown in the screenshot was not persisted AI output;</w:t>
-      </w:r>
-      <w:r>
-        <w:t xml:space="preserve"> </w:t>
-      </w:r>
-      <w:r>
-        <w:rPr>
-          <w:rStyle w:val="VerbatimChar"/>
-        </w:rPr>
-        <w:t xml:space="preserve">SG ECHO LLC</w:t>
-      </w:r>
-      <w:r>
-        <w:t xml:space="preserve"> </w:t>
-      </w:r>
-      <w:r>
-        <w:t xml:space="preserve">/ Patricia Ann Kaelin (</w:t>
-      </w:r>
-      <w:r>
-        <w:rPr>
-          <w:rStyle w:val="VerbatimChar"/>
-        </w:rPr>
-        <w:t xml:space="preserve">cmoj0561t08a4zo2sugztfeek</w:t>
-      </w:r>
-      <w:r>
-        <w:t xml:space="preserve">) remains assigned to Marcos while the lead is</w:t>
-      </w:r>
-      <w:r>
-        <w:t xml:space="preserve"> </w:t>
-      </w:r>
-      <w:r>
-        <w:rPr>
-          <w:rStyle w:val="VerbatimChar"/>
-        </w:rPr>
-        <w:t xml:space="preserve">DNC</w:t>
-      </w:r>
-      <w:r>
-        <w:t xml:space="preserve"> </w:t>
-      </w:r>
-      <w:r>
-        <w:t xml:space="preserve">+</w:t>
-      </w:r>
-      <w:r>
-        <w:t xml:space="preserve"> </w:t>
-      </w:r>
-      <w:r>
-        <w:rPr>
-          <w:rStyle w:val="VerbatimChar"/>
-        </w:rPr>
-        <w:t xml:space="preserve">optedOut=true</w:t>
-      </w:r>
-      <w:r>
-        <w:t xml:space="preserve">, which explains why the thread dropped out of the normal inbox flow after the removal request.</w:t>
-      </w:r>
-    </w:p>
-    <w:p>
-      <w:pPr>
-        <w:pStyle w:val="Compact"/>
-        <w:numPr>
-          <w:ilvl w:val="0"/>
-          <w:numId w:val="1302"/>
-        </w:numPr>
-      </w:pPr>
-      <w:r>
-        <w:t xml:space="preserve">Twilio verification for the newly surfaced inbox replies: both</w:t>
-      </w:r>
-      <w:r>
-        <w:t xml:space="preserve"> </w:t>
-      </w:r>
-      <w:r>
-        <w:rPr>
-          <w:rStyle w:val="VerbatimChar"/>
-        </w:rPr>
-        <w:t xml:space="preserve">ROBBY 2025 / STAINLESS VALVE CO</w:t>
-      </w:r>
-      <w:r>
-        <w:t xml:space="preserve"> </w:t>
-      </w:r>
-      <w:r>
-        <w:t xml:space="preserve">(</w:t>
-      </w:r>
-      <w:r>
-        <w:rPr>
-          <w:rStyle w:val="VerbatimChar"/>
-        </w:rPr>
-        <w:t xml:space="preserve">START</w:t>
-      </w:r>
-      <w:r>
-        <w:t xml:space="preserve">, sid</w:t>
-      </w:r>
-      <w:r>
-        <w:t xml:space="preserve"> </w:t>
-      </w:r>
-      <w:r>
-        <w:rPr>
-          <w:rStyle w:val="VerbatimChar"/>
-        </w:rPr>
-        <w:t xml:space="preserve">SM8a2d22907979efa09bb51f84a18cf83b</w:t>
-      </w:r>
-      <w:r>
-        <w:t xml:space="preserve">) and</w:t>
-      </w:r>
-      <w:r>
-        <w:t xml:space="preserve"> </w:t>
-      </w:r>
-      <w:r>
-        <w:rPr>
-          <w:rStyle w:val="VerbatimChar"/>
-        </w:rPr>
-        <w:t xml:space="preserve">Jason Faraj / Woodland Creek</w:t>
-      </w:r>
-      <w:r>
-        <w:t xml:space="preserve"> </w:t>
-      </w:r>
-      <w:r>
-        <w:t xml:space="preserve">(</w:t>
-      </w:r>
-      <w:r>
-        <w:rPr>
-          <w:rStyle w:val="VerbatimChar"/>
-        </w:rPr>
-        <w:t xml:space="preserve">Okay</w:t>
-      </w:r>
-      <w:r>
-        <w:t xml:space="preserve">, sid</w:t>
-      </w:r>
-      <w:r>
-        <w:t xml:space="preserve"> </w:t>
-      </w:r>
-      <w:r>
-        <w:rPr>
-          <w:rStyle w:val="VerbatimChar"/>
-        </w:rPr>
-        <w:t xml:space="preserve">SM91f71ed97aca21d1561f8ff8f6fdb393</w:t>
-      </w:r>
-      <w:r>
-        <w:t xml:space="preserve">) are real inbound Twilio messages from 2026-04-15, not UI-generated phantom replies.</w:t>
-      </w:r>
-    </w:p>
-    <w:p>
-      <w:pPr>
-        <w:pStyle w:val="Compact"/>
-        <w:numPr>
-          <w:ilvl w:val="0"/>
-          <w:numId w:val="1302"/>
-        </w:numPr>
-      </w:pPr>
-      <w:r>
-        <w:t xml:space="preserve">Latest inbox cleanup fix: commit</w:t>
-      </w:r>
-      <w:r>
-        <w:t xml:space="preserve"> </w:t>
-      </w:r>
-      <w:r>
-        <w:rPr>
-          <w:rStyle w:val="VerbatimChar"/>
-        </w:rPr>
-        <w:t xml:space="preserve">74f472f</w:t>
-      </w:r>
-      <w:r>
-        <w:t xml:space="preserve"> </w:t>
-      </w:r>
-      <w:r>
-        <w:t xml:space="preserve">narrows unread DNC visibility in default inbox scopes to a recent 7-day window so old hidden DNC backlog does not suddenly flood reps after the SG ECHO visibility fix.</w:t>
-      </w:r>
-    </w:p>
-    <w:p>
-      <w:pPr>
-        <w:pStyle w:val="Compact"/>
-        <w:numPr>
-          <w:ilvl w:val="0"/>
-          <w:numId w:val="1302"/>
-        </w:numPr>
-      </w:pPr>
-      <w:r>
-        <w:t xml:space="preserve">Latest opt-in normalization fix: commit</w:t>
-      </w:r>
-      <w:r>
-        <w:t xml:space="preserve"> </w:t>
-      </w:r>
-      <w:r>
-        <w:rPr>
-          <w:rStyle w:val="VerbatimChar"/>
-        </w:rPr>
-        <w:t xml:space="preserve">74f472f</w:t>
-      </w:r>
-      <w:r>
-        <w:t xml:space="preserve"> </w:t>
-      </w:r>
-      <w:r>
-        <w:t xml:space="preserve">updates</w:t>
-      </w:r>
-      <w:r>
-        <w:t xml:space="preserve"> </w:t>
-      </w:r>
-      <w:r>
-        <w:rPr>
-          <w:rStyle w:val="VerbatimChar"/>
-        </w:rPr>
-        <w:t xml:space="preserve">ComplianceService.handleOptIn()</w:t>
-      </w:r>
-      <w:r>
-        <w:t xml:space="preserve"> </w:t>
-      </w:r>
-      <w:r>
-        <w:t xml:space="preserve">so</w:t>
-      </w:r>
-      <w:r>
-        <w:t xml:space="preserve"> </w:t>
-      </w:r>
-      <w:r>
-        <w:rPr>
-          <w:rStyle w:val="VerbatimChar"/>
-        </w:rPr>
-        <w:t xml:space="preserve">START/UNSTOP/SUBSCRIBE</w:t>
-      </w:r>
-      <w:r>
-        <w:t xml:space="preserve"> </w:t>
-      </w:r>
-      <w:r>
-        <w:t xml:space="preserve">clears DNC suppression state (</w:t>
-      </w:r>
-      <w:r>
-        <w:rPr>
-          <w:rStyle w:val="VerbatimChar"/>
-        </w:rPr>
-        <w:t xml:space="preserve">optedOut</w:t>
-      </w:r>
-      <w:r>
-        <w:t xml:space="preserve">,</w:t>
-      </w:r>
-      <w:r>
-        <w:t xml:space="preserve"> </w:t>
-      </w:r>
-      <w:r>
-        <w:rPr>
-          <w:rStyle w:val="VerbatimChar"/>
-        </w:rPr>
-        <w:t xml:space="preserve">isSuppressed</w:t>
-      </w:r>
-      <w:r>
-        <w:t xml:space="preserve">,</w:t>
-      </w:r>
-      <w:r>
-        <w:t xml:space="preserve"> </w:t>
-      </w:r>
-      <w:r>
-        <w:rPr>
-          <w:rStyle w:val="VerbatimChar"/>
-        </w:rPr>
-        <w:t xml:space="preserve">suppressionEntry</w:t>
-      </w:r>
-      <w:r>
-        <w:t xml:space="preserve">,</w:t>
-      </w:r>
-      <w:r>
-        <w:t xml:space="preserve"> </w:t>
-      </w:r>
-      <w:r>
-        <w:rPr>
-          <w:rStyle w:val="VerbatimChar"/>
-        </w:rPr>
-        <w:t xml:space="preserve">conversation.leadStatus</w:t>
-      </w:r>
-      <w:r>
-        <w:t xml:space="preserve">) instead of leaving a re-subscribed lead logically stuck in DNC.</w:t>
-      </w:r>
-    </w:p>
-    <w:p>
-      <w:pPr>
-        <w:pStyle w:val="Compact"/>
-        <w:numPr>
-          <w:ilvl w:val="0"/>
-          <w:numId w:val="1302"/>
-        </w:numPr>
-      </w:pPr>
-      <w:r>
-        <w:t xml:space="preserve">Latest unread-summary alignment fix: commit</w:t>
-      </w:r>
-      <w:r>
-        <w:t xml:space="preserve"> </w:t>
-      </w:r>
-      <w:r>
-        <w:rPr>
-          <w:rStyle w:val="VerbatimChar"/>
-        </w:rPr>
-        <w:t xml:space="preserve">a54c027</w:t>
-      </w:r>
-      <w:r>
-        <w:t xml:space="preserve"> </w:t>
-      </w:r>
-      <w:r>
-        <w:t xml:space="preserve">makes</w:t>
-      </w:r>
-      <w:r>
-        <w:t xml:space="preserve"> </w:t>
-      </w:r>
-      <w:r>
-        <w:rPr>
-          <w:rStyle w:val="VerbatimChar"/>
-        </w:rPr>
-        <w:t xml:space="preserve">/inbox/unread-summary</w:t>
-      </w:r>
-      <w:r>
-        <w:t xml:space="preserve"> </w:t>
-      </w:r>
-      <w:r>
-        <w:t xml:space="preserve">reuse the same</w:t>
-      </w:r>
-      <w:r>
-        <w:t xml:space="preserve"> </w:t>
-      </w:r>
-      <w:r>
-        <w:rPr>
-          <w:rStyle w:val="VerbatimChar"/>
-        </w:rPr>
-        <w:t xml:space="preserve">buildVisibilityConditions()</w:t>
-      </w:r>
-      <w:r>
-        <w:t xml:space="preserve"> </w:t>
-      </w:r>
-      <w:r>
-        <w:t xml:space="preserve">logic as Inbox/Admin View, eliminating the server-side mismatch that previously showed sidebar</w:t>
-      </w:r>
-      <w:r>
-        <w:t xml:space="preserve"> </w:t>
-      </w:r>
-      <w:r>
-        <w:rPr>
-          <w:rStyle w:val="VerbatimChar"/>
-        </w:rPr>
-        <w:t xml:space="preserve">9+</w:t>
-      </w:r>
-      <w:r>
-        <w:t xml:space="preserve"> </w:t>
-      </w:r>
-      <w:r>
-        <w:t xml:space="preserve">while the visible inbox unread count was lower.</w:t>
-      </w:r>
-    </w:p>
-    <w:p>
-      <w:pPr>
-        <w:pStyle w:val="Compact"/>
-        <w:numPr>
-          <w:ilvl w:val="0"/>
-          <w:numId w:val="1302"/>
-        </w:numPr>
-      </w:pPr>
-      <w:r>
-        <w:t xml:space="preserve">Production verification after unread-summary deploy: built backend helper</w:t>
-      </w:r>
-      <w:r>
-        <w:t xml:space="preserve"> </w:t>
-      </w:r>
-      <w:r>
-        <w:rPr>
-          <w:rStyle w:val="VerbatimChar"/>
-        </w:rPr>
-        <w:t xml:space="preserve">buildUnreadSummaryWhere()</w:t>
-      </w:r>
-      <w:r>
-        <w:t xml:space="preserve"> </w:t>
-      </w:r>
-      <w:r>
-        <w:t xml:space="preserve">and the Inbox list visibility path both now count the same</w:t>
-      </w:r>
-      <w:r>
-        <w:t xml:space="preserve"> </w:t>
-      </w:r>
-      <w:r>
-        <w:rPr>
-          <w:rStyle w:val="VerbatimChar"/>
-        </w:rPr>
-        <w:t xml:space="preserve">7</w:t>
-      </w:r>
-      <w:r>
-        <w:t xml:space="preserve"> </w:t>
-      </w:r>
-      <w:r>
-        <w:t xml:space="preserve">visible unread conversations (</w:t>
-      </w:r>
-      <w:r>
-        <w:rPr>
-          <w:rStyle w:val="VerbatimChar"/>
-        </w:rPr>
-        <w:t xml:space="preserve">10</w:t>
-      </w:r>
-      <w:r>
-        <w:t xml:space="preserve"> </w:t>
-      </w:r>
-      <w:r>
-        <w:t xml:space="preserve">unread messages) in Admin scope, confirming the badge/list logic is aligned even though live counts continue to change with new inbound traffic.</w:t>
+        <w:t xml:space="preserve"> </w:t>
+      </w:r>
+      <w:r>
+        <w:t xml:space="preserve">remaining eligible recent conversations with empty AI state.</w:t>
       </w:r>
     </w:p>
     <w:p>
@@ -14533,6 +14923,376 @@
             </w:pPr>
             <w:r>
               <w:t xml:space="preserve">Production SHA a54c027; PM2 online; helper/list counts both return 7</w:t>
+            </w:r>
+          </w:p>
+        </w:tc>
+        <w:tc>
+          <w:tcPr/>
+          <w:p>
+            <w:pPr>
+              <w:pStyle w:val="Compact"/>
+            </w:pPr>
+            <w:r>
+              <w:t xml:space="preserve">Done</w:t>
+            </w:r>
+          </w:p>
+        </w:tc>
+      </w:tr>
+      <w:tr>
+        <w:tc>
+          <w:tcPr/>
+          <w:p>
+            <w:pPr>
+              <w:pStyle w:val="Compact"/>
+            </w:pPr>
+            <w:r>
+              <w:t xml:space="preserve">2026-04-28</w:t>
+            </w:r>
+          </w:p>
+        </w:tc>
+        <w:tc>
+          <w:tcPr/>
+          <w:p>
+            <w:pPr>
+              <w:pStyle w:val="Compact"/>
+            </w:pPr>
+            <w:r>
+              <w:t xml:space="preserve">AI Parser Fix</w:t>
+            </w:r>
+          </w:p>
+        </w:tc>
+        <w:tc>
+          <w:tcPr/>
+          <w:p>
+            <w:pPr>
+              <w:pStyle w:val="Compact"/>
+            </w:pPr>
+            <w:r>
+              <w:t xml:space="preserve">Extracted fenced JSON before parsing Anthropic output</w:t>
+            </w:r>
+          </w:p>
+        </w:tc>
+        <w:tc>
+          <w:tcPr/>
+          <w:p>
+            <w:pPr>
+              <w:pStyle w:val="Compact"/>
+            </w:pPr>
+            <w:r>
+              <w:t xml:space="preserve">cc50ca6</w:t>
+            </w:r>
+          </w:p>
+        </w:tc>
+        <w:tc>
+          <w:tcPr/>
+          <w:p>
+            <w:pPr>
+              <w:pStyle w:val="Compact"/>
+            </w:pPr>
+            <w:r>
+              <w:t xml:space="preserve">AI tests 11/11 passed;</w:t>
+            </w:r>
+            <w:r>
+              <w:t xml:space="preserve"> </w:t>
+            </w:r>
+            <w:r>
+              <w:rPr>
+                <w:rStyle w:val="VerbatimChar"/>
+              </w:rPr>
+              <w:t xml:space="preserve">server npm run build</w:t>
+            </w:r>
+            <w:r>
+              <w:t xml:space="preserve"> </w:t>
+            </w:r>
+            <w:r>
+              <w:t xml:space="preserve">passed</w:t>
+            </w:r>
+          </w:p>
+        </w:tc>
+        <w:tc>
+          <w:tcPr/>
+          <w:p>
+            <w:pPr>
+              <w:pStyle w:val="Compact"/>
+            </w:pPr>
+            <w:r>
+              <w:t xml:space="preserve">Done</w:t>
+            </w:r>
+          </w:p>
+        </w:tc>
+      </w:tr>
+      <w:tr>
+        <w:tc>
+          <w:tcPr/>
+          <w:p>
+            <w:pPr>
+              <w:pStyle w:val="Compact"/>
+            </w:pPr>
+            <w:r>
+              <w:t xml:space="preserve">2026-04-28</w:t>
+            </w:r>
+          </w:p>
+        </w:tc>
+        <w:tc>
+          <w:tcPr/>
+          <w:p>
+            <w:pPr>
+              <w:pStyle w:val="Compact"/>
+            </w:pPr>
+            <w:r>
+              <w:t xml:space="preserve">Production Deploy</w:t>
+            </w:r>
+          </w:p>
+        </w:tc>
+        <w:tc>
+          <w:tcPr/>
+          <w:p>
+            <w:pPr>
+              <w:pStyle w:val="Compact"/>
+            </w:pPr>
+            <w:r>
+              <w:t xml:space="preserve">Deployed fenced-JSON parser compatibility fix</w:t>
+            </w:r>
+          </w:p>
+        </w:tc>
+        <w:tc>
+          <w:tcPr/>
+          <w:p>
+            <w:pPr>
+              <w:pStyle w:val="Compact"/>
+            </w:pPr>
+            <w:r>
+              <w:t xml:space="preserve">cc50ca6</w:t>
+            </w:r>
+          </w:p>
+        </w:tc>
+        <w:tc>
+          <w:tcPr/>
+          <w:p>
+            <w:pPr>
+              <w:pStyle w:val="Compact"/>
+            </w:pPr>
+            <w:r>
+              <w:t xml:space="preserve">Production SHA cc50ca6; PM2 online; raw payload parse confirmed</w:t>
+            </w:r>
+          </w:p>
+        </w:tc>
+        <w:tc>
+          <w:tcPr/>
+          <w:p>
+            <w:pPr>
+              <w:pStyle w:val="Compact"/>
+            </w:pPr>
+            <w:r>
+              <w:t xml:space="preserve">Done</w:t>
+            </w:r>
+          </w:p>
+        </w:tc>
+      </w:tr>
+      <w:tr>
+        <w:tc>
+          <w:tcPr/>
+          <w:p>
+            <w:pPr>
+              <w:pStyle w:val="Compact"/>
+            </w:pPr>
+            <w:r>
+              <w:t xml:space="preserve">2026-04-28</w:t>
+            </w:r>
+          </w:p>
+        </w:tc>
+        <w:tc>
+          <w:tcPr/>
+          <w:p>
+            <w:pPr>
+              <w:pStyle w:val="Compact"/>
+            </w:pPr>
+            <w:r>
+              <w:t xml:space="preserve">AI Schema Drift Fix</w:t>
+            </w:r>
+          </w:p>
+        </w:tc>
+        <w:tc>
+          <w:tcPr/>
+          <w:p>
+            <w:pPr>
+              <w:pStyle w:val="Compact"/>
+            </w:pPr>
+            <w:r>
+              <w:t xml:space="preserve">Normalized near-valid locked payload instead of null return</w:t>
+            </w:r>
+          </w:p>
+        </w:tc>
+        <w:tc>
+          <w:tcPr/>
+          <w:p>
+            <w:pPr>
+              <w:pStyle w:val="Compact"/>
+            </w:pPr>
+            <w:r>
+              <w:t xml:space="preserve">56f4a8b</w:t>
+            </w:r>
+          </w:p>
+        </w:tc>
+        <w:tc>
+          <w:tcPr/>
+          <w:p>
+            <w:pPr>
+              <w:pStyle w:val="Compact"/>
+            </w:pPr>
+            <w:r>
+              <w:t xml:space="preserve">AI tests 12/12 passed;</w:t>
+            </w:r>
+            <w:r>
+              <w:t xml:space="preserve"> </w:t>
+            </w:r>
+            <w:r>
+              <w:rPr>
+                <w:rStyle w:val="VerbatimChar"/>
+              </w:rPr>
+              <w:t xml:space="preserve">server npm run build</w:t>
+            </w:r>
+            <w:r>
+              <w:t xml:space="preserve"> </w:t>
+            </w:r>
+            <w:r>
+              <w:t xml:space="preserve">passed</w:t>
+            </w:r>
+          </w:p>
+        </w:tc>
+        <w:tc>
+          <w:tcPr/>
+          <w:p>
+            <w:pPr>
+              <w:pStyle w:val="Compact"/>
+            </w:pPr>
+            <w:r>
+              <w:t xml:space="preserve">Done</w:t>
+            </w:r>
+          </w:p>
+        </w:tc>
+      </w:tr>
+      <w:tr>
+        <w:tc>
+          <w:tcPr/>
+          <w:p>
+            <w:pPr>
+              <w:pStyle w:val="Compact"/>
+            </w:pPr>
+            <w:r>
+              <w:t xml:space="preserve">2026-04-28</w:t>
+            </w:r>
+          </w:p>
+        </w:tc>
+        <w:tc>
+          <w:tcPr/>
+          <w:p>
+            <w:pPr>
+              <w:pStyle w:val="Compact"/>
+            </w:pPr>
+            <w:r>
+              <w:t xml:space="preserve">Production Deploy</w:t>
+            </w:r>
+          </w:p>
+        </w:tc>
+        <w:tc>
+          <w:tcPr/>
+          <w:p>
+            <w:pPr>
+              <w:pStyle w:val="Compact"/>
+            </w:pPr>
+            <w:r>
+              <w:t xml:space="preserve">Deployed classifier schema-drift tolerance fix</w:t>
+            </w:r>
+          </w:p>
+        </w:tc>
+        <w:tc>
+          <w:tcPr/>
+          <w:p>
+            <w:pPr>
+              <w:pStyle w:val="Compact"/>
+            </w:pPr>
+            <w:r>
+              <w:t xml:space="preserve">56f4a8b</w:t>
+            </w:r>
+          </w:p>
+        </w:tc>
+        <w:tc>
+          <w:tcPr/>
+          <w:p>
+            <w:pPr>
+              <w:pStyle w:val="Compact"/>
+            </w:pPr>
+            <w:r>
+              <w:t xml:space="preserve">Production SHA 56f4a8b; PM2 online; direct classifyInbound non-null</w:t>
+            </w:r>
+          </w:p>
+        </w:tc>
+        <w:tc>
+          <w:tcPr/>
+          <w:p>
+            <w:pPr>
+              <w:pStyle w:val="Compact"/>
+            </w:pPr>
+            <w:r>
+              <w:t xml:space="preserve">Done</w:t>
+            </w:r>
+          </w:p>
+        </w:tc>
+      </w:tr>
+      <w:tr>
+        <w:tc>
+          <w:tcPr/>
+          <w:p>
+            <w:pPr>
+              <w:pStyle w:val="Compact"/>
+            </w:pPr>
+            <w:r>
+              <w:t xml:space="preserve">2026-04-28</w:t>
+            </w:r>
+          </w:p>
+        </w:tc>
+        <w:tc>
+          <w:tcPr/>
+          <w:p>
+            <w:pPr>
+              <w:pStyle w:val="Compact"/>
+            </w:pPr>
+            <w:r>
+              <w:t xml:space="preserve">Production Recovery</w:t>
+            </w:r>
+          </w:p>
+        </w:tc>
+        <w:tc>
+          <w:tcPr/>
+          <w:p>
+            <w:pPr>
+              <w:pStyle w:val="Compact"/>
+            </w:pPr>
+            <w:r>
+              <w:t xml:space="preserve">Backfilled recent eligible conversations missing AI state</w:t>
+            </w:r>
+          </w:p>
+        </w:tc>
+        <w:tc>
+          <w:tcPr/>
+          <w:p>
+            <w:pPr>
+              <w:pStyle w:val="Compact"/>
+            </w:pPr>
+            <w:r>
+              <w:t xml:space="preserve">N/A</w:t>
+            </w:r>
+          </w:p>
+        </w:tc>
+        <w:tc>
+          <w:tcPr/>
+          <w:p>
+            <w:pPr>
+              <w:pStyle w:val="Compact"/>
+            </w:pPr>
+            <w:r>
+              <w:t xml:space="preserve">5 conversations updated; remaining eligible recent null count = 0</w:t>
             </w:r>
           </w:p>
         </w:tc>

</xml_diff>

<commit_message>
docs: record inbox and blast gate updates
</commit_message>
<xml_diff>
--- a/CHECKLIST_M1_M2_REMEDIATION_2026-04-28.docx
+++ b/CHECKLIST_M1_M2_REMEDIATION_2026-04-28.docx
@@ -11982,6 +11982,198 @@
       </w:r>
       <w:r>
         <w:t xml:space="preserve">remaining eligible recent conversations with empty AI state.</w:t>
+      </w:r>
+    </w:p>
+    <w:p>
+      <w:pPr>
+        <w:pStyle w:val="Compact"/>
+        <w:numPr>
+          <w:ilvl w:val="0"/>
+          <w:numId w:val="1302"/>
+        </w:numPr>
+      </w:pPr>
+      <w:r>
+        <w:t xml:space="preserve">Latest inbox reassignment fix: restored a visible</w:t>
+      </w:r>
+      <w:r>
+        <w:t xml:space="preserve"> </w:t>
+      </w:r>
+      <w:r>
+        <w:rPr>
+          <w:rStyle w:val="VerbatimChar"/>
+        </w:rPr>
+        <w:t xml:space="preserve">Assign Rep</w:t>
+      </w:r>
+      <w:r>
+        <w:t xml:space="preserve"> </w:t>
+      </w:r>
+      <w:r>
+        <w:t xml:space="preserve">trigger in the inbox thread header so the existing admin/manager reassignment modal and</w:t>
+      </w:r>
+      <w:r>
+        <w:t xml:space="preserve"> </w:t>
+      </w:r>
+      <w:r>
+        <w:rPr>
+          <w:rStyle w:val="VerbatimChar"/>
+        </w:rPr>
+        <w:t xml:space="preserve">/api/inbox/:id/assign</w:t>
+      </w:r>
+      <w:r>
+        <w:t xml:space="preserve"> </w:t>
+      </w:r>
+      <w:r>
+        <w:t xml:space="preserve">API are reachable again;</w:t>
+      </w:r>
+      <w:r>
+        <w:t xml:space="preserve"> </w:t>
+      </w:r>
+      <w:r>
+        <w:rPr>
+          <w:rStyle w:val="VerbatimChar"/>
+        </w:rPr>
+        <w:t xml:space="preserve">client npm run build</w:t>
+      </w:r>
+      <w:r>
+        <w:t xml:space="preserve"> </w:t>
+      </w:r>
+      <w:r>
+        <w:t xml:space="preserve">passed.</w:t>
+      </w:r>
+    </w:p>
+    <w:p>
+      <w:pPr>
+        <w:pStyle w:val="Compact"/>
+        <w:numPr>
+          <w:ilvl w:val="0"/>
+          <w:numId w:val="1302"/>
+        </w:numPr>
+      </w:pPr>
+      <w:r>
+        <w:t xml:space="preserve">Production outbound-gate override: Stuart (</w:t>
+      </w:r>
+      <w:r>
+        <w:rPr>
+          <w:rStyle w:val="VerbatimChar"/>
+        </w:rPr>
+        <w:t xml:space="preserve">15</w:t>
+      </w:r>
+      <w:r>
+        <w:t xml:space="preserve"> </w:t>
+      </w:r>
+      <w:r>
+        <w:t xml:space="preserve">overdue next actions) and Marcos (</w:t>
+      </w:r>
+      <w:r>
+        <w:rPr>
+          <w:rStyle w:val="VerbatimChar"/>
+        </w:rPr>
+        <w:t xml:space="preserve">3</w:t>
+      </w:r>
+      <w:r>
+        <w:t xml:space="preserve">) were unblocked for campaign blasts by setting their per-rep</w:t>
+      </w:r>
+      <w:r>
+        <w:t xml:space="preserve"> </w:t>
+      </w:r>
+      <w:r>
+        <w:rPr>
+          <w:rStyle w:val="VerbatimChar"/>
+        </w:rPr>
+        <w:t xml:space="preserve">smsOutboundThreshold</w:t>
+      </w:r>
+      <w:r>
+        <w:t xml:space="preserve"> </w:t>
+      </w:r>
+      <w:r>
+        <w:t xml:space="preserve">override to</w:t>
+      </w:r>
+      <w:r>
+        <w:t xml:space="preserve"> </w:t>
+      </w:r>
+      <w:r>
+        <w:rPr>
+          <w:rStyle w:val="VerbatimChar"/>
+        </w:rPr>
+        <w:t xml:space="preserve">0</w:t>
+      </w:r>
+      <w:r>
+        <w:t xml:space="preserve">; the underlying overdue backlog still exists and should be worked separately, but the blast gate no longer blocks those two reps.</w:t>
+      </w:r>
+    </w:p>
+    <w:p>
+      <w:pPr>
+        <w:pStyle w:val="Compact"/>
+        <w:numPr>
+          <w:ilvl w:val="0"/>
+          <w:numId w:val="1302"/>
+        </w:numPr>
+      </w:pPr>
+      <w:r>
+        <w:t xml:space="preserve">Production REP account created:</w:t>
+      </w:r>
+      <w:r>
+        <w:t xml:space="preserve"> </w:t>
+      </w:r>
+      <w:r>
+        <w:rPr>
+          <w:rStyle w:val="VerbatimChar"/>
+        </w:rPr>
+        <w:t xml:space="preserve">Vitalii Shynkaruk</w:t>
+      </w:r>
+      <w:r>
+        <w:t xml:space="preserve"> </w:t>
+      </w:r>
+      <w:r>
+        <w:t xml:space="preserve">(</w:t>
+      </w:r>
+      <w:r>
+        <w:rPr>
+          <w:rStyle w:val="VerbatimChar"/>
+        </w:rPr>
+        <w:t xml:space="preserve">VS</w:t>
+      </w:r>
+      <w:r>
+        <w:t xml:space="preserve">,</w:t>
+      </w:r>
+      <w:r>
+        <w:t xml:space="preserve"> </w:t>
+      </w:r>
+      <w:r>
+        <w:rPr>
+          <w:rStyle w:val="VerbatimChar"/>
+        </w:rPr>
+        <w:t xml:space="preserve">94vshynkaryk@ukr.net</w:t>
+      </w:r>
+      <w:r>
+        <w:t xml:space="preserve">) created as an active</w:t>
+      </w:r>
+      <w:r>
+        <w:t xml:space="preserve"> </w:t>
+      </w:r>
+      <w:r>
+        <w:rPr>
+          <w:rStyle w:val="VerbatimChar"/>
+        </w:rPr>
+        <w:t xml:space="preserve">REP</w:t>
+      </w:r>
+      <w:r>
+        <w:t xml:space="preserve"> </w:t>
+      </w:r>
+      <w:r>
+        <w:t xml:space="preserve">user with default SMS lock threshold</w:t>
+      </w:r>
+      <w:r>
+        <w:t xml:space="preserve"> </w:t>
+      </w:r>
+      <w:r>
+        <w:rPr>
+          <w:rStyle w:val="VerbatimChar"/>
+        </w:rPr>
+        <w:t xml:space="preserve">1</w:t>
+      </w:r>
+      <w:r>
+        <w:t xml:space="preserve">.</w:t>
       </w:r>
     </w:p>
     <w:p>
@@ -15293,6 +15485,270 @@
             </w:pPr>
             <w:r>
               <w:t xml:space="preserve">5 conversations updated; remaining eligible recent null count = 0</w:t>
+            </w:r>
+          </w:p>
+        </w:tc>
+        <w:tc>
+          <w:tcPr/>
+          <w:p>
+            <w:pPr>
+              <w:pStyle w:val="Compact"/>
+            </w:pPr>
+            <w:r>
+              <w:t xml:space="preserve">Done</w:t>
+            </w:r>
+          </w:p>
+        </w:tc>
+      </w:tr>
+      <w:tr>
+        <w:tc>
+          <w:tcPr/>
+          <w:p>
+            <w:pPr>
+              <w:pStyle w:val="Compact"/>
+            </w:pPr>
+            <w:r>
+              <w:t xml:space="preserve">2026-04-29</w:t>
+            </w:r>
+          </w:p>
+        </w:tc>
+        <w:tc>
+          <w:tcPr/>
+          <w:p>
+            <w:pPr>
+              <w:pStyle w:val="Compact"/>
+            </w:pPr>
+            <w:r>
+              <w:t xml:space="preserve">Inbox Reassignment</w:t>
+            </w:r>
+          </w:p>
+        </w:tc>
+        <w:tc>
+          <w:tcPr/>
+          <w:p>
+            <w:pPr>
+              <w:pStyle w:val="Compact"/>
+            </w:pPr>
+            <w:r>
+              <w:t xml:space="preserve">Restored visible Assign Rep trigger in inbox thread</w:t>
+            </w:r>
+          </w:p>
+        </w:tc>
+        <w:tc>
+          <w:tcPr/>
+          <w:p>
+            <w:pPr>
+              <w:pStyle w:val="Compact"/>
+            </w:pPr>
+            <w:r>
+              <w:t xml:space="preserve">56a2561</w:t>
+            </w:r>
+          </w:p>
+        </w:tc>
+        <w:tc>
+          <w:tcPr/>
+          <w:p>
+            <w:pPr>
+              <w:pStyle w:val="Compact"/>
+            </w:pPr>
+            <w:r>
+              <w:rPr>
+                <w:rStyle w:val="VerbatimChar"/>
+              </w:rPr>
+              <w:t xml:space="preserve">client npm run build</w:t>
+            </w:r>
+            <w:r>
+              <w:t xml:space="preserve"> </w:t>
+            </w:r>
+            <w:r>
+              <w:t xml:space="preserve">passed; existing modal/API path reachable</w:t>
+            </w:r>
+          </w:p>
+        </w:tc>
+        <w:tc>
+          <w:tcPr/>
+          <w:p>
+            <w:pPr>
+              <w:pStyle w:val="Compact"/>
+            </w:pPr>
+            <w:r>
+              <w:t xml:space="preserve">Done</w:t>
+            </w:r>
+          </w:p>
+        </w:tc>
+      </w:tr>
+      <w:tr>
+        <w:tc>
+          <w:tcPr/>
+          <w:p>
+            <w:pPr>
+              <w:pStyle w:val="Compact"/>
+            </w:pPr>
+            <w:r>
+              <w:t xml:space="preserve">2026-04-29</w:t>
+            </w:r>
+          </w:p>
+        </w:tc>
+        <w:tc>
+          <w:tcPr/>
+          <w:p>
+            <w:pPr>
+              <w:pStyle w:val="Compact"/>
+            </w:pPr>
+            <w:r>
+              <w:t xml:space="preserve">Blast Gate Override</w:t>
+            </w:r>
+          </w:p>
+        </w:tc>
+        <w:tc>
+          <w:tcPr/>
+          <w:p>
+            <w:pPr>
+              <w:pStyle w:val="Compact"/>
+            </w:pPr>
+            <w:r>
+              <w:t xml:space="preserve">Disabled SMS overdue lock for Stuart and Marcos</w:t>
+            </w:r>
+          </w:p>
+        </w:tc>
+        <w:tc>
+          <w:tcPr/>
+          <w:p>
+            <w:pPr>
+              <w:pStyle w:val="Compact"/>
+            </w:pPr>
+            <w:r>
+              <w:t xml:space="preserve">N/A</w:t>
+            </w:r>
+          </w:p>
+        </w:tc>
+        <w:tc>
+          <w:tcPr/>
+          <w:p>
+            <w:pPr>
+              <w:pStyle w:val="Compact"/>
+            </w:pPr>
+            <w:r>
+              <w:t xml:space="preserve">Threshold override</w:t>
+            </w:r>
+            <w:r>
+              <w:t xml:space="preserve"> </w:t>
+            </w:r>
+            <w:r>
+              <w:rPr>
+                <w:rStyle w:val="VerbatimChar"/>
+              </w:rPr>
+              <w:t xml:space="preserve">0</w:t>
+            </w:r>
+            <w:r>
+              <w:t xml:space="preserve">; gate now returns</w:t>
+            </w:r>
+            <w:r>
+              <w:t xml:space="preserve"> </w:t>
+            </w:r>
+            <w:r>
+              <w:rPr>
+                <w:rStyle w:val="VerbatimChar"/>
+              </w:rPr>
+              <w:t xml:space="preserve">blocked=false</w:t>
+            </w:r>
+            <w:r>
+              <w:t xml:space="preserve"> </w:t>
+            </w:r>
+            <w:r>
+              <w:t xml:space="preserve">for both</w:t>
+            </w:r>
+          </w:p>
+        </w:tc>
+        <w:tc>
+          <w:tcPr/>
+          <w:p>
+            <w:pPr>
+              <w:pStyle w:val="Compact"/>
+            </w:pPr>
+            <w:r>
+              <w:t xml:space="preserve">Done</w:t>
+            </w:r>
+          </w:p>
+        </w:tc>
+      </w:tr>
+      <w:tr>
+        <w:tc>
+          <w:tcPr/>
+          <w:p>
+            <w:pPr>
+              <w:pStyle w:val="Compact"/>
+            </w:pPr>
+            <w:r>
+              <w:t xml:space="preserve">2026-04-29</w:t>
+            </w:r>
+          </w:p>
+        </w:tc>
+        <w:tc>
+          <w:tcPr/>
+          <w:p>
+            <w:pPr>
+              <w:pStyle w:val="Compact"/>
+            </w:pPr>
+            <w:r>
+              <w:t xml:space="preserve">REP Provisioning</w:t>
+            </w:r>
+          </w:p>
+        </w:tc>
+        <w:tc>
+          <w:tcPr/>
+          <w:p>
+            <w:pPr>
+              <w:pStyle w:val="Compact"/>
+            </w:pPr>
+            <w:r>
+              <w:t xml:space="preserve">Created production REP account for Vitalii Shynkaruk</w:t>
+            </w:r>
+          </w:p>
+        </w:tc>
+        <w:tc>
+          <w:tcPr/>
+          <w:p>
+            <w:pPr>
+              <w:pStyle w:val="Compact"/>
+            </w:pPr>
+            <w:r>
+              <w:t xml:space="preserve">N/A</w:t>
+            </w:r>
+          </w:p>
+        </w:tc>
+        <w:tc>
+          <w:tcPr/>
+          <w:p>
+            <w:pPr>
+              <w:pStyle w:val="Compact"/>
+            </w:pPr>
+            <w:r>
+              <w:t xml:space="preserve">User exists as active</w:t>
+            </w:r>
+            <w:r>
+              <w:t xml:space="preserve"> </w:t>
+            </w:r>
+            <w:r>
+              <w:rPr>
+                <w:rStyle w:val="VerbatimChar"/>
+              </w:rPr>
+              <w:t xml:space="preserve">REP</w:t>
+            </w:r>
+            <w:r>
+              <w:t xml:space="preserve"> </w:t>
+            </w:r>
+            <w:r>
+              <w:t xml:space="preserve">with initials</w:t>
+            </w:r>
+            <w:r>
+              <w:t xml:space="preserve"> </w:t>
+            </w:r>
+            <w:r>
+              <w:rPr>
+                <w:rStyle w:val="VerbatimChar"/>
+              </w:rPr>
+              <w:t xml:space="preserve">VS</w:t>
             </w:r>
           </w:p>
         </w:tc>

</xml_diff>

<commit_message>
Update remediation checklist for HELOC fix
</commit_message>
<xml_diff>
--- a/CHECKLIST_M1_M2_REMEDIATION_2026-04-28.docx
+++ b/CHECKLIST_M1_M2_REMEDIATION_2026-04-28.docx
@@ -11798,6 +11798,93 @@
         </w:numPr>
       </w:pPr>
       <w:r>
+        <w:t xml:space="preserve">Latest HELOC suggestion repair: commit</w:t>
+      </w:r>
+      <w:r>
+        <w:t xml:space="preserve"> </w:t>
+      </w:r>
+      <w:r>
+        <w:rPr>
+          <w:rStyle w:val="VerbatimChar"/>
+        </w:rPr>
+        <w:t xml:space="preserve">8b6b61d</w:t>
+      </w:r>
+      <w:r>
+        <w:t xml:space="preserve"> </w:t>
+      </w:r>
+      <w:r>
+        <w:t xml:space="preserve">now treats questions like</w:t>
+      </w:r>
+      <w:r>
+        <w:t xml:space="preserve"> </w:t>
+      </w:r>
+      <w:r>
+        <w:rPr>
+          <w:rStyle w:val="VerbatimChar"/>
+        </w:rPr>
+        <w:t xml:space="preserve">What is a HELOC?</w:t>
+      </w:r>
+      <w:r>
+        <w:t xml:space="preserve"> </w:t>
+      </w:r>
+      <w:r>
+        <w:t xml:space="preserve">/</w:t>
+      </w:r>
+      <w:r>
+        <w:t xml:space="preserve"> </w:t>
+      </w:r>
+      <w:r>
+        <w:rPr>
+          <w:rStyle w:val="VerbatimChar"/>
+        </w:rPr>
+        <w:t xml:space="preserve">What is a LOC?</w:t>
+      </w:r>
+      <w:r>
+        <w:t xml:space="preserve"> </w:t>
+      </w:r>
+      <w:r>
+        <w:t xml:space="preserve">as contextual product clarifications, replaces stale email-style suggestions with product-aware explanations, targeted regression</w:t>
+      </w:r>
+      <w:r>
+        <w:t xml:space="preserve"> </w:t>
+      </w:r>
+      <w:r>
+        <w:rPr>
+          <w:rStyle w:val="VerbatimChar"/>
+        </w:rPr>
+        <w:t xml:space="preserve">server/tests/aiSuggestionPolicy.test.ts</w:t>
+      </w:r>
+      <w:r>
+        <w:t xml:space="preserve"> </w:t>
+      </w:r>
+      <w:r>
+        <w:t xml:space="preserve">passed 13/13, and</w:t>
+      </w:r>
+      <w:r>
+        <w:t xml:space="preserve"> </w:t>
+      </w:r>
+      <w:r>
+        <w:rPr>
+          <w:rStyle w:val="VerbatimChar"/>
+        </w:rPr>
+        <w:t xml:space="preserve">server npm run build</w:t>
+      </w:r>
+      <w:r>
+        <w:t xml:space="preserve"> </w:t>
+      </w:r>
+      <w:r>
+        <w:t xml:space="preserve">passed.</w:t>
+      </w:r>
+    </w:p>
+    <w:p>
+      <w:pPr>
+        <w:pStyle w:val="Compact"/>
+        <w:numPr>
+          <w:ilvl w:val="0"/>
+          <w:numId w:val="1302"/>
+        </w:numPr>
+      </w:pPr>
+      <w:r>
         <w:t xml:space="preserve">Production direct-call verification after the final AI fix:</w:t>
       </w:r>
       <w:r>
@@ -12110,7 +12197,7 @@
         </w:numPr>
       </w:pPr>
       <w:r>
-        <w:t xml:space="preserve">Production REP account created:</w:t>
+        <w:t xml:space="preserve">Production REP cleanup: temporary account</w:t>
       </w:r>
       <w:r>
         <w:t xml:space="preserve"> </w:t>
@@ -12146,34 +12233,22 @@
         <w:t xml:space="preserve">94vshynkaryk@ukr.net</w:t>
       </w:r>
       <w:r>
-        <w:t xml:space="preserve">) created as an active</w:t>
-      </w:r>
-      <w:r>
-        <w:t xml:space="preserve"> </w:t>
-      </w:r>
-      <w:r>
-        <w:rPr>
-          <w:rStyle w:val="VerbatimChar"/>
-        </w:rPr>
-        <w:t xml:space="preserve">REP</w:t>
-      </w:r>
-      <w:r>
-        <w:t xml:space="preserve"> </w:t>
-      </w:r>
-      <w:r>
-        <w:t xml:space="preserve">user with default SMS lock threshold</w:t>
-      </w:r>
-      <w:r>
-        <w:t xml:space="preserve"> </w:t>
-      </w:r>
-      <w:r>
-        <w:rPr>
-          <w:rStyle w:val="VerbatimChar"/>
-        </w:rPr>
-        <w:t xml:space="preserve">1</w:t>
-      </w:r>
-      <w:r>
-        <w:t xml:space="preserve">.</w:t>
+        <w:t xml:space="preserve">) was safely hard-deleted after verifying</w:t>
+      </w:r>
+      <w:r>
+        <w:t xml:space="preserve"> </w:t>
+      </w:r>
+      <w:r>
+        <w:rPr>
+          <w:rStyle w:val="VerbatimChar"/>
+        </w:rPr>
+        <w:t xml:space="preserve">0</w:t>
+      </w:r>
+      <w:r>
+        <w:t xml:space="preserve"> </w:t>
+      </w:r>
+      <w:r>
+        <w:t xml:space="preserve">dependent leads, conversations, messages, campaigns, assignments, activity logs, tags, deals, deal events, funding events, and renewal tasks.</w:t>
       </w:r>
     </w:p>
     <w:p>
@@ -15691,55 +15766,49 @@
               <w:pStyle w:val="Compact"/>
             </w:pPr>
             <w:r>
-              <w:t xml:space="preserve">REP Provisioning</w:t>
-            </w:r>
-          </w:p>
-        </w:tc>
-        <w:tc>
-          <w:tcPr/>
-          <w:p>
-            <w:pPr>
-              <w:pStyle w:val="Compact"/>
-            </w:pPr>
-            <w:r>
-              <w:t xml:space="preserve">Created production REP account for Vitalii Shynkaruk</w:t>
-            </w:r>
-          </w:p>
-        </w:tc>
-        <w:tc>
-          <w:tcPr/>
-          <w:p>
-            <w:pPr>
-              <w:pStyle w:val="Compact"/>
-            </w:pPr>
-            <w:r>
-              <w:t xml:space="preserve">N/A</w:t>
-            </w:r>
-          </w:p>
-        </w:tc>
-        <w:tc>
-          <w:tcPr/>
-          <w:p>
-            <w:pPr>
-              <w:pStyle w:val="Compact"/>
-            </w:pPr>
-            <w:r>
-              <w:t xml:space="preserve">User exists as active</w:t>
-            </w:r>
-            <w:r>
-              <w:t xml:space="preserve"> </w:t>
-            </w:r>
+              <w:t xml:space="preserve">AI Suggestions</w:t>
+            </w:r>
+          </w:p>
+        </w:tc>
+        <w:tc>
+          <w:tcPr/>
+          <w:p>
+            <w:pPr>
+              <w:pStyle w:val="Compact"/>
+            </w:pPr>
+            <w:r>
+              <w:t xml:space="preserve">Repaired stale HELOC / LOC product-definition suggestions</w:t>
+            </w:r>
+          </w:p>
+        </w:tc>
+        <w:tc>
+          <w:tcPr/>
+          <w:p>
+            <w:pPr>
+              <w:pStyle w:val="Compact"/>
+            </w:pPr>
+            <w:r>
+              <w:t xml:space="preserve">8b6b61d</w:t>
+            </w:r>
+          </w:p>
+        </w:tc>
+        <w:tc>
+          <w:tcPr/>
+          <w:p>
+            <w:pPr>
+              <w:pStyle w:val="Compact"/>
+            </w:pPr>
             <w:r>
               <w:rPr>
                 <w:rStyle w:val="VerbatimChar"/>
               </w:rPr>
-              <w:t xml:space="preserve">REP</w:t>
+              <w:t xml:space="preserve">aiSuggestionPolicy</w:t>
             </w:r>
             <w:r>
               <w:t xml:space="preserve"> </w:t>
             </w:r>
             <w:r>
-              <w:t xml:space="preserve">with initials</w:t>
+              <w:t xml:space="preserve">13/13 passed;</w:t>
             </w:r>
             <w:r>
               <w:t xml:space="preserve"> </w:t>
@@ -15748,7 +15817,81 @@
               <w:rPr>
                 <w:rStyle w:val="VerbatimChar"/>
               </w:rPr>
-              <w:t xml:space="preserve">VS</w:t>
+              <w:t xml:space="preserve">server npm run build</w:t>
+            </w:r>
+            <w:r>
+              <w:t xml:space="preserve"> </w:t>
+            </w:r>
+            <w:r>
+              <w:t xml:space="preserve">passed</w:t>
+            </w:r>
+          </w:p>
+        </w:tc>
+        <w:tc>
+          <w:tcPr/>
+          <w:p>
+            <w:pPr>
+              <w:pStyle w:val="Compact"/>
+            </w:pPr>
+            <w:r>
+              <w:t xml:space="preserve">Done</w:t>
+            </w:r>
+          </w:p>
+        </w:tc>
+      </w:tr>
+      <w:tr>
+        <w:tc>
+          <w:tcPr/>
+          <w:p>
+            <w:pPr>
+              <w:pStyle w:val="Compact"/>
+            </w:pPr>
+            <w:r>
+              <w:t xml:space="preserve">2026-04-29</w:t>
+            </w:r>
+          </w:p>
+        </w:tc>
+        <w:tc>
+          <w:tcPr/>
+          <w:p>
+            <w:pPr>
+              <w:pStyle w:val="Compact"/>
+            </w:pPr>
+            <w:r>
+              <w:t xml:space="preserve">REP Cleanup</w:t>
+            </w:r>
+          </w:p>
+        </w:tc>
+        <w:tc>
+          <w:tcPr/>
+          <w:p>
+            <w:pPr>
+              <w:pStyle w:val="Compact"/>
+            </w:pPr>
+            <w:r>
+              <w:t xml:space="preserve">Removed temporary production REP account for Vitalii</w:t>
+            </w:r>
+          </w:p>
+        </w:tc>
+        <w:tc>
+          <w:tcPr/>
+          <w:p>
+            <w:pPr>
+              <w:pStyle w:val="Compact"/>
+            </w:pPr>
+            <w:r>
+              <w:t xml:space="preserve">N/A</w:t>
+            </w:r>
+          </w:p>
+        </w:tc>
+        <w:tc>
+          <w:tcPr/>
+          <w:p>
+            <w:pPr>
+              <w:pStyle w:val="Compact"/>
+            </w:pPr>
+            <w:r>
+              <w:t xml:space="preserve">Dependency audit all zero; post-check confirms user no longer exists</w:t>
             </w:r>
           </w:p>
         </w:tc>

</xml_diff>